<commit_message>
v1.3 add co-occurrence exploratory analysis for Group 2
</commit_message>
<xml_diff>
--- a/Word Tables/Table1_Patient_Characteristics.docx
+++ b/Word Tables/Table1_Patient_Characteristics.docx
@@ -238,7 +238,7 @@
                 <w:sz w:val="20"/>
                 <w:b w:val="true"/>
               </w:rPr>
-              <w:t xml:space="default">407 (100%)</w:t>
+              <w:t xml:space="default">390 (100%)</w:t>
             </w:r>
           </w:p>
         </w:tc>
@@ -263,7 +263,7 @@
                 <w:sz w:val="20"/>
                 <w:b w:val="true"/>
               </w:rPr>
-              <w:t xml:space="default">451 (100%)</w:t>
+              <w:t xml:space="default">479 (100%)</w:t>
             </w:r>
           </w:p>
         </w:tc>
@@ -288,7 +288,7 @@
                 <w:sz w:val="20"/>
                 <w:b w:val="true"/>
               </w:rPr>
-              <w:t xml:space="default">858</w:t>
+              <w:t xml:space="default">869</w:t>
             </w:r>
           </w:p>
         </w:tc>
@@ -313,7 +313,7 @@
                 <w:sz w:val="20"/>
                 <w:b w:val="true"/>
               </w:rPr>
-              <w:t xml:space="default">52.6%</w:t>
+              <w:t xml:space="default">55.1%</w:t>
             </w:r>
           </w:p>
         </w:tc>
@@ -366,55 +366,55 @@
                 <w:rFonts w:ascii="Calibri" w:hAnsi="Calibri"/>
                 <w:sz w:val="20"/>
               </w:rPr>
-              <w:t xml:space="default">16 (3.9%)</w:t>
-            </w:r>
-          </w:p>
-        </w:tc>
-        <w:tc>
-          <w:tcPr>
-            <w:tcBorders>
-              <w:top w:val="single" w:space="0" w:color="D3D3D3"/>
-              <w:bottom w:val="single" w:space="0" w:color="D3D3D3"/>
-              <w:start w:val="single" w:space="0" w:color="D3D3D3"/>
-              <w:end w:val="single" w:space="0" w:color="D3D3D3"/>
-            </w:tcBorders>
-          </w:tcPr>
-          <w:p>
-            <w:pPr>
-              <w:spacing w:before="0" w:after="60"/>
-              <w:keepNext/>
-              <w:jc w:val="start"/>
-            </w:pPr>
-            <w:r>
-              <w:rPr>
-                <w:rFonts w:ascii="Calibri" w:hAnsi="Calibri"/>
-                <w:sz w:val="20"/>
-              </w:rPr>
-              <w:t xml:space="default">36 (7.9%)</w:t>
-            </w:r>
-          </w:p>
-        </w:tc>
-        <w:tc>
-          <w:tcPr>
-            <w:tcBorders>
-              <w:top w:val="single" w:space="0" w:color="D3D3D3"/>
-              <w:bottom w:val="single" w:space="0" w:color="D3D3D3"/>
-              <w:start w:val="single" w:space="0" w:color="D3D3D3"/>
-              <w:end w:val="single" w:space="0" w:color="D3D3D3"/>
-            </w:tcBorders>
-          </w:tcPr>
-          <w:p>
-            <w:pPr>
-              <w:spacing w:before="0" w:after="60"/>
-              <w:keepNext/>
-              <w:jc w:val="start"/>
-            </w:pPr>
-            <w:r>
-              <w:rPr>
-                <w:rFonts w:ascii="Calibri" w:hAnsi="Calibri"/>
-                <w:sz w:val="20"/>
-              </w:rPr>
-              <w:t xml:space="default">52</w:t>
+              <w:t xml:space="default">14 (3.7%)</w:t>
+            </w:r>
+          </w:p>
+        </w:tc>
+        <w:tc>
+          <w:tcPr>
+            <w:tcBorders>
+              <w:top w:val="single" w:space="0" w:color="D3D3D3"/>
+              <w:bottom w:val="single" w:space="0" w:color="D3D3D3"/>
+              <w:start w:val="single" w:space="0" w:color="D3D3D3"/>
+              <w:end w:val="single" w:space="0" w:color="D3D3D3"/>
+            </w:tcBorders>
+          </w:tcPr>
+          <w:p>
+            <w:pPr>
+              <w:spacing w:before="0" w:after="60"/>
+              <w:keepNext/>
+              <w:jc w:val="start"/>
+            </w:pPr>
+            <w:r>
+              <w:rPr>
+                <w:rFonts w:ascii="Calibri" w:hAnsi="Calibri"/>
+                <w:sz w:val="20"/>
+              </w:rPr>
+              <w:t xml:space="default">39 (8.1%)</w:t>
+            </w:r>
+          </w:p>
+        </w:tc>
+        <w:tc>
+          <w:tcPr>
+            <w:tcBorders>
+              <w:top w:val="single" w:space="0" w:color="D3D3D3"/>
+              <w:bottom w:val="single" w:space="0" w:color="D3D3D3"/>
+              <w:start w:val="single" w:space="0" w:color="D3D3D3"/>
+              <w:end w:val="single" w:space="0" w:color="D3D3D3"/>
+            </w:tcBorders>
+          </w:tcPr>
+          <w:p>
+            <w:pPr>
+              <w:spacing w:before="0" w:after="60"/>
+              <w:keepNext/>
+              <w:jc w:val="start"/>
+            </w:pPr>
+            <w:r>
+              <w:rPr>
+                <w:rFonts w:ascii="Calibri" w:hAnsi="Calibri"/>
+                <w:sz w:val="20"/>
+              </w:rPr>
+              <w:t xml:space="default">53</w:t>
             </w:r>
           </w:p>
         </w:tc>
@@ -438,7 +438,7 @@
                 <w:rFonts w:ascii="Calibri" w:hAnsi="Calibri"/>
                 <w:sz w:val="20"/>
               </w:rPr>
-              <w:t xml:space="default">69.4%</w:t>
+              <w:t xml:space="default">73%</w:t>
             </w:r>
           </w:p>
         </w:tc>
@@ -491,55 +491,55 @@
                 <w:rFonts w:ascii="Calibri" w:hAnsi="Calibri"/>
                 <w:sz w:val="20"/>
               </w:rPr>
-              <w:t xml:space="default">29 (7.1%)</w:t>
-            </w:r>
-          </w:p>
-        </w:tc>
-        <w:tc>
-          <w:tcPr>
-            <w:tcBorders>
-              <w:top w:val="single" w:space="0" w:color="D3D3D3"/>
-              <w:bottom w:val="single" w:space="0" w:color="D3D3D3"/>
-              <w:start w:val="single" w:space="0" w:color="D3D3D3"/>
-              <w:end w:val="single" w:space="0" w:color="D3D3D3"/>
-            </w:tcBorders>
-          </w:tcPr>
-          <w:p>
-            <w:pPr>
-              <w:spacing w:before="0" w:after="60"/>
-              <w:keepNext/>
-              <w:jc w:val="start"/>
-            </w:pPr>
-            <w:r>
-              <w:rPr>
-                <w:rFonts w:ascii="Calibri" w:hAnsi="Calibri"/>
-                <w:sz w:val="20"/>
-              </w:rPr>
-              <w:t xml:space="default">53 (11.7%)</w:t>
-            </w:r>
-          </w:p>
-        </w:tc>
-        <w:tc>
-          <w:tcPr>
-            <w:tcBorders>
-              <w:top w:val="single" w:space="0" w:color="D3D3D3"/>
-              <w:bottom w:val="single" w:space="0" w:color="D3D3D3"/>
-              <w:start w:val="single" w:space="0" w:color="D3D3D3"/>
-              <w:end w:val="single" w:space="0" w:color="D3D3D3"/>
-            </w:tcBorders>
-          </w:tcPr>
-          <w:p>
-            <w:pPr>
-              <w:spacing w:before="0" w:after="60"/>
-              <w:keepNext/>
-              <w:jc w:val="start"/>
-            </w:pPr>
-            <w:r>
-              <w:rPr>
-                <w:rFonts w:ascii="Calibri" w:hAnsi="Calibri"/>
-                <w:sz w:val="20"/>
-              </w:rPr>
-              <w:t xml:space="default">82</w:t>
+              <w:t xml:space="default">29 (7.4%)</w:t>
+            </w:r>
+          </w:p>
+        </w:tc>
+        <w:tc>
+          <w:tcPr>
+            <w:tcBorders>
+              <w:top w:val="single" w:space="0" w:color="D3D3D3"/>
+              <w:bottom w:val="single" w:space="0" w:color="D3D3D3"/>
+              <w:start w:val="single" w:space="0" w:color="D3D3D3"/>
+              <w:end w:val="single" w:space="0" w:color="D3D3D3"/>
+            </w:tcBorders>
+          </w:tcPr>
+          <w:p>
+            <w:pPr>
+              <w:spacing w:before="0" w:after="60"/>
+              <w:keepNext/>
+              <w:jc w:val="start"/>
+            </w:pPr>
+            <w:r>
+              <w:rPr>
+                <w:rFonts w:ascii="Calibri" w:hAnsi="Calibri"/>
+                <w:sz w:val="20"/>
+              </w:rPr>
+              <w:t xml:space="default">54 (11.2%)</w:t>
+            </w:r>
+          </w:p>
+        </w:tc>
+        <w:tc>
+          <w:tcPr>
+            <w:tcBorders>
+              <w:top w:val="single" w:space="0" w:color="D3D3D3"/>
+              <w:bottom w:val="single" w:space="0" w:color="D3D3D3"/>
+              <w:start w:val="single" w:space="0" w:color="D3D3D3"/>
+              <w:end w:val="single" w:space="0" w:color="D3D3D3"/>
+            </w:tcBorders>
+          </w:tcPr>
+          <w:p>
+            <w:pPr>
+              <w:spacing w:before="0" w:after="60"/>
+              <w:keepNext/>
+              <w:jc w:val="start"/>
+            </w:pPr>
+            <w:r>
+              <w:rPr>
+                <w:rFonts w:ascii="Calibri" w:hAnsi="Calibri"/>
+                <w:sz w:val="20"/>
+              </w:rPr>
+              <w:t xml:space="default">83</w:t>
             </w:r>
           </w:p>
         </w:tc>
@@ -563,7 +563,7 @@
                 <w:rFonts w:ascii="Calibri" w:hAnsi="Calibri"/>
                 <w:sz w:val="20"/>
               </w:rPr>
-              <w:t xml:space="default">64.6%</w:t>
+              <w:t xml:space="default">65.1%</w:t>
             </w:r>
           </w:p>
         </w:tc>
@@ -616,55 +616,55 @@
                 <w:rFonts w:ascii="Calibri" w:hAnsi="Calibri"/>
                 <w:sz w:val="20"/>
               </w:rPr>
-              <w:t xml:space="default">31 (7.5%)</w:t>
-            </w:r>
-          </w:p>
-        </w:tc>
-        <w:tc>
-          <w:tcPr>
-            <w:tcBorders>
-              <w:top w:val="single" w:space="0" w:color="D3D3D3"/>
-              <w:bottom w:val="single" w:space="0" w:color="D3D3D3"/>
-              <w:start w:val="single" w:space="0" w:color="D3D3D3"/>
-              <w:end w:val="single" w:space="0" w:color="D3D3D3"/>
-            </w:tcBorders>
-          </w:tcPr>
-          <w:p>
-            <w:pPr>
-              <w:spacing w:before="0" w:after="60"/>
-              <w:keepNext/>
-              <w:jc w:val="start"/>
-            </w:pPr>
-            <w:r>
-              <w:rPr>
-                <w:rFonts w:ascii="Calibri" w:hAnsi="Calibri"/>
-                <w:sz w:val="20"/>
-              </w:rPr>
-              <w:t xml:space="default">41 (9.1%)</w:t>
-            </w:r>
-          </w:p>
-        </w:tc>
-        <w:tc>
-          <w:tcPr>
-            <w:tcBorders>
-              <w:top w:val="single" w:space="0" w:color="D3D3D3"/>
-              <w:bottom w:val="single" w:space="0" w:color="D3D3D3"/>
-              <w:start w:val="single" w:space="0" w:color="D3D3D3"/>
-              <w:end w:val="single" w:space="0" w:color="D3D3D3"/>
-            </w:tcBorders>
-          </w:tcPr>
-          <w:p>
-            <w:pPr>
-              <w:spacing w:before="0" w:after="60"/>
-              <w:keepNext/>
-              <w:jc w:val="start"/>
-            </w:pPr>
-            <w:r>
-              <w:rPr>
-                <w:rFonts w:ascii="Calibri" w:hAnsi="Calibri"/>
-                <w:sz w:val="20"/>
-              </w:rPr>
-              <w:t xml:space="default">72</w:t>
+              <w:t xml:space="default">29 (7.5%)</w:t>
+            </w:r>
+          </w:p>
+        </w:tc>
+        <w:tc>
+          <w:tcPr>
+            <w:tcBorders>
+              <w:top w:val="single" w:space="0" w:color="D3D3D3"/>
+              <w:bottom w:val="single" w:space="0" w:color="D3D3D3"/>
+              <w:start w:val="single" w:space="0" w:color="D3D3D3"/>
+              <w:end w:val="single" w:space="0" w:color="D3D3D3"/>
+            </w:tcBorders>
+          </w:tcPr>
+          <w:p>
+            <w:pPr>
+              <w:spacing w:before="0" w:after="60"/>
+              <w:keepNext/>
+              <w:jc w:val="start"/>
+            </w:pPr>
+            <w:r>
+              <w:rPr>
+                <w:rFonts w:ascii="Calibri" w:hAnsi="Calibri"/>
+                <w:sz w:val="20"/>
+              </w:rPr>
+              <w:t xml:space="default">44 (9.1%)</w:t>
+            </w:r>
+          </w:p>
+        </w:tc>
+        <w:tc>
+          <w:tcPr>
+            <w:tcBorders>
+              <w:top w:val="single" w:space="0" w:color="D3D3D3"/>
+              <w:bottom w:val="single" w:space="0" w:color="D3D3D3"/>
+              <w:start w:val="single" w:space="0" w:color="D3D3D3"/>
+              <w:end w:val="single" w:space="0" w:color="D3D3D3"/>
+            </w:tcBorders>
+          </w:tcPr>
+          <w:p>
+            <w:pPr>
+              <w:spacing w:before="0" w:after="60"/>
+              <w:keepNext/>
+              <w:jc w:val="start"/>
+            </w:pPr>
+            <w:r>
+              <w:rPr>
+                <w:rFonts w:ascii="Calibri" w:hAnsi="Calibri"/>
+                <w:sz w:val="20"/>
+              </w:rPr>
+              <w:t xml:space="default">73</w:t>
             </w:r>
           </w:p>
         </w:tc>
@@ -688,7 +688,7 @@
                 <w:rFonts w:ascii="Calibri" w:hAnsi="Calibri"/>
                 <w:sz w:val="20"/>
               </w:rPr>
-              <w:t xml:space="default">57.2%</w:t>
+              <w:t xml:space="default">60%</w:t>
             </w:r>
           </w:p>
         </w:tc>
@@ -741,55 +741,55 @@
                 <w:rFonts w:ascii="Calibri" w:hAnsi="Calibri"/>
                 <w:sz w:val="20"/>
               </w:rPr>
-              <w:t xml:space="default">75 (18.3%)</w:t>
-            </w:r>
-          </w:p>
-        </w:tc>
-        <w:tc>
-          <w:tcPr>
-            <w:tcBorders>
-              <w:top w:val="single" w:space="0" w:color="D3D3D3"/>
-              <w:bottom w:val="single" w:space="0" w:color="D3D3D3"/>
-              <w:start w:val="single" w:space="0" w:color="D3D3D3"/>
-              <w:end w:val="single" w:space="0" w:color="D3D3D3"/>
-            </w:tcBorders>
-          </w:tcPr>
-          <w:p>
-            <w:pPr>
-              <w:spacing w:before="0" w:after="60"/>
-              <w:keepNext/>
-              <w:jc w:val="start"/>
-            </w:pPr>
-            <w:r>
-              <w:rPr>
-                <w:rFonts w:ascii="Calibri" w:hAnsi="Calibri"/>
-                <w:sz w:val="20"/>
-              </w:rPr>
-              <w:t xml:space="default">62 (13.7%)</w:t>
-            </w:r>
-          </w:p>
-        </w:tc>
-        <w:tc>
-          <w:tcPr>
-            <w:tcBorders>
-              <w:top w:val="single" w:space="0" w:color="D3D3D3"/>
-              <w:bottom w:val="single" w:space="0" w:color="D3D3D3"/>
-              <w:start w:val="single" w:space="0" w:color="D3D3D3"/>
-              <w:end w:val="single" w:space="0" w:color="D3D3D3"/>
-            </w:tcBorders>
-          </w:tcPr>
-          <w:p>
-            <w:pPr>
-              <w:spacing w:before="0" w:after="60"/>
-              <w:keepNext/>
-              <w:jc w:val="start"/>
-            </w:pPr>
-            <w:r>
-              <w:rPr>
-                <w:rFonts w:ascii="Calibri" w:hAnsi="Calibri"/>
-                <w:sz w:val="20"/>
-              </w:rPr>
-              <w:t xml:space="default">136</w:t>
+              <w:t xml:space="default">73 (18.9%)</w:t>
+            </w:r>
+          </w:p>
+        </w:tc>
+        <w:tc>
+          <w:tcPr>
+            <w:tcBorders>
+              <w:top w:val="single" w:space="0" w:color="D3D3D3"/>
+              <w:bottom w:val="single" w:space="0" w:color="D3D3D3"/>
+              <w:start w:val="single" w:space="0" w:color="D3D3D3"/>
+              <w:end w:val="single" w:space="0" w:color="D3D3D3"/>
+            </w:tcBorders>
+          </w:tcPr>
+          <w:p>
+            <w:pPr>
+              <w:spacing w:before="0" w:after="60"/>
+              <w:keepNext/>
+              <w:jc w:val="start"/>
+            </w:pPr>
+            <w:r>
+              <w:rPr>
+                <w:rFonts w:ascii="Calibri" w:hAnsi="Calibri"/>
+                <w:sz w:val="20"/>
+              </w:rPr>
+              <w:t xml:space="default">69 (14.3%)</w:t>
+            </w:r>
+          </w:p>
+        </w:tc>
+        <w:tc>
+          <w:tcPr>
+            <w:tcBorders>
+              <w:top w:val="single" w:space="0" w:color="D3D3D3"/>
+              <w:bottom w:val="single" w:space="0" w:color="D3D3D3"/>
+              <w:start w:val="single" w:space="0" w:color="D3D3D3"/>
+              <w:end w:val="single" w:space="0" w:color="D3D3D3"/>
+            </w:tcBorders>
+          </w:tcPr>
+          <w:p>
+            <w:pPr>
+              <w:spacing w:before="0" w:after="60"/>
+              <w:keepNext/>
+              <w:jc w:val="start"/>
+            </w:pPr>
+            <w:r>
+              <w:rPr>
+                <w:rFonts w:ascii="Calibri" w:hAnsi="Calibri"/>
+                <w:sz w:val="20"/>
+              </w:rPr>
+              <w:t xml:space="default">142</w:t>
             </w:r>
           </w:p>
         </w:tc>
@@ -813,7 +813,7 @@
                 <w:rFonts w:ascii="Calibri" w:hAnsi="Calibri"/>
                 <w:sz w:val="20"/>
               </w:rPr>
-              <w:t xml:space="default">45.3%</w:t>
+              <w:t xml:space="default">48.3%</w:t>
             </w:r>
           </w:p>
         </w:tc>
@@ -866,55 +866,55 @@
                 <w:rFonts w:ascii="Calibri" w:hAnsi="Calibri"/>
                 <w:sz w:val="20"/>
               </w:rPr>
-              <w:t xml:space="default">81 (19.9%)</w:t>
-            </w:r>
-          </w:p>
-        </w:tc>
-        <w:tc>
-          <w:tcPr>
-            <w:tcBorders>
-              <w:top w:val="single" w:space="0" w:color="D3D3D3"/>
-              <w:bottom w:val="single" w:space="0" w:color="D3D3D3"/>
-              <w:start w:val="single" w:space="0" w:color="D3D3D3"/>
-              <w:end w:val="single" w:space="0" w:color="D3D3D3"/>
-            </w:tcBorders>
-          </w:tcPr>
-          <w:p>
-            <w:pPr>
-              <w:spacing w:before="0" w:after="60"/>
-              <w:keepNext/>
-              <w:jc w:val="start"/>
-            </w:pPr>
-            <w:r>
-              <w:rPr>
-                <w:rFonts w:ascii="Calibri" w:hAnsi="Calibri"/>
-                <w:sz w:val="20"/>
-              </w:rPr>
-              <w:t xml:space="default">67 (14.9%)</w:t>
-            </w:r>
-          </w:p>
-        </w:tc>
-        <w:tc>
-          <w:tcPr>
-            <w:tcBorders>
-              <w:top w:val="single" w:space="0" w:color="D3D3D3"/>
-              <w:bottom w:val="single" w:space="0" w:color="D3D3D3"/>
-              <w:start w:val="single" w:space="0" w:color="D3D3D3"/>
-              <w:end w:val="single" w:space="0" w:color="D3D3D3"/>
-            </w:tcBorders>
-          </w:tcPr>
-          <w:p>
-            <w:pPr>
-              <w:spacing w:before="0" w:after="60"/>
-              <w:keepNext/>
-              <w:jc w:val="start"/>
-            </w:pPr>
-            <w:r>
-              <w:rPr>
-                <w:rFonts w:ascii="Calibri" w:hAnsi="Calibri"/>
-                <w:sz w:val="20"/>
-              </w:rPr>
-              <w:t xml:space="default">148</w:t>
+              <w:t xml:space="default">80 (20.6%)</w:t>
+            </w:r>
+          </w:p>
+        </w:tc>
+        <w:tc>
+          <w:tcPr>
+            <w:tcBorders>
+              <w:top w:val="single" w:space="0" w:color="D3D3D3"/>
+              <w:bottom w:val="single" w:space="0" w:color="D3D3D3"/>
+              <w:start w:val="single" w:space="0" w:color="D3D3D3"/>
+              <w:end w:val="single" w:space="0" w:color="D3D3D3"/>
+            </w:tcBorders>
+          </w:tcPr>
+          <w:p>
+            <w:pPr>
+              <w:spacing w:before="0" w:after="60"/>
+              <w:keepNext/>
+              <w:jc w:val="start"/>
+            </w:pPr>
+            <w:r>
+              <w:rPr>
+                <w:rFonts w:ascii="Calibri" w:hAnsi="Calibri"/>
+                <w:sz w:val="20"/>
+              </w:rPr>
+              <w:t xml:space="default">70 (14.5%)</w:t>
+            </w:r>
+          </w:p>
+        </w:tc>
+        <w:tc>
+          <w:tcPr>
+            <w:tcBorders>
+              <w:top w:val="single" w:space="0" w:color="D3D3D3"/>
+              <w:bottom w:val="single" w:space="0" w:color="D3D3D3"/>
+              <w:start w:val="single" w:space="0" w:color="D3D3D3"/>
+              <w:end w:val="single" w:space="0" w:color="D3D3D3"/>
+            </w:tcBorders>
+          </w:tcPr>
+          <w:p>
+            <w:pPr>
+              <w:spacing w:before="0" w:after="60"/>
+              <w:keepNext/>
+              <w:jc w:val="start"/>
+            </w:pPr>
+            <w:r>
+              <w:rPr>
+                <w:rFonts w:ascii="Calibri" w:hAnsi="Calibri"/>
+                <w:sz w:val="20"/>
+              </w:rPr>
+              <w:t xml:space="default">150</w:t>
             </w:r>
           </w:p>
         </w:tc>
@@ -938,7 +938,7 @@
                 <w:rFonts w:ascii="Calibri" w:hAnsi="Calibri"/>
                 <w:sz w:val="20"/>
               </w:rPr>
-              <w:t xml:space="default">45.3%</w:t>
+              <w:t xml:space="default">46.4%</w:t>
             </w:r>
           </w:p>
         </w:tc>
@@ -991,31 +991,31 @@
                 <w:rFonts w:ascii="Calibri" w:hAnsi="Calibri"/>
                 <w:sz w:val="20"/>
               </w:rPr>
-              <w:t xml:space="default">68 (16.7%)</w:t>
-            </w:r>
-          </w:p>
-        </w:tc>
-        <w:tc>
-          <w:tcPr>
-            <w:tcBorders>
-              <w:top w:val="single" w:space="0" w:color="D3D3D3"/>
-              <w:bottom w:val="single" w:space="0" w:color="D3D3D3"/>
-              <w:start w:val="single" w:space="0" w:color="D3D3D3"/>
-              <w:end w:val="single" w:space="0" w:color="D3D3D3"/>
-            </w:tcBorders>
-          </w:tcPr>
-          <w:p>
-            <w:pPr>
-              <w:spacing w:before="0" w:after="60"/>
-              <w:keepNext/>
-              <w:jc w:val="start"/>
-            </w:pPr>
-            <w:r>
-              <w:rPr>
-                <w:rFonts w:ascii="Calibri" w:hAnsi="Calibri"/>
-                <w:sz w:val="20"/>
-              </w:rPr>
-              <w:t xml:space="default">66 (14.6%)</w:t>
+              <w:t xml:space="default">67 (17.1%)</w:t>
+            </w:r>
+          </w:p>
+        </w:tc>
+        <w:tc>
+          <w:tcPr>
+            <w:tcBorders>
+              <w:top w:val="single" w:space="0" w:color="D3D3D3"/>
+              <w:bottom w:val="single" w:space="0" w:color="D3D3D3"/>
+              <w:start w:val="single" w:space="0" w:color="D3D3D3"/>
+              <w:end w:val="single" w:space="0" w:color="D3D3D3"/>
+            </w:tcBorders>
+          </w:tcPr>
+          <w:p>
+            <w:pPr>
+              <w:spacing w:before="0" w:after="60"/>
+              <w:keepNext/>
+              <w:jc w:val="start"/>
+            </w:pPr>
+            <w:r>
+              <w:rPr>
+                <w:rFonts w:ascii="Calibri" w:hAnsi="Calibri"/>
+                <w:sz w:val="20"/>
+              </w:rPr>
+              <w:t xml:space="default">67 (14%)</w:t>
             </w:r>
           </w:p>
         </w:tc>
@@ -1063,7 +1063,7 @@
                 <w:rFonts w:ascii="Calibri" w:hAnsi="Calibri"/>
                 <w:sz w:val="20"/>
               </w:rPr>
-              <w:t xml:space="default">49.2%</w:t>
+              <w:t xml:space="default">50.1%</w:t>
             </w:r>
           </w:p>
         </w:tc>
@@ -1116,31 +1116,31 @@
                 <w:rFonts w:ascii="Calibri" w:hAnsi="Calibri"/>
                 <w:sz w:val="20"/>
               </w:rPr>
-              <w:t xml:space="default">59 (14.6%)</w:t>
-            </w:r>
-          </w:p>
-        </w:tc>
-        <w:tc>
-          <w:tcPr>
-            <w:tcBorders>
-              <w:top w:val="single" w:space="0" w:color="D3D3D3"/>
-              <w:bottom w:val="single" w:space="0" w:color="D3D3D3"/>
-              <w:start w:val="single" w:space="0" w:color="D3D3D3"/>
-              <w:end w:val="single" w:space="0" w:color="D3D3D3"/>
-            </w:tcBorders>
-          </w:tcPr>
-          <w:p>
-            <w:pPr>
-              <w:spacing w:before="0" w:after="60"/>
-              <w:keepNext/>
-              <w:jc w:val="start"/>
-            </w:pPr>
-            <w:r>
-              <w:rPr>
-                <w:rFonts w:ascii="Calibri" w:hAnsi="Calibri"/>
-                <w:sz w:val="20"/>
-              </w:rPr>
-              <w:t xml:space="default">69 (15.4%)</w:t>
+              <w:t xml:space="default">56 (14.5%)</w:t>
+            </w:r>
+          </w:p>
+        </w:tc>
+        <w:tc>
+          <w:tcPr>
+            <w:tcBorders>
+              <w:top w:val="single" w:space="0" w:color="D3D3D3"/>
+              <w:bottom w:val="single" w:space="0" w:color="D3D3D3"/>
+              <w:start w:val="single" w:space="0" w:color="D3D3D3"/>
+              <w:end w:val="single" w:space="0" w:color="D3D3D3"/>
+            </w:tcBorders>
+          </w:tcPr>
+          <w:p>
+            <w:pPr>
+              <w:spacing w:before="0" w:after="60"/>
+              <w:keepNext/>
+              <w:jc w:val="start"/>
+            </w:pPr>
+            <w:r>
+              <w:rPr>
+                <w:rFonts w:ascii="Calibri" w:hAnsi="Calibri"/>
+                <w:sz w:val="20"/>
+              </w:rPr>
+              <w:t xml:space="default">72 (15.1%)</w:t>
             </w:r>
           </w:p>
         </w:tc>
@@ -1188,7 +1188,7 @@
                 <w:rFonts w:ascii="Calibri" w:hAnsi="Calibri"/>
                 <w:sz w:val="20"/>
               </w:rPr>
-              <w:t xml:space="default">53.8%</w:t>
+              <w:t xml:space="default">56.2%</w:t>
             </w:r>
           </w:p>
         </w:tc>
@@ -1241,31 +1241,31 @@
                 <w:rFonts w:ascii="Calibri" w:hAnsi="Calibri"/>
                 <w:sz w:val="20"/>
               </w:rPr>
-              <w:t xml:space="default">49 (12%)</w:t>
-            </w:r>
-          </w:p>
-        </w:tc>
-        <w:tc>
-          <w:tcPr>
-            <w:tcBorders>
-              <w:top w:val="single" w:space="0" w:color="D3D3D3"/>
-              <w:bottom w:val="single" w:space="0" w:color="D3D3D3"/>
-              <w:start w:val="single" w:space="0" w:color="D3D3D3"/>
-              <w:end w:val="single" w:space="0" w:color="D3D3D3"/>
-            </w:tcBorders>
-          </w:tcPr>
-          <w:p>
-            <w:pPr>
-              <w:spacing w:before="0" w:after="60"/>
-              <w:keepNext/>
-              <w:jc w:val="start"/>
-            </w:pPr>
-            <w:r>
-              <w:rPr>
-                <w:rFonts w:ascii="Calibri" w:hAnsi="Calibri"/>
-                <w:sz w:val="20"/>
-              </w:rPr>
-              <w:t xml:space="default">58 (12.8%)</w:t>
+              <w:t xml:space="default">41 (10.5%)</w:t>
+            </w:r>
+          </w:p>
+        </w:tc>
+        <w:tc>
+          <w:tcPr>
+            <w:tcBorders>
+              <w:top w:val="single" w:space="0" w:color="D3D3D3"/>
+              <w:bottom w:val="single" w:space="0" w:color="D3D3D3"/>
+              <w:start w:val="single" w:space="0" w:color="D3D3D3"/>
+              <w:end w:val="single" w:space="0" w:color="D3D3D3"/>
+            </w:tcBorders>
+          </w:tcPr>
+          <w:p>
+            <w:pPr>
+              <w:spacing w:before="0" w:after="60"/>
+              <w:keepNext/>
+              <w:jc w:val="start"/>
+            </w:pPr>
+            <w:r>
+              <w:rPr>
+                <w:rFonts w:ascii="Calibri" w:hAnsi="Calibri"/>
+                <w:sz w:val="20"/>
+              </w:rPr>
+              <w:t xml:space="default">66 (13.7%)</w:t>
             </w:r>
           </w:p>
         </w:tc>
@@ -1313,7 +1313,7 @@
                 <w:rFonts w:ascii="Calibri" w:hAnsi="Calibri"/>
                 <w:sz w:val="20"/>
               </w:rPr>
-              <w:t xml:space="default">54.2%</w:t>
+              <w:t xml:space="default">61.7%</w:t>
             </w:r>
           </w:p>
         </w:tc>
@@ -1368,7 +1368,7 @@
                 <w:sz w:val="20"/>
                 <w:b w:val="true"/>
               </w:rPr>
-              <w:t xml:space="default">42.4 ± 16.5</w:t>
+              <w:t xml:space="default">42.5 ± 16.6</w:t>
             </w:r>
           </w:p>
         </w:tc>
@@ -1626,55 +1626,55 @@
                 <w:rFonts w:ascii="Calibri" w:hAnsi="Calibri"/>
                 <w:sz w:val="20"/>
               </w:rPr>
-              <w:t xml:space="default">258 (63.3%)</w:t>
-            </w:r>
-          </w:p>
-        </w:tc>
-        <w:tc>
-          <w:tcPr>
-            <w:tcBorders>
-              <w:top w:val="single" w:space="0" w:color="D3D3D3"/>
-              <w:bottom w:val="single" w:space="0" w:color="D3D3D3"/>
-              <w:start w:val="single" w:space="0" w:color="D3D3D3"/>
-              <w:end w:val="single" w:space="0" w:color="D3D3D3"/>
-            </w:tcBorders>
-          </w:tcPr>
-          <w:p>
-            <w:pPr>
-              <w:spacing w:before="0" w:after="60"/>
-              <w:keepNext/>
-              <w:jc w:val="start"/>
-            </w:pPr>
-            <w:r>
-              <w:rPr>
-                <w:rFonts w:ascii="Calibri" w:hAnsi="Calibri"/>
-                <w:sz w:val="20"/>
-              </w:rPr>
-              <w:t xml:space="default">284 (62.9%)</w:t>
-            </w:r>
-          </w:p>
-        </w:tc>
-        <w:tc>
-          <w:tcPr>
-            <w:tcBorders>
-              <w:top w:val="single" w:space="0" w:color="D3D3D3"/>
-              <w:bottom w:val="single" w:space="0" w:color="D3D3D3"/>
-              <w:start w:val="single" w:space="0" w:color="D3D3D3"/>
-              <w:end w:val="single" w:space="0" w:color="D3D3D3"/>
-            </w:tcBorders>
-          </w:tcPr>
-          <w:p>
-            <w:pPr>
-              <w:spacing w:before="0" w:after="60"/>
-              <w:keepNext/>
-              <w:jc w:val="start"/>
-            </w:pPr>
-            <w:r>
-              <w:rPr>
-                <w:rFonts w:ascii="Calibri" w:hAnsi="Calibri"/>
-                <w:sz w:val="20"/>
-              </w:rPr>
-              <w:t xml:space="default">542 (63.1%)</w:t>
+              <w:t xml:space="default">245 (63%)</w:t>
+            </w:r>
+          </w:p>
+        </w:tc>
+        <w:tc>
+          <w:tcPr>
+            <w:tcBorders>
+              <w:top w:val="single" w:space="0" w:color="D3D3D3"/>
+              <w:bottom w:val="single" w:space="0" w:color="D3D3D3"/>
+              <w:start w:val="single" w:space="0" w:color="D3D3D3"/>
+              <w:end w:val="single" w:space="0" w:color="D3D3D3"/>
+            </w:tcBorders>
+          </w:tcPr>
+          <w:p>
+            <w:pPr>
+              <w:spacing w:before="0" w:after="60"/>
+              <w:keepNext/>
+              <w:jc w:val="start"/>
+            </w:pPr>
+            <w:r>
+              <w:rPr>
+                <w:rFonts w:ascii="Calibri" w:hAnsi="Calibri"/>
+                <w:sz w:val="20"/>
+              </w:rPr>
+              <w:t xml:space="default">302 (62.9%)</w:t>
+            </w:r>
+          </w:p>
+        </w:tc>
+        <w:tc>
+          <w:tcPr>
+            <w:tcBorders>
+              <w:top w:val="single" w:space="0" w:color="D3D3D3"/>
+              <w:bottom w:val="single" w:space="0" w:color="D3D3D3"/>
+              <w:start w:val="single" w:space="0" w:color="D3D3D3"/>
+              <w:end w:val="single" w:space="0" w:color="D3D3D3"/>
+            </w:tcBorders>
+          </w:tcPr>
+          <w:p>
+            <w:pPr>
+              <w:spacing w:before="0" w:after="60"/>
+              <w:keepNext/>
+              <w:jc w:val="start"/>
+            </w:pPr>
+            <w:r>
+              <w:rPr>
+                <w:rFonts w:ascii="Calibri" w:hAnsi="Calibri"/>
+                <w:sz w:val="20"/>
+              </w:rPr>
+              <w:t xml:space="default">547 (63%)</w:t>
             </w:r>
           </w:p>
         </w:tc>
@@ -1698,7 +1698,7 @@
                 <w:rFonts w:ascii="Calibri" w:hAnsi="Calibri"/>
                 <w:sz w:val="20"/>
               </w:rPr>
-              <w:t xml:space="default">52.4%</w:t>
+              <w:t xml:space="default">55.1%</w:t>
             </w:r>
           </w:p>
         </w:tc>
@@ -1751,55 +1751,55 @@
                 <w:rFonts w:ascii="Calibri" w:hAnsi="Calibri"/>
                 <w:sz w:val="20"/>
               </w:rPr>
-              <w:t xml:space="default">150 (36.7%)</w:t>
-            </w:r>
-          </w:p>
-        </w:tc>
-        <w:tc>
-          <w:tcPr>
-            <w:tcBorders>
-              <w:top w:val="single" w:space="0" w:color="D3D3D3"/>
-              <w:bottom w:val="single" w:space="0" w:color="D3D3D3"/>
-              <w:start w:val="single" w:space="0" w:color="D3D3D3"/>
-              <w:end w:val="single" w:space="0" w:color="D3D3D3"/>
-            </w:tcBorders>
-          </w:tcPr>
-          <w:p>
-            <w:pPr>
-              <w:spacing w:before="0" w:after="60"/>
-              <w:keepNext/>
-              <w:jc w:val="start"/>
-            </w:pPr>
-            <w:r>
-              <w:rPr>
-                <w:rFonts w:ascii="Calibri" w:hAnsi="Calibri"/>
-                <w:sz w:val="20"/>
-              </w:rPr>
-              <w:t xml:space="default">167 (37.1%)</w:t>
-            </w:r>
-          </w:p>
-        </w:tc>
-        <w:tc>
-          <w:tcPr>
-            <w:tcBorders>
-              <w:top w:val="single" w:space="0" w:color="D3D3D3"/>
-              <w:bottom w:val="single" w:space="0" w:color="D3D3D3"/>
-              <w:start w:val="single" w:space="0" w:color="D3D3D3"/>
-              <w:end w:val="single" w:space="0" w:color="D3D3D3"/>
-            </w:tcBorders>
-          </w:tcPr>
-          <w:p>
-            <w:pPr>
-              <w:spacing w:before="0" w:after="60"/>
-              <w:keepNext/>
-              <w:jc w:val="start"/>
-            </w:pPr>
-            <w:r>
-              <w:rPr>
-                <w:rFonts w:ascii="Calibri" w:hAnsi="Calibri"/>
-                <w:sz w:val="20"/>
-              </w:rPr>
-              <w:t xml:space="default">317 (36.9%)</w:t>
+              <w:t xml:space="default">144 (37%)</w:t>
+            </w:r>
+          </w:p>
+        </w:tc>
+        <w:tc>
+          <w:tcPr>
+            <w:tcBorders>
+              <w:top w:val="single" w:space="0" w:color="D3D3D3"/>
+              <w:bottom w:val="single" w:space="0" w:color="D3D3D3"/>
+              <w:start w:val="single" w:space="0" w:color="D3D3D3"/>
+              <w:end w:val="single" w:space="0" w:color="D3D3D3"/>
+            </w:tcBorders>
+          </w:tcPr>
+          <w:p>
+            <w:pPr>
+              <w:spacing w:before="0" w:after="60"/>
+              <w:keepNext/>
+              <w:jc w:val="start"/>
+            </w:pPr>
+            <w:r>
+              <w:rPr>
+                <w:rFonts w:ascii="Calibri" w:hAnsi="Calibri"/>
+                <w:sz w:val="20"/>
+              </w:rPr>
+              <w:t xml:space="default">178 (37.1%)</w:t>
+            </w:r>
+          </w:p>
+        </w:tc>
+        <w:tc>
+          <w:tcPr>
+            <w:tcBorders>
+              <w:top w:val="single" w:space="0" w:color="D3D3D3"/>
+              <w:bottom w:val="single" w:space="0" w:color="D3D3D3"/>
+              <w:start w:val="single" w:space="0" w:color="D3D3D3"/>
+              <w:end w:val="single" w:space="0" w:color="D3D3D3"/>
+            </w:tcBorders>
+          </w:tcPr>
+          <w:p>
+            <w:pPr>
+              <w:spacing w:before="0" w:after="60"/>
+              <w:keepNext/>
+              <w:jc w:val="start"/>
+            </w:pPr>
+            <w:r>
+              <w:rPr>
+                <w:rFonts w:ascii="Calibri" w:hAnsi="Calibri"/>
+                <w:sz w:val="20"/>
+              </w:rPr>
+              <w:t xml:space="default">322 (37%)</w:t>
             </w:r>
           </w:p>
         </w:tc>
@@ -1823,7 +1823,7 @@
                 <w:rFonts w:ascii="Calibri" w:hAnsi="Calibri"/>
                 <w:sz w:val="20"/>
               </w:rPr>
-              <w:t xml:space="default">52.8%</w:t>
+              <w:t xml:space="default">55.2%</w:t>
             </w:r>
           </w:p>
         </w:tc>
@@ -2006,55 +2006,55 @@
                 <w:rFonts w:ascii="Calibri" w:hAnsi="Calibri"/>
                 <w:sz w:val="20"/>
               </w:rPr>
-              <w:t xml:space="default">144 (35.3%)</w:t>
-            </w:r>
-          </w:p>
-        </w:tc>
-        <w:tc>
-          <w:tcPr>
-            <w:tcBorders>
-              <w:top w:val="single" w:space="0" w:color="D3D3D3"/>
-              <w:bottom w:val="single" w:space="0" w:color="D3D3D3"/>
-              <w:start w:val="single" w:space="0" w:color="D3D3D3"/>
-              <w:end w:val="single" w:space="0" w:color="D3D3D3"/>
-            </w:tcBorders>
-          </w:tcPr>
-          <w:p>
-            <w:pPr>
-              <w:spacing w:before="0" w:after="60"/>
-              <w:keepNext/>
-              <w:jc w:val="start"/>
-            </w:pPr>
-            <w:r>
-              <w:rPr>
-                <w:rFonts w:ascii="Calibri" w:hAnsi="Calibri"/>
-                <w:sz w:val="20"/>
-              </w:rPr>
-              <w:t xml:space="default">130 (28.9%)</w:t>
-            </w:r>
-          </w:p>
-        </w:tc>
-        <w:tc>
-          <w:tcPr>
-            <w:tcBorders>
-              <w:top w:val="single" w:space="0" w:color="D3D3D3"/>
-              <w:bottom w:val="single" w:space="0" w:color="D3D3D3"/>
-              <w:start w:val="single" w:space="0" w:color="D3D3D3"/>
-              <w:end w:val="single" w:space="0" w:color="D3D3D3"/>
-            </w:tcBorders>
-          </w:tcPr>
-          <w:p>
-            <w:pPr>
-              <w:spacing w:before="0" w:after="60"/>
-              <w:keepNext/>
-              <w:jc w:val="start"/>
-            </w:pPr>
-            <w:r>
-              <w:rPr>
-                <w:rFonts w:ascii="Calibri" w:hAnsi="Calibri"/>
-                <w:sz w:val="20"/>
-              </w:rPr>
-              <w:t xml:space="default">274 (31.9%)</w:t>
+              <w:t xml:space="default">140 (35.8%)</w:t>
+            </w:r>
+          </w:p>
+        </w:tc>
+        <w:tc>
+          <w:tcPr>
+            <w:tcBorders>
+              <w:top w:val="single" w:space="0" w:color="D3D3D3"/>
+              <w:bottom w:val="single" w:space="0" w:color="D3D3D3"/>
+              <w:start w:val="single" w:space="0" w:color="D3D3D3"/>
+              <w:end w:val="single" w:space="0" w:color="D3D3D3"/>
+            </w:tcBorders>
+          </w:tcPr>
+          <w:p>
+            <w:pPr>
+              <w:spacing w:before="0" w:after="60"/>
+              <w:keepNext/>
+              <w:jc w:val="start"/>
+            </w:pPr>
+            <w:r>
+              <w:rPr>
+                <w:rFonts w:ascii="Calibri" w:hAnsi="Calibri"/>
+                <w:sz w:val="20"/>
+              </w:rPr>
+              <w:t xml:space="default">139 (28.9%)</w:t>
+            </w:r>
+          </w:p>
+        </w:tc>
+        <w:tc>
+          <w:tcPr>
+            <w:tcBorders>
+              <w:top w:val="single" w:space="0" w:color="D3D3D3"/>
+              <w:bottom w:val="single" w:space="0" w:color="D3D3D3"/>
+              <w:start w:val="single" w:space="0" w:color="D3D3D3"/>
+              <w:end w:val="single" w:space="0" w:color="D3D3D3"/>
+            </w:tcBorders>
+          </w:tcPr>
+          <w:p>
+            <w:pPr>
+              <w:spacing w:before="0" w:after="60"/>
+              <w:keepNext/>
+              <w:jc w:val="start"/>
+            </w:pPr>
+            <w:r>
+              <w:rPr>
+                <w:rFonts w:ascii="Calibri" w:hAnsi="Calibri"/>
+                <w:sz w:val="20"/>
+              </w:rPr>
+              <w:t xml:space="default">278 (32%)</w:t>
             </w:r>
           </w:p>
         </w:tc>
@@ -2078,7 +2078,7 @@
                 <w:rFonts w:ascii="Calibri" w:hAnsi="Calibri"/>
                 <w:sz w:val="20"/>
               </w:rPr>
-              <w:t xml:space="default">47.5%</w:t>
+              <w:t xml:space="default">49.8%</w:t>
             </w:r>
           </w:p>
         </w:tc>
@@ -2131,55 +2131,55 @@
                 <w:rFonts w:ascii="Calibri" w:hAnsi="Calibri"/>
                 <w:sz w:val="20"/>
               </w:rPr>
-              <w:t xml:space="default">61 (15%)</w:t>
-            </w:r>
-          </w:p>
-        </w:tc>
-        <w:tc>
-          <w:tcPr>
-            <w:tcBorders>
-              <w:top w:val="single" w:space="0" w:color="D3D3D3"/>
-              <w:bottom w:val="single" w:space="0" w:color="D3D3D3"/>
-              <w:start w:val="single" w:space="0" w:color="D3D3D3"/>
-              <w:end w:val="single" w:space="0" w:color="D3D3D3"/>
-            </w:tcBorders>
-          </w:tcPr>
-          <w:p>
-            <w:pPr>
-              <w:spacing w:before="0" w:after="60"/>
-              <w:keepNext/>
-              <w:jc w:val="start"/>
-            </w:pPr>
-            <w:r>
-              <w:rPr>
-                <w:rFonts w:ascii="Calibri" w:hAnsi="Calibri"/>
-                <w:sz w:val="20"/>
-              </w:rPr>
-              <w:t xml:space="default">68 (15%)</w:t>
-            </w:r>
-          </w:p>
-        </w:tc>
-        <w:tc>
-          <w:tcPr>
-            <w:tcBorders>
-              <w:top w:val="single" w:space="0" w:color="D3D3D3"/>
-              <w:bottom w:val="single" w:space="0" w:color="D3D3D3"/>
-              <w:start w:val="single" w:space="0" w:color="D3D3D3"/>
-              <w:end w:val="single" w:space="0" w:color="D3D3D3"/>
-            </w:tcBorders>
-          </w:tcPr>
-          <w:p>
-            <w:pPr>
-              <w:spacing w:before="0" w:after="60"/>
-              <w:keepNext/>
-              <w:jc w:val="start"/>
-            </w:pPr>
-            <w:r>
-              <w:rPr>
-                <w:rFonts w:ascii="Calibri" w:hAnsi="Calibri"/>
-                <w:sz w:val="20"/>
-              </w:rPr>
-              <w:t xml:space="default">129 (15%)</w:t>
+              <w:t xml:space="default">54 (13.9%)</w:t>
+            </w:r>
+          </w:p>
+        </w:tc>
+        <w:tc>
+          <w:tcPr>
+            <w:tcBorders>
+              <w:top w:val="single" w:space="0" w:color="D3D3D3"/>
+              <w:bottom w:val="single" w:space="0" w:color="D3D3D3"/>
+              <w:start w:val="single" w:space="0" w:color="D3D3D3"/>
+              <w:end w:val="single" w:space="0" w:color="D3D3D3"/>
+            </w:tcBorders>
+          </w:tcPr>
+          <w:p>
+            <w:pPr>
+              <w:spacing w:before="0" w:after="60"/>
+              <w:keepNext/>
+              <w:jc w:val="start"/>
+            </w:pPr>
+            <w:r>
+              <w:rPr>
+                <w:rFonts w:ascii="Calibri" w:hAnsi="Calibri"/>
+                <w:sz w:val="20"/>
+              </w:rPr>
+              <w:t xml:space="default">77 (16.1%)</w:t>
+            </w:r>
+          </w:p>
+        </w:tc>
+        <w:tc>
+          <w:tcPr>
+            <w:tcBorders>
+              <w:top w:val="single" w:space="0" w:color="D3D3D3"/>
+              <w:bottom w:val="single" w:space="0" w:color="D3D3D3"/>
+              <w:start w:val="single" w:space="0" w:color="D3D3D3"/>
+              <w:end w:val="single" w:space="0" w:color="D3D3D3"/>
+            </w:tcBorders>
+          </w:tcPr>
+          <w:p>
+            <w:pPr>
+              <w:spacing w:before="0" w:after="60"/>
+              <w:keepNext/>
+              <w:jc w:val="start"/>
+            </w:pPr>
+            <w:r>
+              <w:rPr>
+                <w:rFonts w:ascii="Calibri" w:hAnsi="Calibri"/>
+                <w:sz w:val="20"/>
+              </w:rPr>
+              <w:t xml:space="default">131 (15.1%)</w:t>
             </w:r>
           </w:p>
         </w:tc>
@@ -2203,7 +2203,7 @@
                 <w:rFonts w:ascii="Calibri" w:hAnsi="Calibri"/>
                 <w:sz w:val="20"/>
               </w:rPr>
-              <w:t xml:space="default">52.6%</w:t>
+              <w:t xml:space="default">58.7%</w:t>
             </w:r>
           </w:p>
         </w:tc>
@@ -2256,55 +2256,55 @@
                 <w:rFonts w:ascii="Calibri" w:hAnsi="Calibri"/>
                 <w:sz w:val="20"/>
               </w:rPr>
-              <w:t xml:space="default">58 (14.3%)</w:t>
-            </w:r>
-          </w:p>
-        </w:tc>
-        <w:tc>
-          <w:tcPr>
-            <w:tcBorders>
-              <w:top w:val="single" w:space="0" w:color="D3D3D3"/>
-              <w:bottom w:val="single" w:space="0" w:color="D3D3D3"/>
-              <w:start w:val="single" w:space="0" w:color="D3D3D3"/>
-              <w:end w:val="single" w:space="0" w:color="D3D3D3"/>
-            </w:tcBorders>
-          </w:tcPr>
-          <w:p>
-            <w:pPr>
-              <w:spacing w:before="0" w:after="60"/>
-              <w:keepNext/>
-              <w:jc w:val="start"/>
-            </w:pPr>
-            <w:r>
-              <w:rPr>
-                <w:rFonts w:ascii="Calibri" w:hAnsi="Calibri"/>
-                <w:sz w:val="20"/>
-              </w:rPr>
-              <w:t xml:space="default">57 (12.6%)</w:t>
-            </w:r>
-          </w:p>
-        </w:tc>
-        <w:tc>
-          <w:tcPr>
-            <w:tcBorders>
-              <w:top w:val="single" w:space="0" w:color="D3D3D3"/>
-              <w:bottom w:val="single" w:space="0" w:color="D3D3D3"/>
-              <w:start w:val="single" w:space="0" w:color="D3D3D3"/>
-              <w:end w:val="single" w:space="0" w:color="D3D3D3"/>
-            </w:tcBorders>
-          </w:tcPr>
-          <w:p>
-            <w:pPr>
-              <w:spacing w:before="0" w:after="60"/>
-              <w:keepNext/>
-              <w:jc w:val="start"/>
-            </w:pPr>
-            <w:r>
-              <w:rPr>
-                <w:rFonts w:ascii="Calibri" w:hAnsi="Calibri"/>
-                <w:sz w:val="20"/>
-              </w:rPr>
-              <w:t xml:space="default">115 (13.4%)</w:t>
+              <w:t xml:space="default">56 (14.3%)</w:t>
+            </w:r>
+          </w:p>
+        </w:tc>
+        <w:tc>
+          <w:tcPr>
+            <w:tcBorders>
+              <w:top w:val="single" w:space="0" w:color="D3D3D3"/>
+              <w:bottom w:val="single" w:space="0" w:color="D3D3D3"/>
+              <w:start w:val="single" w:space="0" w:color="D3D3D3"/>
+              <w:end w:val="single" w:space="0" w:color="D3D3D3"/>
+            </w:tcBorders>
+          </w:tcPr>
+          <w:p>
+            <w:pPr>
+              <w:spacing w:before="0" w:after="60"/>
+              <w:keepNext/>
+              <w:jc w:val="start"/>
+            </w:pPr>
+            <w:r>
+              <w:rPr>
+                <w:rFonts w:ascii="Calibri" w:hAnsi="Calibri"/>
+                <w:sz w:val="20"/>
+              </w:rPr>
+              <w:t xml:space="default">60 (12.6%)</w:t>
+            </w:r>
+          </w:p>
+        </w:tc>
+        <w:tc>
+          <w:tcPr>
+            <w:tcBorders>
+              <w:top w:val="single" w:space="0" w:color="D3D3D3"/>
+              <w:bottom w:val="single" w:space="0" w:color="D3D3D3"/>
+              <w:start w:val="single" w:space="0" w:color="D3D3D3"/>
+              <w:end w:val="single" w:space="0" w:color="D3D3D3"/>
+            </w:tcBorders>
+          </w:tcPr>
+          <w:p>
+            <w:pPr>
+              <w:spacing w:before="0" w:after="60"/>
+              <w:keepNext/>
+              <w:jc w:val="start"/>
+            </w:pPr>
+            <w:r>
+              <w:rPr>
+                <w:rFonts w:ascii="Calibri" w:hAnsi="Calibri"/>
+                <w:sz w:val="20"/>
+              </w:rPr>
+              <w:t xml:space="default">116 (13.4%)</w:t>
             </w:r>
           </w:p>
         </w:tc>
@@ -2328,7 +2328,7 @@
                 <w:rFonts w:ascii="Calibri" w:hAnsi="Calibri"/>
                 <w:sz w:val="20"/>
               </w:rPr>
-              <w:t xml:space="default">49.3%</w:t>
+              <w:t xml:space="default">52.1%</w:t>
             </w:r>
           </w:p>
         </w:tc>
@@ -2381,55 +2381,55 @@
                 <w:rFonts w:ascii="Calibri" w:hAnsi="Calibri"/>
                 <w:sz w:val="20"/>
               </w:rPr>
-              <w:t xml:space="default">42 (10.4%)</w:t>
-            </w:r>
-          </w:p>
-        </w:tc>
-        <w:tc>
-          <w:tcPr>
-            <w:tcBorders>
-              <w:top w:val="single" w:space="0" w:color="D3D3D3"/>
-              <w:bottom w:val="single" w:space="0" w:color="D3D3D3"/>
-              <w:start w:val="single" w:space="0" w:color="D3D3D3"/>
-              <w:end w:val="single" w:space="0" w:color="D3D3D3"/>
-            </w:tcBorders>
-          </w:tcPr>
-          <w:p>
-            <w:pPr>
-              <w:spacing w:before="0" w:after="60"/>
-              <w:keepNext/>
-              <w:jc w:val="start"/>
-            </w:pPr>
-            <w:r>
-              <w:rPr>
-                <w:rFonts w:ascii="Calibri" w:hAnsi="Calibri"/>
-                <w:sz w:val="20"/>
-              </w:rPr>
-              <w:t xml:space="default">37 (8.2%)</w:t>
-            </w:r>
-          </w:p>
-        </w:tc>
-        <w:tc>
-          <w:tcPr>
-            <w:tcBorders>
-              <w:top w:val="single" w:space="0" w:color="D3D3D3"/>
-              <w:bottom w:val="single" w:space="0" w:color="D3D3D3"/>
-              <w:start w:val="single" w:space="0" w:color="D3D3D3"/>
-              <w:end w:val="single" w:space="0" w:color="D3D3D3"/>
-            </w:tcBorders>
-          </w:tcPr>
-          <w:p>
-            <w:pPr>
-              <w:spacing w:before="0" w:after="60"/>
-              <w:keepNext/>
-              <w:jc w:val="start"/>
-            </w:pPr>
-            <w:r>
-              <w:rPr>
-                <w:rFonts w:ascii="Calibri" w:hAnsi="Calibri"/>
-                <w:sz w:val="20"/>
-              </w:rPr>
-              <w:t xml:space="default">79 (9.2%)</w:t>
+              <w:t xml:space="default">42 (10.9%)</w:t>
+            </w:r>
+          </w:p>
+        </w:tc>
+        <w:tc>
+          <w:tcPr>
+            <w:tcBorders>
+              <w:top w:val="single" w:space="0" w:color="D3D3D3"/>
+              <w:bottom w:val="single" w:space="0" w:color="D3D3D3"/>
+              <w:start w:val="single" w:space="0" w:color="D3D3D3"/>
+              <w:end w:val="single" w:space="0" w:color="D3D3D3"/>
+            </w:tcBorders>
+          </w:tcPr>
+          <w:p>
+            <w:pPr>
+              <w:spacing w:before="0" w:after="60"/>
+              <w:keepNext/>
+              <w:jc w:val="start"/>
+            </w:pPr>
+            <w:r>
+              <w:rPr>
+                <w:rFonts w:ascii="Calibri" w:hAnsi="Calibri"/>
+                <w:sz w:val="20"/>
+              </w:rPr>
+              <w:t xml:space="default">37 (7.7%)</w:t>
+            </w:r>
+          </w:p>
+        </w:tc>
+        <w:tc>
+          <w:tcPr>
+            <w:tcBorders>
+              <w:top w:val="single" w:space="0" w:color="D3D3D3"/>
+              <w:bottom w:val="single" w:space="0" w:color="D3D3D3"/>
+              <w:start w:val="single" w:space="0" w:color="D3D3D3"/>
+              <w:end w:val="single" w:space="0" w:color="D3D3D3"/>
+            </w:tcBorders>
+          </w:tcPr>
+          <w:p>
+            <w:pPr>
+              <w:spacing w:before="0" w:after="60"/>
+              <w:keepNext/>
+              <w:jc w:val="start"/>
+            </w:pPr>
+            <w:r>
+              <w:rPr>
+                <w:rFonts w:ascii="Calibri" w:hAnsi="Calibri"/>
+                <w:sz w:val="20"/>
+              </w:rPr>
+              <w:t xml:space="default">79 (9.1%)</w:t>
             </w:r>
           </w:p>
         </w:tc>
@@ -2506,55 +2506,55 @@
                 <w:rFonts w:ascii="Calibri" w:hAnsi="Calibri"/>
                 <w:sz w:val="20"/>
               </w:rPr>
-              <w:t xml:space="default">47 (11.6%)</w:t>
-            </w:r>
-          </w:p>
-        </w:tc>
-        <w:tc>
-          <w:tcPr>
-            <w:tcBorders>
-              <w:top w:val="single" w:space="0" w:color="D3D3D3"/>
-              <w:bottom w:val="single" w:space="0" w:color="D3D3D3"/>
-              <w:start w:val="single" w:space="0" w:color="D3D3D3"/>
-              <w:end w:val="single" w:space="0" w:color="D3D3D3"/>
-            </w:tcBorders>
-          </w:tcPr>
-          <w:p>
-            <w:pPr>
-              <w:spacing w:before="0" w:after="60"/>
-              <w:keepNext/>
-              <w:jc w:val="start"/>
-            </w:pPr>
-            <w:r>
-              <w:rPr>
-                <w:rFonts w:ascii="Calibri" w:hAnsi="Calibri"/>
-                <w:sz w:val="20"/>
-              </w:rPr>
-              <w:t xml:space="default">33 (7.4%)</w:t>
-            </w:r>
-          </w:p>
-        </w:tc>
-        <w:tc>
-          <w:tcPr>
-            <w:tcBorders>
-              <w:top w:val="single" w:space="0" w:color="D3D3D3"/>
-              <w:bottom w:val="single" w:space="0" w:color="D3D3D3"/>
-              <w:start w:val="single" w:space="0" w:color="D3D3D3"/>
-              <w:end w:val="single" w:space="0" w:color="D3D3D3"/>
-            </w:tcBorders>
-          </w:tcPr>
-          <w:p>
-            <w:pPr>
-              <w:spacing w:before="0" w:after="60"/>
-              <w:keepNext/>
-              <w:jc w:val="start"/>
-            </w:pPr>
-            <w:r>
-              <w:rPr>
-                <w:rFonts w:ascii="Calibri" w:hAnsi="Calibri"/>
-                <w:sz w:val="20"/>
-              </w:rPr>
-              <w:t xml:space="default">80 (9.4%)</w:t>
+              <w:t xml:space="default">45 (11.5%)</w:t>
+            </w:r>
+          </w:p>
+        </w:tc>
+        <w:tc>
+          <w:tcPr>
+            <w:tcBorders>
+              <w:top w:val="single" w:space="0" w:color="D3D3D3"/>
+              <w:bottom w:val="single" w:space="0" w:color="D3D3D3"/>
+              <w:start w:val="single" w:space="0" w:color="D3D3D3"/>
+              <w:end w:val="single" w:space="0" w:color="D3D3D3"/>
+            </w:tcBorders>
+          </w:tcPr>
+          <w:p>
+            <w:pPr>
+              <w:spacing w:before="0" w:after="60"/>
+              <w:keepNext/>
+              <w:jc w:val="start"/>
+            </w:pPr>
+            <w:r>
+              <w:rPr>
+                <w:rFonts w:ascii="Calibri" w:hAnsi="Calibri"/>
+                <w:sz w:val="20"/>
+              </w:rPr>
+              <w:t xml:space="default">37 (7.8%)</w:t>
+            </w:r>
+          </w:p>
+        </w:tc>
+        <w:tc>
+          <w:tcPr>
+            <w:tcBorders>
+              <w:top w:val="single" w:space="0" w:color="D3D3D3"/>
+              <w:bottom w:val="single" w:space="0" w:color="D3D3D3"/>
+              <w:start w:val="single" w:space="0" w:color="D3D3D3"/>
+              <w:end w:val="single" w:space="0" w:color="D3D3D3"/>
+            </w:tcBorders>
+          </w:tcPr>
+          <w:p>
+            <w:pPr>
+              <w:spacing w:before="0" w:after="60"/>
+              <w:keepNext/>
+              <w:jc w:val="start"/>
+            </w:pPr>
+            <w:r>
+              <w:rPr>
+                <w:rFonts w:ascii="Calibri" w:hAnsi="Calibri"/>
+                <w:sz w:val="20"/>
+              </w:rPr>
+              <w:t xml:space="default">82 (9.4%)</w:t>
             </w:r>
           </w:p>
         </w:tc>
@@ -2578,7 +2578,7 @@
                 <w:rFonts w:ascii="Calibri" w:hAnsi="Calibri"/>
                 <w:sz w:val="20"/>
               </w:rPr>
-              <w:t xml:space="default">41.3%</w:t>
+              <w:t xml:space="default">45.5%</w:t>
             </w:r>
           </w:p>
         </w:tc>
@@ -2761,55 +2761,55 @@
                 <w:rFonts w:ascii="Calibri" w:hAnsi="Calibri"/>
                 <w:sz w:val="20"/>
               </w:rPr>
-              <w:t xml:space="default">176 (43.3%)</w:t>
-            </w:r>
-          </w:p>
-        </w:tc>
-        <w:tc>
-          <w:tcPr>
-            <w:tcBorders>
-              <w:top w:val="single" w:space="0" w:color="D3D3D3"/>
-              <w:bottom w:val="single" w:space="0" w:color="D3D3D3"/>
-              <w:start w:val="single" w:space="0" w:color="D3D3D3"/>
-              <w:end w:val="single" w:space="0" w:color="D3D3D3"/>
-            </w:tcBorders>
-          </w:tcPr>
-          <w:p>
-            <w:pPr>
-              <w:spacing w:before="0" w:after="60"/>
-              <w:keepNext/>
-              <w:jc w:val="start"/>
-            </w:pPr>
-            <w:r>
-              <w:rPr>
-                <w:rFonts w:ascii="Calibri" w:hAnsi="Calibri"/>
-                <w:sz w:val="20"/>
-              </w:rPr>
-              <w:t xml:space="default">143 (31.8%)</w:t>
-            </w:r>
-          </w:p>
-        </w:tc>
-        <w:tc>
-          <w:tcPr>
-            <w:tcBorders>
-              <w:top w:val="single" w:space="0" w:color="D3D3D3"/>
-              <w:bottom w:val="single" w:space="0" w:color="D3D3D3"/>
-              <w:start w:val="single" w:space="0" w:color="D3D3D3"/>
-              <w:end w:val="single" w:space="0" w:color="D3D3D3"/>
-            </w:tcBorders>
-          </w:tcPr>
-          <w:p>
-            <w:pPr>
-              <w:spacing w:before="0" w:after="60"/>
-              <w:keepNext/>
-              <w:jc w:val="start"/>
-            </w:pPr>
-            <w:r>
-              <w:rPr>
-                <w:rFonts w:ascii="Calibri" w:hAnsi="Calibri"/>
-                <w:sz w:val="20"/>
-              </w:rPr>
-              <w:t xml:space="default">319 (37.2%)</w:t>
+              <w:t xml:space="default">175 (44.9%)</w:t>
+            </w:r>
+          </w:p>
+        </w:tc>
+        <w:tc>
+          <w:tcPr>
+            <w:tcBorders>
+              <w:top w:val="single" w:space="0" w:color="D3D3D3"/>
+              <w:bottom w:val="single" w:space="0" w:color="D3D3D3"/>
+              <w:start w:val="single" w:space="0" w:color="D3D3D3"/>
+              <w:end w:val="single" w:space="0" w:color="D3D3D3"/>
+            </w:tcBorders>
+          </w:tcPr>
+          <w:p>
+            <w:pPr>
+              <w:spacing w:before="0" w:after="60"/>
+              <w:keepNext/>
+              <w:jc w:val="start"/>
+            </w:pPr>
+            <w:r>
+              <w:rPr>
+                <w:rFonts w:ascii="Calibri" w:hAnsi="Calibri"/>
+                <w:sz w:val="20"/>
+              </w:rPr>
+              <w:t xml:space="default">150 (31.3%)</w:t>
+            </w:r>
+          </w:p>
+        </w:tc>
+        <w:tc>
+          <w:tcPr>
+            <w:tcBorders>
+              <w:top w:val="single" w:space="0" w:color="D3D3D3"/>
+              <w:bottom w:val="single" w:space="0" w:color="D3D3D3"/>
+              <w:start w:val="single" w:space="0" w:color="D3D3D3"/>
+              <w:end w:val="single" w:space="0" w:color="D3D3D3"/>
+            </w:tcBorders>
+          </w:tcPr>
+          <w:p>
+            <w:pPr>
+              <w:spacing w:before="0" w:after="60"/>
+              <w:keepNext/>
+              <w:jc w:val="start"/>
+            </w:pPr>
+            <w:r>
+              <w:rPr>
+                <w:rFonts w:ascii="Calibri" w:hAnsi="Calibri"/>
+                <w:sz w:val="20"/>
+              </w:rPr>
+              <w:t xml:space="default">325 (37.4%)</w:t>
             </w:r>
           </w:p>
         </w:tc>
@@ -2833,7 +2833,7 @@
                 <w:rFonts w:ascii="Calibri" w:hAnsi="Calibri"/>
                 <w:sz w:val="20"/>
               </w:rPr>
-              <w:t xml:space="default">44.8%</w:t>
+              <w:t xml:space="default">46.1%</w:t>
             </w:r>
           </w:p>
         </w:tc>
@@ -2886,55 +2886,55 @@
                 <w:rFonts w:ascii="Calibri" w:hAnsi="Calibri"/>
                 <w:sz w:val="20"/>
               </w:rPr>
-              <w:t xml:space="default">36 (8.8%)</w:t>
-            </w:r>
-          </w:p>
-        </w:tc>
-        <w:tc>
-          <w:tcPr>
-            <w:tcBorders>
-              <w:top w:val="single" w:space="0" w:color="D3D3D3"/>
-              <w:bottom w:val="single" w:space="0" w:color="D3D3D3"/>
-              <w:start w:val="single" w:space="0" w:color="D3D3D3"/>
-              <w:end w:val="single" w:space="0" w:color="D3D3D3"/>
-            </w:tcBorders>
-          </w:tcPr>
-          <w:p>
-            <w:pPr>
-              <w:spacing w:before="0" w:after="60"/>
-              <w:keepNext/>
-              <w:jc w:val="start"/>
-            </w:pPr>
-            <w:r>
-              <w:rPr>
-                <w:rFonts w:ascii="Calibri" w:hAnsi="Calibri"/>
-                <w:sz w:val="20"/>
-              </w:rPr>
-              <w:t xml:space="default">51 (11.3%)</w:t>
-            </w:r>
-          </w:p>
-        </w:tc>
-        <w:tc>
-          <w:tcPr>
-            <w:tcBorders>
-              <w:top w:val="single" w:space="0" w:color="D3D3D3"/>
-              <w:bottom w:val="single" w:space="0" w:color="D3D3D3"/>
-              <w:start w:val="single" w:space="0" w:color="D3D3D3"/>
-              <w:end w:val="single" w:space="0" w:color="D3D3D3"/>
-            </w:tcBorders>
-          </w:tcPr>
-          <w:p>
-            <w:pPr>
-              <w:spacing w:before="0" w:after="60"/>
-              <w:keepNext/>
-              <w:jc w:val="start"/>
-            </w:pPr>
-            <w:r>
-              <w:rPr>
-                <w:rFonts w:ascii="Calibri" w:hAnsi="Calibri"/>
-                <w:sz w:val="20"/>
-              </w:rPr>
-              <w:t xml:space="default">87 (10.1%)</w:t>
+              <w:t xml:space="default">35 (8.9%)</w:t>
+            </w:r>
+          </w:p>
+        </w:tc>
+        <w:tc>
+          <w:tcPr>
+            <w:tcBorders>
+              <w:top w:val="single" w:space="0" w:color="D3D3D3"/>
+              <w:bottom w:val="single" w:space="0" w:color="D3D3D3"/>
+              <w:start w:val="single" w:space="0" w:color="D3D3D3"/>
+              <w:end w:val="single" w:space="0" w:color="D3D3D3"/>
+            </w:tcBorders>
+          </w:tcPr>
+          <w:p>
+            <w:pPr>
+              <w:spacing w:before="0" w:after="60"/>
+              <w:keepNext/>
+              <w:jc w:val="start"/>
+            </w:pPr>
+            <w:r>
+              <w:rPr>
+                <w:rFonts w:ascii="Calibri" w:hAnsi="Calibri"/>
+                <w:sz w:val="20"/>
+              </w:rPr>
+              <w:t xml:space="default">52 (10.9%)</w:t>
+            </w:r>
+          </w:p>
+        </w:tc>
+        <w:tc>
+          <w:tcPr>
+            <w:tcBorders>
+              <w:top w:val="single" w:space="0" w:color="D3D3D3"/>
+              <w:bottom w:val="single" w:space="0" w:color="D3D3D3"/>
+              <w:start w:val="single" w:space="0" w:color="D3D3D3"/>
+              <w:end w:val="single" w:space="0" w:color="D3D3D3"/>
+            </w:tcBorders>
+          </w:tcPr>
+          <w:p>
+            <w:pPr>
+              <w:spacing w:before="0" w:after="60"/>
+              <w:keepNext/>
+              <w:jc w:val="start"/>
+            </w:pPr>
+            <w:r>
+              <w:rPr>
+                <w:rFonts w:ascii="Calibri" w:hAnsi="Calibri"/>
+                <w:sz w:val="20"/>
+              </w:rPr>
+              <w:t xml:space="default">87 (10%)</w:t>
             </w:r>
           </w:p>
         </w:tc>
@@ -2958,7 +2958,7 @@
                 <w:rFonts w:ascii="Calibri" w:hAnsi="Calibri"/>
                 <w:sz w:val="20"/>
               </w:rPr>
-              <w:t xml:space="default">58.8%</w:t>
+              <w:t xml:space="default">60%</w:t>
             </w:r>
           </w:p>
         </w:tc>
@@ -3011,55 +3011,55 @@
                 <w:rFonts w:ascii="Calibri" w:hAnsi="Calibri"/>
                 <w:sz w:val="20"/>
               </w:rPr>
-              <w:t xml:space="default">48 (11.8%)</w:t>
-            </w:r>
-          </w:p>
-        </w:tc>
-        <w:tc>
-          <w:tcPr>
-            <w:tcBorders>
-              <w:top w:val="single" w:space="0" w:color="D3D3D3"/>
-              <w:bottom w:val="single" w:space="0" w:color="D3D3D3"/>
-              <w:start w:val="single" w:space="0" w:color="D3D3D3"/>
-              <w:end w:val="single" w:space="0" w:color="D3D3D3"/>
-            </w:tcBorders>
-          </w:tcPr>
-          <w:p>
-            <w:pPr>
-              <w:spacing w:before="0" w:after="60"/>
-              <w:keepNext/>
-              <w:jc w:val="start"/>
-            </w:pPr>
-            <w:r>
-              <w:rPr>
-                <w:rFonts w:ascii="Calibri" w:hAnsi="Calibri"/>
-                <w:sz w:val="20"/>
-              </w:rPr>
-              <w:t xml:space="default">40 (8.9%)</w:t>
-            </w:r>
-          </w:p>
-        </w:tc>
-        <w:tc>
-          <w:tcPr>
-            <w:tcBorders>
-              <w:top w:val="single" w:space="0" w:color="D3D3D3"/>
-              <w:bottom w:val="single" w:space="0" w:color="D3D3D3"/>
-              <w:start w:val="single" w:space="0" w:color="D3D3D3"/>
-              <w:end w:val="single" w:space="0" w:color="D3D3D3"/>
-            </w:tcBorders>
-          </w:tcPr>
-          <w:p>
-            <w:pPr>
-              <w:spacing w:before="0" w:after="60"/>
-              <w:keepNext/>
-              <w:jc w:val="start"/>
-            </w:pPr>
-            <w:r>
-              <w:rPr>
-                <w:rFonts w:ascii="Calibri" w:hAnsi="Calibri"/>
-                <w:sz w:val="20"/>
-              </w:rPr>
-              <w:t xml:space="default">88 (10.3%)</w:t>
+              <w:t xml:space="default">44 (11.3%)</w:t>
+            </w:r>
+          </w:p>
+        </w:tc>
+        <w:tc>
+          <w:tcPr>
+            <w:tcBorders>
+              <w:top w:val="single" w:space="0" w:color="D3D3D3"/>
+              <w:bottom w:val="single" w:space="0" w:color="D3D3D3"/>
+              <w:start w:val="single" w:space="0" w:color="D3D3D3"/>
+              <w:end w:val="single" w:space="0" w:color="D3D3D3"/>
+            </w:tcBorders>
+          </w:tcPr>
+          <w:p>
+            <w:pPr>
+              <w:spacing w:before="0" w:after="60"/>
+              <w:keepNext/>
+              <w:jc w:val="start"/>
+            </w:pPr>
+            <w:r>
+              <w:rPr>
+                <w:rFonts w:ascii="Calibri" w:hAnsi="Calibri"/>
+                <w:sz w:val="20"/>
+              </w:rPr>
+              <w:t xml:space="default">44 (9.3%)</w:t>
+            </w:r>
+          </w:p>
+        </w:tc>
+        <w:tc>
+          <w:tcPr>
+            <w:tcBorders>
+              <w:top w:val="single" w:space="0" w:color="D3D3D3"/>
+              <w:bottom w:val="single" w:space="0" w:color="D3D3D3"/>
+              <w:start w:val="single" w:space="0" w:color="D3D3D3"/>
+              <w:end w:val="single" w:space="0" w:color="D3D3D3"/>
+            </w:tcBorders>
+          </w:tcPr>
+          <w:p>
+            <w:pPr>
+              <w:spacing w:before="0" w:after="60"/>
+              <w:keepNext/>
+              <w:jc w:val="start"/>
+            </w:pPr>
+            <w:r>
+              <w:rPr>
+                <w:rFonts w:ascii="Calibri" w:hAnsi="Calibri"/>
+                <w:sz w:val="20"/>
+              </w:rPr>
+              <w:t xml:space="default">88 (10.2%)</w:t>
             </w:r>
           </w:p>
         </w:tc>
@@ -3083,7 +3083,7 @@
                 <w:rFonts w:ascii="Calibri" w:hAnsi="Calibri"/>
                 <w:sz w:val="20"/>
               </w:rPr>
-              <w:t xml:space="default">45.4%</w:t>
+              <w:t xml:space="default">50.3%</w:t>
             </w:r>
           </w:p>
         </w:tc>
@@ -3136,55 +3136,55 @@
                 <w:rFonts w:ascii="Calibri" w:hAnsi="Calibri"/>
                 <w:sz w:val="20"/>
               </w:rPr>
-              <w:t xml:space="default">13 (3.1%)</w:t>
-            </w:r>
-          </w:p>
-        </w:tc>
-        <w:tc>
-          <w:tcPr>
-            <w:tcBorders>
-              <w:top w:val="single" w:space="0" w:color="D3D3D3"/>
-              <w:bottom w:val="single" w:space="0" w:color="D3D3D3"/>
-              <w:start w:val="single" w:space="0" w:color="D3D3D3"/>
-              <w:end w:val="single" w:space="0" w:color="D3D3D3"/>
-            </w:tcBorders>
-          </w:tcPr>
-          <w:p>
-            <w:pPr>
-              <w:spacing w:before="0" w:after="60"/>
-              <w:keepNext/>
-              <w:jc w:val="start"/>
-            </w:pPr>
-            <w:r>
-              <w:rPr>
-                <w:rFonts w:ascii="Calibri" w:hAnsi="Calibri"/>
-                <w:sz w:val="20"/>
-              </w:rPr>
-              <w:t xml:space="default">24 (5.3%)</w:t>
-            </w:r>
-          </w:p>
-        </w:tc>
-        <w:tc>
-          <w:tcPr>
-            <w:tcBorders>
-              <w:top w:val="single" w:space="0" w:color="D3D3D3"/>
-              <w:bottom w:val="single" w:space="0" w:color="D3D3D3"/>
-              <w:start w:val="single" w:space="0" w:color="D3D3D3"/>
-              <w:end w:val="single" w:space="0" w:color="D3D3D3"/>
-            </w:tcBorders>
-          </w:tcPr>
-          <w:p>
-            <w:pPr>
-              <w:spacing w:before="0" w:after="60"/>
-              <w:keepNext/>
-              <w:jc w:val="start"/>
-            </w:pPr>
-            <w:r>
-              <w:rPr>
-                <w:rFonts w:ascii="Calibri" w:hAnsi="Calibri"/>
-                <w:sz w:val="20"/>
-              </w:rPr>
-              <w:t xml:space="default">37 (4.3%)</w:t>
+              <w:t xml:space="default">13 (3.3%)</w:t>
+            </w:r>
+          </w:p>
+        </w:tc>
+        <w:tc>
+          <w:tcPr>
+            <w:tcBorders>
+              <w:top w:val="single" w:space="0" w:color="D3D3D3"/>
+              <w:bottom w:val="single" w:space="0" w:color="D3D3D3"/>
+              <w:start w:val="single" w:space="0" w:color="D3D3D3"/>
+              <w:end w:val="single" w:space="0" w:color="D3D3D3"/>
+            </w:tcBorders>
+          </w:tcPr>
+          <w:p>
+            <w:pPr>
+              <w:spacing w:before="0" w:after="60"/>
+              <w:keepNext/>
+              <w:jc w:val="start"/>
+            </w:pPr>
+            <w:r>
+              <w:rPr>
+                <w:rFonts w:ascii="Calibri" w:hAnsi="Calibri"/>
+                <w:sz w:val="20"/>
+              </w:rPr>
+              <w:t xml:space="default">25 (5.3%)</w:t>
+            </w:r>
+          </w:p>
+        </w:tc>
+        <w:tc>
+          <w:tcPr>
+            <w:tcBorders>
+              <w:top w:val="single" w:space="0" w:color="D3D3D3"/>
+              <w:bottom w:val="single" w:space="0" w:color="D3D3D3"/>
+              <w:start w:val="single" w:space="0" w:color="D3D3D3"/>
+              <w:end w:val="single" w:space="0" w:color="D3D3D3"/>
+            </w:tcBorders>
+          </w:tcPr>
+          <w:p>
+            <w:pPr>
+              <w:spacing w:before="0" w:after="60"/>
+              <w:keepNext/>
+              <w:jc w:val="start"/>
+            </w:pPr>
+            <w:r>
+              <w:rPr>
+                <w:rFonts w:ascii="Calibri" w:hAnsi="Calibri"/>
+                <w:sz w:val="20"/>
+              </w:rPr>
+              <w:t xml:space="default">38 (4.4%)</w:t>
             </w:r>
           </w:p>
         </w:tc>
@@ -3208,7 +3208,7 @@
                 <w:rFonts w:ascii="Calibri" w:hAnsi="Calibri"/>
                 <w:sz w:val="20"/>
               </w:rPr>
-              <w:t xml:space="default">65.2%</w:t>
+              <w:t xml:space="default">66.5%</w:t>
             </w:r>
           </w:p>
         </w:tc>
@@ -3391,55 +3391,55 @@
                 <w:rFonts w:ascii="Calibri" w:hAnsi="Calibri"/>
                 <w:sz w:val="20"/>
               </w:rPr>
-              <w:t xml:space="default">101 (24.7%)</w:t>
-            </w:r>
-          </w:p>
-        </w:tc>
-        <w:tc>
-          <w:tcPr>
-            <w:tcBorders>
-              <w:top w:val="single" w:space="0" w:color="D3D3D3"/>
-              <w:bottom w:val="single" w:space="0" w:color="D3D3D3"/>
-              <w:start w:val="single" w:space="0" w:color="D3D3D3"/>
-              <w:end w:val="single" w:space="0" w:color="D3D3D3"/>
-            </w:tcBorders>
-          </w:tcPr>
-          <w:p>
-            <w:pPr>
-              <w:spacing w:before="0" w:after="60"/>
-              <w:keepNext/>
-              <w:jc w:val="start"/>
-            </w:pPr>
-            <w:r>
-              <w:rPr>
-                <w:rFonts w:ascii="Calibri" w:hAnsi="Calibri"/>
-                <w:sz w:val="20"/>
-              </w:rPr>
-              <w:t xml:space="default">115 (25.4%)</w:t>
-            </w:r>
-          </w:p>
-        </w:tc>
-        <w:tc>
-          <w:tcPr>
-            <w:tcBorders>
-              <w:top w:val="single" w:space="0" w:color="D3D3D3"/>
-              <w:bottom w:val="single" w:space="0" w:color="D3D3D3"/>
-              <w:start w:val="single" w:space="0" w:color="D3D3D3"/>
-              <w:end w:val="single" w:space="0" w:color="D3D3D3"/>
-            </w:tcBorders>
-          </w:tcPr>
-          <w:p>
-            <w:pPr>
-              <w:spacing w:before="0" w:after="60"/>
-              <w:keepNext/>
-              <w:jc w:val="start"/>
-            </w:pPr>
-            <w:r>
-              <w:rPr>
-                <w:rFonts w:ascii="Calibri" w:hAnsi="Calibri"/>
-                <w:sz w:val="20"/>
-              </w:rPr>
-              <w:t xml:space="default">215 (25.1%)</w:t>
+              <w:t xml:space="default">96 (24.5%)</w:t>
+            </w:r>
+          </w:p>
+        </w:tc>
+        <w:tc>
+          <w:tcPr>
+            <w:tcBorders>
+              <w:top w:val="single" w:space="0" w:color="D3D3D3"/>
+              <w:bottom w:val="single" w:space="0" w:color="D3D3D3"/>
+              <w:start w:val="single" w:space="0" w:color="D3D3D3"/>
+              <w:end w:val="single" w:space="0" w:color="D3D3D3"/>
+            </w:tcBorders>
+          </w:tcPr>
+          <w:p>
+            <w:pPr>
+              <w:spacing w:before="0" w:after="60"/>
+              <w:keepNext/>
+              <w:jc w:val="start"/>
+            </w:pPr>
+            <w:r>
+              <w:rPr>
+                <w:rFonts w:ascii="Calibri" w:hAnsi="Calibri"/>
+                <w:sz w:val="20"/>
+              </w:rPr>
+              <w:t xml:space="default">123 (25.8%)</w:t>
+            </w:r>
+          </w:p>
+        </w:tc>
+        <w:tc>
+          <w:tcPr>
+            <w:tcBorders>
+              <w:top w:val="single" w:space="0" w:color="D3D3D3"/>
+              <w:bottom w:val="single" w:space="0" w:color="D3D3D3"/>
+              <w:start w:val="single" w:space="0" w:color="D3D3D3"/>
+              <w:end w:val="single" w:space="0" w:color="D3D3D3"/>
+            </w:tcBorders>
+          </w:tcPr>
+          <w:p>
+            <w:pPr>
+              <w:spacing w:before="0" w:after="60"/>
+              <w:keepNext/>
+              <w:jc w:val="start"/>
+            </w:pPr>
+            <w:r>
+              <w:rPr>
+                <w:rFonts w:ascii="Calibri" w:hAnsi="Calibri"/>
+                <w:sz w:val="20"/>
+              </w:rPr>
+              <w:t xml:space="default">219 (25.2%)</w:t>
             </w:r>
           </w:p>
         </w:tc>
@@ -3463,7 +3463,7 @@
                 <w:rFonts w:ascii="Calibri" w:hAnsi="Calibri"/>
                 <w:sz w:val="20"/>
               </w:rPr>
-              <w:t xml:space="default">53.2%</w:t>
+              <w:t xml:space="default">56.4%</w:t>
             </w:r>
           </w:p>
         </w:tc>
@@ -3516,55 +3516,55 @@
                 <w:rFonts w:ascii="Calibri" w:hAnsi="Calibri"/>
                 <w:sz w:val="20"/>
               </w:rPr>
-              <w:t xml:space="default">114 (27.9%)</w:t>
-            </w:r>
-          </w:p>
-        </w:tc>
-        <w:tc>
-          <w:tcPr>
-            <w:tcBorders>
-              <w:top w:val="single" w:space="0" w:color="D3D3D3"/>
-              <w:bottom w:val="single" w:space="0" w:color="D3D3D3"/>
-              <w:start w:val="single" w:space="0" w:color="D3D3D3"/>
-              <w:end w:val="single" w:space="0" w:color="D3D3D3"/>
-            </w:tcBorders>
-          </w:tcPr>
-          <w:p>
-            <w:pPr>
-              <w:spacing w:before="0" w:after="60"/>
-              <w:keepNext/>
-              <w:jc w:val="start"/>
-            </w:pPr>
-            <w:r>
-              <w:rPr>
-                <w:rFonts w:ascii="Calibri" w:hAnsi="Calibri"/>
-                <w:sz w:val="20"/>
-              </w:rPr>
-              <w:t xml:space="default">94 (20.8%)</w:t>
-            </w:r>
-          </w:p>
-        </w:tc>
-        <w:tc>
-          <w:tcPr>
-            <w:tcBorders>
-              <w:top w:val="single" w:space="0" w:color="D3D3D3"/>
-              <w:bottom w:val="single" w:space="0" w:color="D3D3D3"/>
-              <w:start w:val="single" w:space="0" w:color="D3D3D3"/>
-              <w:end w:val="single" w:space="0" w:color="D3D3D3"/>
-            </w:tcBorders>
-          </w:tcPr>
-          <w:p>
-            <w:pPr>
-              <w:spacing w:before="0" w:after="60"/>
-              <w:keepNext/>
-              <w:jc w:val="start"/>
-            </w:pPr>
-            <w:r>
-              <w:rPr>
-                <w:rFonts w:ascii="Calibri" w:hAnsi="Calibri"/>
-                <w:sz w:val="20"/>
-              </w:rPr>
-              <w:t xml:space="default">207 (24.2%)</w:t>
+              <w:t xml:space="default">103 (26.5%)</w:t>
+            </w:r>
+          </w:p>
+        </w:tc>
+        <w:tc>
+          <w:tcPr>
+            <w:tcBorders>
+              <w:top w:val="single" w:space="0" w:color="D3D3D3"/>
+              <w:bottom w:val="single" w:space="0" w:color="D3D3D3"/>
+              <w:start w:val="single" w:space="0" w:color="D3D3D3"/>
+              <w:end w:val="single" w:space="0" w:color="D3D3D3"/>
+            </w:tcBorders>
+          </w:tcPr>
+          <w:p>
+            <w:pPr>
+              <w:spacing w:before="0" w:after="60"/>
+              <w:keepNext/>
+              <w:jc w:val="start"/>
+            </w:pPr>
+            <w:r>
+              <w:rPr>
+                <w:rFonts w:ascii="Calibri" w:hAnsi="Calibri"/>
+                <w:sz w:val="20"/>
+              </w:rPr>
+              <w:t xml:space="default">104 (21.7%)</w:t>
+            </w:r>
+          </w:p>
+        </w:tc>
+        <w:tc>
+          <w:tcPr>
+            <w:tcBorders>
+              <w:top w:val="single" w:space="0" w:color="D3D3D3"/>
+              <w:bottom w:val="single" w:space="0" w:color="D3D3D3"/>
+              <w:start w:val="single" w:space="0" w:color="D3D3D3"/>
+              <w:end w:val="single" w:space="0" w:color="D3D3D3"/>
+            </w:tcBorders>
+          </w:tcPr>
+          <w:p>
+            <w:pPr>
+              <w:spacing w:before="0" w:after="60"/>
+              <w:keepNext/>
+              <w:jc w:val="start"/>
+            </w:pPr>
+            <w:r>
+              <w:rPr>
+                <w:rFonts w:ascii="Calibri" w:hAnsi="Calibri"/>
+                <w:sz w:val="20"/>
+              </w:rPr>
+              <w:t xml:space="default">207 (23.9%)</w:t>
             </w:r>
           </w:p>
         </w:tc>
@@ -3588,7 +3588,7 @@
                 <w:rFonts w:ascii="Calibri" w:hAnsi="Calibri"/>
                 <w:sz w:val="20"/>
               </w:rPr>
-              <w:t xml:space="default">45.2%</w:t>
+              <w:t xml:space="default">50.1%</w:t>
             </w:r>
           </w:p>
         </w:tc>
@@ -3641,55 +3641,55 @@
                 <w:rFonts w:ascii="Calibri" w:hAnsi="Calibri"/>
                 <w:sz w:val="20"/>
               </w:rPr>
-              <w:t xml:space="default">98 (24.1%)</w:t>
-            </w:r>
-          </w:p>
-        </w:tc>
-        <w:tc>
-          <w:tcPr>
-            <w:tcBorders>
-              <w:top w:val="single" w:space="0" w:color="D3D3D3"/>
-              <w:bottom w:val="single" w:space="0" w:color="D3D3D3"/>
-              <w:start w:val="single" w:space="0" w:color="D3D3D3"/>
-              <w:end w:val="single" w:space="0" w:color="D3D3D3"/>
-            </w:tcBorders>
-          </w:tcPr>
-          <w:p>
-            <w:pPr>
-              <w:spacing w:before="0" w:after="60"/>
-              <w:keepNext/>
-              <w:jc w:val="start"/>
-            </w:pPr>
-            <w:r>
-              <w:rPr>
-                <w:rFonts w:ascii="Calibri" w:hAnsi="Calibri"/>
-                <w:sz w:val="20"/>
-              </w:rPr>
-              <w:t xml:space="default">104 (23.1%)</w:t>
-            </w:r>
-          </w:p>
-        </w:tc>
-        <w:tc>
-          <w:tcPr>
-            <w:tcBorders>
-              <w:top w:val="single" w:space="0" w:color="D3D3D3"/>
-              <w:bottom w:val="single" w:space="0" w:color="D3D3D3"/>
-              <w:start w:val="single" w:space="0" w:color="D3D3D3"/>
-              <w:end w:val="single" w:space="0" w:color="D3D3D3"/>
-            </w:tcBorders>
-          </w:tcPr>
-          <w:p>
-            <w:pPr>
-              <w:spacing w:before="0" w:after="60"/>
-              <w:keepNext/>
-              <w:jc w:val="start"/>
-            </w:pPr>
-            <w:r>
-              <w:rPr>
-                <w:rFonts w:ascii="Calibri" w:hAnsi="Calibri"/>
-                <w:sz w:val="20"/>
-              </w:rPr>
-              <w:t xml:space="default">202 (23.6%)</w:t>
+              <w:t xml:space="default">96 (24.6%)</w:t>
+            </w:r>
+          </w:p>
+        </w:tc>
+        <w:tc>
+          <w:tcPr>
+            <w:tcBorders>
+              <w:top w:val="single" w:space="0" w:color="D3D3D3"/>
+              <w:bottom w:val="single" w:space="0" w:color="D3D3D3"/>
+              <w:start w:val="single" w:space="0" w:color="D3D3D3"/>
+              <w:end w:val="single" w:space="0" w:color="D3D3D3"/>
+            </w:tcBorders>
+          </w:tcPr>
+          <w:p>
+            <w:pPr>
+              <w:spacing w:before="0" w:after="60"/>
+              <w:keepNext/>
+              <w:jc w:val="start"/>
+            </w:pPr>
+            <w:r>
+              <w:rPr>
+                <w:rFonts w:ascii="Calibri" w:hAnsi="Calibri"/>
+                <w:sz w:val="20"/>
+              </w:rPr>
+              <w:t xml:space="default">108 (22.5%)</w:t>
+            </w:r>
+          </w:p>
+        </w:tc>
+        <w:tc>
+          <w:tcPr>
+            <w:tcBorders>
+              <w:top w:val="single" w:space="0" w:color="D3D3D3"/>
+              <w:bottom w:val="single" w:space="0" w:color="D3D3D3"/>
+              <w:start w:val="single" w:space="0" w:color="D3D3D3"/>
+              <w:end w:val="single" w:space="0" w:color="D3D3D3"/>
+            </w:tcBorders>
+          </w:tcPr>
+          <w:p>
+            <w:pPr>
+              <w:spacing w:before="0" w:after="60"/>
+              <w:keepNext/>
+              <w:jc w:val="start"/>
+            </w:pPr>
+            <w:r>
+              <w:rPr>
+                <w:rFonts w:ascii="Calibri" w:hAnsi="Calibri"/>
+                <w:sz w:val="20"/>
+              </w:rPr>
+              <w:t xml:space="default">204 (23.5%)</w:t>
             </w:r>
           </w:p>
         </w:tc>
@@ -3713,7 +3713,7 @@
                 <w:rFonts w:ascii="Calibri" w:hAnsi="Calibri"/>
                 <w:sz w:val="20"/>
               </w:rPr>
-              <w:t xml:space="default">51.5%</w:t>
+              <w:t xml:space="default">52.9%</w:t>
             </w:r>
           </w:p>
         </w:tc>
@@ -3766,55 +3766,55 @@
                 <w:rFonts w:ascii="Calibri" w:hAnsi="Calibri"/>
                 <w:sz w:val="20"/>
               </w:rPr>
-              <w:t xml:space="default">92 (22.6%)</w:t>
-            </w:r>
-          </w:p>
-        </w:tc>
-        <w:tc>
-          <w:tcPr>
-            <w:tcBorders>
-              <w:top w:val="single" w:space="0" w:color="D3D3D3"/>
-              <w:bottom w:val="single" w:space="0" w:color="D3D3D3"/>
-              <w:start w:val="single" w:space="0" w:color="D3D3D3"/>
-              <w:end w:val="single" w:space="0" w:color="D3D3D3"/>
-            </w:tcBorders>
-          </w:tcPr>
-          <w:p>
-            <w:pPr>
-              <w:spacing w:before="0" w:after="60"/>
-              <w:keepNext/>
-              <w:jc w:val="start"/>
-            </w:pPr>
-            <w:r>
-              <w:rPr>
-                <w:rFonts w:ascii="Calibri" w:hAnsi="Calibri"/>
-                <w:sz w:val="20"/>
-              </w:rPr>
-              <w:t xml:space="default">134 (29.7%)</w:t>
-            </w:r>
-          </w:p>
-        </w:tc>
-        <w:tc>
-          <w:tcPr>
-            <w:tcBorders>
-              <w:top w:val="single" w:space="0" w:color="D3D3D3"/>
-              <w:bottom w:val="single" w:space="0" w:color="D3D3D3"/>
-              <w:start w:val="single" w:space="0" w:color="D3D3D3"/>
-              <w:end w:val="single" w:space="0" w:color="D3D3D3"/>
-            </w:tcBorders>
-          </w:tcPr>
-          <w:p>
-            <w:pPr>
-              <w:spacing w:before="0" w:after="60"/>
-              <w:keepNext/>
-              <w:jc w:val="start"/>
-            </w:pPr>
-            <w:r>
-              <w:rPr>
-                <w:rFonts w:ascii="Calibri" w:hAnsi="Calibri"/>
-                <w:sz w:val="20"/>
-              </w:rPr>
-              <w:t xml:space="default">226 (26.3%)</w:t>
+              <w:t xml:space="default">92 (23.6%)</w:t>
+            </w:r>
+          </w:p>
+        </w:tc>
+        <w:tc>
+          <w:tcPr>
+            <w:tcBorders>
+              <w:top w:val="single" w:space="0" w:color="D3D3D3"/>
+              <w:bottom w:val="single" w:space="0" w:color="D3D3D3"/>
+              <w:start w:val="single" w:space="0" w:color="D3D3D3"/>
+              <w:end w:val="single" w:space="0" w:color="D3D3D3"/>
+            </w:tcBorders>
+          </w:tcPr>
+          <w:p>
+            <w:pPr>
+              <w:spacing w:before="0" w:after="60"/>
+              <w:keepNext/>
+              <w:jc w:val="start"/>
+            </w:pPr>
+            <w:r>
+              <w:rPr>
+                <w:rFonts w:ascii="Calibri" w:hAnsi="Calibri"/>
+                <w:sz w:val="20"/>
+              </w:rPr>
+              <w:t xml:space="default">140 (29.1%)</w:t>
+            </w:r>
+          </w:p>
+        </w:tc>
+        <w:tc>
+          <w:tcPr>
+            <w:tcBorders>
+              <w:top w:val="single" w:space="0" w:color="D3D3D3"/>
+              <w:bottom w:val="single" w:space="0" w:color="D3D3D3"/>
+              <w:start w:val="single" w:space="0" w:color="D3D3D3"/>
+              <w:end w:val="single" w:space="0" w:color="D3D3D3"/>
+            </w:tcBorders>
+          </w:tcPr>
+          <w:p>
+            <w:pPr>
+              <w:spacing w:before="0" w:after="60"/>
+              <w:keepNext/>
+              <w:jc w:val="start"/>
+            </w:pPr>
+            <w:r>
+              <w:rPr>
+                <w:rFonts w:ascii="Calibri" w:hAnsi="Calibri"/>
+                <w:sz w:val="20"/>
+              </w:rPr>
+              <w:t xml:space="default">231 (26.6%)</w:t>
             </w:r>
           </w:p>
         </w:tc>
@@ -3838,7 +3838,7 @@
                 <w:rFonts w:ascii="Calibri" w:hAnsi="Calibri"/>
                 <w:sz w:val="20"/>
               </w:rPr>
-              <w:t xml:space="default">59.3%</w:t>
+              <w:t xml:space="default">60.3%</w:t>
             </w:r>
           </w:p>
         </w:tc>
@@ -4021,55 +4021,55 @@
                 <w:rFonts w:ascii="Calibri" w:hAnsi="Calibri"/>
                 <w:sz w:val="20"/>
               </w:rPr>
-              <w:t xml:space="default">46 (11.3%)</w:t>
-            </w:r>
-          </w:p>
-        </w:tc>
-        <w:tc>
-          <w:tcPr>
-            <w:tcBorders>
-              <w:top w:val="single" w:space="0" w:color="D3D3D3"/>
-              <w:bottom w:val="single" w:space="0" w:color="D3D3D3"/>
-              <w:start w:val="single" w:space="0" w:color="D3D3D3"/>
-              <w:end w:val="single" w:space="0" w:color="D3D3D3"/>
-            </w:tcBorders>
-          </w:tcPr>
-          <w:p>
-            <w:pPr>
-              <w:spacing w:before="0" w:after="60"/>
-              <w:keepNext/>
-              <w:jc w:val="start"/>
-            </w:pPr>
-            <w:r>
-              <w:rPr>
-                <w:rFonts w:ascii="Calibri" w:hAnsi="Calibri"/>
-                <w:sz w:val="20"/>
-              </w:rPr>
-              <w:t xml:space="default">37 (8.2%)</w:t>
-            </w:r>
-          </w:p>
-        </w:tc>
-        <w:tc>
-          <w:tcPr>
-            <w:tcBorders>
-              <w:top w:val="single" w:space="0" w:color="D3D3D3"/>
-              <w:bottom w:val="single" w:space="0" w:color="D3D3D3"/>
-              <w:start w:val="single" w:space="0" w:color="D3D3D3"/>
-              <w:end w:val="single" w:space="0" w:color="D3D3D3"/>
-            </w:tcBorders>
-          </w:tcPr>
-          <w:p>
-            <w:pPr>
-              <w:spacing w:before="0" w:after="60"/>
-              <w:keepNext/>
-              <w:jc w:val="start"/>
-            </w:pPr>
-            <w:r>
-              <w:rPr>
-                <w:rFonts w:ascii="Calibri" w:hAnsi="Calibri"/>
-                <w:sz w:val="20"/>
-              </w:rPr>
-              <w:t xml:space="default">83 (9.7%)</w:t>
+              <w:t xml:space="default">43 (11.2%)</w:t>
+            </w:r>
+          </w:p>
+        </w:tc>
+        <w:tc>
+          <w:tcPr>
+            <w:tcBorders>
+              <w:top w:val="single" w:space="0" w:color="D3D3D3"/>
+              <w:bottom w:val="single" w:space="0" w:color="D3D3D3"/>
+              <w:start w:val="single" w:space="0" w:color="D3D3D3"/>
+              <w:end w:val="single" w:space="0" w:color="D3D3D3"/>
+            </w:tcBorders>
+          </w:tcPr>
+          <w:p>
+            <w:pPr>
+              <w:spacing w:before="0" w:after="60"/>
+              <w:keepNext/>
+              <w:jc w:val="start"/>
+            </w:pPr>
+            <w:r>
+              <w:rPr>
+                <w:rFonts w:ascii="Calibri" w:hAnsi="Calibri"/>
+                <w:sz w:val="20"/>
+              </w:rPr>
+              <w:t xml:space="default">41 (8.5%)</w:t>
+            </w:r>
+          </w:p>
+        </w:tc>
+        <w:tc>
+          <w:tcPr>
+            <w:tcBorders>
+              <w:top w:val="single" w:space="0" w:color="D3D3D3"/>
+              <w:bottom w:val="single" w:space="0" w:color="D3D3D3"/>
+              <w:start w:val="single" w:space="0" w:color="D3D3D3"/>
+              <w:end w:val="single" w:space="0" w:color="D3D3D3"/>
+            </w:tcBorders>
+          </w:tcPr>
+          <w:p>
+            <w:pPr>
+              <w:spacing w:before="0" w:after="60"/>
+              <w:keepNext/>
+              <w:jc w:val="start"/>
+            </w:pPr>
+            <w:r>
+              <w:rPr>
+                <w:rFonts w:ascii="Calibri" w:hAnsi="Calibri"/>
+                <w:sz w:val="20"/>
+              </w:rPr>
+              <w:t xml:space="default">84 (9.7%)</w:t>
             </w:r>
           </w:p>
         </w:tc>
@@ -4093,7 +4093,7 @@
                 <w:rFonts w:ascii="Calibri" w:hAnsi="Calibri"/>
                 <w:sz w:val="20"/>
               </w:rPr>
-              <w:t xml:space="default">44.6%</w:t>
+              <w:t xml:space="default">48.5%</w:t>
             </w:r>
           </w:p>
         </w:tc>
@@ -4146,55 +4146,55 @@
                 <w:rFonts w:ascii="Calibri" w:hAnsi="Calibri"/>
                 <w:sz w:val="20"/>
               </w:rPr>
-              <w:t xml:space="default">86 (21%)</w:t>
-            </w:r>
-          </w:p>
-        </w:tc>
-        <w:tc>
-          <w:tcPr>
-            <w:tcBorders>
-              <w:top w:val="single" w:space="0" w:color="D3D3D3"/>
-              <w:bottom w:val="single" w:space="0" w:color="D3D3D3"/>
-              <w:start w:val="single" w:space="0" w:color="D3D3D3"/>
-              <w:end w:val="single" w:space="0" w:color="D3D3D3"/>
-            </w:tcBorders>
-          </w:tcPr>
-          <w:p>
-            <w:pPr>
-              <w:spacing w:before="0" w:after="60"/>
-              <w:keepNext/>
-              <w:jc w:val="start"/>
-            </w:pPr>
-            <w:r>
-              <w:rPr>
-                <w:rFonts w:ascii="Calibri" w:hAnsi="Calibri"/>
-                <w:sz w:val="20"/>
-              </w:rPr>
-              <w:t xml:space="default">107 (23.7%)</w:t>
-            </w:r>
-          </w:p>
-        </w:tc>
-        <w:tc>
-          <w:tcPr>
-            <w:tcBorders>
-              <w:top w:val="single" w:space="0" w:color="D3D3D3"/>
-              <w:bottom w:val="single" w:space="0" w:color="D3D3D3"/>
-              <w:start w:val="single" w:space="0" w:color="D3D3D3"/>
-              <w:end w:val="single" w:space="0" w:color="D3D3D3"/>
-            </w:tcBorders>
-          </w:tcPr>
-          <w:p>
-            <w:pPr>
-              <w:spacing w:before="0" w:after="60"/>
-              <w:keepNext/>
-              <w:jc w:val="start"/>
-            </w:pPr>
-            <w:r>
-              <w:rPr>
-                <w:rFonts w:ascii="Calibri" w:hAnsi="Calibri"/>
-                <w:sz w:val="20"/>
-              </w:rPr>
-              <w:t xml:space="default">192 (22.4%)</w:t>
+              <w:t xml:space="default">84 (21.5%)</w:t>
+            </w:r>
+          </w:p>
+        </w:tc>
+        <w:tc>
+          <w:tcPr>
+            <w:tcBorders>
+              <w:top w:val="single" w:space="0" w:color="D3D3D3"/>
+              <w:bottom w:val="single" w:space="0" w:color="D3D3D3"/>
+              <w:start w:val="single" w:space="0" w:color="D3D3D3"/>
+              <w:end w:val="single" w:space="0" w:color="D3D3D3"/>
+            </w:tcBorders>
+          </w:tcPr>
+          <w:p>
+            <w:pPr>
+              <w:spacing w:before="0" w:after="60"/>
+              <w:keepNext/>
+              <w:jc w:val="start"/>
+            </w:pPr>
+            <w:r>
+              <w:rPr>
+                <w:rFonts w:ascii="Calibri" w:hAnsi="Calibri"/>
+                <w:sz w:val="20"/>
+              </w:rPr>
+              <w:t xml:space="default">110 (23%)</w:t>
+            </w:r>
+          </w:p>
+        </w:tc>
+        <w:tc>
+          <w:tcPr>
+            <w:tcBorders>
+              <w:top w:val="single" w:space="0" w:color="D3D3D3"/>
+              <w:bottom w:val="single" w:space="0" w:color="D3D3D3"/>
+              <w:start w:val="single" w:space="0" w:color="D3D3D3"/>
+              <w:end w:val="single" w:space="0" w:color="D3D3D3"/>
+            </w:tcBorders>
+          </w:tcPr>
+          <w:p>
+            <w:pPr>
+              <w:spacing w:before="0" w:after="60"/>
+              <w:keepNext/>
+              <w:jc w:val="start"/>
+            </w:pPr>
+            <w:r>
+              <w:rPr>
+                <w:rFonts w:ascii="Calibri" w:hAnsi="Calibri"/>
+                <w:sz w:val="20"/>
+              </w:rPr>
+              <w:t xml:space="default">194 (22.3%)</w:t>
             </w:r>
           </w:p>
         </w:tc>
@@ -4218,7 +4218,7 @@
                 <w:rFonts w:ascii="Calibri" w:hAnsi="Calibri"/>
                 <w:sz w:val="20"/>
               </w:rPr>
-              <w:t xml:space="default">55.5%</w:t>
+              <w:t xml:space="default">56.9%</w:t>
             </w:r>
           </w:p>
         </w:tc>
@@ -4271,55 +4271,55 @@
                 <w:rFonts w:ascii="Calibri" w:hAnsi="Calibri"/>
                 <w:sz w:val="20"/>
               </w:rPr>
-              <w:t xml:space="default">181 (44.5%)</w:t>
-            </w:r>
-          </w:p>
-        </w:tc>
-        <w:tc>
-          <w:tcPr>
-            <w:tcBorders>
-              <w:top w:val="single" w:space="0" w:color="D3D3D3"/>
-              <w:bottom w:val="single" w:space="0" w:color="D3D3D3"/>
-              <w:start w:val="single" w:space="0" w:color="D3D3D3"/>
-              <w:end w:val="single" w:space="0" w:color="D3D3D3"/>
-            </w:tcBorders>
-          </w:tcPr>
-          <w:p>
-            <w:pPr>
-              <w:spacing w:before="0" w:after="60"/>
-              <w:keepNext/>
-              <w:jc w:val="start"/>
-            </w:pPr>
-            <w:r>
-              <w:rPr>
-                <w:rFonts w:ascii="Calibri" w:hAnsi="Calibri"/>
-                <w:sz w:val="20"/>
-              </w:rPr>
-              <w:t xml:space="default">229 (50.8%)</w:t>
-            </w:r>
-          </w:p>
-        </w:tc>
-        <w:tc>
-          <w:tcPr>
-            <w:tcBorders>
-              <w:top w:val="single" w:space="0" w:color="D3D3D3"/>
-              <w:bottom w:val="single" w:space="0" w:color="D3D3D3"/>
-              <w:start w:val="single" w:space="0" w:color="D3D3D3"/>
-              <w:end w:val="single" w:space="0" w:color="D3D3D3"/>
-            </w:tcBorders>
-          </w:tcPr>
-          <w:p>
-            <w:pPr>
-              <w:spacing w:before="0" w:after="60"/>
-              <w:keepNext/>
-              <w:jc w:val="start"/>
-            </w:pPr>
-            <w:r>
-              <w:rPr>
-                <w:rFonts w:ascii="Calibri" w:hAnsi="Calibri"/>
-                <w:sz w:val="20"/>
-              </w:rPr>
-              <w:t xml:space="default">411 (47.8%)</w:t>
+              <w:t xml:space="default">172 (44%)</w:t>
+            </w:r>
+          </w:p>
+        </w:tc>
+        <w:tc>
+          <w:tcPr>
+            <w:tcBorders>
+              <w:top w:val="single" w:space="0" w:color="D3D3D3"/>
+              <w:bottom w:val="single" w:space="0" w:color="D3D3D3"/>
+              <w:start w:val="single" w:space="0" w:color="D3D3D3"/>
+              <w:end w:val="single" w:space="0" w:color="D3D3D3"/>
+            </w:tcBorders>
+          </w:tcPr>
+          <w:p>
+            <w:pPr>
+              <w:spacing w:before="0" w:after="60"/>
+              <w:keepNext/>
+              <w:jc w:val="start"/>
+            </w:pPr>
+            <w:r>
+              <w:rPr>
+                <w:rFonts w:ascii="Calibri" w:hAnsi="Calibri"/>
+                <w:sz w:val="20"/>
+              </w:rPr>
+              <w:t xml:space="default">244 (51%)</w:t>
+            </w:r>
+          </w:p>
+        </w:tc>
+        <w:tc>
+          <w:tcPr>
+            <w:tcBorders>
+              <w:top w:val="single" w:space="0" w:color="D3D3D3"/>
+              <w:bottom w:val="single" w:space="0" w:color="D3D3D3"/>
+              <w:start w:val="single" w:space="0" w:color="D3D3D3"/>
+              <w:end w:val="single" w:space="0" w:color="D3D3D3"/>
+            </w:tcBorders>
+          </w:tcPr>
+          <w:p>
+            <w:pPr>
+              <w:spacing w:before="0" w:after="60"/>
+              <w:keepNext/>
+              <w:jc w:val="start"/>
+            </w:pPr>
+            <w:r>
+              <w:rPr>
+                <w:rFonts w:ascii="Calibri" w:hAnsi="Calibri"/>
+                <w:sz w:val="20"/>
+              </w:rPr>
+              <w:t xml:space="default">416 (47.8%)</w:t>
             </w:r>
           </w:p>
         </w:tc>
@@ -4343,7 +4343,7 @@
                 <w:rFonts w:ascii="Calibri" w:hAnsi="Calibri"/>
                 <w:sz w:val="20"/>
               </w:rPr>
-              <w:t xml:space="default">55.8%</w:t>
+              <w:t xml:space="default">58.8%</w:t>
             </w:r>
           </w:p>
         </w:tc>
@@ -4396,55 +4396,55 @@
                 <w:rFonts w:ascii="Calibri" w:hAnsi="Calibri"/>
                 <w:sz w:val="20"/>
               </w:rPr>
-              <w:t xml:space="default">42 (10.2%)</w:t>
-            </w:r>
-          </w:p>
-        </w:tc>
-        <w:tc>
-          <w:tcPr>
-            <w:tcBorders>
-              <w:top w:val="single" w:space="0" w:color="D3D3D3"/>
-              <w:bottom w:val="single" w:space="0" w:color="D3D3D3"/>
-              <w:start w:val="single" w:space="0" w:color="D3D3D3"/>
-              <w:end w:val="single" w:space="0" w:color="D3D3D3"/>
-            </w:tcBorders>
-          </w:tcPr>
-          <w:p>
-            <w:pPr>
-              <w:spacing w:before="0" w:after="60"/>
-              <w:keepNext/>
-              <w:jc w:val="start"/>
-            </w:pPr>
-            <w:r>
-              <w:rPr>
-                <w:rFonts w:ascii="Calibri" w:hAnsi="Calibri"/>
-                <w:sz w:val="20"/>
-              </w:rPr>
-              <w:t xml:space="default">40 (8.9%)</w:t>
-            </w:r>
-          </w:p>
-        </w:tc>
-        <w:tc>
-          <w:tcPr>
-            <w:tcBorders>
-              <w:top w:val="single" w:space="0" w:color="D3D3D3"/>
-              <w:bottom w:val="single" w:space="0" w:color="D3D3D3"/>
-              <w:start w:val="single" w:space="0" w:color="D3D3D3"/>
-              <w:end w:val="single" w:space="0" w:color="D3D3D3"/>
-            </w:tcBorders>
-          </w:tcPr>
-          <w:p>
-            <w:pPr>
-              <w:spacing w:before="0" w:after="60"/>
-              <w:keepNext/>
-              <w:jc w:val="start"/>
-            </w:pPr>
-            <w:r>
-              <w:rPr>
-                <w:rFonts w:ascii="Calibri" w:hAnsi="Calibri"/>
-                <w:sz w:val="20"/>
-              </w:rPr>
-              <w:t xml:space="default">82 (9.5%)</w:t>
+              <w:t xml:space="default">40 (10.3%)</w:t>
+            </w:r>
+          </w:p>
+        </w:tc>
+        <w:tc>
+          <w:tcPr>
+            <w:tcBorders>
+              <w:top w:val="single" w:space="0" w:color="D3D3D3"/>
+              <w:bottom w:val="single" w:space="0" w:color="D3D3D3"/>
+              <w:start w:val="single" w:space="0" w:color="D3D3D3"/>
+              <w:end w:val="single" w:space="0" w:color="D3D3D3"/>
+            </w:tcBorders>
+          </w:tcPr>
+          <w:p>
+            <w:pPr>
+              <w:spacing w:before="0" w:after="60"/>
+              <w:keepNext/>
+              <w:jc w:val="start"/>
+            </w:pPr>
+            <w:r>
+              <w:rPr>
+                <w:rFonts w:ascii="Calibri" w:hAnsi="Calibri"/>
+                <w:sz w:val="20"/>
+              </w:rPr>
+              <w:t xml:space="default">44 (9.2%)</w:t>
+            </w:r>
+          </w:p>
+        </w:tc>
+        <w:tc>
+          <w:tcPr>
+            <w:tcBorders>
+              <w:top w:val="single" w:space="0" w:color="D3D3D3"/>
+              <w:bottom w:val="single" w:space="0" w:color="D3D3D3"/>
+              <w:start w:val="single" w:space="0" w:color="D3D3D3"/>
+              <w:end w:val="single" w:space="0" w:color="D3D3D3"/>
+            </w:tcBorders>
+          </w:tcPr>
+          <w:p>
+            <w:pPr>
+              <w:spacing w:before="0" w:after="60"/>
+              <w:keepNext/>
+              <w:jc w:val="start"/>
+            </w:pPr>
+            <w:r>
+              <w:rPr>
+                <w:rFonts w:ascii="Calibri" w:hAnsi="Calibri"/>
+                <w:sz w:val="20"/>
+              </w:rPr>
+              <w:t xml:space="default">84 (9.7%)</w:t>
             </w:r>
           </w:p>
         </w:tc>
@@ -4468,7 +4468,7 @@
                 <w:rFonts w:ascii="Calibri" w:hAnsi="Calibri"/>
                 <w:sz w:val="20"/>
               </w:rPr>
-              <w:t xml:space="default">49.1%</w:t>
+              <w:t xml:space="default">52.4%</w:t>
             </w:r>
           </w:p>
         </w:tc>
@@ -4521,55 +4521,55 @@
                 <w:rFonts w:ascii="Calibri" w:hAnsi="Calibri"/>
                 <w:sz w:val="20"/>
               </w:rPr>
-              <w:t xml:space="default">51 (12.6%)</w:t>
-            </w:r>
-          </w:p>
-        </w:tc>
-        <w:tc>
-          <w:tcPr>
-            <w:tcBorders>
-              <w:top w:val="single" w:space="0" w:color="D3D3D3"/>
-              <w:bottom w:val="single" w:space="0" w:color="D3D3D3"/>
-              <w:start w:val="single" w:space="0" w:color="D3D3D3"/>
-              <w:end w:val="single" w:space="0" w:color="D3D3D3"/>
-            </w:tcBorders>
-          </w:tcPr>
-          <w:p>
-            <w:pPr>
-              <w:spacing w:before="0" w:after="60"/>
-              <w:keepNext/>
-              <w:jc w:val="start"/>
-            </w:pPr>
-            <w:r>
-              <w:rPr>
-                <w:rFonts w:ascii="Calibri" w:hAnsi="Calibri"/>
-                <w:sz w:val="20"/>
-              </w:rPr>
-              <w:t xml:space="default">37 (8.2%)</w:t>
-            </w:r>
-          </w:p>
-        </w:tc>
-        <w:tc>
-          <w:tcPr>
-            <w:tcBorders>
-              <w:top w:val="single" w:space="0" w:color="D3D3D3"/>
-              <w:bottom w:val="single" w:space="0" w:color="D3D3D3"/>
-              <w:start w:val="single" w:space="0" w:color="D3D3D3"/>
-              <w:end w:val="single" w:space="0" w:color="D3D3D3"/>
-            </w:tcBorders>
-          </w:tcPr>
-          <w:p>
-            <w:pPr>
-              <w:spacing w:before="0" w:after="60"/>
-              <w:keepNext/>
-              <w:jc w:val="start"/>
-            </w:pPr>
-            <w:r>
-              <w:rPr>
-                <w:rFonts w:ascii="Calibri" w:hAnsi="Calibri"/>
-                <w:sz w:val="20"/>
-              </w:rPr>
-              <w:t xml:space="default">88 (10.3%)</w:t>
+              <w:t xml:space="default">50 (12.8%)</w:t>
+            </w:r>
+          </w:p>
+        </w:tc>
+        <w:tc>
+          <w:tcPr>
+            <w:tcBorders>
+              <w:top w:val="single" w:space="0" w:color="D3D3D3"/>
+              <w:bottom w:val="single" w:space="0" w:color="D3D3D3"/>
+              <w:start w:val="single" w:space="0" w:color="D3D3D3"/>
+              <w:end w:val="single" w:space="0" w:color="D3D3D3"/>
+            </w:tcBorders>
+          </w:tcPr>
+          <w:p>
+            <w:pPr>
+              <w:spacing w:before="0" w:after="60"/>
+              <w:keepNext/>
+              <w:jc w:val="start"/>
+            </w:pPr>
+            <w:r>
+              <w:rPr>
+                <w:rFonts w:ascii="Calibri" w:hAnsi="Calibri"/>
+                <w:sz w:val="20"/>
+              </w:rPr>
+              <w:t xml:space="default">39 (8%)</w:t>
+            </w:r>
+          </w:p>
+        </w:tc>
+        <w:tc>
+          <w:tcPr>
+            <w:tcBorders>
+              <w:top w:val="single" w:space="0" w:color="D3D3D3"/>
+              <w:bottom w:val="single" w:space="0" w:color="D3D3D3"/>
+              <w:start w:val="single" w:space="0" w:color="D3D3D3"/>
+              <w:end w:val="single" w:space="0" w:color="D3D3D3"/>
+            </w:tcBorders>
+          </w:tcPr>
+          <w:p>
+            <w:pPr>
+              <w:spacing w:before="0" w:after="60"/>
+              <w:keepNext/>
+              <w:jc w:val="start"/>
+            </w:pPr>
+            <w:r>
+              <w:rPr>
+                <w:rFonts w:ascii="Calibri" w:hAnsi="Calibri"/>
+                <w:sz w:val="20"/>
+              </w:rPr>
+              <w:t xml:space="default">88 (10.2%)</w:t>
             </w:r>
           </w:p>
         </w:tc>
@@ -4593,7 +4593,7 @@
                 <w:rFonts w:ascii="Calibri" w:hAnsi="Calibri"/>
                 <w:sz w:val="20"/>
               </w:rPr>
-              <w:t xml:space="default">41.8%</w:t>
+              <w:t xml:space="default">43.5%</w:t>
             </w:r>
           </w:p>
         </w:tc>
@@ -4776,55 +4776,55 @@
                 <w:rFonts w:ascii="Calibri" w:hAnsi="Calibri"/>
                 <w:sz w:val="20"/>
               </w:rPr>
-              <w:t xml:space="default">62 (15.2%)</w:t>
-            </w:r>
-          </w:p>
-        </w:tc>
-        <w:tc>
-          <w:tcPr>
-            <w:tcBorders>
-              <w:top w:val="single" w:space="0" w:color="D3D3D3"/>
-              <w:bottom w:val="single" w:space="0" w:color="D3D3D3"/>
-              <w:start w:val="single" w:space="0" w:color="D3D3D3"/>
-              <w:end w:val="single" w:space="0" w:color="D3D3D3"/>
-            </w:tcBorders>
-          </w:tcPr>
-          <w:p>
-            <w:pPr>
-              <w:spacing w:before="0" w:after="60"/>
-              <w:keepNext/>
-              <w:jc w:val="start"/>
-            </w:pPr>
-            <w:r>
-              <w:rPr>
-                <w:rFonts w:ascii="Calibri" w:hAnsi="Calibri"/>
-                <w:sz w:val="20"/>
-              </w:rPr>
-              <w:t xml:space="default">66 (14.7%)</w:t>
-            </w:r>
-          </w:p>
-        </w:tc>
-        <w:tc>
-          <w:tcPr>
-            <w:tcBorders>
-              <w:top w:val="single" w:space="0" w:color="D3D3D3"/>
-              <w:bottom w:val="single" w:space="0" w:color="D3D3D3"/>
-              <w:start w:val="single" w:space="0" w:color="D3D3D3"/>
-              <w:end w:val="single" w:space="0" w:color="D3D3D3"/>
-            </w:tcBorders>
-          </w:tcPr>
-          <w:p>
-            <w:pPr>
-              <w:spacing w:before="0" w:after="60"/>
-              <w:keepNext/>
-              <w:jc w:val="start"/>
-            </w:pPr>
-            <w:r>
-              <w:rPr>
-                <w:rFonts w:ascii="Calibri" w:hAnsi="Calibri"/>
-                <w:sz w:val="20"/>
-              </w:rPr>
-              <w:t xml:space="default">128 (14.9%)</w:t>
+              <w:t xml:space="default">61 (15.6%)</w:t>
+            </w:r>
+          </w:p>
+        </w:tc>
+        <w:tc>
+          <w:tcPr>
+            <w:tcBorders>
+              <w:top w:val="single" w:space="0" w:color="D3D3D3"/>
+              <w:bottom w:val="single" w:space="0" w:color="D3D3D3"/>
+              <w:start w:val="single" w:space="0" w:color="D3D3D3"/>
+              <w:end w:val="single" w:space="0" w:color="D3D3D3"/>
+            </w:tcBorders>
+          </w:tcPr>
+          <w:p>
+            <w:pPr>
+              <w:spacing w:before="0" w:after="60"/>
+              <w:keepNext/>
+              <w:jc w:val="start"/>
+            </w:pPr>
+            <w:r>
+              <w:rPr>
+                <w:rFonts w:ascii="Calibri" w:hAnsi="Calibri"/>
+                <w:sz w:val="20"/>
+              </w:rPr>
+              <w:t xml:space="default">69 (14.3%)</w:t>
+            </w:r>
+          </w:p>
+        </w:tc>
+        <w:tc>
+          <w:tcPr>
+            <w:tcBorders>
+              <w:top w:val="single" w:space="0" w:color="D3D3D3"/>
+              <w:bottom w:val="single" w:space="0" w:color="D3D3D3"/>
+              <w:start w:val="single" w:space="0" w:color="D3D3D3"/>
+              <w:end w:val="single" w:space="0" w:color="D3D3D3"/>
+            </w:tcBorders>
+          </w:tcPr>
+          <w:p>
+            <w:pPr>
+              <w:spacing w:before="0" w:after="60"/>
+              <w:keepNext/>
+              <w:jc w:val="start"/>
+            </w:pPr>
+            <w:r>
+              <w:rPr>
+                <w:rFonts w:ascii="Calibri" w:hAnsi="Calibri"/>
+                <w:sz w:val="20"/>
+              </w:rPr>
+              <w:t xml:space="default">129 (14.9%)</w:t>
             </w:r>
           </w:p>
         </w:tc>
@@ -4848,7 +4848,7 @@
                 <w:rFonts w:ascii="Calibri" w:hAnsi="Calibri"/>
                 <w:sz w:val="20"/>
               </w:rPr>
-              <w:t xml:space="default">51.6%</w:t>
+              <w:t xml:space="default">53%</w:t>
             </w:r>
           </w:p>
         </w:tc>
@@ -4901,55 +4901,55 @@
                 <w:rFonts w:ascii="Calibri" w:hAnsi="Calibri"/>
                 <w:sz w:val="20"/>
               </w:rPr>
-              <w:t xml:space="default">88 (21.7%)</w:t>
-            </w:r>
-          </w:p>
-        </w:tc>
-        <w:tc>
-          <w:tcPr>
-            <w:tcBorders>
-              <w:top w:val="single" w:space="0" w:color="D3D3D3"/>
-              <w:bottom w:val="single" w:space="0" w:color="D3D3D3"/>
-              <w:start w:val="single" w:space="0" w:color="D3D3D3"/>
-              <w:end w:val="single" w:space="0" w:color="D3D3D3"/>
-            </w:tcBorders>
-          </w:tcPr>
-          <w:p>
-            <w:pPr>
-              <w:spacing w:before="0" w:after="60"/>
-              <w:keepNext/>
-              <w:jc w:val="start"/>
-            </w:pPr>
-            <w:r>
-              <w:rPr>
-                <w:rFonts w:ascii="Calibri" w:hAnsi="Calibri"/>
-                <w:sz w:val="20"/>
-              </w:rPr>
-              <w:t xml:space="default">105 (23.2%)</w:t>
-            </w:r>
-          </w:p>
-        </w:tc>
-        <w:tc>
-          <w:tcPr>
-            <w:tcBorders>
-              <w:top w:val="single" w:space="0" w:color="D3D3D3"/>
-              <w:bottom w:val="single" w:space="0" w:color="D3D3D3"/>
-              <w:start w:val="single" w:space="0" w:color="D3D3D3"/>
-              <w:end w:val="single" w:space="0" w:color="D3D3D3"/>
-            </w:tcBorders>
-          </w:tcPr>
-          <w:p>
-            <w:pPr>
-              <w:spacing w:before="0" w:after="60"/>
-              <w:keepNext/>
-              <w:jc w:val="start"/>
-            </w:pPr>
-            <w:r>
-              <w:rPr>
-                <w:rFonts w:ascii="Calibri" w:hAnsi="Calibri"/>
-                <w:sz w:val="20"/>
-              </w:rPr>
-              <w:t xml:space="default">193 (22.5%)</w:t>
+              <w:t xml:space="default">86 (22.1%)</w:t>
+            </w:r>
+          </w:p>
+        </w:tc>
+        <w:tc>
+          <w:tcPr>
+            <w:tcBorders>
+              <w:top w:val="single" w:space="0" w:color="D3D3D3"/>
+              <w:bottom w:val="single" w:space="0" w:color="D3D3D3"/>
+              <w:start w:val="single" w:space="0" w:color="D3D3D3"/>
+              <w:end w:val="single" w:space="0" w:color="D3D3D3"/>
+            </w:tcBorders>
+          </w:tcPr>
+          <w:p>
+            <w:pPr>
+              <w:spacing w:before="0" w:after="60"/>
+              <w:keepNext/>
+              <w:jc w:val="start"/>
+            </w:pPr>
+            <w:r>
+              <w:rPr>
+                <w:rFonts w:ascii="Calibri" w:hAnsi="Calibri"/>
+                <w:sz w:val="20"/>
+              </w:rPr>
+              <w:t xml:space="default">108 (22.5%)</w:t>
+            </w:r>
+          </w:p>
+        </w:tc>
+        <w:tc>
+          <w:tcPr>
+            <w:tcBorders>
+              <w:top w:val="single" w:space="0" w:color="D3D3D3"/>
+              <w:bottom w:val="single" w:space="0" w:color="D3D3D3"/>
+              <w:start w:val="single" w:space="0" w:color="D3D3D3"/>
+              <w:end w:val="single" w:space="0" w:color="D3D3D3"/>
+            </w:tcBorders>
+          </w:tcPr>
+          <w:p>
+            <w:pPr>
+              <w:spacing w:before="0" w:after="60"/>
+              <w:keepNext/>
+              <w:jc w:val="start"/>
+            </w:pPr>
+            <w:r>
+              <w:rPr>
+                <w:rFonts w:ascii="Calibri" w:hAnsi="Calibri"/>
+                <w:sz w:val="20"/>
+              </w:rPr>
+              <w:t xml:space="default">194 (22.3%)</w:t>
             </w:r>
           </w:p>
         </w:tc>
@@ -4973,7 +4973,7 @@
                 <w:rFonts w:ascii="Calibri" w:hAnsi="Calibri"/>
                 <w:sz w:val="20"/>
               </w:rPr>
-              <w:t xml:space="default">54.2%</w:t>
+              <w:t xml:space="default">55.5%</w:t>
             </w:r>
           </w:p>
         </w:tc>
@@ -5026,55 +5026,55 @@
                 <w:rFonts w:ascii="Calibri" w:hAnsi="Calibri"/>
                 <w:sz w:val="20"/>
               </w:rPr>
-              <w:t xml:space="default">144 (35.4%)</w:t>
-            </w:r>
-          </w:p>
-        </w:tc>
-        <w:tc>
-          <w:tcPr>
-            <w:tcBorders>
-              <w:top w:val="single" w:space="0" w:color="D3D3D3"/>
-              <w:bottom w:val="single" w:space="0" w:color="D3D3D3"/>
-              <w:start w:val="single" w:space="0" w:color="D3D3D3"/>
-              <w:end w:val="single" w:space="0" w:color="D3D3D3"/>
-            </w:tcBorders>
-          </w:tcPr>
-          <w:p>
-            <w:pPr>
-              <w:spacing w:before="0" w:after="60"/>
-              <w:keepNext/>
-              <w:jc w:val="start"/>
-            </w:pPr>
-            <w:r>
-              <w:rPr>
-                <w:rFonts w:ascii="Calibri" w:hAnsi="Calibri"/>
-                <w:sz w:val="20"/>
-              </w:rPr>
-              <w:t xml:space="default">113 (25%)</w:t>
-            </w:r>
-          </w:p>
-        </w:tc>
-        <w:tc>
-          <w:tcPr>
-            <w:tcBorders>
-              <w:top w:val="single" w:space="0" w:color="D3D3D3"/>
-              <w:bottom w:val="single" w:space="0" w:color="D3D3D3"/>
-              <w:start w:val="single" w:space="0" w:color="D3D3D3"/>
-              <w:end w:val="single" w:space="0" w:color="D3D3D3"/>
-            </w:tcBorders>
-          </w:tcPr>
-          <w:p>
-            <w:pPr>
-              <w:spacing w:before="0" w:after="60"/>
-              <w:keepNext/>
-              <w:jc w:val="start"/>
-            </w:pPr>
-            <w:r>
-              <w:rPr>
-                <w:rFonts w:ascii="Calibri" w:hAnsi="Calibri"/>
-                <w:sz w:val="20"/>
-              </w:rPr>
-              <w:t xml:space="default">257 (30%)</w:t>
+              <w:t xml:space="default">138 (35.4%)</w:t>
+            </w:r>
+          </w:p>
+        </w:tc>
+        <w:tc>
+          <w:tcPr>
+            <w:tcBorders>
+              <w:top w:val="single" w:space="0" w:color="D3D3D3"/>
+              <w:bottom w:val="single" w:space="0" w:color="D3D3D3"/>
+              <w:start w:val="single" w:space="0" w:color="D3D3D3"/>
+              <w:end w:val="single" w:space="0" w:color="D3D3D3"/>
+            </w:tcBorders>
+          </w:tcPr>
+          <w:p>
+            <w:pPr>
+              <w:spacing w:before="0" w:after="60"/>
+              <w:keepNext/>
+              <w:jc w:val="start"/>
+            </w:pPr>
+            <w:r>
+              <w:rPr>
+                <w:rFonts w:ascii="Calibri" w:hAnsi="Calibri"/>
+                <w:sz w:val="20"/>
+              </w:rPr>
+              <w:t xml:space="default">122 (25.4%)</w:t>
+            </w:r>
+          </w:p>
+        </w:tc>
+        <w:tc>
+          <w:tcPr>
+            <w:tcBorders>
+              <w:top w:val="single" w:space="0" w:color="D3D3D3"/>
+              <w:bottom w:val="single" w:space="0" w:color="D3D3D3"/>
+              <w:start w:val="single" w:space="0" w:color="D3D3D3"/>
+              <w:end w:val="single" w:space="0" w:color="D3D3D3"/>
+            </w:tcBorders>
+          </w:tcPr>
+          <w:p>
+            <w:pPr>
+              <w:spacing w:before="0" w:after="60"/>
+              <w:keepNext/>
+              <w:jc w:val="start"/>
+            </w:pPr>
+            <w:r>
+              <w:rPr>
+                <w:rFonts w:ascii="Calibri" w:hAnsi="Calibri"/>
+                <w:sz w:val="20"/>
+              </w:rPr>
+              <w:t xml:space="default">260 (29.9%)</w:t>
             </w:r>
           </w:p>
         </w:tc>
@@ -5098,7 +5098,7 @@
                 <w:rFonts w:ascii="Calibri" w:hAnsi="Calibri"/>
                 <w:sz w:val="20"/>
               </w:rPr>
-              <w:t xml:space="default">43.9%</w:t>
+              <w:t xml:space="default">46.8%</w:t>
             </w:r>
           </w:p>
         </w:tc>
@@ -5151,55 +5151,55 @@
                 <w:rFonts w:ascii="Calibri" w:hAnsi="Calibri"/>
                 <w:sz w:val="20"/>
               </w:rPr>
-              <w:t xml:space="default">64 (15.7%)</w:t>
-            </w:r>
-          </w:p>
-        </w:tc>
-        <w:tc>
-          <w:tcPr>
-            <w:tcBorders>
-              <w:top w:val="single" w:space="0" w:color="D3D3D3"/>
-              <w:bottom w:val="single" w:space="0" w:color="D3D3D3"/>
-              <w:start w:val="single" w:space="0" w:color="D3D3D3"/>
-              <w:end w:val="single" w:space="0" w:color="D3D3D3"/>
-            </w:tcBorders>
-          </w:tcPr>
-          <w:p>
-            <w:pPr>
-              <w:spacing w:before="0" w:after="60"/>
-              <w:keepNext/>
-              <w:jc w:val="start"/>
-            </w:pPr>
-            <w:r>
-              <w:rPr>
-                <w:rFonts w:ascii="Calibri" w:hAnsi="Calibri"/>
-                <w:sz w:val="20"/>
-              </w:rPr>
-              <w:t xml:space="default">110 (24.3%)</w:t>
-            </w:r>
-          </w:p>
-        </w:tc>
-        <w:tc>
-          <w:tcPr>
-            <w:tcBorders>
-              <w:top w:val="single" w:space="0" w:color="D3D3D3"/>
-              <w:bottom w:val="single" w:space="0" w:color="D3D3D3"/>
-              <w:start w:val="single" w:space="0" w:color="D3D3D3"/>
-              <w:end w:val="single" w:space="0" w:color="D3D3D3"/>
-            </w:tcBorders>
-          </w:tcPr>
-          <w:p>
-            <w:pPr>
-              <w:spacing w:before="0" w:after="60"/>
-              <w:keepNext/>
-              <w:jc w:val="start"/>
-            </w:pPr>
-            <w:r>
-              <w:rPr>
-                <w:rFonts w:ascii="Calibri" w:hAnsi="Calibri"/>
-                <w:sz w:val="20"/>
-              </w:rPr>
-              <w:t xml:space="default">174 (20.2%)</w:t>
+              <w:t xml:space="default">64 (16.4%)</w:t>
+            </w:r>
+          </w:p>
+        </w:tc>
+        <w:tc>
+          <w:tcPr>
+            <w:tcBorders>
+              <w:top w:val="single" w:space="0" w:color="D3D3D3"/>
+              <w:bottom w:val="single" w:space="0" w:color="D3D3D3"/>
+              <w:start w:val="single" w:space="0" w:color="D3D3D3"/>
+              <w:end w:val="single" w:space="0" w:color="D3D3D3"/>
+            </w:tcBorders>
+          </w:tcPr>
+          <w:p>
+            <w:pPr>
+              <w:spacing w:before="0" w:after="60"/>
+              <w:keepNext/>
+              <w:jc w:val="start"/>
+            </w:pPr>
+            <w:r>
+              <w:rPr>
+                <w:rFonts w:ascii="Calibri" w:hAnsi="Calibri"/>
+                <w:sz w:val="20"/>
+              </w:rPr>
+              <w:t xml:space="default">116 (24.2%)</w:t>
+            </w:r>
+          </w:p>
+        </w:tc>
+        <w:tc>
+          <w:tcPr>
+            <w:tcBorders>
+              <w:top w:val="single" w:space="0" w:color="D3D3D3"/>
+              <w:bottom w:val="single" w:space="0" w:color="D3D3D3"/>
+              <w:start w:val="single" w:space="0" w:color="D3D3D3"/>
+              <w:end w:val="single" w:space="0" w:color="D3D3D3"/>
+            </w:tcBorders>
+          </w:tcPr>
+          <w:p>
+            <w:pPr>
+              <w:spacing w:before="0" w:after="60"/>
+              <w:keepNext/>
+              <w:jc w:val="start"/>
+            </w:pPr>
+            <w:r>
+              <w:rPr>
+                <w:rFonts w:ascii="Calibri" w:hAnsi="Calibri"/>
+                <w:sz w:val="20"/>
+              </w:rPr>
+              <w:t xml:space="default">180 (20.7%)</w:t>
             </w:r>
           </w:p>
         </w:tc>
@@ -5223,7 +5223,7 @@
                 <w:rFonts w:ascii="Calibri" w:hAnsi="Calibri"/>
                 <w:sz w:val="20"/>
               </w:rPr>
-              <w:t xml:space="default">63.1%</w:t>
+              <w:t xml:space="default">64.4%</w:t>
             </w:r>
           </w:p>
         </w:tc>
@@ -5406,31 +5406,31 @@
                 <w:rFonts w:ascii="Calibri" w:hAnsi="Calibri"/>
                 <w:sz w:val="20"/>
               </w:rPr>
-              <w:t xml:space="default">25 (6.2%)</w:t>
-            </w:r>
-          </w:p>
-        </w:tc>
-        <w:tc>
-          <w:tcPr>
-            <w:tcBorders>
-              <w:top w:val="single" w:space="0" w:color="D3D3D3"/>
-              <w:bottom w:val="single" w:space="0" w:color="D3D3D3"/>
-              <w:start w:val="single" w:space="0" w:color="D3D3D3"/>
-              <w:end w:val="single" w:space="0" w:color="D3D3D3"/>
-            </w:tcBorders>
-          </w:tcPr>
-          <w:p>
-            <w:pPr>
-              <w:spacing w:before="0" w:after="60"/>
-              <w:keepNext/>
-              <w:jc w:val="start"/>
-            </w:pPr>
-            <w:r>
-              <w:rPr>
-                <w:rFonts w:ascii="Calibri" w:hAnsi="Calibri"/>
-                <w:sz w:val="20"/>
-              </w:rPr>
-              <w:t xml:space="default">11 (2.4%)</w:t>
+              <w:t xml:space="default">25 (6.5%)</w:t>
+            </w:r>
+          </w:p>
+        </w:tc>
+        <w:tc>
+          <w:tcPr>
+            <w:tcBorders>
+              <w:top w:val="single" w:space="0" w:color="D3D3D3"/>
+              <w:bottom w:val="single" w:space="0" w:color="D3D3D3"/>
+              <w:start w:val="single" w:space="0" w:color="D3D3D3"/>
+              <w:end w:val="single" w:space="0" w:color="D3D3D3"/>
+            </w:tcBorders>
+          </w:tcPr>
+          <w:p>
+            <w:pPr>
+              <w:spacing w:before="0" w:after="60"/>
+              <w:keepNext/>
+              <w:jc w:val="start"/>
+            </w:pPr>
+            <w:r>
+              <w:rPr>
+                <w:rFonts w:ascii="Calibri" w:hAnsi="Calibri"/>
+                <w:sz w:val="20"/>
+              </w:rPr>
+              <w:t xml:space="default">11 (2.3%)</w:t>
             </w:r>
           </w:p>
         </w:tc>
@@ -5531,55 +5531,55 @@
                 <w:rFonts w:ascii="Calibri" w:hAnsi="Calibri"/>
                 <w:sz w:val="20"/>
               </w:rPr>
-              <w:t xml:space="default">382 (93.8%)</w:t>
-            </w:r>
-          </w:p>
-        </w:tc>
-        <w:tc>
-          <w:tcPr>
-            <w:tcBorders>
-              <w:top w:val="single" w:space="0" w:color="D3D3D3"/>
-              <w:bottom w:val="single" w:space="0" w:color="D3D3D3"/>
-              <w:start w:val="single" w:space="0" w:color="D3D3D3"/>
-              <w:end w:val="single" w:space="0" w:color="D3D3D3"/>
-            </w:tcBorders>
-          </w:tcPr>
-          <w:p>
-            <w:pPr>
-              <w:spacing w:before="0" w:after="60"/>
-              <w:keepNext/>
-              <w:jc w:val="start"/>
-            </w:pPr>
-            <w:r>
-              <w:rPr>
-                <w:rFonts w:ascii="Calibri" w:hAnsi="Calibri"/>
-                <w:sz w:val="20"/>
-              </w:rPr>
-              <w:t xml:space="default">440 (97.6%)</w:t>
-            </w:r>
-          </w:p>
-        </w:tc>
-        <w:tc>
-          <w:tcPr>
-            <w:tcBorders>
-              <w:top w:val="single" w:space="0" w:color="D3D3D3"/>
-              <w:bottom w:val="single" w:space="0" w:color="D3D3D3"/>
-              <w:start w:val="single" w:space="0" w:color="D3D3D3"/>
-              <w:end w:val="single" w:space="0" w:color="D3D3D3"/>
-            </w:tcBorders>
-          </w:tcPr>
-          <w:p>
-            <w:pPr>
-              <w:spacing w:before="0" w:after="60"/>
-              <w:keepNext/>
-              <w:jc w:val="start"/>
-            </w:pPr>
-            <w:r>
-              <w:rPr>
-                <w:rFonts w:ascii="Calibri" w:hAnsi="Calibri"/>
-                <w:sz w:val="20"/>
-              </w:rPr>
-              <w:t xml:space="default">822 (95.8%)</w:t>
+              <w:t xml:space="default">365 (93.5%)</w:t>
+            </w:r>
+          </w:p>
+        </w:tc>
+        <w:tc>
+          <w:tcPr>
+            <w:tcBorders>
+              <w:top w:val="single" w:space="0" w:color="D3D3D3"/>
+              <w:bottom w:val="single" w:space="0" w:color="D3D3D3"/>
+              <w:start w:val="single" w:space="0" w:color="D3D3D3"/>
+              <w:end w:val="single" w:space="0" w:color="D3D3D3"/>
+            </w:tcBorders>
+          </w:tcPr>
+          <w:p>
+            <w:pPr>
+              <w:spacing w:before="0" w:after="60"/>
+              <w:keepNext/>
+              <w:jc w:val="start"/>
+            </w:pPr>
+            <w:r>
+              <w:rPr>
+                <w:rFonts w:ascii="Calibri" w:hAnsi="Calibri"/>
+                <w:sz w:val="20"/>
+              </w:rPr>
+              <w:t xml:space="default">468 (97.7%)</w:t>
+            </w:r>
+          </w:p>
+        </w:tc>
+        <w:tc>
+          <w:tcPr>
+            <w:tcBorders>
+              <w:top w:val="single" w:space="0" w:color="D3D3D3"/>
+              <w:bottom w:val="single" w:space="0" w:color="D3D3D3"/>
+              <w:start w:val="single" w:space="0" w:color="D3D3D3"/>
+              <w:end w:val="single" w:space="0" w:color="D3D3D3"/>
+            </w:tcBorders>
+          </w:tcPr>
+          <w:p>
+            <w:pPr>
+              <w:spacing w:before="0" w:after="60"/>
+              <w:keepNext/>
+              <w:jc w:val="start"/>
+            </w:pPr>
+            <w:r>
+              <w:rPr>
+                <w:rFonts w:ascii="Calibri" w:hAnsi="Calibri"/>
+                <w:sz w:val="20"/>
+              </w:rPr>
+              <w:t xml:space="default">833 (95.8%)</w:t>
             </w:r>
           </w:p>
         </w:tc>
@@ -5603,7 +5603,7 @@
                 <w:rFonts w:ascii="Calibri" w:hAnsi="Calibri"/>
                 <w:sz w:val="20"/>
               </w:rPr>
-              <w:t xml:space="default">53.5%</w:t>
+              <w:t xml:space="default">56.2%</w:t>
             </w:r>
           </w:p>
         </w:tc>
@@ -5786,55 +5786,55 @@
                 <w:rFonts w:ascii="Calibri" w:hAnsi="Calibri"/>
                 <w:sz w:val="20"/>
               </w:rPr>
-              <w:t xml:space="default">49 (12%)</w:t>
-            </w:r>
-          </w:p>
-        </w:tc>
-        <w:tc>
-          <w:tcPr>
-            <w:tcBorders>
-              <w:top w:val="single" w:space="0" w:color="D3D3D3"/>
-              <w:bottom w:val="single" w:space="0" w:color="D3D3D3"/>
-              <w:start w:val="single" w:space="0" w:color="D3D3D3"/>
-              <w:end w:val="single" w:space="0" w:color="D3D3D3"/>
-            </w:tcBorders>
-          </w:tcPr>
-          <w:p>
-            <w:pPr>
-              <w:spacing w:before="0" w:after="60"/>
-              <w:keepNext/>
-              <w:jc w:val="start"/>
-            </w:pPr>
-            <w:r>
-              <w:rPr>
-                <w:rFonts w:ascii="Calibri" w:hAnsi="Calibri"/>
-                <w:sz w:val="20"/>
-              </w:rPr>
-              <w:t xml:space="default">49 (10.9%)</w:t>
-            </w:r>
-          </w:p>
-        </w:tc>
-        <w:tc>
-          <w:tcPr>
-            <w:tcBorders>
-              <w:top w:val="single" w:space="0" w:color="D3D3D3"/>
-              <w:bottom w:val="single" w:space="0" w:color="D3D3D3"/>
-              <w:start w:val="single" w:space="0" w:color="D3D3D3"/>
-              <w:end w:val="single" w:space="0" w:color="D3D3D3"/>
-            </w:tcBorders>
-          </w:tcPr>
-          <w:p>
-            <w:pPr>
-              <w:spacing w:before="0" w:after="60"/>
-              <w:keepNext/>
-              <w:jc w:val="start"/>
-            </w:pPr>
-            <w:r>
-              <w:rPr>
-                <w:rFonts w:ascii="Calibri" w:hAnsi="Calibri"/>
-                <w:sz w:val="20"/>
-              </w:rPr>
-              <w:t xml:space="default">98 (11.4%)</w:t>
+              <w:t xml:space="default">49 (12.6%)</w:t>
+            </w:r>
+          </w:p>
+        </w:tc>
+        <w:tc>
+          <w:tcPr>
+            <w:tcBorders>
+              <w:top w:val="single" w:space="0" w:color="D3D3D3"/>
+              <w:bottom w:val="single" w:space="0" w:color="D3D3D3"/>
+              <w:start w:val="single" w:space="0" w:color="D3D3D3"/>
+              <w:end w:val="single" w:space="0" w:color="D3D3D3"/>
+            </w:tcBorders>
+          </w:tcPr>
+          <w:p>
+            <w:pPr>
+              <w:spacing w:before="0" w:after="60"/>
+              <w:keepNext/>
+              <w:jc w:val="start"/>
+            </w:pPr>
+            <w:r>
+              <w:rPr>
+                <w:rFonts w:ascii="Calibri" w:hAnsi="Calibri"/>
+                <w:sz w:val="20"/>
+              </w:rPr>
+              <w:t xml:space="default">49 (10.2%)</w:t>
+            </w:r>
+          </w:p>
+        </w:tc>
+        <w:tc>
+          <w:tcPr>
+            <w:tcBorders>
+              <w:top w:val="single" w:space="0" w:color="D3D3D3"/>
+              <w:bottom w:val="single" w:space="0" w:color="D3D3D3"/>
+              <w:start w:val="single" w:space="0" w:color="D3D3D3"/>
+              <w:end w:val="single" w:space="0" w:color="D3D3D3"/>
+            </w:tcBorders>
+          </w:tcPr>
+          <w:p>
+            <w:pPr>
+              <w:spacing w:before="0" w:after="60"/>
+              <w:keepNext/>
+              <w:jc w:val="start"/>
+            </w:pPr>
+            <w:r>
+              <w:rPr>
+                <w:rFonts w:ascii="Calibri" w:hAnsi="Calibri"/>
+                <w:sz w:val="20"/>
+              </w:rPr>
+              <w:t xml:space="default">98 (11.3%)</w:t>
             </w:r>
           </w:p>
         </w:tc>
@@ -5911,55 +5911,55 @@
                 <w:rFonts w:ascii="Calibri" w:hAnsi="Calibri"/>
                 <w:sz w:val="20"/>
               </w:rPr>
-              <w:t xml:space="default">358 (88%)</w:t>
-            </w:r>
-          </w:p>
-        </w:tc>
-        <w:tc>
-          <w:tcPr>
-            <w:tcBorders>
-              <w:top w:val="single" w:space="0" w:color="D3D3D3"/>
-              <w:bottom w:val="single" w:space="0" w:color="D3D3D3"/>
-              <w:start w:val="single" w:space="0" w:color="D3D3D3"/>
-              <w:end w:val="single" w:space="0" w:color="D3D3D3"/>
-            </w:tcBorders>
-          </w:tcPr>
-          <w:p>
-            <w:pPr>
-              <w:spacing w:before="0" w:after="60"/>
-              <w:keepNext/>
-              <w:jc w:val="start"/>
-            </w:pPr>
-            <w:r>
-              <w:rPr>
-                <w:rFonts w:ascii="Calibri" w:hAnsi="Calibri"/>
-                <w:sz w:val="20"/>
-              </w:rPr>
-              <w:t xml:space="default">402 (89.1%)</w:t>
-            </w:r>
-          </w:p>
-        </w:tc>
-        <w:tc>
-          <w:tcPr>
-            <w:tcBorders>
-              <w:top w:val="single" w:space="0" w:color="D3D3D3"/>
-              <w:bottom w:val="single" w:space="0" w:color="D3D3D3"/>
-              <w:start w:val="single" w:space="0" w:color="D3D3D3"/>
-              <w:end w:val="single" w:space="0" w:color="D3D3D3"/>
-            </w:tcBorders>
-          </w:tcPr>
-          <w:p>
-            <w:pPr>
-              <w:spacing w:before="0" w:after="60"/>
-              <w:keepNext/>
-              <w:jc w:val="start"/>
-            </w:pPr>
-            <w:r>
-              <w:rPr>
-                <w:rFonts w:ascii="Calibri" w:hAnsi="Calibri"/>
-                <w:sz w:val="20"/>
-              </w:rPr>
-              <w:t xml:space="default">760 (88.6%)</w:t>
+              <w:t xml:space="default">341 (87.4%)</w:t>
+            </w:r>
+          </w:p>
+        </w:tc>
+        <w:tc>
+          <w:tcPr>
+            <w:tcBorders>
+              <w:top w:val="single" w:space="0" w:color="D3D3D3"/>
+              <w:bottom w:val="single" w:space="0" w:color="D3D3D3"/>
+              <w:start w:val="single" w:space="0" w:color="D3D3D3"/>
+              <w:end w:val="single" w:space="0" w:color="D3D3D3"/>
+            </w:tcBorders>
+          </w:tcPr>
+          <w:p>
+            <w:pPr>
+              <w:spacing w:before="0" w:after="60"/>
+              <w:keepNext/>
+              <w:jc w:val="start"/>
+            </w:pPr>
+            <w:r>
+              <w:rPr>
+                <w:rFonts w:ascii="Calibri" w:hAnsi="Calibri"/>
+                <w:sz w:val="20"/>
+              </w:rPr>
+              <w:t xml:space="default">430 (89.8%)</w:t>
+            </w:r>
+          </w:p>
+        </w:tc>
+        <w:tc>
+          <w:tcPr>
+            <w:tcBorders>
+              <w:top w:val="single" w:space="0" w:color="D3D3D3"/>
+              <w:bottom w:val="single" w:space="0" w:color="D3D3D3"/>
+              <w:start w:val="single" w:space="0" w:color="D3D3D3"/>
+              <w:end w:val="single" w:space="0" w:color="D3D3D3"/>
+            </w:tcBorders>
+          </w:tcPr>
+          <w:p>
+            <w:pPr>
+              <w:spacing w:before="0" w:after="60"/>
+              <w:keepNext/>
+              <w:jc w:val="start"/>
+            </w:pPr>
+            <w:r>
+              <w:rPr>
+                <w:rFonts w:ascii="Calibri" w:hAnsi="Calibri"/>
+                <w:sz w:val="20"/>
+              </w:rPr>
+              <w:t xml:space="default">771 (88.7%)</w:t>
             </w:r>
           </w:p>
         </w:tc>
@@ -5983,7 +5983,7 @@
                 <w:rFonts w:ascii="Calibri" w:hAnsi="Calibri"/>
                 <w:sz w:val="20"/>
               </w:rPr>
-              <w:t xml:space="default">52.9%</w:t>
+              <w:t xml:space="default">55.8%</w:t>
             </w:r>
           </w:p>
         </w:tc>

</xml_diff>

<commit_message>
v1.5 tighten Group 1: 7th-char filter on S01/S11; drop ext cause from Criterion A
</commit_message>
<xml_diff>
--- a/Word Tables/Table1_Patient_Characteristics.docx
+++ b/Word Tables/Table1_Patient_Characteristics.docx
@@ -238,7 +238,7 @@
                 <w:sz w:val="20"/>
                 <w:b w:val="true"/>
               </w:rPr>
-              <w:t xml:space="default">390 (100%)</w:t>
+              <w:t xml:space="default">338 (100%)</w:t>
             </w:r>
           </w:p>
         </w:tc>
@@ -263,7 +263,7 @@
                 <w:sz w:val="20"/>
                 <w:b w:val="true"/>
               </w:rPr>
-              <w:t xml:space="default">479 (100%)</w:t>
+              <w:t xml:space="default">471 (100%)</w:t>
             </w:r>
           </w:p>
         </w:tc>
@@ -288,7 +288,7 @@
                 <w:sz w:val="20"/>
                 <w:b w:val="true"/>
               </w:rPr>
-              <w:t xml:space="default">869</w:t>
+              <w:t xml:space="default">809</w:t>
             </w:r>
           </w:p>
         </w:tc>
@@ -313,7 +313,7 @@
                 <w:sz w:val="20"/>
                 <w:b w:val="true"/>
               </w:rPr>
-              <w:t xml:space="default">55.1%</w:t>
+              <w:t xml:space="default">58.3%</w:t>
             </w:r>
           </w:p>
         </w:tc>
@@ -366,55 +366,55 @@
                 <w:rFonts w:ascii="Calibri" w:hAnsi="Calibri"/>
                 <w:sz w:val="20"/>
               </w:rPr>
-              <w:t xml:space="default">14 (3.7%)</w:t>
-            </w:r>
-          </w:p>
-        </w:tc>
-        <w:tc>
-          <w:tcPr>
-            <w:tcBorders>
-              <w:top w:val="single" w:space="0" w:color="D3D3D3"/>
-              <w:bottom w:val="single" w:space="0" w:color="D3D3D3"/>
-              <w:start w:val="single" w:space="0" w:color="D3D3D3"/>
-              <w:end w:val="single" w:space="0" w:color="D3D3D3"/>
-            </w:tcBorders>
-          </w:tcPr>
-          <w:p>
-            <w:pPr>
-              <w:spacing w:before="0" w:after="60"/>
-              <w:keepNext/>
-              <w:jc w:val="start"/>
-            </w:pPr>
-            <w:r>
-              <w:rPr>
-                <w:rFonts w:ascii="Calibri" w:hAnsi="Calibri"/>
-                <w:sz w:val="20"/>
-              </w:rPr>
-              <w:t xml:space="default">39 (8.1%)</w:t>
-            </w:r>
-          </w:p>
-        </w:tc>
-        <w:tc>
-          <w:tcPr>
-            <w:tcBorders>
-              <w:top w:val="single" w:space="0" w:color="D3D3D3"/>
-              <w:bottom w:val="single" w:space="0" w:color="D3D3D3"/>
-              <w:start w:val="single" w:space="0" w:color="D3D3D3"/>
-              <w:end w:val="single" w:space="0" w:color="D3D3D3"/>
-            </w:tcBorders>
-          </w:tcPr>
-          <w:p>
-            <w:pPr>
-              <w:spacing w:before="0" w:after="60"/>
-              <w:keepNext/>
-              <w:jc w:val="start"/>
-            </w:pPr>
-            <w:r>
-              <w:rPr>
-                <w:rFonts w:ascii="Calibri" w:hAnsi="Calibri"/>
-                <w:sz w:val="20"/>
-              </w:rPr>
-              <w:t xml:space="default">53</w:t>
+              <w:t xml:space="default">11 (3.1%)</w:t>
+            </w:r>
+          </w:p>
+        </w:tc>
+        <w:tc>
+          <w:tcPr>
+            <w:tcBorders>
+              <w:top w:val="single" w:space="0" w:color="D3D3D3"/>
+              <w:bottom w:val="single" w:space="0" w:color="D3D3D3"/>
+              <w:start w:val="single" w:space="0" w:color="D3D3D3"/>
+              <w:end w:val="single" w:space="0" w:color="D3D3D3"/>
+            </w:tcBorders>
+          </w:tcPr>
+          <w:p>
+            <w:pPr>
+              <w:spacing w:before="0" w:after="60"/>
+              <w:keepNext/>
+              <w:jc w:val="start"/>
+            </w:pPr>
+            <w:r>
+              <w:rPr>
+                <w:rFonts w:ascii="Calibri" w:hAnsi="Calibri"/>
+                <w:sz w:val="20"/>
+              </w:rPr>
+              <w:t xml:space="default">39 (8.2%)</w:t>
+            </w:r>
+          </w:p>
+        </w:tc>
+        <w:tc>
+          <w:tcPr>
+            <w:tcBorders>
+              <w:top w:val="single" w:space="0" w:color="D3D3D3"/>
+              <w:bottom w:val="single" w:space="0" w:color="D3D3D3"/>
+              <w:start w:val="single" w:space="0" w:color="D3D3D3"/>
+              <w:end w:val="single" w:space="0" w:color="D3D3D3"/>
+            </w:tcBorders>
+          </w:tcPr>
+          <w:p>
+            <w:pPr>
+              <w:spacing w:before="0" w:after="60"/>
+              <w:keepNext/>
+              <w:jc w:val="start"/>
+            </w:pPr>
+            <w:r>
+              <w:rPr>
+                <w:rFonts w:ascii="Calibri" w:hAnsi="Calibri"/>
+                <w:sz w:val="20"/>
+              </w:rPr>
+              <w:t xml:space="default">49</w:t>
             </w:r>
           </w:p>
         </w:tc>
@@ -438,7 +438,7 @@
                 <w:rFonts w:ascii="Calibri" w:hAnsi="Calibri"/>
                 <w:sz w:val="20"/>
               </w:rPr>
-              <w:t xml:space="default">73%</w:t>
+              <w:t xml:space="default">78.5%</w:t>
             </w:r>
           </w:p>
         </w:tc>
@@ -491,55 +491,55 @@
                 <w:rFonts w:ascii="Calibri" w:hAnsi="Calibri"/>
                 <w:sz w:val="20"/>
               </w:rPr>
-              <w:t xml:space="default">29 (7.4%)</w:t>
-            </w:r>
-          </w:p>
-        </w:tc>
-        <w:tc>
-          <w:tcPr>
-            <w:tcBorders>
-              <w:top w:val="single" w:space="0" w:color="D3D3D3"/>
-              <w:bottom w:val="single" w:space="0" w:color="D3D3D3"/>
-              <w:start w:val="single" w:space="0" w:color="D3D3D3"/>
-              <w:end w:val="single" w:space="0" w:color="D3D3D3"/>
-            </w:tcBorders>
-          </w:tcPr>
-          <w:p>
-            <w:pPr>
-              <w:spacing w:before="0" w:after="60"/>
-              <w:keepNext/>
-              <w:jc w:val="start"/>
-            </w:pPr>
-            <w:r>
-              <w:rPr>
-                <w:rFonts w:ascii="Calibri" w:hAnsi="Calibri"/>
-                <w:sz w:val="20"/>
-              </w:rPr>
-              <w:t xml:space="default">54 (11.2%)</w:t>
-            </w:r>
-          </w:p>
-        </w:tc>
-        <w:tc>
-          <w:tcPr>
-            <w:tcBorders>
-              <w:top w:val="single" w:space="0" w:color="D3D3D3"/>
-              <w:bottom w:val="single" w:space="0" w:color="D3D3D3"/>
-              <w:start w:val="single" w:space="0" w:color="D3D3D3"/>
-              <w:end w:val="single" w:space="0" w:color="D3D3D3"/>
-            </w:tcBorders>
-          </w:tcPr>
-          <w:p>
-            <w:pPr>
-              <w:spacing w:before="0" w:after="60"/>
-              <w:keepNext/>
-              <w:jc w:val="start"/>
-            </w:pPr>
-            <w:r>
-              <w:rPr>
-                <w:rFonts w:ascii="Calibri" w:hAnsi="Calibri"/>
-                <w:sz w:val="20"/>
-              </w:rPr>
-              <w:t xml:space="default">83</w:t>
+              <w:t xml:space="default">23 (6.7%)</w:t>
+            </w:r>
+          </w:p>
+        </w:tc>
+        <w:tc>
+          <w:tcPr>
+            <w:tcBorders>
+              <w:top w:val="single" w:space="0" w:color="D3D3D3"/>
+              <w:bottom w:val="single" w:space="0" w:color="D3D3D3"/>
+              <w:start w:val="single" w:space="0" w:color="D3D3D3"/>
+              <w:end w:val="single" w:space="0" w:color="D3D3D3"/>
+            </w:tcBorders>
+          </w:tcPr>
+          <w:p>
+            <w:pPr>
+              <w:spacing w:before="0" w:after="60"/>
+              <w:keepNext/>
+              <w:jc w:val="start"/>
+            </w:pPr>
+            <w:r>
+              <w:rPr>
+                <w:rFonts w:ascii="Calibri" w:hAnsi="Calibri"/>
+                <w:sz w:val="20"/>
+              </w:rPr>
+              <w:t xml:space="default">52 (11.1%)</w:t>
+            </w:r>
+          </w:p>
+        </w:tc>
+        <w:tc>
+          <w:tcPr>
+            <w:tcBorders>
+              <w:top w:val="single" w:space="0" w:color="D3D3D3"/>
+              <w:bottom w:val="single" w:space="0" w:color="D3D3D3"/>
+              <w:start w:val="single" w:space="0" w:color="D3D3D3"/>
+              <w:end w:val="single" w:space="0" w:color="D3D3D3"/>
+            </w:tcBorders>
+          </w:tcPr>
+          <w:p>
+            <w:pPr>
+              <w:spacing w:before="0" w:after="60"/>
+              <w:keepNext/>
+              <w:jc w:val="start"/>
+            </w:pPr>
+            <w:r>
+              <w:rPr>
+                <w:rFonts w:ascii="Calibri" w:hAnsi="Calibri"/>
+                <w:sz w:val="20"/>
+              </w:rPr>
+              <w:t xml:space="default">75</w:t>
             </w:r>
           </w:p>
         </w:tc>
@@ -563,7 +563,7 @@
                 <w:rFonts w:ascii="Calibri" w:hAnsi="Calibri"/>
                 <w:sz w:val="20"/>
               </w:rPr>
-              <w:t xml:space="default">65.1%</w:t>
+              <w:t xml:space="default">69.9%</w:t>
             </w:r>
           </w:p>
         </w:tc>
@@ -616,55 +616,55 @@
                 <w:rFonts w:ascii="Calibri" w:hAnsi="Calibri"/>
                 <w:sz w:val="20"/>
               </w:rPr>
-              <w:t xml:space="default">29 (7.5%)</w:t>
-            </w:r>
-          </w:p>
-        </w:tc>
-        <w:tc>
-          <w:tcPr>
-            <w:tcBorders>
-              <w:top w:val="single" w:space="0" w:color="D3D3D3"/>
-              <w:bottom w:val="single" w:space="0" w:color="D3D3D3"/>
-              <w:start w:val="single" w:space="0" w:color="D3D3D3"/>
-              <w:end w:val="single" w:space="0" w:color="D3D3D3"/>
-            </w:tcBorders>
-          </w:tcPr>
-          <w:p>
-            <w:pPr>
-              <w:spacing w:before="0" w:after="60"/>
-              <w:keepNext/>
-              <w:jc w:val="start"/>
-            </w:pPr>
-            <w:r>
-              <w:rPr>
-                <w:rFonts w:ascii="Calibri" w:hAnsi="Calibri"/>
-                <w:sz w:val="20"/>
-              </w:rPr>
-              <w:t xml:space="default">44 (9.1%)</w:t>
-            </w:r>
-          </w:p>
-        </w:tc>
-        <w:tc>
-          <w:tcPr>
-            <w:tcBorders>
-              <w:top w:val="single" w:space="0" w:color="D3D3D3"/>
-              <w:bottom w:val="single" w:space="0" w:color="D3D3D3"/>
-              <w:start w:val="single" w:space="0" w:color="D3D3D3"/>
-              <w:end w:val="single" w:space="0" w:color="D3D3D3"/>
-            </w:tcBorders>
-          </w:tcPr>
-          <w:p>
-            <w:pPr>
-              <w:spacing w:before="0" w:after="60"/>
-              <w:keepNext/>
-              <w:jc w:val="start"/>
-            </w:pPr>
-            <w:r>
-              <w:rPr>
-                <w:rFonts w:ascii="Calibri" w:hAnsi="Calibri"/>
-                <w:sz w:val="20"/>
-              </w:rPr>
-              <w:t xml:space="default">73</w:t>
+              <w:t xml:space="default">20 (5.8%)</w:t>
+            </w:r>
+          </w:p>
+        </w:tc>
+        <w:tc>
+          <w:tcPr>
+            <w:tcBorders>
+              <w:top w:val="single" w:space="0" w:color="D3D3D3"/>
+              <w:bottom w:val="single" w:space="0" w:color="D3D3D3"/>
+              <w:start w:val="single" w:space="0" w:color="D3D3D3"/>
+              <w:end w:val="single" w:space="0" w:color="D3D3D3"/>
+            </w:tcBorders>
+          </w:tcPr>
+          <w:p>
+            <w:pPr>
+              <w:spacing w:before="0" w:after="60"/>
+              <w:keepNext/>
+              <w:jc w:val="start"/>
+            </w:pPr>
+            <w:r>
+              <w:rPr>
+                <w:rFonts w:ascii="Calibri" w:hAnsi="Calibri"/>
+                <w:sz w:val="20"/>
+              </w:rPr>
+              <w:t xml:space="default">44 (9.3%)</w:t>
+            </w:r>
+          </w:p>
+        </w:tc>
+        <w:tc>
+          <w:tcPr>
+            <w:tcBorders>
+              <w:top w:val="single" w:space="0" w:color="D3D3D3"/>
+              <w:bottom w:val="single" w:space="0" w:color="D3D3D3"/>
+              <w:start w:val="single" w:space="0" w:color="D3D3D3"/>
+              <w:end w:val="single" w:space="0" w:color="D3D3D3"/>
+            </w:tcBorders>
+          </w:tcPr>
+          <w:p>
+            <w:pPr>
+              <w:spacing w:before="0" w:after="60"/>
+              <w:keepNext/>
+              <w:jc w:val="start"/>
+            </w:pPr>
+            <w:r>
+              <w:rPr>
+                <w:rFonts w:ascii="Calibri" w:hAnsi="Calibri"/>
+                <w:sz w:val="20"/>
+              </w:rPr>
+              <w:t xml:space="default">63</w:t>
             </w:r>
           </w:p>
         </w:tc>
@@ -688,7 +688,7 @@
                 <w:rFonts w:ascii="Calibri" w:hAnsi="Calibri"/>
                 <w:sz w:val="20"/>
               </w:rPr>
-              <w:t xml:space="default">60%</w:t>
+              <w:t xml:space="default">69.1%</w:t>
             </w:r>
           </w:p>
         </w:tc>
@@ -741,55 +741,55 @@
                 <w:rFonts w:ascii="Calibri" w:hAnsi="Calibri"/>
                 <w:sz w:val="20"/>
               </w:rPr>
-              <w:t xml:space="default">73 (18.9%)</w:t>
-            </w:r>
-          </w:p>
-        </w:tc>
-        <w:tc>
-          <w:tcPr>
-            <w:tcBorders>
-              <w:top w:val="single" w:space="0" w:color="D3D3D3"/>
-              <w:bottom w:val="single" w:space="0" w:color="D3D3D3"/>
-              <w:start w:val="single" w:space="0" w:color="D3D3D3"/>
-              <w:end w:val="single" w:space="0" w:color="D3D3D3"/>
-            </w:tcBorders>
-          </w:tcPr>
-          <w:p>
-            <w:pPr>
-              <w:spacing w:before="0" w:after="60"/>
-              <w:keepNext/>
-              <w:jc w:val="start"/>
-            </w:pPr>
-            <w:r>
-              <w:rPr>
-                <w:rFonts w:ascii="Calibri" w:hAnsi="Calibri"/>
-                <w:sz w:val="20"/>
-              </w:rPr>
-              <w:t xml:space="default">69 (14.3%)</w:t>
-            </w:r>
-          </w:p>
-        </w:tc>
-        <w:tc>
-          <w:tcPr>
-            <w:tcBorders>
-              <w:top w:val="single" w:space="0" w:color="D3D3D3"/>
-              <w:bottom w:val="single" w:space="0" w:color="D3D3D3"/>
-              <w:start w:val="single" w:space="0" w:color="D3D3D3"/>
-              <w:end w:val="single" w:space="0" w:color="D3D3D3"/>
-            </w:tcBorders>
-          </w:tcPr>
-          <w:p>
-            <w:pPr>
-              <w:spacing w:before="0" w:after="60"/>
-              <w:keepNext/>
-              <w:jc w:val="start"/>
-            </w:pPr>
-            <w:r>
-              <w:rPr>
-                <w:rFonts w:ascii="Calibri" w:hAnsi="Calibri"/>
-                <w:sz w:val="20"/>
-              </w:rPr>
-              <w:t xml:space="default">142</w:t>
+              <w:t xml:space="default">66 (19.7%)</w:t>
+            </w:r>
+          </w:p>
+        </w:tc>
+        <w:tc>
+          <w:tcPr>
+            <w:tcBorders>
+              <w:top w:val="single" w:space="0" w:color="D3D3D3"/>
+              <w:bottom w:val="single" w:space="0" w:color="D3D3D3"/>
+              <w:start w:val="single" w:space="0" w:color="D3D3D3"/>
+              <w:end w:val="single" w:space="0" w:color="D3D3D3"/>
+            </w:tcBorders>
+          </w:tcPr>
+          <w:p>
+            <w:pPr>
+              <w:spacing w:before="0" w:after="60"/>
+              <w:keepNext/>
+              <w:jc w:val="start"/>
+            </w:pPr>
+            <w:r>
+              <w:rPr>
+                <w:rFonts w:ascii="Calibri" w:hAnsi="Calibri"/>
+                <w:sz w:val="20"/>
+              </w:rPr>
+              <w:t xml:space="default">67 (14.3%)</w:t>
+            </w:r>
+          </w:p>
+        </w:tc>
+        <w:tc>
+          <w:tcPr>
+            <w:tcBorders>
+              <w:top w:val="single" w:space="0" w:color="D3D3D3"/>
+              <w:bottom w:val="single" w:space="0" w:color="D3D3D3"/>
+              <w:start w:val="single" w:space="0" w:color="D3D3D3"/>
+              <w:end w:val="single" w:space="0" w:color="D3D3D3"/>
+            </w:tcBorders>
+          </w:tcPr>
+          <w:p>
+            <w:pPr>
+              <w:spacing w:before="0" w:after="60"/>
+              <w:keepNext/>
+              <w:jc w:val="start"/>
+            </w:pPr>
+            <w:r>
+              <w:rPr>
+                <w:rFonts w:ascii="Calibri" w:hAnsi="Calibri"/>
+                <w:sz w:val="20"/>
+              </w:rPr>
+              <w:t xml:space="default">134</w:t>
             </w:r>
           </w:p>
         </w:tc>
@@ -813,7 +813,7 @@
                 <w:rFonts w:ascii="Calibri" w:hAnsi="Calibri"/>
                 <w:sz w:val="20"/>
               </w:rPr>
-              <w:t xml:space="default">48.3%</w:t>
+              <w:t xml:space="default">50.4%</w:t>
             </w:r>
           </w:p>
         </w:tc>
@@ -866,55 +866,55 @@
                 <w:rFonts w:ascii="Calibri" w:hAnsi="Calibri"/>
                 <w:sz w:val="20"/>
               </w:rPr>
-              <w:t xml:space="default">80 (20.6%)</w:t>
-            </w:r>
-          </w:p>
-        </w:tc>
-        <w:tc>
-          <w:tcPr>
-            <w:tcBorders>
-              <w:top w:val="single" w:space="0" w:color="D3D3D3"/>
-              <w:bottom w:val="single" w:space="0" w:color="D3D3D3"/>
-              <w:start w:val="single" w:space="0" w:color="D3D3D3"/>
-              <w:end w:val="single" w:space="0" w:color="D3D3D3"/>
-            </w:tcBorders>
-          </w:tcPr>
-          <w:p>
-            <w:pPr>
-              <w:spacing w:before="0" w:after="60"/>
-              <w:keepNext/>
-              <w:jc w:val="start"/>
-            </w:pPr>
-            <w:r>
-              <w:rPr>
-                <w:rFonts w:ascii="Calibri" w:hAnsi="Calibri"/>
-                <w:sz w:val="20"/>
-              </w:rPr>
-              <w:t xml:space="default">70 (14.5%)</w:t>
-            </w:r>
-          </w:p>
-        </w:tc>
-        <w:tc>
-          <w:tcPr>
-            <w:tcBorders>
-              <w:top w:val="single" w:space="0" w:color="D3D3D3"/>
-              <w:bottom w:val="single" w:space="0" w:color="D3D3D3"/>
-              <w:start w:val="single" w:space="0" w:color="D3D3D3"/>
-              <w:end w:val="single" w:space="0" w:color="D3D3D3"/>
-            </w:tcBorders>
-          </w:tcPr>
-          <w:p>
-            <w:pPr>
-              <w:spacing w:before="0" w:after="60"/>
-              <w:keepNext/>
-              <w:jc w:val="start"/>
-            </w:pPr>
-            <w:r>
-              <w:rPr>
-                <w:rFonts w:ascii="Calibri" w:hAnsi="Calibri"/>
-                <w:sz w:val="20"/>
-              </w:rPr>
-              <w:t xml:space="default">150</w:t>
+              <w:t xml:space="default">73 (21.5%)</w:t>
+            </w:r>
+          </w:p>
+        </w:tc>
+        <w:tc>
+          <w:tcPr>
+            <w:tcBorders>
+              <w:top w:val="single" w:space="0" w:color="D3D3D3"/>
+              <w:bottom w:val="single" w:space="0" w:color="D3D3D3"/>
+              <w:start w:val="single" w:space="0" w:color="D3D3D3"/>
+              <w:end w:val="single" w:space="0" w:color="D3D3D3"/>
+            </w:tcBorders>
+          </w:tcPr>
+          <w:p>
+            <w:pPr>
+              <w:spacing w:before="0" w:after="60"/>
+              <w:keepNext/>
+              <w:jc w:val="start"/>
+            </w:pPr>
+            <w:r>
+              <w:rPr>
+                <w:rFonts w:ascii="Calibri" w:hAnsi="Calibri"/>
+                <w:sz w:val="20"/>
+              </w:rPr>
+              <w:t xml:space="default">70 (14.8%)</w:t>
+            </w:r>
+          </w:p>
+        </w:tc>
+        <w:tc>
+          <w:tcPr>
+            <w:tcBorders>
+              <w:top w:val="single" w:space="0" w:color="D3D3D3"/>
+              <w:bottom w:val="single" w:space="0" w:color="D3D3D3"/>
+              <w:start w:val="single" w:space="0" w:color="D3D3D3"/>
+              <w:end w:val="single" w:space="0" w:color="D3D3D3"/>
+            </w:tcBorders>
+          </w:tcPr>
+          <w:p>
+            <w:pPr>
+              <w:spacing w:before="0" w:after="60"/>
+              <w:keepNext/>
+              <w:jc w:val="start"/>
+            </w:pPr>
+            <w:r>
+              <w:rPr>
+                <w:rFonts w:ascii="Calibri" w:hAnsi="Calibri"/>
+                <w:sz w:val="20"/>
+              </w:rPr>
+              <w:t xml:space="default">142</w:t>
             </w:r>
           </w:p>
         </w:tc>
@@ -938,7 +938,7 @@
                 <w:rFonts w:ascii="Calibri" w:hAnsi="Calibri"/>
                 <w:sz w:val="20"/>
               </w:rPr>
-              <w:t xml:space="default">46.4%</w:t>
+              <w:t xml:space="default">48.9%</w:t>
             </w:r>
           </w:p>
         </w:tc>
@@ -991,55 +991,55 @@
                 <w:rFonts w:ascii="Calibri" w:hAnsi="Calibri"/>
                 <w:sz w:val="20"/>
               </w:rPr>
-              <w:t xml:space="default">67 (17.1%)</w:t>
-            </w:r>
-          </w:p>
-        </w:tc>
-        <w:tc>
-          <w:tcPr>
-            <w:tcBorders>
-              <w:top w:val="single" w:space="0" w:color="D3D3D3"/>
-              <w:bottom w:val="single" w:space="0" w:color="D3D3D3"/>
-              <w:start w:val="single" w:space="0" w:color="D3D3D3"/>
-              <w:end w:val="single" w:space="0" w:color="D3D3D3"/>
-            </w:tcBorders>
-          </w:tcPr>
-          <w:p>
-            <w:pPr>
-              <w:spacing w:before="0" w:after="60"/>
-              <w:keepNext/>
-              <w:jc w:val="start"/>
-            </w:pPr>
-            <w:r>
-              <w:rPr>
-                <w:rFonts w:ascii="Calibri" w:hAnsi="Calibri"/>
-                <w:sz w:val="20"/>
-              </w:rPr>
-              <w:t xml:space="default">67 (14%)</w:t>
-            </w:r>
-          </w:p>
-        </w:tc>
-        <w:tc>
-          <w:tcPr>
-            <w:tcBorders>
-              <w:top w:val="single" w:space="0" w:color="D3D3D3"/>
-              <w:bottom w:val="single" w:space="0" w:color="D3D3D3"/>
-              <w:start w:val="single" w:space="0" w:color="D3D3D3"/>
-              <w:end w:val="single" w:space="0" w:color="D3D3D3"/>
-            </w:tcBorders>
-          </w:tcPr>
-          <w:p>
-            <w:pPr>
-              <w:spacing w:before="0" w:after="60"/>
-              <w:keepNext/>
-              <w:jc w:val="start"/>
-            </w:pPr>
-            <w:r>
-              <w:rPr>
-                <w:rFonts w:ascii="Calibri" w:hAnsi="Calibri"/>
-                <w:sz w:val="20"/>
-              </w:rPr>
-              <w:t xml:space="default">134</w:t>
+              <w:t xml:space="default">63 (18.6%)</w:t>
+            </w:r>
+          </w:p>
+        </w:tc>
+        <w:tc>
+          <w:tcPr>
+            <w:tcBorders>
+              <w:top w:val="single" w:space="0" w:color="D3D3D3"/>
+              <w:bottom w:val="single" w:space="0" w:color="D3D3D3"/>
+              <w:start w:val="single" w:space="0" w:color="D3D3D3"/>
+              <w:end w:val="single" w:space="0" w:color="D3D3D3"/>
+            </w:tcBorders>
+          </w:tcPr>
+          <w:p>
+            <w:pPr>
+              <w:spacing w:before="0" w:after="60"/>
+              <w:keepNext/>
+              <w:jc w:val="start"/>
+            </w:pPr>
+            <w:r>
+              <w:rPr>
+                <w:rFonts w:ascii="Calibri" w:hAnsi="Calibri"/>
+                <w:sz w:val="20"/>
+              </w:rPr>
+              <w:t xml:space="default">67 (14.2%)</w:t>
+            </w:r>
+          </w:p>
+        </w:tc>
+        <w:tc>
+          <w:tcPr>
+            <w:tcBorders>
+              <w:top w:val="single" w:space="0" w:color="D3D3D3"/>
+              <w:bottom w:val="single" w:space="0" w:color="D3D3D3"/>
+              <w:start w:val="single" w:space="0" w:color="D3D3D3"/>
+              <w:end w:val="single" w:space="0" w:color="D3D3D3"/>
+            </w:tcBorders>
+          </w:tcPr>
+          <w:p>
+            <w:pPr>
+              <w:spacing w:before="0" w:after="60"/>
+              <w:keepNext/>
+              <w:jc w:val="start"/>
+            </w:pPr>
+            <w:r>
+              <w:rPr>
+                <w:rFonts w:ascii="Calibri" w:hAnsi="Calibri"/>
+                <w:sz w:val="20"/>
+              </w:rPr>
+              <w:t xml:space="default">130</w:t>
             </w:r>
           </w:p>
         </w:tc>
@@ -1063,7 +1063,7 @@
                 <w:rFonts w:ascii="Calibri" w:hAnsi="Calibri"/>
                 <w:sz w:val="20"/>
               </w:rPr>
-              <w:t xml:space="default">50.1%</w:t>
+              <w:t xml:space="default">51.6%</w:t>
             </w:r>
           </w:p>
         </w:tc>
@@ -1116,55 +1116,55 @@
                 <w:rFonts w:ascii="Calibri" w:hAnsi="Calibri"/>
                 <w:sz w:val="20"/>
               </w:rPr>
-              <w:t xml:space="default">56 (14.5%)</w:t>
-            </w:r>
-          </w:p>
-        </w:tc>
-        <w:tc>
-          <w:tcPr>
-            <w:tcBorders>
-              <w:top w:val="single" w:space="0" w:color="D3D3D3"/>
-              <w:bottom w:val="single" w:space="0" w:color="D3D3D3"/>
-              <w:start w:val="single" w:space="0" w:color="D3D3D3"/>
-              <w:end w:val="single" w:space="0" w:color="D3D3D3"/>
-            </w:tcBorders>
-          </w:tcPr>
-          <w:p>
-            <w:pPr>
-              <w:spacing w:before="0" w:after="60"/>
-              <w:keepNext/>
-              <w:jc w:val="start"/>
-            </w:pPr>
-            <w:r>
-              <w:rPr>
-                <w:rFonts w:ascii="Calibri" w:hAnsi="Calibri"/>
-                <w:sz w:val="20"/>
-              </w:rPr>
-              <w:t xml:space="default">72 (15.1%)</w:t>
-            </w:r>
-          </w:p>
-        </w:tc>
-        <w:tc>
-          <w:tcPr>
-            <w:tcBorders>
-              <w:top w:val="single" w:space="0" w:color="D3D3D3"/>
-              <w:bottom w:val="single" w:space="0" w:color="D3D3D3"/>
-              <w:start w:val="single" w:space="0" w:color="D3D3D3"/>
-              <w:end w:val="single" w:space="0" w:color="D3D3D3"/>
-            </w:tcBorders>
-          </w:tcPr>
-          <w:p>
-            <w:pPr>
-              <w:spacing w:before="0" w:after="60"/>
-              <w:keepNext/>
-              <w:jc w:val="start"/>
-            </w:pPr>
-            <w:r>
-              <w:rPr>
-                <w:rFonts w:ascii="Calibri" w:hAnsi="Calibri"/>
-                <w:sz w:val="20"/>
-              </w:rPr>
-              <w:t xml:space="default">129</w:t>
+              <w:t xml:space="default">46 (13.5%)</w:t>
+            </w:r>
+          </w:p>
+        </w:tc>
+        <w:tc>
+          <w:tcPr>
+            <w:tcBorders>
+              <w:top w:val="single" w:space="0" w:color="D3D3D3"/>
+              <w:bottom w:val="single" w:space="0" w:color="D3D3D3"/>
+              <w:start w:val="single" w:space="0" w:color="D3D3D3"/>
+              <w:end w:val="single" w:space="0" w:color="D3D3D3"/>
+            </w:tcBorders>
+          </w:tcPr>
+          <w:p>
+            <w:pPr>
+              <w:spacing w:before="0" w:after="60"/>
+              <w:keepNext/>
+              <w:jc w:val="start"/>
+            </w:pPr>
+            <w:r>
+              <w:rPr>
+                <w:rFonts w:ascii="Calibri" w:hAnsi="Calibri"/>
+                <w:sz w:val="20"/>
+              </w:rPr>
+              <w:t xml:space="default">72 (15.4%)</w:t>
+            </w:r>
+          </w:p>
+        </w:tc>
+        <w:tc>
+          <w:tcPr>
+            <w:tcBorders>
+              <w:top w:val="single" w:space="0" w:color="D3D3D3"/>
+              <w:bottom w:val="single" w:space="0" w:color="D3D3D3"/>
+              <w:start w:val="single" w:space="0" w:color="D3D3D3"/>
+              <w:end w:val="single" w:space="0" w:color="D3D3D3"/>
+            </w:tcBorders>
+          </w:tcPr>
+          <w:p>
+            <w:pPr>
+              <w:spacing w:before="0" w:after="60"/>
+              <w:keepNext/>
+              <w:jc w:val="start"/>
+            </w:pPr>
+            <w:r>
+              <w:rPr>
+                <w:rFonts w:ascii="Calibri" w:hAnsi="Calibri"/>
+                <w:sz w:val="20"/>
+              </w:rPr>
+              <w:t xml:space="default">118</w:t>
             </w:r>
           </w:p>
         </w:tc>
@@ -1188,7 +1188,7 @@
                 <w:rFonts w:ascii="Calibri" w:hAnsi="Calibri"/>
                 <w:sz w:val="20"/>
               </w:rPr>
-              <w:t xml:space="default">56.2%</w:t>
+              <w:t xml:space="default">61.4%</w:t>
             </w:r>
           </w:p>
         </w:tc>
@@ -1241,55 +1241,55 @@
                 <w:rFonts w:ascii="Calibri" w:hAnsi="Calibri"/>
                 <w:sz w:val="20"/>
               </w:rPr>
-              <w:t xml:space="default">41 (10.5%)</w:t>
-            </w:r>
-          </w:p>
-        </w:tc>
-        <w:tc>
-          <w:tcPr>
-            <w:tcBorders>
-              <w:top w:val="single" w:space="0" w:color="D3D3D3"/>
-              <w:bottom w:val="single" w:space="0" w:color="D3D3D3"/>
-              <w:start w:val="single" w:space="0" w:color="D3D3D3"/>
-              <w:end w:val="single" w:space="0" w:color="D3D3D3"/>
-            </w:tcBorders>
-          </w:tcPr>
-          <w:p>
-            <w:pPr>
-              <w:spacing w:before="0" w:after="60"/>
-              <w:keepNext/>
-              <w:jc w:val="start"/>
-            </w:pPr>
-            <w:r>
-              <w:rPr>
-                <w:rFonts w:ascii="Calibri" w:hAnsi="Calibri"/>
-                <w:sz w:val="20"/>
-              </w:rPr>
-              <w:t xml:space="default">66 (13.7%)</w:t>
-            </w:r>
-          </w:p>
-        </w:tc>
-        <w:tc>
-          <w:tcPr>
-            <w:tcBorders>
-              <w:top w:val="single" w:space="0" w:color="D3D3D3"/>
-              <w:bottom w:val="single" w:space="0" w:color="D3D3D3"/>
-              <w:start w:val="single" w:space="0" w:color="D3D3D3"/>
-              <w:end w:val="single" w:space="0" w:color="D3D3D3"/>
-            </w:tcBorders>
-          </w:tcPr>
-          <w:p>
-            <w:pPr>
-              <w:spacing w:before="0" w:after="60"/>
-              <w:keepNext/>
-              <w:jc w:val="start"/>
-            </w:pPr>
-            <w:r>
-              <w:rPr>
-                <w:rFonts w:ascii="Calibri" w:hAnsi="Calibri"/>
-                <w:sz w:val="20"/>
-              </w:rPr>
-              <w:t xml:space="default">106</w:t>
+              <w:t xml:space="default">38 (11.1%)</w:t>
+            </w:r>
+          </w:p>
+        </w:tc>
+        <w:tc>
+          <w:tcPr>
+            <w:tcBorders>
+              <w:top w:val="single" w:space="0" w:color="D3D3D3"/>
+              <w:bottom w:val="single" w:space="0" w:color="D3D3D3"/>
+              <w:start w:val="single" w:space="0" w:color="D3D3D3"/>
+              <w:end w:val="single" w:space="0" w:color="D3D3D3"/>
+            </w:tcBorders>
+          </w:tcPr>
+          <w:p>
+            <w:pPr>
+              <w:spacing w:before="0" w:after="60"/>
+              <w:keepNext/>
+              <w:jc w:val="start"/>
+            </w:pPr>
+            <w:r>
+              <w:rPr>
+                <w:rFonts w:ascii="Calibri" w:hAnsi="Calibri"/>
+                <w:sz w:val="20"/>
+              </w:rPr>
+              <w:t xml:space="default">60 (12.7%)</w:t>
+            </w:r>
+          </w:p>
+        </w:tc>
+        <w:tc>
+          <w:tcPr>
+            <w:tcBorders>
+              <w:top w:val="single" w:space="0" w:color="D3D3D3"/>
+              <w:bottom w:val="single" w:space="0" w:color="D3D3D3"/>
+              <w:start w:val="single" w:space="0" w:color="D3D3D3"/>
+              <w:end w:val="single" w:space="0" w:color="D3D3D3"/>
+            </w:tcBorders>
+          </w:tcPr>
+          <w:p>
+            <w:pPr>
+              <w:spacing w:before="0" w:after="60"/>
+              <w:keepNext/>
+              <w:jc w:val="start"/>
+            </w:pPr>
+            <w:r>
+              <w:rPr>
+                <w:rFonts w:ascii="Calibri" w:hAnsi="Calibri"/>
+                <w:sz w:val="20"/>
+              </w:rPr>
+              <w:t xml:space="default">97</w:t>
             </w:r>
           </w:p>
         </w:tc>
@@ -1313,7 +1313,7 @@
                 <w:rFonts w:ascii="Calibri" w:hAnsi="Calibri"/>
                 <w:sz w:val="20"/>
               </w:rPr>
-              <w:t xml:space="default">61.7%</w:t>
+              <w:t xml:space="default">61.5%</w:t>
             </w:r>
           </w:p>
         </w:tc>
@@ -1368,7 +1368,7 @@
                 <w:sz w:val="20"/>
                 <w:b w:val="true"/>
               </w:rPr>
-              <w:t xml:space="default">42.5 ± 16.6</w:t>
+              <w:t xml:space="default">42 ± 16.6</w:t>
             </w:r>
           </w:p>
         </w:tc>
@@ -1393,7 +1393,7 @@
                 <w:sz w:val="20"/>
                 <w:b w:val="true"/>
               </w:rPr>
-              <w:t xml:space="default">41.5 ± 15.6</w:t>
+              <w:t xml:space="default">41.6 ± 15.7</w:t>
             </w:r>
           </w:p>
         </w:tc>
@@ -1418,7 +1418,7 @@
                 <w:sz w:val="20"/>
                 <w:b w:val="true"/>
               </w:rPr>
-              <w:t xml:space="default">42 ± 16.1</w:t>
+              <w:t xml:space="default">41.8 ± 16.1</w:t>
             </w:r>
           </w:p>
         </w:tc>
@@ -1626,55 +1626,55 @@
                 <w:rFonts w:ascii="Calibri" w:hAnsi="Calibri"/>
                 <w:sz w:val="20"/>
               </w:rPr>
-              <w:t xml:space="default">245 (63%)</w:t>
-            </w:r>
-          </w:p>
-        </w:tc>
-        <w:tc>
-          <w:tcPr>
-            <w:tcBorders>
-              <w:top w:val="single" w:space="0" w:color="D3D3D3"/>
-              <w:bottom w:val="single" w:space="0" w:color="D3D3D3"/>
-              <w:start w:val="single" w:space="0" w:color="D3D3D3"/>
-              <w:end w:val="single" w:space="0" w:color="D3D3D3"/>
-            </w:tcBorders>
-          </w:tcPr>
-          <w:p>
-            <w:pPr>
-              <w:spacing w:before="0" w:after="60"/>
-              <w:keepNext/>
-              <w:jc w:val="start"/>
-            </w:pPr>
-            <w:r>
-              <w:rPr>
-                <w:rFonts w:ascii="Calibri" w:hAnsi="Calibri"/>
-                <w:sz w:val="20"/>
-              </w:rPr>
-              <w:t xml:space="default">302 (62.9%)</w:t>
-            </w:r>
-          </w:p>
-        </w:tc>
-        <w:tc>
-          <w:tcPr>
-            <w:tcBorders>
-              <w:top w:val="single" w:space="0" w:color="D3D3D3"/>
-              <w:bottom w:val="single" w:space="0" w:color="D3D3D3"/>
-              <w:start w:val="single" w:space="0" w:color="D3D3D3"/>
-              <w:end w:val="single" w:space="0" w:color="D3D3D3"/>
-            </w:tcBorders>
-          </w:tcPr>
-          <w:p>
-            <w:pPr>
-              <w:spacing w:before="0" w:after="60"/>
-              <w:keepNext/>
-              <w:jc w:val="start"/>
-            </w:pPr>
-            <w:r>
-              <w:rPr>
-                <w:rFonts w:ascii="Calibri" w:hAnsi="Calibri"/>
-                <w:sz w:val="20"/>
-              </w:rPr>
-              <w:t xml:space="default">547 (63%)</w:t>
+              <w:t xml:space="default">216 (63.9%)</w:t>
+            </w:r>
+          </w:p>
+        </w:tc>
+        <w:tc>
+          <w:tcPr>
+            <w:tcBorders>
+              <w:top w:val="single" w:space="0" w:color="D3D3D3"/>
+              <w:bottom w:val="single" w:space="0" w:color="D3D3D3"/>
+              <w:start w:val="single" w:space="0" w:color="D3D3D3"/>
+              <w:end w:val="single" w:space="0" w:color="D3D3D3"/>
+            </w:tcBorders>
+          </w:tcPr>
+          <w:p>
+            <w:pPr>
+              <w:spacing w:before="0" w:after="60"/>
+              <w:keepNext/>
+              <w:jc w:val="start"/>
+            </w:pPr>
+            <w:r>
+              <w:rPr>
+                <w:rFonts w:ascii="Calibri" w:hAnsi="Calibri"/>
+                <w:sz w:val="20"/>
+              </w:rPr>
+              <w:t xml:space="default">294 (62.3%)</w:t>
+            </w:r>
+          </w:p>
+        </w:tc>
+        <w:tc>
+          <w:tcPr>
+            <w:tcBorders>
+              <w:top w:val="single" w:space="0" w:color="D3D3D3"/>
+              <w:bottom w:val="single" w:space="0" w:color="D3D3D3"/>
+              <w:start w:val="single" w:space="0" w:color="D3D3D3"/>
+              <w:end w:val="single" w:space="0" w:color="D3D3D3"/>
+            </w:tcBorders>
+          </w:tcPr>
+          <w:p>
+            <w:pPr>
+              <w:spacing w:before="0" w:after="60"/>
+              <w:keepNext/>
+              <w:jc w:val="start"/>
+            </w:pPr>
+            <w:r>
+              <w:rPr>
+                <w:rFonts w:ascii="Calibri" w:hAnsi="Calibri"/>
+                <w:sz w:val="20"/>
+              </w:rPr>
+              <w:t xml:space="default">509 (63%)</w:t>
             </w:r>
           </w:p>
         </w:tc>
@@ -1698,7 +1698,7 @@
                 <w:rFonts w:ascii="Calibri" w:hAnsi="Calibri"/>
                 <w:sz w:val="20"/>
               </w:rPr>
-              <w:t xml:space="default">55.1%</w:t>
+              <w:t xml:space="default">57.7%</w:t>
             </w:r>
           </w:p>
         </w:tc>
@@ -1751,55 +1751,55 @@
                 <w:rFonts w:ascii="Calibri" w:hAnsi="Calibri"/>
                 <w:sz w:val="20"/>
               </w:rPr>
-              <w:t xml:space="default">144 (37%)</w:t>
-            </w:r>
-          </w:p>
-        </w:tc>
-        <w:tc>
-          <w:tcPr>
-            <w:tcBorders>
-              <w:top w:val="single" w:space="0" w:color="D3D3D3"/>
-              <w:bottom w:val="single" w:space="0" w:color="D3D3D3"/>
-              <w:start w:val="single" w:space="0" w:color="D3D3D3"/>
-              <w:end w:val="single" w:space="0" w:color="D3D3D3"/>
-            </w:tcBorders>
-          </w:tcPr>
-          <w:p>
-            <w:pPr>
-              <w:spacing w:before="0" w:after="60"/>
-              <w:keepNext/>
-              <w:jc w:val="start"/>
-            </w:pPr>
-            <w:r>
-              <w:rPr>
-                <w:rFonts w:ascii="Calibri" w:hAnsi="Calibri"/>
-                <w:sz w:val="20"/>
-              </w:rPr>
-              <w:t xml:space="default">178 (37.1%)</w:t>
-            </w:r>
-          </w:p>
-        </w:tc>
-        <w:tc>
-          <w:tcPr>
-            <w:tcBorders>
-              <w:top w:val="single" w:space="0" w:color="D3D3D3"/>
-              <w:bottom w:val="single" w:space="0" w:color="D3D3D3"/>
-              <w:start w:val="single" w:space="0" w:color="D3D3D3"/>
-              <w:end w:val="single" w:space="0" w:color="D3D3D3"/>
-            </w:tcBorders>
-          </w:tcPr>
-          <w:p>
-            <w:pPr>
-              <w:spacing w:before="0" w:after="60"/>
-              <w:keepNext/>
-              <w:jc w:val="start"/>
-            </w:pPr>
-            <w:r>
-              <w:rPr>
-                <w:rFonts w:ascii="Calibri" w:hAnsi="Calibri"/>
-                <w:sz w:val="20"/>
-              </w:rPr>
-              <w:t xml:space="default">322 (37%)</w:t>
+              <w:t xml:space="default">122 (36.1%)</w:t>
+            </w:r>
+          </w:p>
+        </w:tc>
+        <w:tc>
+          <w:tcPr>
+            <w:tcBorders>
+              <w:top w:val="single" w:space="0" w:color="D3D3D3"/>
+              <w:bottom w:val="single" w:space="0" w:color="D3D3D3"/>
+              <w:start w:val="single" w:space="0" w:color="D3D3D3"/>
+              <w:end w:val="single" w:space="0" w:color="D3D3D3"/>
+            </w:tcBorders>
+          </w:tcPr>
+          <w:p>
+            <w:pPr>
+              <w:spacing w:before="0" w:after="60"/>
+              <w:keepNext/>
+              <w:jc w:val="start"/>
+            </w:pPr>
+            <w:r>
+              <w:rPr>
+                <w:rFonts w:ascii="Calibri" w:hAnsi="Calibri"/>
+                <w:sz w:val="20"/>
+              </w:rPr>
+              <w:t xml:space="default">178 (37.7%)</w:t>
+            </w:r>
+          </w:p>
+        </w:tc>
+        <w:tc>
+          <w:tcPr>
+            <w:tcBorders>
+              <w:top w:val="single" w:space="0" w:color="D3D3D3"/>
+              <w:bottom w:val="single" w:space="0" w:color="D3D3D3"/>
+              <w:start w:val="single" w:space="0" w:color="D3D3D3"/>
+              <w:end w:val="single" w:space="0" w:color="D3D3D3"/>
+            </w:tcBorders>
+          </w:tcPr>
+          <w:p>
+            <w:pPr>
+              <w:spacing w:before="0" w:after="60"/>
+              <w:keepNext/>
+              <w:jc w:val="start"/>
+            </w:pPr>
+            <w:r>
+              <w:rPr>
+                <w:rFonts w:ascii="Calibri" w:hAnsi="Calibri"/>
+                <w:sz w:val="20"/>
+              </w:rPr>
+              <w:t xml:space="default">300 (37%)</w:t>
             </w:r>
           </w:p>
         </w:tc>
@@ -1823,7 +1823,7 @@
                 <w:rFonts w:ascii="Calibri" w:hAnsi="Calibri"/>
                 <w:sz w:val="20"/>
               </w:rPr>
-              <w:t xml:space="default">55.2%</w:t>
+              <w:t xml:space="default">59.3%</w:t>
             </w:r>
           </w:p>
         </w:tc>
@@ -2006,55 +2006,55 @@
                 <w:rFonts w:ascii="Calibri" w:hAnsi="Calibri"/>
                 <w:sz w:val="20"/>
               </w:rPr>
-              <w:t xml:space="default">140 (35.8%)</w:t>
-            </w:r>
-          </w:p>
-        </w:tc>
-        <w:tc>
-          <w:tcPr>
-            <w:tcBorders>
-              <w:top w:val="single" w:space="0" w:color="D3D3D3"/>
-              <w:bottom w:val="single" w:space="0" w:color="D3D3D3"/>
-              <w:start w:val="single" w:space="0" w:color="D3D3D3"/>
-              <w:end w:val="single" w:space="0" w:color="D3D3D3"/>
-            </w:tcBorders>
-          </w:tcPr>
-          <w:p>
-            <w:pPr>
-              <w:spacing w:before="0" w:after="60"/>
-              <w:keepNext/>
-              <w:jc w:val="start"/>
-            </w:pPr>
-            <w:r>
-              <w:rPr>
-                <w:rFonts w:ascii="Calibri" w:hAnsi="Calibri"/>
-                <w:sz w:val="20"/>
-              </w:rPr>
-              <w:t xml:space="default">139 (28.9%)</w:t>
-            </w:r>
-          </w:p>
-        </w:tc>
-        <w:tc>
-          <w:tcPr>
-            <w:tcBorders>
-              <w:top w:val="single" w:space="0" w:color="D3D3D3"/>
-              <w:bottom w:val="single" w:space="0" w:color="D3D3D3"/>
-              <w:start w:val="single" w:space="0" w:color="D3D3D3"/>
-              <w:end w:val="single" w:space="0" w:color="D3D3D3"/>
-            </w:tcBorders>
-          </w:tcPr>
-          <w:p>
-            <w:pPr>
-              <w:spacing w:before="0" w:after="60"/>
-              <w:keepNext/>
-              <w:jc w:val="start"/>
-            </w:pPr>
-            <w:r>
-              <w:rPr>
-                <w:rFonts w:ascii="Calibri" w:hAnsi="Calibri"/>
-                <w:sz w:val="20"/>
-              </w:rPr>
-              <w:t xml:space="default">278 (32%)</w:t>
+              <w:t xml:space="default">124 (36.8%)</w:t>
+            </w:r>
+          </w:p>
+        </w:tc>
+        <w:tc>
+          <w:tcPr>
+            <w:tcBorders>
+              <w:top w:val="single" w:space="0" w:color="D3D3D3"/>
+              <w:bottom w:val="single" w:space="0" w:color="D3D3D3"/>
+              <w:start w:val="single" w:space="0" w:color="D3D3D3"/>
+              <w:end w:val="single" w:space="0" w:color="D3D3D3"/>
+            </w:tcBorders>
+          </w:tcPr>
+          <w:p>
+            <w:pPr>
+              <w:spacing w:before="0" w:after="60"/>
+              <w:keepNext/>
+              <w:jc w:val="start"/>
+            </w:pPr>
+            <w:r>
+              <w:rPr>
+                <w:rFonts w:ascii="Calibri" w:hAnsi="Calibri"/>
+                <w:sz w:val="20"/>
+              </w:rPr>
+              <w:t xml:space="default">138 (29.2%)</w:t>
+            </w:r>
+          </w:p>
+        </w:tc>
+        <w:tc>
+          <w:tcPr>
+            <w:tcBorders>
+              <w:top w:val="single" w:space="0" w:color="D3D3D3"/>
+              <w:bottom w:val="single" w:space="0" w:color="D3D3D3"/>
+              <w:start w:val="single" w:space="0" w:color="D3D3D3"/>
+              <w:end w:val="single" w:space="0" w:color="D3D3D3"/>
+            </w:tcBorders>
+          </w:tcPr>
+          <w:p>
+            <w:pPr>
+              <w:spacing w:before="0" w:after="60"/>
+              <w:keepNext/>
+              <w:jc w:val="start"/>
+            </w:pPr>
+            <w:r>
+              <w:rPr>
+                <w:rFonts w:ascii="Calibri" w:hAnsi="Calibri"/>
+                <w:sz w:val="20"/>
+              </w:rPr>
+              <w:t xml:space="default">262 (32.4%)</w:t>
             </w:r>
           </w:p>
         </w:tc>
@@ -2078,7 +2078,7 @@
                 <w:rFonts w:ascii="Calibri" w:hAnsi="Calibri"/>
                 <w:sz w:val="20"/>
               </w:rPr>
-              <w:t xml:space="default">49.8%</w:t>
+              <w:t xml:space="default">52.6%</w:t>
             </w:r>
           </w:p>
         </w:tc>
@@ -2131,55 +2131,55 @@
                 <w:rFonts w:ascii="Calibri" w:hAnsi="Calibri"/>
                 <w:sz w:val="20"/>
               </w:rPr>
-              <w:t xml:space="default">54 (13.9%)</w:t>
-            </w:r>
-          </w:p>
-        </w:tc>
-        <w:tc>
-          <w:tcPr>
-            <w:tcBorders>
-              <w:top w:val="single" w:space="0" w:color="D3D3D3"/>
-              <w:bottom w:val="single" w:space="0" w:color="D3D3D3"/>
-              <w:start w:val="single" w:space="0" w:color="D3D3D3"/>
-              <w:end w:val="single" w:space="0" w:color="D3D3D3"/>
-            </w:tcBorders>
-          </w:tcPr>
-          <w:p>
-            <w:pPr>
-              <w:spacing w:before="0" w:after="60"/>
-              <w:keepNext/>
-              <w:jc w:val="start"/>
-            </w:pPr>
-            <w:r>
-              <w:rPr>
-                <w:rFonts w:ascii="Calibri" w:hAnsi="Calibri"/>
-                <w:sz w:val="20"/>
-              </w:rPr>
-              <w:t xml:space="default">77 (16.1%)</w:t>
-            </w:r>
-          </w:p>
-        </w:tc>
-        <w:tc>
-          <w:tcPr>
-            <w:tcBorders>
-              <w:top w:val="single" w:space="0" w:color="D3D3D3"/>
-              <w:bottom w:val="single" w:space="0" w:color="D3D3D3"/>
-              <w:start w:val="single" w:space="0" w:color="D3D3D3"/>
-              <w:end w:val="single" w:space="0" w:color="D3D3D3"/>
-            </w:tcBorders>
-          </w:tcPr>
-          <w:p>
-            <w:pPr>
-              <w:spacing w:before="0" w:after="60"/>
-              <w:keepNext/>
-              <w:jc w:val="start"/>
-            </w:pPr>
-            <w:r>
-              <w:rPr>
-                <w:rFonts w:ascii="Calibri" w:hAnsi="Calibri"/>
-                <w:sz w:val="20"/>
-              </w:rPr>
-              <w:t xml:space="default">131 (15.1%)</w:t>
+              <w:t xml:space="default">48 (14.3%)</w:t>
+            </w:r>
+          </w:p>
+        </w:tc>
+        <w:tc>
+          <w:tcPr>
+            <w:tcBorders>
+              <w:top w:val="single" w:space="0" w:color="D3D3D3"/>
+              <w:bottom w:val="single" w:space="0" w:color="D3D3D3"/>
+              <w:start w:val="single" w:space="0" w:color="D3D3D3"/>
+              <w:end w:val="single" w:space="0" w:color="D3D3D3"/>
+            </w:tcBorders>
+          </w:tcPr>
+          <w:p>
+            <w:pPr>
+              <w:spacing w:before="0" w:after="60"/>
+              <w:keepNext/>
+              <w:jc w:val="start"/>
+            </w:pPr>
+            <w:r>
+              <w:rPr>
+                <w:rFonts w:ascii="Calibri" w:hAnsi="Calibri"/>
+                <w:sz w:val="20"/>
+              </w:rPr>
+              <w:t xml:space="default">71 (15.1%)</w:t>
+            </w:r>
+          </w:p>
+        </w:tc>
+        <w:tc>
+          <w:tcPr>
+            <w:tcBorders>
+              <w:top w:val="single" w:space="0" w:color="D3D3D3"/>
+              <w:bottom w:val="single" w:space="0" w:color="D3D3D3"/>
+              <w:start w:val="single" w:space="0" w:color="D3D3D3"/>
+              <w:end w:val="single" w:space="0" w:color="D3D3D3"/>
+            </w:tcBorders>
+          </w:tcPr>
+          <w:p>
+            <w:pPr>
+              <w:spacing w:before="0" w:after="60"/>
+              <w:keepNext/>
+              <w:jc w:val="start"/>
+            </w:pPr>
+            <w:r>
+              <w:rPr>
+                <w:rFonts w:ascii="Calibri" w:hAnsi="Calibri"/>
+                <w:sz w:val="20"/>
+              </w:rPr>
+              <w:t xml:space="default">120 (14.8%)</w:t>
             </w:r>
           </w:p>
         </w:tc>
@@ -2203,7 +2203,7 @@
                 <w:rFonts w:ascii="Calibri" w:hAnsi="Calibri"/>
                 <w:sz w:val="20"/>
               </w:rPr>
-              <w:t xml:space="default">58.7%</w:t>
+              <w:t xml:space="default">59.7%</w:t>
             </w:r>
           </w:p>
         </w:tc>
@@ -2256,55 +2256,55 @@
                 <w:rFonts w:ascii="Calibri" w:hAnsi="Calibri"/>
                 <w:sz w:val="20"/>
               </w:rPr>
-              <w:t xml:space="default">56 (14.3%)</w:t>
-            </w:r>
-          </w:p>
-        </w:tc>
-        <w:tc>
-          <w:tcPr>
-            <w:tcBorders>
-              <w:top w:val="single" w:space="0" w:color="D3D3D3"/>
-              <w:bottom w:val="single" w:space="0" w:color="D3D3D3"/>
-              <w:start w:val="single" w:space="0" w:color="D3D3D3"/>
-              <w:end w:val="single" w:space="0" w:color="D3D3D3"/>
-            </w:tcBorders>
-          </w:tcPr>
-          <w:p>
-            <w:pPr>
-              <w:spacing w:before="0" w:after="60"/>
-              <w:keepNext/>
-              <w:jc w:val="start"/>
-            </w:pPr>
-            <w:r>
-              <w:rPr>
-                <w:rFonts w:ascii="Calibri" w:hAnsi="Calibri"/>
-                <w:sz w:val="20"/>
-              </w:rPr>
-              <w:t xml:space="default">60 (12.6%)</w:t>
-            </w:r>
-          </w:p>
-        </w:tc>
-        <w:tc>
-          <w:tcPr>
-            <w:tcBorders>
-              <w:top w:val="single" w:space="0" w:color="D3D3D3"/>
-              <w:bottom w:val="single" w:space="0" w:color="D3D3D3"/>
-              <w:start w:val="single" w:space="0" w:color="D3D3D3"/>
-              <w:end w:val="single" w:space="0" w:color="D3D3D3"/>
-            </w:tcBorders>
-          </w:tcPr>
-          <w:p>
-            <w:pPr>
-              <w:spacing w:before="0" w:after="60"/>
-              <w:keepNext/>
-              <w:jc w:val="start"/>
-            </w:pPr>
-            <w:r>
-              <w:rPr>
-                <w:rFonts w:ascii="Calibri" w:hAnsi="Calibri"/>
-                <w:sz w:val="20"/>
-              </w:rPr>
-              <w:t xml:space="default">116 (13.4%)</w:t>
+              <w:t xml:space="default">46 (13.7%)</w:t>
+            </w:r>
+          </w:p>
+        </w:tc>
+        <w:tc>
+          <w:tcPr>
+            <w:tcBorders>
+              <w:top w:val="single" w:space="0" w:color="D3D3D3"/>
+              <w:bottom w:val="single" w:space="0" w:color="D3D3D3"/>
+              <w:start w:val="single" w:space="0" w:color="D3D3D3"/>
+              <w:end w:val="single" w:space="0" w:color="D3D3D3"/>
+            </w:tcBorders>
+          </w:tcPr>
+          <w:p>
+            <w:pPr>
+              <w:spacing w:before="0" w:after="60"/>
+              <w:keepNext/>
+              <w:jc w:val="start"/>
+            </w:pPr>
+            <w:r>
+              <w:rPr>
+                <w:rFonts w:ascii="Calibri" w:hAnsi="Calibri"/>
+                <w:sz w:val="20"/>
+              </w:rPr>
+              <w:t xml:space="default">60 (12.8%)</w:t>
+            </w:r>
+          </w:p>
+        </w:tc>
+        <w:tc>
+          <w:tcPr>
+            <w:tcBorders>
+              <w:top w:val="single" w:space="0" w:color="D3D3D3"/>
+              <w:bottom w:val="single" w:space="0" w:color="D3D3D3"/>
+              <w:start w:val="single" w:space="0" w:color="D3D3D3"/>
+              <w:end w:val="single" w:space="0" w:color="D3D3D3"/>
+            </w:tcBorders>
+          </w:tcPr>
+          <w:p>
+            <w:pPr>
+              <w:spacing w:before="0" w:after="60"/>
+              <w:keepNext/>
+              <w:jc w:val="start"/>
+            </w:pPr>
+            <w:r>
+              <w:rPr>
+                <w:rFonts w:ascii="Calibri" w:hAnsi="Calibri"/>
+                <w:sz w:val="20"/>
+              </w:rPr>
+              <w:t xml:space="default">107 (13.2%)</w:t>
             </w:r>
           </w:p>
         </w:tc>
@@ -2328,7 +2328,7 @@
                 <w:rFonts w:ascii="Calibri" w:hAnsi="Calibri"/>
                 <w:sz w:val="20"/>
               </w:rPr>
-              <w:t xml:space="default">52.1%</w:t>
+              <w:t xml:space="default">56.6%</w:t>
             </w:r>
           </w:p>
         </w:tc>
@@ -2381,55 +2381,55 @@
                 <w:rFonts w:ascii="Calibri" w:hAnsi="Calibri"/>
                 <w:sz w:val="20"/>
               </w:rPr>
-              <w:t xml:space="default">42 (10.9%)</w:t>
-            </w:r>
-          </w:p>
-        </w:tc>
-        <w:tc>
-          <w:tcPr>
-            <w:tcBorders>
-              <w:top w:val="single" w:space="0" w:color="D3D3D3"/>
-              <w:bottom w:val="single" w:space="0" w:color="D3D3D3"/>
-              <w:start w:val="single" w:space="0" w:color="D3D3D3"/>
-              <w:end w:val="single" w:space="0" w:color="D3D3D3"/>
-            </w:tcBorders>
-          </w:tcPr>
-          <w:p>
-            <w:pPr>
-              <w:spacing w:before="0" w:after="60"/>
-              <w:keepNext/>
-              <w:jc w:val="start"/>
-            </w:pPr>
-            <w:r>
-              <w:rPr>
-                <w:rFonts w:ascii="Calibri" w:hAnsi="Calibri"/>
-                <w:sz w:val="20"/>
-              </w:rPr>
-              <w:t xml:space="default">37 (7.7%)</w:t>
-            </w:r>
-          </w:p>
-        </w:tc>
-        <w:tc>
-          <w:tcPr>
-            <w:tcBorders>
-              <w:top w:val="single" w:space="0" w:color="D3D3D3"/>
-              <w:bottom w:val="single" w:space="0" w:color="D3D3D3"/>
-              <w:start w:val="single" w:space="0" w:color="D3D3D3"/>
-              <w:end w:val="single" w:space="0" w:color="D3D3D3"/>
-            </w:tcBorders>
-          </w:tcPr>
-          <w:p>
-            <w:pPr>
-              <w:spacing w:before="0" w:after="60"/>
-              <w:keepNext/>
-              <w:jc w:val="start"/>
-            </w:pPr>
-            <w:r>
-              <w:rPr>
-                <w:rFonts w:ascii="Calibri" w:hAnsi="Calibri"/>
-                <w:sz w:val="20"/>
-              </w:rPr>
-              <w:t xml:space="default">79 (9.1%)</w:t>
+              <w:t xml:space="default">35 (10.3%)</w:t>
+            </w:r>
+          </w:p>
+        </w:tc>
+        <w:tc>
+          <w:tcPr>
+            <w:tcBorders>
+              <w:top w:val="single" w:space="0" w:color="D3D3D3"/>
+              <w:bottom w:val="single" w:space="0" w:color="D3D3D3"/>
+              <w:start w:val="single" w:space="0" w:color="D3D3D3"/>
+              <w:end w:val="single" w:space="0" w:color="D3D3D3"/>
+            </w:tcBorders>
+          </w:tcPr>
+          <w:p>
+            <w:pPr>
+              <w:spacing w:before="0" w:after="60"/>
+              <w:keepNext/>
+              <w:jc w:val="start"/>
+            </w:pPr>
+            <w:r>
+              <w:rPr>
+                <w:rFonts w:ascii="Calibri" w:hAnsi="Calibri"/>
+                <w:sz w:val="20"/>
+              </w:rPr>
+              <w:t xml:space="default">37 (7.8%)</w:t>
+            </w:r>
+          </w:p>
+        </w:tc>
+        <w:tc>
+          <w:tcPr>
+            <w:tcBorders>
+              <w:top w:val="single" w:space="0" w:color="D3D3D3"/>
+              <w:bottom w:val="single" w:space="0" w:color="D3D3D3"/>
+              <w:start w:val="single" w:space="0" w:color="D3D3D3"/>
+              <w:end w:val="single" w:space="0" w:color="D3D3D3"/>
+            </w:tcBorders>
+          </w:tcPr>
+          <w:p>
+            <w:pPr>
+              <w:spacing w:before="0" w:after="60"/>
+              <w:keepNext/>
+              <w:jc w:val="start"/>
+            </w:pPr>
+            <w:r>
+              <w:rPr>
+                <w:rFonts w:ascii="Calibri" w:hAnsi="Calibri"/>
+                <w:sz w:val="20"/>
+              </w:rPr>
+              <w:t xml:space="default">72 (8.8%)</w:t>
             </w:r>
           </w:p>
         </w:tc>
@@ -2453,7 +2453,7 @@
                 <w:rFonts w:ascii="Calibri" w:hAnsi="Calibri"/>
                 <w:sz w:val="20"/>
               </w:rPr>
-              <w:t xml:space="default">46.5%</w:t>
+              <w:t xml:space="default">51.5%</w:t>
             </w:r>
           </w:p>
         </w:tc>
@@ -2506,55 +2506,55 @@
                 <w:rFonts w:ascii="Calibri" w:hAnsi="Calibri"/>
                 <w:sz w:val="20"/>
               </w:rPr>
-              <w:t xml:space="default">45 (11.5%)</w:t>
-            </w:r>
-          </w:p>
-        </w:tc>
-        <w:tc>
-          <w:tcPr>
-            <w:tcBorders>
-              <w:top w:val="single" w:space="0" w:color="D3D3D3"/>
-              <w:bottom w:val="single" w:space="0" w:color="D3D3D3"/>
-              <w:start w:val="single" w:space="0" w:color="D3D3D3"/>
-              <w:end w:val="single" w:space="0" w:color="D3D3D3"/>
-            </w:tcBorders>
-          </w:tcPr>
-          <w:p>
-            <w:pPr>
-              <w:spacing w:before="0" w:after="60"/>
-              <w:keepNext/>
-              <w:jc w:val="start"/>
-            </w:pPr>
-            <w:r>
-              <w:rPr>
-                <w:rFonts w:ascii="Calibri" w:hAnsi="Calibri"/>
-                <w:sz w:val="20"/>
-              </w:rPr>
-              <w:t xml:space="default">37 (7.8%)</w:t>
-            </w:r>
-          </w:p>
-        </w:tc>
-        <w:tc>
-          <w:tcPr>
-            <w:tcBorders>
-              <w:top w:val="single" w:space="0" w:color="D3D3D3"/>
-              <w:bottom w:val="single" w:space="0" w:color="D3D3D3"/>
-              <w:start w:val="single" w:space="0" w:color="D3D3D3"/>
-              <w:end w:val="single" w:space="0" w:color="D3D3D3"/>
-            </w:tcBorders>
-          </w:tcPr>
-          <w:p>
-            <w:pPr>
-              <w:spacing w:before="0" w:after="60"/>
-              <w:keepNext/>
-              <w:jc w:val="start"/>
-            </w:pPr>
-            <w:r>
-              <w:rPr>
-                <w:rFonts w:ascii="Calibri" w:hAnsi="Calibri"/>
-                <w:sz w:val="20"/>
-              </w:rPr>
-              <w:t xml:space="default">82 (9.4%)</w:t>
+              <w:t xml:space="default">38 (11.3%)</w:t>
+            </w:r>
+          </w:p>
+        </w:tc>
+        <w:tc>
+          <w:tcPr>
+            <w:tcBorders>
+              <w:top w:val="single" w:space="0" w:color="D3D3D3"/>
+              <w:bottom w:val="single" w:space="0" w:color="D3D3D3"/>
+              <w:start w:val="single" w:space="0" w:color="D3D3D3"/>
+              <w:end w:val="single" w:space="0" w:color="D3D3D3"/>
+            </w:tcBorders>
+          </w:tcPr>
+          <w:p>
+            <w:pPr>
+              <w:spacing w:before="0" w:after="60"/>
+              <w:keepNext/>
+              <w:jc w:val="start"/>
+            </w:pPr>
+            <w:r>
+              <w:rPr>
+                <w:rFonts w:ascii="Calibri" w:hAnsi="Calibri"/>
+                <w:sz w:val="20"/>
+              </w:rPr>
+              <w:t xml:space="default">37 (7.9%)</w:t>
+            </w:r>
+          </w:p>
+        </w:tc>
+        <w:tc>
+          <w:tcPr>
+            <w:tcBorders>
+              <w:top w:val="single" w:space="0" w:color="D3D3D3"/>
+              <w:bottom w:val="single" w:space="0" w:color="D3D3D3"/>
+              <w:start w:val="single" w:space="0" w:color="D3D3D3"/>
+              <w:end w:val="single" w:space="0" w:color="D3D3D3"/>
+            </w:tcBorders>
+          </w:tcPr>
+          <w:p>
+            <w:pPr>
+              <w:spacing w:before="0" w:after="60"/>
+              <w:keepNext/>
+              <w:jc w:val="start"/>
+            </w:pPr>
+            <w:r>
+              <w:rPr>
+                <w:rFonts w:ascii="Calibri" w:hAnsi="Calibri"/>
+                <w:sz w:val="20"/>
+              </w:rPr>
+              <w:t xml:space="default">75 (9.3%)</w:t>
             </w:r>
           </w:p>
         </w:tc>
@@ -2578,7 +2578,7 @@
                 <w:rFonts w:ascii="Calibri" w:hAnsi="Calibri"/>
                 <w:sz w:val="20"/>
               </w:rPr>
-              <w:t xml:space="default">45.5%</w:t>
+              <w:t xml:space="default">49.4%</w:t>
             </w:r>
           </w:p>
         </w:tc>
@@ -2761,55 +2761,55 @@
                 <w:rFonts w:ascii="Calibri" w:hAnsi="Calibri"/>
                 <w:sz w:val="20"/>
               </w:rPr>
-              <w:t xml:space="default">175 (44.9%)</w:t>
-            </w:r>
-          </w:p>
-        </w:tc>
-        <w:tc>
-          <w:tcPr>
-            <w:tcBorders>
-              <w:top w:val="single" w:space="0" w:color="D3D3D3"/>
-              <w:bottom w:val="single" w:space="0" w:color="D3D3D3"/>
-              <w:start w:val="single" w:space="0" w:color="D3D3D3"/>
-              <w:end w:val="single" w:space="0" w:color="D3D3D3"/>
-            </w:tcBorders>
-          </w:tcPr>
-          <w:p>
-            <w:pPr>
-              <w:spacing w:before="0" w:after="60"/>
-              <w:keepNext/>
-              <w:jc w:val="start"/>
-            </w:pPr>
-            <w:r>
-              <w:rPr>
-                <w:rFonts w:ascii="Calibri" w:hAnsi="Calibri"/>
-                <w:sz w:val="20"/>
-              </w:rPr>
-              <w:t xml:space="default">150 (31.3%)</w:t>
-            </w:r>
-          </w:p>
-        </w:tc>
-        <w:tc>
-          <w:tcPr>
-            <w:tcBorders>
-              <w:top w:val="single" w:space="0" w:color="D3D3D3"/>
-              <w:bottom w:val="single" w:space="0" w:color="D3D3D3"/>
-              <w:start w:val="single" w:space="0" w:color="D3D3D3"/>
-              <w:end w:val="single" w:space="0" w:color="D3D3D3"/>
-            </w:tcBorders>
-          </w:tcPr>
-          <w:p>
-            <w:pPr>
-              <w:spacing w:before="0" w:after="60"/>
-              <w:keepNext/>
-              <w:jc w:val="start"/>
-            </w:pPr>
-            <w:r>
-              <w:rPr>
-                <w:rFonts w:ascii="Calibri" w:hAnsi="Calibri"/>
-                <w:sz w:val="20"/>
-              </w:rPr>
-              <w:t xml:space="default">325 (37.4%)</w:t>
+              <w:t xml:space="default">161 (47.6%)</w:t>
+            </w:r>
+          </w:p>
+        </w:tc>
+        <w:tc>
+          <w:tcPr>
+            <w:tcBorders>
+              <w:top w:val="single" w:space="0" w:color="D3D3D3"/>
+              <w:bottom w:val="single" w:space="0" w:color="D3D3D3"/>
+              <w:start w:val="single" w:space="0" w:color="D3D3D3"/>
+              <w:end w:val="single" w:space="0" w:color="D3D3D3"/>
+            </w:tcBorders>
+          </w:tcPr>
+          <w:p>
+            <w:pPr>
+              <w:spacing w:before="0" w:after="60"/>
+              <w:keepNext/>
+              <w:jc w:val="start"/>
+            </w:pPr>
+            <w:r>
+              <w:rPr>
+                <w:rFonts w:ascii="Calibri" w:hAnsi="Calibri"/>
+                <w:sz w:val="20"/>
+              </w:rPr>
+              <w:t xml:space="default">149 (31.6%)</w:t>
+            </w:r>
+          </w:p>
+        </w:tc>
+        <w:tc>
+          <w:tcPr>
+            <w:tcBorders>
+              <w:top w:val="single" w:space="0" w:color="D3D3D3"/>
+              <w:bottom w:val="single" w:space="0" w:color="D3D3D3"/>
+              <w:start w:val="single" w:space="0" w:color="D3D3D3"/>
+              <w:end w:val="single" w:space="0" w:color="D3D3D3"/>
+            </w:tcBorders>
+          </w:tcPr>
+          <w:p>
+            <w:pPr>
+              <w:spacing w:before="0" w:after="60"/>
+              <w:keepNext/>
+              <w:jc w:val="start"/>
+            </w:pPr>
+            <w:r>
+              <w:rPr>
+                <w:rFonts w:ascii="Calibri" w:hAnsi="Calibri"/>
+                <w:sz w:val="20"/>
+              </w:rPr>
+              <w:t xml:space="default">310 (38.3%)</w:t>
             </w:r>
           </w:p>
         </w:tc>
@@ -2833,7 +2833,7 @@
                 <w:rFonts w:ascii="Calibri" w:hAnsi="Calibri"/>
                 <w:sz w:val="20"/>
               </w:rPr>
-              <w:t xml:space="default">46.1%</w:t>
+              <w:t xml:space="default">48.1%</w:t>
             </w:r>
           </w:p>
         </w:tc>
@@ -2886,55 +2886,55 @@
                 <w:rFonts w:ascii="Calibri" w:hAnsi="Calibri"/>
                 <w:sz w:val="20"/>
               </w:rPr>
-              <w:t xml:space="default">35 (8.9%)</w:t>
-            </w:r>
-          </w:p>
-        </w:tc>
-        <w:tc>
-          <w:tcPr>
-            <w:tcBorders>
-              <w:top w:val="single" w:space="0" w:color="D3D3D3"/>
-              <w:bottom w:val="single" w:space="0" w:color="D3D3D3"/>
-              <w:start w:val="single" w:space="0" w:color="D3D3D3"/>
-              <w:end w:val="single" w:space="0" w:color="D3D3D3"/>
-            </w:tcBorders>
-          </w:tcPr>
-          <w:p>
-            <w:pPr>
-              <w:spacing w:before="0" w:after="60"/>
-              <w:keepNext/>
-              <w:jc w:val="start"/>
-            </w:pPr>
-            <w:r>
-              <w:rPr>
-                <w:rFonts w:ascii="Calibri" w:hAnsi="Calibri"/>
-                <w:sz w:val="20"/>
-              </w:rPr>
-              <w:t xml:space="default">52 (10.9%)</w:t>
-            </w:r>
-          </w:p>
-        </w:tc>
-        <w:tc>
-          <w:tcPr>
-            <w:tcBorders>
-              <w:top w:val="single" w:space="0" w:color="D3D3D3"/>
-              <w:bottom w:val="single" w:space="0" w:color="D3D3D3"/>
-              <w:start w:val="single" w:space="0" w:color="D3D3D3"/>
-              <w:end w:val="single" w:space="0" w:color="D3D3D3"/>
-            </w:tcBorders>
-          </w:tcPr>
-          <w:p>
-            <w:pPr>
-              <w:spacing w:before="0" w:after="60"/>
-              <w:keepNext/>
-              <w:jc w:val="start"/>
-            </w:pPr>
-            <w:r>
-              <w:rPr>
-                <w:rFonts w:ascii="Calibri" w:hAnsi="Calibri"/>
-                <w:sz w:val="20"/>
-              </w:rPr>
-              <w:t xml:space="default">87 (10%)</w:t>
+              <w:t xml:space="default">30 (8.8%)</w:t>
+            </w:r>
+          </w:p>
+        </w:tc>
+        <w:tc>
+          <w:tcPr>
+            <w:tcBorders>
+              <w:top w:val="single" w:space="0" w:color="D3D3D3"/>
+              <w:bottom w:val="single" w:space="0" w:color="D3D3D3"/>
+              <w:start w:val="single" w:space="0" w:color="D3D3D3"/>
+              <w:end w:val="single" w:space="0" w:color="D3D3D3"/>
+            </w:tcBorders>
+          </w:tcPr>
+          <w:p>
+            <w:pPr>
+              <w:spacing w:before="0" w:after="60"/>
+              <w:keepNext/>
+              <w:jc w:val="start"/>
+            </w:pPr>
+            <w:r>
+              <w:rPr>
+                <w:rFonts w:ascii="Calibri" w:hAnsi="Calibri"/>
+                <w:sz w:val="20"/>
+              </w:rPr>
+              <w:t xml:space="default">52 (11.1%)</w:t>
+            </w:r>
+          </w:p>
+        </w:tc>
+        <w:tc>
+          <w:tcPr>
+            <w:tcBorders>
+              <w:top w:val="single" w:space="0" w:color="D3D3D3"/>
+              <w:bottom w:val="single" w:space="0" w:color="D3D3D3"/>
+              <w:start w:val="single" w:space="0" w:color="D3D3D3"/>
+              <w:end w:val="single" w:space="0" w:color="D3D3D3"/>
+            </w:tcBorders>
+          </w:tcPr>
+          <w:p>
+            <w:pPr>
+              <w:spacing w:before="0" w:after="60"/>
+              <w:keepNext/>
+              <w:jc w:val="start"/>
+            </w:pPr>
+            <w:r>
+              <w:rPr>
+                <w:rFonts w:ascii="Calibri" w:hAnsi="Calibri"/>
+                <w:sz w:val="20"/>
+              </w:rPr>
+              <w:t xml:space="default">82 (10.1%)</w:t>
             </w:r>
           </w:p>
         </w:tc>
@@ -2958,7 +2958,7 @@
                 <w:rFonts w:ascii="Calibri" w:hAnsi="Calibri"/>
                 <w:sz w:val="20"/>
               </w:rPr>
-              <w:t xml:space="default">60%</w:t>
+              <w:t xml:space="default">63.7%</w:t>
             </w:r>
           </w:p>
         </w:tc>
@@ -3011,55 +3011,55 @@
                 <w:rFonts w:ascii="Calibri" w:hAnsi="Calibri"/>
                 <w:sz w:val="20"/>
               </w:rPr>
-              <w:t xml:space="default">44 (11.3%)</w:t>
-            </w:r>
-          </w:p>
-        </w:tc>
-        <w:tc>
-          <w:tcPr>
-            <w:tcBorders>
-              <w:top w:val="single" w:space="0" w:color="D3D3D3"/>
-              <w:bottom w:val="single" w:space="0" w:color="D3D3D3"/>
-              <w:start w:val="single" w:space="0" w:color="D3D3D3"/>
-              <w:end w:val="single" w:space="0" w:color="D3D3D3"/>
-            </w:tcBorders>
-          </w:tcPr>
-          <w:p>
-            <w:pPr>
-              <w:spacing w:before="0" w:after="60"/>
-              <w:keepNext/>
-              <w:jc w:val="start"/>
-            </w:pPr>
-            <w:r>
-              <w:rPr>
-                <w:rFonts w:ascii="Calibri" w:hAnsi="Calibri"/>
-                <w:sz w:val="20"/>
-              </w:rPr>
-              <w:t xml:space="default">44 (9.3%)</w:t>
-            </w:r>
-          </w:p>
-        </w:tc>
-        <w:tc>
-          <w:tcPr>
-            <w:tcBorders>
-              <w:top w:val="single" w:space="0" w:color="D3D3D3"/>
-              <w:bottom w:val="single" w:space="0" w:color="D3D3D3"/>
-              <w:start w:val="single" w:space="0" w:color="D3D3D3"/>
-              <w:end w:val="single" w:space="0" w:color="D3D3D3"/>
-            </w:tcBorders>
-          </w:tcPr>
-          <w:p>
-            <w:pPr>
-              <w:spacing w:before="0" w:after="60"/>
-              <w:keepNext/>
-              <w:jc w:val="start"/>
-            </w:pPr>
-            <w:r>
-              <w:rPr>
-                <w:rFonts w:ascii="Calibri" w:hAnsi="Calibri"/>
-                <w:sz w:val="20"/>
-              </w:rPr>
-              <w:t xml:space="default">88 (10.2%)</w:t>
+              <w:t xml:space="default">38 (11.2%)</w:t>
+            </w:r>
+          </w:p>
+        </w:tc>
+        <w:tc>
+          <w:tcPr>
+            <w:tcBorders>
+              <w:top w:val="single" w:space="0" w:color="D3D3D3"/>
+              <w:bottom w:val="single" w:space="0" w:color="D3D3D3"/>
+              <w:start w:val="single" w:space="0" w:color="D3D3D3"/>
+              <w:end w:val="single" w:space="0" w:color="D3D3D3"/>
+            </w:tcBorders>
+          </w:tcPr>
+          <w:p>
+            <w:pPr>
+              <w:spacing w:before="0" w:after="60"/>
+              <w:keepNext/>
+              <w:jc w:val="start"/>
+            </w:pPr>
+            <w:r>
+              <w:rPr>
+                <w:rFonts w:ascii="Calibri" w:hAnsi="Calibri"/>
+                <w:sz w:val="20"/>
+              </w:rPr>
+              <w:t xml:space="default">44 (9.4%)</w:t>
+            </w:r>
+          </w:p>
+        </w:tc>
+        <w:tc>
+          <w:tcPr>
+            <w:tcBorders>
+              <w:top w:val="single" w:space="0" w:color="D3D3D3"/>
+              <w:bottom w:val="single" w:space="0" w:color="D3D3D3"/>
+              <w:start w:val="single" w:space="0" w:color="D3D3D3"/>
+              <w:end w:val="single" w:space="0" w:color="D3D3D3"/>
+            </w:tcBorders>
+          </w:tcPr>
+          <w:p>
+            <w:pPr>
+              <w:spacing w:before="0" w:after="60"/>
+              <w:keepNext/>
+              <w:jc w:val="start"/>
+            </w:pPr>
+            <w:r>
+              <w:rPr>
+                <w:rFonts w:ascii="Calibri" w:hAnsi="Calibri"/>
+                <w:sz w:val="20"/>
+              </w:rPr>
+              <w:t xml:space="default">82 (10.2%)</w:t>
             </w:r>
           </w:p>
         </w:tc>
@@ -3083,7 +3083,7 @@
                 <w:rFonts w:ascii="Calibri" w:hAnsi="Calibri"/>
                 <w:sz w:val="20"/>
               </w:rPr>
-              <w:t xml:space="default">50.3%</w:t>
+              <w:t xml:space="default">53.9%</w:t>
             </w:r>
           </w:p>
         </w:tc>
@@ -3136,55 +3136,55 @@
                 <w:rFonts w:ascii="Calibri" w:hAnsi="Calibri"/>
                 <w:sz w:val="20"/>
               </w:rPr>
-              <w:t xml:space="default">13 (3.3%)</w:t>
-            </w:r>
-          </w:p>
-        </w:tc>
-        <w:tc>
-          <w:tcPr>
-            <w:tcBorders>
-              <w:top w:val="single" w:space="0" w:color="D3D3D3"/>
-              <w:bottom w:val="single" w:space="0" w:color="D3D3D3"/>
-              <w:start w:val="single" w:space="0" w:color="D3D3D3"/>
-              <w:end w:val="single" w:space="0" w:color="D3D3D3"/>
-            </w:tcBorders>
-          </w:tcPr>
-          <w:p>
-            <w:pPr>
-              <w:spacing w:before="0" w:after="60"/>
-              <w:keepNext/>
-              <w:jc w:val="start"/>
-            </w:pPr>
-            <w:r>
-              <w:rPr>
-                <w:rFonts w:ascii="Calibri" w:hAnsi="Calibri"/>
-                <w:sz w:val="20"/>
-              </w:rPr>
-              <w:t xml:space="default">25 (5.3%)</w:t>
-            </w:r>
-          </w:p>
-        </w:tc>
-        <w:tc>
-          <w:tcPr>
-            <w:tcBorders>
-              <w:top w:val="single" w:space="0" w:color="D3D3D3"/>
-              <w:bottom w:val="single" w:space="0" w:color="D3D3D3"/>
-              <w:start w:val="single" w:space="0" w:color="D3D3D3"/>
-              <w:end w:val="single" w:space="0" w:color="D3D3D3"/>
-            </w:tcBorders>
-          </w:tcPr>
-          <w:p>
-            <w:pPr>
-              <w:spacing w:before="0" w:after="60"/>
-              <w:keepNext/>
-              <w:jc w:val="start"/>
-            </w:pPr>
-            <w:r>
-              <w:rPr>
-                <w:rFonts w:ascii="Calibri" w:hAnsi="Calibri"/>
-                <w:sz w:val="20"/>
-              </w:rPr>
-              <w:t xml:space="default">38 (4.4%)</w:t>
+              <w:t xml:space="default">10 (3%)</w:t>
+            </w:r>
+          </w:p>
+        </w:tc>
+        <w:tc>
+          <w:tcPr>
+            <w:tcBorders>
+              <w:top w:val="single" w:space="0" w:color="D3D3D3"/>
+              <w:bottom w:val="single" w:space="0" w:color="D3D3D3"/>
+              <w:start w:val="single" w:space="0" w:color="D3D3D3"/>
+              <w:end w:val="single" w:space="0" w:color="D3D3D3"/>
+            </w:tcBorders>
+          </w:tcPr>
+          <w:p>
+            <w:pPr>
+              <w:spacing w:before="0" w:after="60"/>
+              <w:keepNext/>
+              <w:jc w:val="start"/>
+            </w:pPr>
+            <w:r>
+              <w:rPr>
+                <w:rFonts w:ascii="Calibri" w:hAnsi="Calibri"/>
+                <w:sz w:val="20"/>
+              </w:rPr>
+              <w:t xml:space="default">25 (5.4%)</w:t>
+            </w:r>
+          </w:p>
+        </w:tc>
+        <w:tc>
+          <w:tcPr>
+            <w:tcBorders>
+              <w:top w:val="single" w:space="0" w:color="D3D3D3"/>
+              <w:bottom w:val="single" w:space="0" w:color="D3D3D3"/>
+              <w:start w:val="single" w:space="0" w:color="D3D3D3"/>
+              <w:end w:val="single" w:space="0" w:color="D3D3D3"/>
+            </w:tcBorders>
+          </w:tcPr>
+          <w:p>
+            <w:pPr>
+              <w:spacing w:before="0" w:after="60"/>
+              <w:keepNext/>
+              <w:jc w:val="start"/>
+            </w:pPr>
+            <w:r>
+              <w:rPr>
+                <w:rFonts w:ascii="Calibri" w:hAnsi="Calibri"/>
+                <w:sz w:val="20"/>
+              </w:rPr>
+              <w:t xml:space="default">35 (4.4%)</w:t>
             </w:r>
           </w:p>
         </w:tc>
@@ -3208,7 +3208,7 @@
                 <w:rFonts w:ascii="Calibri" w:hAnsi="Calibri"/>
                 <w:sz w:val="20"/>
               </w:rPr>
-              <w:t xml:space="default">66.5%</w:t>
+              <w:t xml:space="default">71.5%</w:t>
             </w:r>
           </w:p>
         </w:tc>
@@ -3391,55 +3391,55 @@
                 <w:rFonts w:ascii="Calibri" w:hAnsi="Calibri"/>
                 <w:sz w:val="20"/>
               </w:rPr>
-              <w:t xml:space="default">96 (24.5%)</w:t>
-            </w:r>
-          </w:p>
-        </w:tc>
-        <w:tc>
-          <w:tcPr>
-            <w:tcBorders>
-              <w:top w:val="single" w:space="0" w:color="D3D3D3"/>
-              <w:bottom w:val="single" w:space="0" w:color="D3D3D3"/>
-              <w:start w:val="single" w:space="0" w:color="D3D3D3"/>
-              <w:end w:val="single" w:space="0" w:color="D3D3D3"/>
-            </w:tcBorders>
-          </w:tcPr>
-          <w:p>
-            <w:pPr>
-              <w:spacing w:before="0" w:after="60"/>
-              <w:keepNext/>
-              <w:jc w:val="start"/>
-            </w:pPr>
-            <w:r>
-              <w:rPr>
-                <w:rFonts w:ascii="Calibri" w:hAnsi="Calibri"/>
-                <w:sz w:val="20"/>
-              </w:rPr>
-              <w:t xml:space="default">123 (25.8%)</w:t>
-            </w:r>
-          </w:p>
-        </w:tc>
-        <w:tc>
-          <w:tcPr>
-            <w:tcBorders>
-              <w:top w:val="single" w:space="0" w:color="D3D3D3"/>
-              <w:bottom w:val="single" w:space="0" w:color="D3D3D3"/>
-              <w:start w:val="single" w:space="0" w:color="D3D3D3"/>
-              <w:end w:val="single" w:space="0" w:color="D3D3D3"/>
-            </w:tcBorders>
-          </w:tcPr>
-          <w:p>
-            <w:pPr>
-              <w:spacing w:before="0" w:after="60"/>
-              <w:keepNext/>
-              <w:jc w:val="start"/>
-            </w:pPr>
-            <w:r>
-              <w:rPr>
-                <w:rFonts w:ascii="Calibri" w:hAnsi="Calibri"/>
-                <w:sz w:val="20"/>
-              </w:rPr>
-              <w:t xml:space="default">219 (25.2%)</w:t>
+              <w:t xml:space="default">82 (24.3%)</w:t>
+            </w:r>
+          </w:p>
+        </w:tc>
+        <w:tc>
+          <w:tcPr>
+            <w:tcBorders>
+              <w:top w:val="single" w:space="0" w:color="D3D3D3"/>
+              <w:bottom w:val="single" w:space="0" w:color="D3D3D3"/>
+              <w:start w:val="single" w:space="0" w:color="D3D3D3"/>
+              <w:end w:val="single" w:space="0" w:color="D3D3D3"/>
+            </w:tcBorders>
+          </w:tcPr>
+          <w:p>
+            <w:pPr>
+              <w:spacing w:before="0" w:after="60"/>
+              <w:keepNext/>
+              <w:jc w:val="start"/>
+            </w:pPr>
+            <w:r>
+              <w:rPr>
+                <w:rFonts w:ascii="Calibri" w:hAnsi="Calibri"/>
+                <w:sz w:val="20"/>
+              </w:rPr>
+              <w:t xml:space="default">123 (26.2%)</w:t>
+            </w:r>
+          </w:p>
+        </w:tc>
+        <w:tc>
+          <w:tcPr>
+            <w:tcBorders>
+              <w:top w:val="single" w:space="0" w:color="D3D3D3"/>
+              <w:bottom w:val="single" w:space="0" w:color="D3D3D3"/>
+              <w:start w:val="single" w:space="0" w:color="D3D3D3"/>
+              <w:end w:val="single" w:space="0" w:color="D3D3D3"/>
+            </w:tcBorders>
+          </w:tcPr>
+          <w:p>
+            <w:pPr>
+              <w:spacing w:before="0" w:after="60"/>
+              <w:keepNext/>
+              <w:jc w:val="start"/>
+            </w:pPr>
+            <w:r>
+              <w:rPr>
+                <w:rFonts w:ascii="Calibri" w:hAnsi="Calibri"/>
+                <w:sz w:val="20"/>
+              </w:rPr>
+              <w:t xml:space="default">206 (25.4%)</w:t>
             </w:r>
           </w:p>
         </w:tc>
@@ -3463,7 +3463,7 @@
                 <w:rFonts w:ascii="Calibri" w:hAnsi="Calibri"/>
                 <w:sz w:val="20"/>
               </w:rPr>
-              <w:t xml:space="default">56.4%</w:t>
+              <w:t xml:space="default">60.1%</w:t>
             </w:r>
           </w:p>
         </w:tc>
@@ -3516,55 +3516,55 @@
                 <w:rFonts w:ascii="Calibri" w:hAnsi="Calibri"/>
                 <w:sz w:val="20"/>
               </w:rPr>
-              <w:t xml:space="default">103 (26.5%)</w:t>
-            </w:r>
-          </w:p>
-        </w:tc>
-        <w:tc>
-          <w:tcPr>
-            <w:tcBorders>
-              <w:top w:val="single" w:space="0" w:color="D3D3D3"/>
-              <w:bottom w:val="single" w:space="0" w:color="D3D3D3"/>
-              <w:start w:val="single" w:space="0" w:color="D3D3D3"/>
-              <w:end w:val="single" w:space="0" w:color="D3D3D3"/>
-            </w:tcBorders>
-          </w:tcPr>
-          <w:p>
-            <w:pPr>
-              <w:spacing w:before="0" w:after="60"/>
-              <w:keepNext/>
-              <w:jc w:val="start"/>
-            </w:pPr>
-            <w:r>
-              <w:rPr>
-                <w:rFonts w:ascii="Calibri" w:hAnsi="Calibri"/>
-                <w:sz w:val="20"/>
-              </w:rPr>
-              <w:t xml:space="default">104 (21.7%)</w:t>
-            </w:r>
-          </w:p>
-        </w:tc>
-        <w:tc>
-          <w:tcPr>
-            <w:tcBorders>
-              <w:top w:val="single" w:space="0" w:color="D3D3D3"/>
-              <w:bottom w:val="single" w:space="0" w:color="D3D3D3"/>
-              <w:start w:val="single" w:space="0" w:color="D3D3D3"/>
-              <w:end w:val="single" w:space="0" w:color="D3D3D3"/>
-            </w:tcBorders>
-          </w:tcPr>
-          <w:p>
-            <w:pPr>
-              <w:spacing w:before="0" w:after="60"/>
-              <w:keepNext/>
-              <w:jc w:val="start"/>
-            </w:pPr>
-            <w:r>
-              <w:rPr>
-                <w:rFonts w:ascii="Calibri" w:hAnsi="Calibri"/>
-                <w:sz w:val="20"/>
-              </w:rPr>
-              <w:t xml:space="default">207 (23.9%)</w:t>
+              <w:t xml:space="default">92 (27.4%)</w:t>
+            </w:r>
+          </w:p>
+        </w:tc>
+        <w:tc>
+          <w:tcPr>
+            <w:tcBorders>
+              <w:top w:val="single" w:space="0" w:color="D3D3D3"/>
+              <w:bottom w:val="single" w:space="0" w:color="D3D3D3"/>
+              <w:start w:val="single" w:space="0" w:color="D3D3D3"/>
+              <w:end w:val="single" w:space="0" w:color="D3D3D3"/>
+            </w:tcBorders>
+          </w:tcPr>
+          <w:p>
+            <w:pPr>
+              <w:spacing w:before="0" w:after="60"/>
+              <w:keepNext/>
+              <w:jc w:val="start"/>
+            </w:pPr>
+            <w:r>
+              <w:rPr>
+                <w:rFonts w:ascii="Calibri" w:hAnsi="Calibri"/>
+                <w:sz w:val="20"/>
+              </w:rPr>
+              <w:t xml:space="default">97 (20.6%)</w:t>
+            </w:r>
+          </w:p>
+        </w:tc>
+        <w:tc>
+          <w:tcPr>
+            <w:tcBorders>
+              <w:top w:val="single" w:space="0" w:color="D3D3D3"/>
+              <w:bottom w:val="single" w:space="0" w:color="D3D3D3"/>
+              <w:start w:val="single" w:space="0" w:color="D3D3D3"/>
+              <w:end w:val="single" w:space="0" w:color="D3D3D3"/>
+            </w:tcBorders>
+          </w:tcPr>
+          <w:p>
+            <w:pPr>
+              <w:spacing w:before="0" w:after="60"/>
+              <w:keepNext/>
+              <w:jc w:val="start"/>
+            </w:pPr>
+            <w:r>
+              <w:rPr>
+                <w:rFonts w:ascii="Calibri" w:hAnsi="Calibri"/>
+                <w:sz w:val="20"/>
+              </w:rPr>
+              <w:t xml:space="default">190 (23.4%)</w:t>
             </w:r>
           </w:p>
         </w:tc>
@@ -3588,7 +3588,7 @@
                 <w:rFonts w:ascii="Calibri" w:hAnsi="Calibri"/>
                 <w:sz w:val="20"/>
               </w:rPr>
-              <w:t xml:space="default">50.1%</w:t>
+              <w:t xml:space="default">51.3%</w:t>
             </w:r>
           </w:p>
         </w:tc>
@@ -3641,55 +3641,55 @@
                 <w:rFonts w:ascii="Calibri" w:hAnsi="Calibri"/>
                 <w:sz w:val="20"/>
               </w:rPr>
-              <w:t xml:space="default">96 (24.6%)</w:t>
-            </w:r>
-          </w:p>
-        </w:tc>
-        <w:tc>
-          <w:tcPr>
-            <w:tcBorders>
-              <w:top w:val="single" w:space="0" w:color="D3D3D3"/>
-              <w:bottom w:val="single" w:space="0" w:color="D3D3D3"/>
-              <w:start w:val="single" w:space="0" w:color="D3D3D3"/>
-              <w:end w:val="single" w:space="0" w:color="D3D3D3"/>
-            </w:tcBorders>
-          </w:tcPr>
-          <w:p>
-            <w:pPr>
-              <w:spacing w:before="0" w:after="60"/>
-              <w:keepNext/>
-              <w:jc w:val="start"/>
-            </w:pPr>
-            <w:r>
-              <w:rPr>
-                <w:rFonts w:ascii="Calibri" w:hAnsi="Calibri"/>
-                <w:sz w:val="20"/>
-              </w:rPr>
-              <w:t xml:space="default">108 (22.5%)</w:t>
-            </w:r>
-          </w:p>
-        </w:tc>
-        <w:tc>
-          <w:tcPr>
-            <w:tcBorders>
-              <w:top w:val="single" w:space="0" w:color="D3D3D3"/>
-              <w:bottom w:val="single" w:space="0" w:color="D3D3D3"/>
-              <w:start w:val="single" w:space="0" w:color="D3D3D3"/>
-              <w:end w:val="single" w:space="0" w:color="D3D3D3"/>
-            </w:tcBorders>
-          </w:tcPr>
-          <w:p>
-            <w:pPr>
-              <w:spacing w:before="0" w:after="60"/>
-              <w:keepNext/>
-              <w:jc w:val="start"/>
-            </w:pPr>
-            <w:r>
-              <w:rPr>
-                <w:rFonts w:ascii="Calibri" w:hAnsi="Calibri"/>
-                <w:sz w:val="20"/>
-              </w:rPr>
-              <w:t xml:space="default">204 (23.5%)</w:t>
+              <w:t xml:space="default">85 (25.1%)</w:t>
+            </w:r>
+          </w:p>
+        </w:tc>
+        <w:tc>
+          <w:tcPr>
+            <w:tcBorders>
+              <w:top w:val="single" w:space="0" w:color="D3D3D3"/>
+              <w:bottom w:val="single" w:space="0" w:color="D3D3D3"/>
+              <w:start w:val="single" w:space="0" w:color="D3D3D3"/>
+              <w:end w:val="single" w:space="0" w:color="D3D3D3"/>
+            </w:tcBorders>
+          </w:tcPr>
+          <w:p>
+            <w:pPr>
+              <w:spacing w:before="0" w:after="60"/>
+              <w:keepNext/>
+              <w:jc w:val="start"/>
+            </w:pPr>
+            <w:r>
+              <w:rPr>
+                <w:rFonts w:ascii="Calibri" w:hAnsi="Calibri"/>
+                <w:sz w:val="20"/>
+              </w:rPr>
+              <w:t xml:space="default">107 (22.6%)</w:t>
+            </w:r>
+          </w:p>
+        </w:tc>
+        <w:tc>
+          <w:tcPr>
+            <w:tcBorders>
+              <w:top w:val="single" w:space="0" w:color="D3D3D3"/>
+              <w:bottom w:val="single" w:space="0" w:color="D3D3D3"/>
+              <w:start w:val="single" w:space="0" w:color="D3D3D3"/>
+              <w:end w:val="single" w:space="0" w:color="D3D3D3"/>
+            </w:tcBorders>
+          </w:tcPr>
+          <w:p>
+            <w:pPr>
+              <w:spacing w:before="0" w:after="60"/>
+              <w:keepNext/>
+              <w:jc w:val="start"/>
+            </w:pPr>
+            <w:r>
+              <w:rPr>
+                <w:rFonts w:ascii="Calibri" w:hAnsi="Calibri"/>
+                <w:sz w:val="20"/>
+              </w:rPr>
+              <w:t xml:space="default">191 (23.6%)</w:t>
             </w:r>
           </w:p>
         </w:tc>
@@ -3713,7 +3713,7 @@
                 <w:rFonts w:ascii="Calibri" w:hAnsi="Calibri"/>
                 <w:sz w:val="20"/>
               </w:rPr>
-              <w:t xml:space="default">52.9%</w:t>
+              <w:t xml:space="default">55.7%</w:t>
             </w:r>
           </w:p>
         </w:tc>
@@ -3766,55 +3766,55 @@
                 <w:rFonts w:ascii="Calibri" w:hAnsi="Calibri"/>
                 <w:sz w:val="20"/>
               </w:rPr>
-              <w:t xml:space="default">92 (23.6%)</w:t>
-            </w:r>
-          </w:p>
-        </w:tc>
-        <w:tc>
-          <w:tcPr>
-            <w:tcBorders>
-              <w:top w:val="single" w:space="0" w:color="D3D3D3"/>
-              <w:bottom w:val="single" w:space="0" w:color="D3D3D3"/>
-              <w:start w:val="single" w:space="0" w:color="D3D3D3"/>
-              <w:end w:val="single" w:space="0" w:color="D3D3D3"/>
-            </w:tcBorders>
-          </w:tcPr>
-          <w:p>
-            <w:pPr>
-              <w:spacing w:before="0" w:after="60"/>
-              <w:keepNext/>
-              <w:jc w:val="start"/>
-            </w:pPr>
-            <w:r>
-              <w:rPr>
-                <w:rFonts w:ascii="Calibri" w:hAnsi="Calibri"/>
-                <w:sz w:val="20"/>
-              </w:rPr>
-              <w:t xml:space="default">140 (29.1%)</w:t>
-            </w:r>
-          </w:p>
-        </w:tc>
-        <w:tc>
-          <w:tcPr>
-            <w:tcBorders>
-              <w:top w:val="single" w:space="0" w:color="D3D3D3"/>
-              <w:bottom w:val="single" w:space="0" w:color="D3D3D3"/>
-              <w:start w:val="single" w:space="0" w:color="D3D3D3"/>
-              <w:end w:val="single" w:space="0" w:color="D3D3D3"/>
-            </w:tcBorders>
-          </w:tcPr>
-          <w:p>
-            <w:pPr>
-              <w:spacing w:before="0" w:after="60"/>
-              <w:keepNext/>
-              <w:jc w:val="start"/>
-            </w:pPr>
-            <w:r>
-              <w:rPr>
-                <w:rFonts w:ascii="Calibri" w:hAnsi="Calibri"/>
-                <w:sz w:val="20"/>
-              </w:rPr>
-              <w:t xml:space="default">231 (26.6%)</w:t>
+              <w:t xml:space="default">75 (22.3%)</w:t>
+            </w:r>
+          </w:p>
+        </w:tc>
+        <w:tc>
+          <w:tcPr>
+            <w:tcBorders>
+              <w:top w:val="single" w:space="0" w:color="D3D3D3"/>
+              <w:bottom w:val="single" w:space="0" w:color="D3D3D3"/>
+              <w:start w:val="single" w:space="0" w:color="D3D3D3"/>
+              <w:end w:val="single" w:space="0" w:color="D3D3D3"/>
+            </w:tcBorders>
+          </w:tcPr>
+          <w:p>
+            <w:pPr>
+              <w:spacing w:before="0" w:after="60"/>
+              <w:keepNext/>
+              <w:jc w:val="start"/>
+            </w:pPr>
+            <w:r>
+              <w:rPr>
+                <w:rFonts w:ascii="Calibri" w:hAnsi="Calibri"/>
+                <w:sz w:val="20"/>
+              </w:rPr>
+              <w:t xml:space="default">140 (29.6%)</w:t>
+            </w:r>
+          </w:p>
+        </w:tc>
+        <w:tc>
+          <w:tcPr>
+            <w:tcBorders>
+              <w:top w:val="single" w:space="0" w:color="D3D3D3"/>
+              <w:bottom w:val="single" w:space="0" w:color="D3D3D3"/>
+              <w:start w:val="single" w:space="0" w:color="D3D3D3"/>
+              <w:end w:val="single" w:space="0" w:color="D3D3D3"/>
+            </w:tcBorders>
+          </w:tcPr>
+          <w:p>
+            <w:pPr>
+              <w:spacing w:before="0" w:after="60"/>
+              <w:keepNext/>
+              <w:jc w:val="start"/>
+            </w:pPr>
+            <w:r>
+              <w:rPr>
+                <w:rFonts w:ascii="Calibri" w:hAnsi="Calibri"/>
+                <w:sz w:val="20"/>
+              </w:rPr>
+              <w:t xml:space="default">215 (26.6%)</w:t>
             </w:r>
           </w:p>
         </w:tc>
@@ -3838,7 +3838,7 @@
                 <w:rFonts w:ascii="Calibri" w:hAnsi="Calibri"/>
                 <w:sz w:val="20"/>
               </w:rPr>
-              <w:t xml:space="default">60.3%</w:t>
+              <w:t xml:space="default">65%</w:t>
             </w:r>
           </w:p>
         </w:tc>
@@ -4021,55 +4021,55 @@
                 <w:rFonts w:ascii="Calibri" w:hAnsi="Calibri"/>
                 <w:sz w:val="20"/>
               </w:rPr>
-              <w:t xml:space="default">43 (11.2%)</w:t>
-            </w:r>
-          </w:p>
-        </w:tc>
-        <w:tc>
-          <w:tcPr>
-            <w:tcBorders>
-              <w:top w:val="single" w:space="0" w:color="D3D3D3"/>
-              <w:bottom w:val="single" w:space="0" w:color="D3D3D3"/>
-              <w:start w:val="single" w:space="0" w:color="D3D3D3"/>
-              <w:end w:val="single" w:space="0" w:color="D3D3D3"/>
-            </w:tcBorders>
-          </w:tcPr>
-          <w:p>
-            <w:pPr>
-              <w:spacing w:before="0" w:after="60"/>
-              <w:keepNext/>
-              <w:jc w:val="start"/>
-            </w:pPr>
-            <w:r>
-              <w:rPr>
-                <w:rFonts w:ascii="Calibri" w:hAnsi="Calibri"/>
-                <w:sz w:val="20"/>
-              </w:rPr>
-              <w:t xml:space="default">41 (8.5%)</w:t>
-            </w:r>
-          </w:p>
-        </w:tc>
-        <w:tc>
-          <w:tcPr>
-            <w:tcBorders>
-              <w:top w:val="single" w:space="0" w:color="D3D3D3"/>
-              <w:bottom w:val="single" w:space="0" w:color="D3D3D3"/>
-              <w:start w:val="single" w:space="0" w:color="D3D3D3"/>
-              <w:end w:val="single" w:space="0" w:color="D3D3D3"/>
-            </w:tcBorders>
-          </w:tcPr>
-          <w:p>
-            <w:pPr>
-              <w:spacing w:before="0" w:after="60"/>
-              <w:keepNext/>
-              <w:jc w:val="start"/>
-            </w:pPr>
-            <w:r>
-              <w:rPr>
-                <w:rFonts w:ascii="Calibri" w:hAnsi="Calibri"/>
-                <w:sz w:val="20"/>
-              </w:rPr>
-              <w:t xml:space="default">84 (9.7%)</w:t>
+              <w:t xml:space="default">36 (10.6%)</w:t>
+            </w:r>
+          </w:p>
+        </w:tc>
+        <w:tc>
+          <w:tcPr>
+            <w:tcBorders>
+              <w:top w:val="single" w:space="0" w:color="D3D3D3"/>
+              <w:bottom w:val="single" w:space="0" w:color="D3D3D3"/>
+              <w:start w:val="single" w:space="0" w:color="D3D3D3"/>
+              <w:end w:val="single" w:space="0" w:color="D3D3D3"/>
+            </w:tcBorders>
+          </w:tcPr>
+          <w:p>
+            <w:pPr>
+              <w:spacing w:before="0" w:after="60"/>
+              <w:keepNext/>
+              <w:jc w:val="start"/>
+            </w:pPr>
+            <w:r>
+              <w:rPr>
+                <w:rFonts w:ascii="Calibri" w:hAnsi="Calibri"/>
+                <w:sz w:val="20"/>
+              </w:rPr>
+              <w:t xml:space="default">41 (8.7%)</w:t>
+            </w:r>
+          </w:p>
+        </w:tc>
+        <w:tc>
+          <w:tcPr>
+            <w:tcBorders>
+              <w:top w:val="single" w:space="0" w:color="D3D3D3"/>
+              <w:bottom w:val="single" w:space="0" w:color="D3D3D3"/>
+              <w:start w:val="single" w:space="0" w:color="D3D3D3"/>
+              <w:end w:val="single" w:space="0" w:color="D3D3D3"/>
+            </w:tcBorders>
+          </w:tcPr>
+          <w:p>
+            <w:pPr>
+              <w:spacing w:before="0" w:after="60"/>
+              <w:keepNext/>
+              <w:jc w:val="start"/>
+            </w:pPr>
+            <w:r>
+              <w:rPr>
+                <w:rFonts w:ascii="Calibri" w:hAnsi="Calibri"/>
+                <w:sz w:val="20"/>
+              </w:rPr>
+              <w:t xml:space="default">77 (9.5%)</w:t>
             </w:r>
           </w:p>
         </w:tc>
@@ -4093,7 +4093,7 @@
                 <w:rFonts w:ascii="Calibri" w:hAnsi="Calibri"/>
                 <w:sz w:val="20"/>
               </w:rPr>
-              <w:t xml:space="default">48.5%</w:t>
+              <w:t xml:space="default">53.3%</w:t>
             </w:r>
           </w:p>
         </w:tc>
@@ -4146,55 +4146,55 @@
                 <w:rFonts w:ascii="Calibri" w:hAnsi="Calibri"/>
                 <w:sz w:val="20"/>
               </w:rPr>
-              <w:t xml:space="default">84 (21.5%)</w:t>
-            </w:r>
-          </w:p>
-        </w:tc>
-        <w:tc>
-          <w:tcPr>
-            <w:tcBorders>
-              <w:top w:val="single" w:space="0" w:color="D3D3D3"/>
-              <w:bottom w:val="single" w:space="0" w:color="D3D3D3"/>
-              <w:start w:val="single" w:space="0" w:color="D3D3D3"/>
-              <w:end w:val="single" w:space="0" w:color="D3D3D3"/>
-            </w:tcBorders>
-          </w:tcPr>
-          <w:p>
-            <w:pPr>
-              <w:spacing w:before="0" w:after="60"/>
-              <w:keepNext/>
-              <w:jc w:val="start"/>
-            </w:pPr>
-            <w:r>
-              <w:rPr>
-                <w:rFonts w:ascii="Calibri" w:hAnsi="Calibri"/>
-                <w:sz w:val="20"/>
-              </w:rPr>
-              <w:t xml:space="default">110 (23%)</w:t>
-            </w:r>
-          </w:p>
-        </w:tc>
-        <w:tc>
-          <w:tcPr>
-            <w:tcBorders>
-              <w:top w:val="single" w:space="0" w:color="D3D3D3"/>
-              <w:bottom w:val="single" w:space="0" w:color="D3D3D3"/>
-              <w:start w:val="single" w:space="0" w:color="D3D3D3"/>
-              <w:end w:val="single" w:space="0" w:color="D3D3D3"/>
-            </w:tcBorders>
-          </w:tcPr>
-          <w:p>
-            <w:pPr>
-              <w:spacing w:before="0" w:after="60"/>
-              <w:keepNext/>
-              <w:jc w:val="start"/>
-            </w:pPr>
-            <w:r>
-              <w:rPr>
-                <w:rFonts w:ascii="Calibri" w:hAnsi="Calibri"/>
-                <w:sz w:val="20"/>
-              </w:rPr>
-              <w:t xml:space="default">194 (22.3%)</w:t>
+              <w:t xml:space="default">72 (21.4%)</w:t>
+            </w:r>
+          </w:p>
+        </w:tc>
+        <w:tc>
+          <w:tcPr>
+            <w:tcBorders>
+              <w:top w:val="single" w:space="0" w:color="D3D3D3"/>
+              <w:bottom w:val="single" w:space="0" w:color="D3D3D3"/>
+              <w:start w:val="single" w:space="0" w:color="D3D3D3"/>
+              <w:end w:val="single" w:space="0" w:color="D3D3D3"/>
+            </w:tcBorders>
+          </w:tcPr>
+          <w:p>
+            <w:pPr>
+              <w:spacing w:before="0" w:after="60"/>
+              <w:keepNext/>
+              <w:jc w:val="start"/>
+            </w:pPr>
+            <w:r>
+              <w:rPr>
+                <w:rFonts w:ascii="Calibri" w:hAnsi="Calibri"/>
+                <w:sz w:val="20"/>
+              </w:rPr>
+              <w:t xml:space="default">110 (23.4%)</w:t>
+            </w:r>
+          </w:p>
+        </w:tc>
+        <w:tc>
+          <w:tcPr>
+            <w:tcBorders>
+              <w:top w:val="single" w:space="0" w:color="D3D3D3"/>
+              <w:bottom w:val="single" w:space="0" w:color="D3D3D3"/>
+              <w:start w:val="single" w:space="0" w:color="D3D3D3"/>
+              <w:end w:val="single" w:space="0" w:color="D3D3D3"/>
+            </w:tcBorders>
+          </w:tcPr>
+          <w:p>
+            <w:pPr>
+              <w:spacing w:before="0" w:after="60"/>
+              <w:keepNext/>
+              <w:jc w:val="start"/>
+            </w:pPr>
+            <w:r>
+              <w:rPr>
+                <w:rFonts w:ascii="Calibri" w:hAnsi="Calibri"/>
+                <w:sz w:val="20"/>
+              </w:rPr>
+              <w:t xml:space="default">182 (22.6%)</w:t>
             </w:r>
           </w:p>
         </w:tc>
@@ -4218,7 +4218,7 @@
                 <w:rFonts w:ascii="Calibri" w:hAnsi="Calibri"/>
                 <w:sz w:val="20"/>
               </w:rPr>
-              <w:t xml:space="default">56.9%</w:t>
+              <w:t xml:space="default">60.5%</w:t>
             </w:r>
           </w:p>
         </w:tc>
@@ -4271,55 +4271,55 @@
                 <w:rFonts w:ascii="Calibri" w:hAnsi="Calibri"/>
                 <w:sz w:val="20"/>
               </w:rPr>
-              <w:t xml:space="default">172 (44%)</w:t>
-            </w:r>
-          </w:p>
-        </w:tc>
-        <w:tc>
-          <w:tcPr>
-            <w:tcBorders>
-              <w:top w:val="single" w:space="0" w:color="D3D3D3"/>
-              <w:bottom w:val="single" w:space="0" w:color="D3D3D3"/>
-              <w:start w:val="single" w:space="0" w:color="D3D3D3"/>
-              <w:end w:val="single" w:space="0" w:color="D3D3D3"/>
-            </w:tcBorders>
-          </w:tcPr>
-          <w:p>
-            <w:pPr>
-              <w:spacing w:before="0" w:after="60"/>
-              <w:keepNext/>
-              <w:jc w:val="start"/>
-            </w:pPr>
-            <w:r>
-              <w:rPr>
-                <w:rFonts w:ascii="Calibri" w:hAnsi="Calibri"/>
-                <w:sz w:val="20"/>
-              </w:rPr>
-              <w:t xml:space="default">244 (51%)</w:t>
-            </w:r>
-          </w:p>
-        </w:tc>
-        <w:tc>
-          <w:tcPr>
-            <w:tcBorders>
-              <w:top w:val="single" w:space="0" w:color="D3D3D3"/>
-              <w:bottom w:val="single" w:space="0" w:color="D3D3D3"/>
-              <w:start w:val="single" w:space="0" w:color="D3D3D3"/>
-              <w:end w:val="single" w:space="0" w:color="D3D3D3"/>
-            </w:tcBorders>
-          </w:tcPr>
-          <w:p>
-            <w:pPr>
-              <w:spacing w:before="0" w:after="60"/>
-              <w:keepNext/>
-              <w:jc w:val="start"/>
-            </w:pPr>
-            <w:r>
-              <w:rPr>
-                <w:rFonts w:ascii="Calibri" w:hAnsi="Calibri"/>
-                <w:sz w:val="20"/>
-              </w:rPr>
-              <w:t xml:space="default">416 (47.8%)</w:t>
+              <w:t xml:space="default">146 (43.2%)</w:t>
+            </w:r>
+          </w:p>
+        </w:tc>
+        <w:tc>
+          <w:tcPr>
+            <w:tcBorders>
+              <w:top w:val="single" w:space="0" w:color="D3D3D3"/>
+              <w:bottom w:val="single" w:space="0" w:color="D3D3D3"/>
+              <w:start w:val="single" w:space="0" w:color="D3D3D3"/>
+              <w:end w:val="single" w:space="0" w:color="D3D3D3"/>
+            </w:tcBorders>
+          </w:tcPr>
+          <w:p>
+            <w:pPr>
+              <w:spacing w:before="0" w:after="60"/>
+              <w:keepNext/>
+              <w:jc w:val="start"/>
+            </w:pPr>
+            <w:r>
+              <w:rPr>
+                <w:rFonts w:ascii="Calibri" w:hAnsi="Calibri"/>
+                <w:sz w:val="20"/>
+              </w:rPr>
+              <w:t xml:space="default">236 (50.1%)</w:t>
+            </w:r>
+          </w:p>
+        </w:tc>
+        <w:tc>
+          <w:tcPr>
+            <w:tcBorders>
+              <w:top w:val="single" w:space="0" w:color="D3D3D3"/>
+              <w:bottom w:val="single" w:space="0" w:color="D3D3D3"/>
+              <w:start w:val="single" w:space="0" w:color="D3D3D3"/>
+              <w:end w:val="single" w:space="0" w:color="D3D3D3"/>
+            </w:tcBorders>
+          </w:tcPr>
+          <w:p>
+            <w:pPr>
+              <w:spacing w:before="0" w:after="60"/>
+              <w:keepNext/>
+              <w:jc w:val="start"/>
+            </w:pPr>
+            <w:r>
+              <w:rPr>
+                <w:rFonts w:ascii="Calibri" w:hAnsi="Calibri"/>
+                <w:sz w:val="20"/>
+              </w:rPr>
+              <w:t xml:space="default">382 (47.3%)</w:t>
             </w:r>
           </w:p>
         </w:tc>
@@ -4343,7 +4343,7 @@
                 <w:rFonts w:ascii="Calibri" w:hAnsi="Calibri"/>
                 <w:sz w:val="20"/>
               </w:rPr>
-              <w:t xml:space="default">58.8%</w:t>
+              <w:t xml:space="default">61.8%</w:t>
             </w:r>
           </w:p>
         </w:tc>
@@ -4396,55 +4396,55 @@
                 <w:rFonts w:ascii="Calibri" w:hAnsi="Calibri"/>
                 <w:sz w:val="20"/>
               </w:rPr>
-              <w:t xml:space="default">40 (10.3%)</w:t>
-            </w:r>
-          </w:p>
-        </w:tc>
-        <w:tc>
-          <w:tcPr>
-            <w:tcBorders>
-              <w:top w:val="single" w:space="0" w:color="D3D3D3"/>
-              <w:bottom w:val="single" w:space="0" w:color="D3D3D3"/>
-              <w:start w:val="single" w:space="0" w:color="D3D3D3"/>
-              <w:end w:val="single" w:space="0" w:color="D3D3D3"/>
-            </w:tcBorders>
-          </w:tcPr>
-          <w:p>
-            <w:pPr>
-              <w:spacing w:before="0" w:after="60"/>
-              <w:keepNext/>
-              <w:jc w:val="start"/>
-            </w:pPr>
-            <w:r>
-              <w:rPr>
-                <w:rFonts w:ascii="Calibri" w:hAnsi="Calibri"/>
-                <w:sz w:val="20"/>
-              </w:rPr>
-              <w:t xml:space="default">44 (9.2%)</w:t>
-            </w:r>
-          </w:p>
-        </w:tc>
-        <w:tc>
-          <w:tcPr>
-            <w:tcBorders>
-              <w:top w:val="single" w:space="0" w:color="D3D3D3"/>
-              <w:bottom w:val="single" w:space="0" w:color="D3D3D3"/>
-              <w:start w:val="single" w:space="0" w:color="D3D3D3"/>
-              <w:end w:val="single" w:space="0" w:color="D3D3D3"/>
-            </w:tcBorders>
-          </w:tcPr>
-          <w:p>
-            <w:pPr>
-              <w:spacing w:before="0" w:after="60"/>
-              <w:keepNext/>
-              <w:jc w:val="start"/>
-            </w:pPr>
-            <w:r>
-              <w:rPr>
-                <w:rFonts w:ascii="Calibri" w:hAnsi="Calibri"/>
-                <w:sz w:val="20"/>
-              </w:rPr>
-              <w:t xml:space="default">84 (9.7%)</w:t>
+              <w:t xml:space="default">37 (11%)</w:t>
+            </w:r>
+          </w:p>
+        </w:tc>
+        <w:tc>
+          <w:tcPr>
+            <w:tcBorders>
+              <w:top w:val="single" w:space="0" w:color="D3D3D3"/>
+              <w:bottom w:val="single" w:space="0" w:color="D3D3D3"/>
+              <w:start w:val="single" w:space="0" w:color="D3D3D3"/>
+              <w:end w:val="single" w:space="0" w:color="D3D3D3"/>
+            </w:tcBorders>
+          </w:tcPr>
+          <w:p>
+            <w:pPr>
+              <w:spacing w:before="0" w:after="60"/>
+              <w:keepNext/>
+              <w:jc w:val="start"/>
+            </w:pPr>
+            <w:r>
+              <w:rPr>
+                <w:rFonts w:ascii="Calibri" w:hAnsi="Calibri"/>
+                <w:sz w:val="20"/>
+              </w:rPr>
+              <w:t xml:space="default">44 (9.4%)</w:t>
+            </w:r>
+          </w:p>
+        </w:tc>
+        <w:tc>
+          <w:tcPr>
+            <w:tcBorders>
+              <w:top w:val="single" w:space="0" w:color="D3D3D3"/>
+              <w:bottom w:val="single" w:space="0" w:color="D3D3D3"/>
+              <w:start w:val="single" w:space="0" w:color="D3D3D3"/>
+              <w:end w:val="single" w:space="0" w:color="D3D3D3"/>
+            </w:tcBorders>
+          </w:tcPr>
+          <w:p>
+            <w:pPr>
+              <w:spacing w:before="0" w:after="60"/>
+              <w:keepNext/>
+              <w:jc w:val="start"/>
+            </w:pPr>
+            <w:r>
+              <w:rPr>
+                <w:rFonts w:ascii="Calibri" w:hAnsi="Calibri"/>
+                <w:sz w:val="20"/>
+              </w:rPr>
+              <w:t xml:space="default">81 (10.1%)</w:t>
             </w:r>
           </w:p>
         </w:tc>
@@ -4468,7 +4468,7 @@
                 <w:rFonts w:ascii="Calibri" w:hAnsi="Calibri"/>
                 <w:sz w:val="20"/>
               </w:rPr>
-              <w:t xml:space="default">52.4%</w:t>
+              <w:t xml:space="default">54.2%</w:t>
             </w:r>
           </w:p>
         </w:tc>
@@ -4521,55 +4521,55 @@
                 <w:rFonts w:ascii="Calibri" w:hAnsi="Calibri"/>
                 <w:sz w:val="20"/>
               </w:rPr>
-              <w:t xml:space="default">50 (12.8%)</w:t>
-            </w:r>
-          </w:p>
-        </w:tc>
-        <w:tc>
-          <w:tcPr>
-            <w:tcBorders>
-              <w:top w:val="single" w:space="0" w:color="D3D3D3"/>
-              <w:bottom w:val="single" w:space="0" w:color="D3D3D3"/>
-              <w:start w:val="single" w:space="0" w:color="D3D3D3"/>
-              <w:end w:val="single" w:space="0" w:color="D3D3D3"/>
-            </w:tcBorders>
-          </w:tcPr>
-          <w:p>
-            <w:pPr>
-              <w:spacing w:before="0" w:after="60"/>
-              <w:keepNext/>
-              <w:jc w:val="start"/>
-            </w:pPr>
-            <w:r>
-              <w:rPr>
-                <w:rFonts w:ascii="Calibri" w:hAnsi="Calibri"/>
-                <w:sz w:val="20"/>
-              </w:rPr>
-              <w:t xml:space="default">39 (8%)</w:t>
-            </w:r>
-          </w:p>
-        </w:tc>
-        <w:tc>
-          <w:tcPr>
-            <w:tcBorders>
-              <w:top w:val="single" w:space="0" w:color="D3D3D3"/>
-              <w:bottom w:val="single" w:space="0" w:color="D3D3D3"/>
-              <w:start w:val="single" w:space="0" w:color="D3D3D3"/>
-              <w:end w:val="single" w:space="0" w:color="D3D3D3"/>
-            </w:tcBorders>
-          </w:tcPr>
-          <w:p>
-            <w:pPr>
-              <w:spacing w:before="0" w:after="60"/>
-              <w:keepNext/>
-              <w:jc w:val="start"/>
-            </w:pPr>
-            <w:r>
-              <w:rPr>
-                <w:rFonts w:ascii="Calibri" w:hAnsi="Calibri"/>
-                <w:sz w:val="20"/>
-              </w:rPr>
-              <w:t xml:space="default">88 (10.2%)</w:t>
+              <w:t xml:space="default">45 (13.4%)</w:t>
+            </w:r>
+          </w:p>
+        </w:tc>
+        <w:tc>
+          <w:tcPr>
+            <w:tcBorders>
+              <w:top w:val="single" w:space="0" w:color="D3D3D3"/>
+              <w:bottom w:val="single" w:space="0" w:color="D3D3D3"/>
+              <w:start w:val="single" w:space="0" w:color="D3D3D3"/>
+              <w:end w:val="single" w:space="0" w:color="D3D3D3"/>
+            </w:tcBorders>
+          </w:tcPr>
+          <w:p>
+            <w:pPr>
+              <w:spacing w:before="0" w:after="60"/>
+              <w:keepNext/>
+              <w:jc w:val="start"/>
+            </w:pPr>
+            <w:r>
+              <w:rPr>
+                <w:rFonts w:ascii="Calibri" w:hAnsi="Calibri"/>
+                <w:sz w:val="20"/>
+              </w:rPr>
+              <w:t xml:space="default">39 (8.2%)</w:t>
+            </w:r>
+          </w:p>
+        </w:tc>
+        <w:tc>
+          <w:tcPr>
+            <w:tcBorders>
+              <w:top w:val="single" w:space="0" w:color="D3D3D3"/>
+              <w:bottom w:val="single" w:space="0" w:color="D3D3D3"/>
+              <w:start w:val="single" w:space="0" w:color="D3D3D3"/>
+              <w:end w:val="single" w:space="0" w:color="D3D3D3"/>
+            </w:tcBorders>
+          </w:tcPr>
+          <w:p>
+            <w:pPr>
+              <w:spacing w:before="0" w:after="60"/>
+              <w:keepNext/>
+              <w:jc w:val="start"/>
+            </w:pPr>
+            <w:r>
+              <w:rPr>
+                <w:rFonts w:ascii="Calibri" w:hAnsi="Calibri"/>
+                <w:sz w:val="20"/>
+              </w:rPr>
+              <w:t xml:space="default">84 (10.4%)</w:t>
             </w:r>
           </w:p>
         </w:tc>
@@ -4593,7 +4593,7 @@
                 <w:rFonts w:ascii="Calibri" w:hAnsi="Calibri"/>
                 <w:sz w:val="20"/>
               </w:rPr>
-              <w:t xml:space="default">43.5%</w:t>
+              <w:t xml:space="default">46%</w:t>
             </w:r>
           </w:p>
         </w:tc>
@@ -4776,55 +4776,55 @@
                 <w:rFonts w:ascii="Calibri" w:hAnsi="Calibri"/>
                 <w:sz w:val="20"/>
               </w:rPr>
-              <w:t xml:space="default">61 (15.6%)</w:t>
-            </w:r>
-          </w:p>
-        </w:tc>
-        <w:tc>
-          <w:tcPr>
-            <w:tcBorders>
-              <w:top w:val="single" w:space="0" w:color="D3D3D3"/>
-              <w:bottom w:val="single" w:space="0" w:color="D3D3D3"/>
-              <w:start w:val="single" w:space="0" w:color="D3D3D3"/>
-              <w:end w:val="single" w:space="0" w:color="D3D3D3"/>
-            </w:tcBorders>
-          </w:tcPr>
-          <w:p>
-            <w:pPr>
-              <w:spacing w:before="0" w:after="60"/>
-              <w:keepNext/>
-              <w:jc w:val="start"/>
-            </w:pPr>
-            <w:r>
-              <w:rPr>
-                <w:rFonts w:ascii="Calibri" w:hAnsi="Calibri"/>
-                <w:sz w:val="20"/>
-              </w:rPr>
-              <w:t xml:space="default">69 (14.3%)</w:t>
-            </w:r>
-          </w:p>
-        </w:tc>
-        <w:tc>
-          <w:tcPr>
-            <w:tcBorders>
-              <w:top w:val="single" w:space="0" w:color="D3D3D3"/>
-              <w:bottom w:val="single" w:space="0" w:color="D3D3D3"/>
-              <w:start w:val="single" w:space="0" w:color="D3D3D3"/>
-              <w:end w:val="single" w:space="0" w:color="D3D3D3"/>
-            </w:tcBorders>
-          </w:tcPr>
-          <w:p>
-            <w:pPr>
-              <w:spacing w:before="0" w:after="60"/>
-              <w:keepNext/>
-              <w:jc w:val="start"/>
-            </w:pPr>
-            <w:r>
-              <w:rPr>
-                <w:rFonts w:ascii="Calibri" w:hAnsi="Calibri"/>
-                <w:sz w:val="20"/>
-              </w:rPr>
-              <w:t xml:space="default">129 (14.9%)</w:t>
+              <w:t xml:space="default">53 (15.8%)</w:t>
+            </w:r>
+          </w:p>
+        </w:tc>
+        <w:tc>
+          <w:tcPr>
+            <w:tcBorders>
+              <w:top w:val="single" w:space="0" w:color="D3D3D3"/>
+              <w:bottom w:val="single" w:space="0" w:color="D3D3D3"/>
+              <w:start w:val="single" w:space="0" w:color="D3D3D3"/>
+              <w:end w:val="single" w:space="0" w:color="D3D3D3"/>
+            </w:tcBorders>
+          </w:tcPr>
+          <w:p>
+            <w:pPr>
+              <w:spacing w:before="0" w:after="60"/>
+              <w:keepNext/>
+              <w:jc w:val="start"/>
+            </w:pPr>
+            <w:r>
+              <w:rPr>
+                <w:rFonts w:ascii="Calibri" w:hAnsi="Calibri"/>
+                <w:sz w:val="20"/>
+              </w:rPr>
+              <w:t xml:space="default">69 (14.6%)</w:t>
+            </w:r>
+          </w:p>
+        </w:tc>
+        <w:tc>
+          <w:tcPr>
+            <w:tcBorders>
+              <w:top w:val="single" w:space="0" w:color="D3D3D3"/>
+              <w:bottom w:val="single" w:space="0" w:color="D3D3D3"/>
+              <w:start w:val="single" w:space="0" w:color="D3D3D3"/>
+              <w:end w:val="single" w:space="0" w:color="D3D3D3"/>
+            </w:tcBorders>
+          </w:tcPr>
+          <w:p>
+            <w:pPr>
+              <w:spacing w:before="0" w:after="60"/>
+              <w:keepNext/>
+              <w:jc w:val="start"/>
+            </w:pPr>
+            <w:r>
+              <w:rPr>
+                <w:rFonts w:ascii="Calibri" w:hAnsi="Calibri"/>
+                <w:sz w:val="20"/>
+              </w:rPr>
+              <w:t xml:space="default">122 (15.1%)</w:t>
             </w:r>
           </w:p>
         </w:tc>
@@ -4848,7 +4848,7 @@
                 <w:rFonts w:ascii="Calibri" w:hAnsi="Calibri"/>
                 <w:sz w:val="20"/>
               </w:rPr>
-              <w:t xml:space="default">53%</w:t>
+              <w:t xml:space="default">56.3%</w:t>
             </w:r>
           </w:p>
         </w:tc>
@@ -4901,55 +4901,55 @@
                 <w:rFonts w:ascii="Calibri" w:hAnsi="Calibri"/>
                 <w:sz w:val="20"/>
               </w:rPr>
-              <w:t xml:space="default">86 (22.1%)</w:t>
-            </w:r>
-          </w:p>
-        </w:tc>
-        <w:tc>
-          <w:tcPr>
-            <w:tcBorders>
-              <w:top w:val="single" w:space="0" w:color="D3D3D3"/>
-              <w:bottom w:val="single" w:space="0" w:color="D3D3D3"/>
-              <w:start w:val="single" w:space="0" w:color="D3D3D3"/>
-              <w:end w:val="single" w:space="0" w:color="D3D3D3"/>
-            </w:tcBorders>
-          </w:tcPr>
-          <w:p>
-            <w:pPr>
-              <w:spacing w:before="0" w:after="60"/>
-              <w:keepNext/>
-              <w:jc w:val="start"/>
-            </w:pPr>
-            <w:r>
-              <w:rPr>
-                <w:rFonts w:ascii="Calibri" w:hAnsi="Calibri"/>
-                <w:sz w:val="20"/>
-              </w:rPr>
-              <w:t xml:space="default">108 (22.5%)</w:t>
-            </w:r>
-          </w:p>
-        </w:tc>
-        <w:tc>
-          <w:tcPr>
-            <w:tcBorders>
-              <w:top w:val="single" w:space="0" w:color="D3D3D3"/>
-              <w:bottom w:val="single" w:space="0" w:color="D3D3D3"/>
-              <w:start w:val="single" w:space="0" w:color="D3D3D3"/>
-              <w:end w:val="single" w:space="0" w:color="D3D3D3"/>
-            </w:tcBorders>
-          </w:tcPr>
-          <w:p>
-            <w:pPr>
-              <w:spacing w:before="0" w:after="60"/>
-              <w:keepNext/>
-              <w:jc w:val="start"/>
-            </w:pPr>
-            <w:r>
-              <w:rPr>
-                <w:rFonts w:ascii="Calibri" w:hAnsi="Calibri"/>
-                <w:sz w:val="20"/>
-              </w:rPr>
-              <w:t xml:space="default">194 (22.3%)</w:t>
+              <w:t xml:space="default">71 (21.1%)</w:t>
+            </w:r>
+          </w:p>
+        </w:tc>
+        <w:tc>
+          <w:tcPr>
+            <w:tcBorders>
+              <w:top w:val="single" w:space="0" w:color="D3D3D3"/>
+              <w:bottom w:val="single" w:space="0" w:color="D3D3D3"/>
+              <w:start w:val="single" w:space="0" w:color="D3D3D3"/>
+              <w:end w:val="single" w:space="0" w:color="D3D3D3"/>
+            </w:tcBorders>
+          </w:tcPr>
+          <w:p>
+            <w:pPr>
+              <w:spacing w:before="0" w:after="60"/>
+              <w:keepNext/>
+              <w:jc w:val="start"/>
+            </w:pPr>
+            <w:r>
+              <w:rPr>
+                <w:rFonts w:ascii="Calibri" w:hAnsi="Calibri"/>
+                <w:sz w:val="20"/>
+              </w:rPr>
+              <w:t xml:space="default">107 (22.6%)</w:t>
+            </w:r>
+          </w:p>
+        </w:tc>
+        <w:tc>
+          <w:tcPr>
+            <w:tcBorders>
+              <w:top w:val="single" w:space="0" w:color="D3D3D3"/>
+              <w:bottom w:val="single" w:space="0" w:color="D3D3D3"/>
+              <w:start w:val="single" w:space="0" w:color="D3D3D3"/>
+              <w:end w:val="single" w:space="0" w:color="D3D3D3"/>
+            </w:tcBorders>
+          </w:tcPr>
+          <w:p>
+            <w:pPr>
+              <w:spacing w:before="0" w:after="60"/>
+              <w:keepNext/>
+              <w:jc w:val="start"/>
+            </w:pPr>
+            <w:r>
+              <w:rPr>
+                <w:rFonts w:ascii="Calibri" w:hAnsi="Calibri"/>
+                <w:sz w:val="20"/>
+              </w:rPr>
+              <w:t xml:space="default">178 (22%)</w:t>
             </w:r>
           </w:p>
         </w:tc>
@@ -4973,7 +4973,7 @@
                 <w:rFonts w:ascii="Calibri" w:hAnsi="Calibri"/>
                 <w:sz w:val="20"/>
               </w:rPr>
-              <w:t xml:space="default">55.5%</w:t>
+              <w:t xml:space="default">60%</w:t>
             </w:r>
           </w:p>
         </w:tc>
@@ -5026,55 +5026,55 @@
                 <w:rFonts w:ascii="Calibri" w:hAnsi="Calibri"/>
                 <w:sz w:val="20"/>
               </w:rPr>
-              <w:t xml:space="default">138 (35.4%)</w:t>
-            </w:r>
-          </w:p>
-        </w:tc>
-        <w:tc>
-          <w:tcPr>
-            <w:tcBorders>
-              <w:top w:val="single" w:space="0" w:color="D3D3D3"/>
-              <w:bottom w:val="single" w:space="0" w:color="D3D3D3"/>
-              <w:start w:val="single" w:space="0" w:color="D3D3D3"/>
-              <w:end w:val="single" w:space="0" w:color="D3D3D3"/>
-            </w:tcBorders>
-          </w:tcPr>
-          <w:p>
-            <w:pPr>
-              <w:spacing w:before="0" w:after="60"/>
-              <w:keepNext/>
-              <w:jc w:val="start"/>
-            </w:pPr>
-            <w:r>
-              <w:rPr>
-                <w:rFonts w:ascii="Calibri" w:hAnsi="Calibri"/>
-                <w:sz w:val="20"/>
-              </w:rPr>
-              <w:t xml:space="default">122 (25.4%)</w:t>
-            </w:r>
-          </w:p>
-        </w:tc>
-        <w:tc>
-          <w:tcPr>
-            <w:tcBorders>
-              <w:top w:val="single" w:space="0" w:color="D3D3D3"/>
-              <w:bottom w:val="single" w:space="0" w:color="D3D3D3"/>
-              <w:start w:val="single" w:space="0" w:color="D3D3D3"/>
-              <w:end w:val="single" w:space="0" w:color="D3D3D3"/>
-            </w:tcBorders>
-          </w:tcPr>
-          <w:p>
-            <w:pPr>
-              <w:spacing w:before="0" w:after="60"/>
-              <w:keepNext/>
-              <w:jc w:val="start"/>
-            </w:pPr>
-            <w:r>
-              <w:rPr>
-                <w:rFonts w:ascii="Calibri" w:hAnsi="Calibri"/>
-                <w:sz w:val="20"/>
-              </w:rPr>
-              <w:t xml:space="default">260 (29.9%)</w:t>
+              <w:t xml:space="default">126 (37.2%)</w:t>
+            </w:r>
+          </w:p>
+        </w:tc>
+        <w:tc>
+          <w:tcPr>
+            <w:tcBorders>
+              <w:top w:val="single" w:space="0" w:color="D3D3D3"/>
+              <w:bottom w:val="single" w:space="0" w:color="D3D3D3"/>
+              <w:start w:val="single" w:space="0" w:color="D3D3D3"/>
+              <w:end w:val="single" w:space="0" w:color="D3D3D3"/>
+            </w:tcBorders>
+          </w:tcPr>
+          <w:p>
+            <w:pPr>
+              <w:spacing w:before="0" w:after="60"/>
+              <w:keepNext/>
+              <w:jc w:val="start"/>
+            </w:pPr>
+            <w:r>
+              <w:rPr>
+                <w:rFonts w:ascii="Calibri" w:hAnsi="Calibri"/>
+                <w:sz w:val="20"/>
+              </w:rPr>
+              <w:t xml:space="default">120 (25.5%)</w:t>
+            </w:r>
+          </w:p>
+        </w:tc>
+        <w:tc>
+          <w:tcPr>
+            <w:tcBorders>
+              <w:top w:val="single" w:space="0" w:color="D3D3D3"/>
+              <w:bottom w:val="single" w:space="0" w:color="D3D3D3"/>
+              <w:start w:val="single" w:space="0" w:color="D3D3D3"/>
+              <w:end w:val="single" w:space="0" w:color="D3D3D3"/>
+            </w:tcBorders>
+          </w:tcPr>
+          <w:p>
+            <w:pPr>
+              <w:spacing w:before="0" w:after="60"/>
+              <w:keepNext/>
+              <w:jc w:val="start"/>
+            </w:pPr>
+            <w:r>
+              <w:rPr>
+                <w:rFonts w:ascii="Calibri" w:hAnsi="Calibri"/>
+                <w:sz w:val="20"/>
+              </w:rPr>
+              <w:t xml:space="default">246 (30.4%)</w:t>
             </w:r>
           </w:p>
         </w:tc>
@@ -5098,7 +5098,7 @@
                 <w:rFonts w:ascii="Calibri" w:hAnsi="Calibri"/>
                 <w:sz w:val="20"/>
               </w:rPr>
-              <w:t xml:space="default">46.8%</w:t>
+              <w:t xml:space="default">48.9%</w:t>
             </w:r>
           </w:p>
         </w:tc>
@@ -5151,55 +5151,55 @@
                 <w:rFonts w:ascii="Calibri" w:hAnsi="Calibri"/>
                 <w:sz w:val="20"/>
               </w:rPr>
-              <w:t xml:space="default">64 (16.4%)</w:t>
-            </w:r>
-          </w:p>
-        </w:tc>
-        <w:tc>
-          <w:tcPr>
-            <w:tcBorders>
-              <w:top w:val="single" w:space="0" w:color="D3D3D3"/>
-              <w:bottom w:val="single" w:space="0" w:color="D3D3D3"/>
-              <w:start w:val="single" w:space="0" w:color="D3D3D3"/>
-              <w:end w:val="single" w:space="0" w:color="D3D3D3"/>
-            </w:tcBorders>
-          </w:tcPr>
-          <w:p>
-            <w:pPr>
-              <w:spacing w:before="0" w:after="60"/>
-              <w:keepNext/>
-              <w:jc w:val="start"/>
-            </w:pPr>
-            <w:r>
-              <w:rPr>
-                <w:rFonts w:ascii="Calibri" w:hAnsi="Calibri"/>
-                <w:sz w:val="20"/>
-              </w:rPr>
-              <w:t xml:space="default">116 (24.2%)</w:t>
-            </w:r>
-          </w:p>
-        </w:tc>
-        <w:tc>
-          <w:tcPr>
-            <w:tcBorders>
-              <w:top w:val="single" w:space="0" w:color="D3D3D3"/>
-              <w:bottom w:val="single" w:space="0" w:color="D3D3D3"/>
-              <w:start w:val="single" w:space="0" w:color="D3D3D3"/>
-              <w:end w:val="single" w:space="0" w:color="D3D3D3"/>
-            </w:tcBorders>
-          </w:tcPr>
-          <w:p>
-            <w:pPr>
-              <w:spacing w:before="0" w:after="60"/>
-              <w:keepNext/>
-              <w:jc w:val="start"/>
-            </w:pPr>
-            <w:r>
-              <w:rPr>
-                <w:rFonts w:ascii="Calibri" w:hAnsi="Calibri"/>
-                <w:sz w:val="20"/>
-              </w:rPr>
-              <w:t xml:space="default">180 (20.7%)</w:t>
+              <w:t xml:space="default">50 (14.8%)</w:t>
+            </w:r>
+          </w:p>
+        </w:tc>
+        <w:tc>
+          <w:tcPr>
+            <w:tcBorders>
+              <w:top w:val="single" w:space="0" w:color="D3D3D3"/>
+              <w:bottom w:val="single" w:space="0" w:color="D3D3D3"/>
+              <w:start w:val="single" w:space="0" w:color="D3D3D3"/>
+              <w:end w:val="single" w:space="0" w:color="D3D3D3"/>
+            </w:tcBorders>
+          </w:tcPr>
+          <w:p>
+            <w:pPr>
+              <w:spacing w:before="0" w:after="60"/>
+              <w:keepNext/>
+              <w:jc w:val="start"/>
+            </w:pPr>
+            <w:r>
+              <w:rPr>
+                <w:rFonts w:ascii="Calibri" w:hAnsi="Calibri"/>
+                <w:sz w:val="20"/>
+              </w:rPr>
+              <w:t xml:space="default">116 (24.6%)</w:t>
+            </w:r>
+          </w:p>
+        </w:tc>
+        <w:tc>
+          <w:tcPr>
+            <w:tcBorders>
+              <w:top w:val="single" w:space="0" w:color="D3D3D3"/>
+              <w:bottom w:val="single" w:space="0" w:color="D3D3D3"/>
+              <w:start w:val="single" w:space="0" w:color="D3D3D3"/>
+              <w:end w:val="single" w:space="0" w:color="D3D3D3"/>
+            </w:tcBorders>
+          </w:tcPr>
+          <w:p>
+            <w:pPr>
+              <w:spacing w:before="0" w:after="60"/>
+              <w:keepNext/>
+              <w:jc w:val="start"/>
+            </w:pPr>
+            <w:r>
+              <w:rPr>
+                <w:rFonts w:ascii="Calibri" w:hAnsi="Calibri"/>
+                <w:sz w:val="20"/>
+              </w:rPr>
+              <w:t xml:space="default">166 (20.5%)</w:t>
             </w:r>
           </w:p>
         </w:tc>
@@ -5223,7 +5223,7 @@
                 <w:rFonts w:ascii="Calibri" w:hAnsi="Calibri"/>
                 <w:sz w:val="20"/>
               </w:rPr>
-              <w:t xml:space="default">64.4%</w:t>
+              <w:t xml:space="default">69.9%</w:t>
             </w:r>
           </w:p>
         </w:tc>
@@ -5406,7 +5406,7 @@
                 <w:rFonts w:ascii="Calibri" w:hAnsi="Calibri"/>
                 <w:sz w:val="20"/>
               </w:rPr>
-              <w:t xml:space="default">25 (6.5%)</w:t>
+              <w:t xml:space="default">22 (6.5%)</w:t>
             </w:r>
           </w:p>
         </w:tc>
@@ -5454,7 +5454,7 @@
                 <w:rFonts w:ascii="Calibri" w:hAnsi="Calibri"/>
                 <w:sz w:val="20"/>
               </w:rPr>
-              <w:t xml:space="default">36 (4.2%)</w:t>
+              <w:t xml:space="default">33 (4.1%)</w:t>
             </w:r>
           </w:p>
         </w:tc>
@@ -5478,7 +5478,7 @@
                 <w:rFonts w:ascii="Calibri" w:hAnsi="Calibri"/>
                 <w:sz w:val="20"/>
               </w:rPr>
-              <w:t xml:space="default">30.4%</w:t>
+              <w:t xml:space="default">33.6%</w:t>
             </w:r>
           </w:p>
         </w:tc>
@@ -5531,55 +5531,55 @@
                 <w:rFonts w:ascii="Calibri" w:hAnsi="Calibri"/>
                 <w:sz w:val="20"/>
               </w:rPr>
-              <w:t xml:space="default">365 (93.5%)</w:t>
-            </w:r>
-          </w:p>
-        </w:tc>
-        <w:tc>
-          <w:tcPr>
-            <w:tcBorders>
-              <w:top w:val="single" w:space="0" w:color="D3D3D3"/>
-              <w:bottom w:val="single" w:space="0" w:color="D3D3D3"/>
-              <w:start w:val="single" w:space="0" w:color="D3D3D3"/>
-              <w:end w:val="single" w:space="0" w:color="D3D3D3"/>
-            </w:tcBorders>
-          </w:tcPr>
-          <w:p>
-            <w:pPr>
-              <w:spacing w:before="0" w:after="60"/>
-              <w:keepNext/>
-              <w:jc w:val="start"/>
-            </w:pPr>
-            <w:r>
-              <w:rPr>
-                <w:rFonts w:ascii="Calibri" w:hAnsi="Calibri"/>
-                <w:sz w:val="20"/>
-              </w:rPr>
-              <w:t xml:space="default">468 (97.7%)</w:t>
-            </w:r>
-          </w:p>
-        </w:tc>
-        <w:tc>
-          <w:tcPr>
-            <w:tcBorders>
-              <w:top w:val="single" w:space="0" w:color="D3D3D3"/>
-              <w:bottom w:val="single" w:space="0" w:color="D3D3D3"/>
-              <w:start w:val="single" w:space="0" w:color="D3D3D3"/>
-              <w:end w:val="single" w:space="0" w:color="D3D3D3"/>
-            </w:tcBorders>
-          </w:tcPr>
-          <w:p>
-            <w:pPr>
-              <w:spacing w:before="0" w:after="60"/>
-              <w:keepNext/>
-              <w:jc w:val="start"/>
-            </w:pPr>
-            <w:r>
-              <w:rPr>
-                <w:rFonts w:ascii="Calibri" w:hAnsi="Calibri"/>
-                <w:sz w:val="20"/>
-              </w:rPr>
-              <w:t xml:space="default">833 (95.8%)</w:t>
+              <w:t xml:space="default">316 (93.5%)</w:t>
+            </w:r>
+          </w:p>
+        </w:tc>
+        <w:tc>
+          <w:tcPr>
+            <w:tcBorders>
+              <w:top w:val="single" w:space="0" w:color="D3D3D3"/>
+              <w:bottom w:val="single" w:space="0" w:color="D3D3D3"/>
+              <w:start w:val="single" w:space="0" w:color="D3D3D3"/>
+              <w:end w:val="single" w:space="0" w:color="D3D3D3"/>
+            </w:tcBorders>
+          </w:tcPr>
+          <w:p>
+            <w:pPr>
+              <w:spacing w:before="0" w:after="60"/>
+              <w:keepNext/>
+              <w:jc w:val="start"/>
+            </w:pPr>
+            <w:r>
+              <w:rPr>
+                <w:rFonts w:ascii="Calibri" w:hAnsi="Calibri"/>
+                <w:sz w:val="20"/>
+              </w:rPr>
+              <w:t xml:space="default">460 (97.7%)</w:t>
+            </w:r>
+          </w:p>
+        </w:tc>
+        <w:tc>
+          <w:tcPr>
+            <w:tcBorders>
+              <w:top w:val="single" w:space="0" w:color="D3D3D3"/>
+              <w:bottom w:val="single" w:space="0" w:color="D3D3D3"/>
+              <w:start w:val="single" w:space="0" w:color="D3D3D3"/>
+              <w:end w:val="single" w:space="0" w:color="D3D3D3"/>
+            </w:tcBorders>
+          </w:tcPr>
+          <w:p>
+            <w:pPr>
+              <w:spacing w:before="0" w:after="60"/>
+              <w:keepNext/>
+              <w:jc w:val="start"/>
+            </w:pPr>
+            <w:r>
+              <w:rPr>
+                <w:rFonts w:ascii="Calibri" w:hAnsi="Calibri"/>
+                <w:sz w:val="20"/>
+              </w:rPr>
+              <w:t xml:space="default">776 (95.9%)</w:t>
             </w:r>
           </w:p>
         </w:tc>
@@ -5603,7 +5603,7 @@
                 <w:rFonts w:ascii="Calibri" w:hAnsi="Calibri"/>
                 <w:sz w:val="20"/>
               </w:rPr>
-              <w:t xml:space="default">56.2%</w:t>
+              <w:t xml:space="default">59.3%</w:t>
             </w:r>
           </w:p>
         </w:tc>
@@ -5786,55 +5786,55 @@
                 <w:rFonts w:ascii="Calibri" w:hAnsi="Calibri"/>
                 <w:sz w:val="20"/>
               </w:rPr>
-              <w:t xml:space="default">49 (12.6%)</w:t>
-            </w:r>
-          </w:p>
-        </w:tc>
-        <w:tc>
-          <w:tcPr>
-            <w:tcBorders>
-              <w:top w:val="single" w:space="0" w:color="D3D3D3"/>
-              <w:bottom w:val="single" w:space="0" w:color="D3D3D3"/>
-              <w:start w:val="single" w:space="0" w:color="D3D3D3"/>
-              <w:end w:val="single" w:space="0" w:color="D3D3D3"/>
-            </w:tcBorders>
-          </w:tcPr>
-          <w:p>
-            <w:pPr>
-              <w:spacing w:before="0" w:after="60"/>
-              <w:keepNext/>
-              <w:jc w:val="start"/>
-            </w:pPr>
-            <w:r>
-              <w:rPr>
-                <w:rFonts w:ascii="Calibri" w:hAnsi="Calibri"/>
-                <w:sz w:val="20"/>
-              </w:rPr>
-              <w:t xml:space="default">49 (10.2%)</w:t>
-            </w:r>
-          </w:p>
-        </w:tc>
-        <w:tc>
-          <w:tcPr>
-            <w:tcBorders>
-              <w:top w:val="single" w:space="0" w:color="D3D3D3"/>
-              <w:bottom w:val="single" w:space="0" w:color="D3D3D3"/>
-              <w:start w:val="single" w:space="0" w:color="D3D3D3"/>
-              <w:end w:val="single" w:space="0" w:color="D3D3D3"/>
-            </w:tcBorders>
-          </w:tcPr>
-          <w:p>
-            <w:pPr>
-              <w:spacing w:before="0" w:after="60"/>
-              <w:keepNext/>
-              <w:jc w:val="start"/>
-            </w:pPr>
-            <w:r>
-              <w:rPr>
-                <w:rFonts w:ascii="Calibri" w:hAnsi="Calibri"/>
-                <w:sz w:val="20"/>
-              </w:rPr>
-              <w:t xml:space="default">98 (11.3%)</w:t>
+              <w:t xml:space="default">45 (13.4%)</w:t>
+            </w:r>
+          </w:p>
+        </w:tc>
+        <w:tc>
+          <w:tcPr>
+            <w:tcBorders>
+              <w:top w:val="single" w:space="0" w:color="D3D3D3"/>
+              <w:bottom w:val="single" w:space="0" w:color="D3D3D3"/>
+              <w:start w:val="single" w:space="0" w:color="D3D3D3"/>
+              <w:end w:val="single" w:space="0" w:color="D3D3D3"/>
+            </w:tcBorders>
+          </w:tcPr>
+          <w:p>
+            <w:pPr>
+              <w:spacing w:before="0" w:after="60"/>
+              <w:keepNext/>
+              <w:jc w:val="start"/>
+            </w:pPr>
+            <w:r>
+              <w:rPr>
+                <w:rFonts w:ascii="Calibri" w:hAnsi="Calibri"/>
+                <w:sz w:val="20"/>
+              </w:rPr>
+              <w:t xml:space="default">49 (10.4%)</w:t>
+            </w:r>
+          </w:p>
+        </w:tc>
+        <w:tc>
+          <w:tcPr>
+            <w:tcBorders>
+              <w:top w:val="single" w:space="0" w:color="D3D3D3"/>
+              <w:bottom w:val="single" w:space="0" w:color="D3D3D3"/>
+              <w:start w:val="single" w:space="0" w:color="D3D3D3"/>
+              <w:end w:val="single" w:space="0" w:color="D3D3D3"/>
+            </w:tcBorders>
+          </w:tcPr>
+          <w:p>
+            <w:pPr>
+              <w:spacing w:before="0" w:after="60"/>
+              <w:keepNext/>
+              <w:jc w:val="start"/>
+            </w:pPr>
+            <w:r>
+              <w:rPr>
+                <w:rFonts w:ascii="Calibri" w:hAnsi="Calibri"/>
+                <w:sz w:val="20"/>
+              </w:rPr>
+              <w:t xml:space="default">94 (11.7%)</w:t>
             </w:r>
           </w:p>
         </w:tc>
@@ -5858,7 +5858,7 @@
                 <w:rFonts w:ascii="Calibri" w:hAnsi="Calibri"/>
                 <w:sz w:val="20"/>
               </w:rPr>
-              <w:t xml:space="default">50%</w:t>
+              <w:t xml:space="default">51.9%</w:t>
             </w:r>
           </w:p>
         </w:tc>
@@ -5911,55 +5911,55 @@
                 <w:rFonts w:ascii="Calibri" w:hAnsi="Calibri"/>
                 <w:sz w:val="20"/>
               </w:rPr>
-              <w:t xml:space="default">341 (87.4%)</w:t>
-            </w:r>
-          </w:p>
-        </w:tc>
-        <w:tc>
-          <w:tcPr>
-            <w:tcBorders>
-              <w:top w:val="single" w:space="0" w:color="D3D3D3"/>
-              <w:bottom w:val="single" w:space="0" w:color="D3D3D3"/>
-              <w:start w:val="single" w:space="0" w:color="D3D3D3"/>
-              <w:end w:val="single" w:space="0" w:color="D3D3D3"/>
-            </w:tcBorders>
-          </w:tcPr>
-          <w:p>
-            <w:pPr>
-              <w:spacing w:before="0" w:after="60"/>
-              <w:keepNext/>
-              <w:jc w:val="start"/>
-            </w:pPr>
-            <w:r>
-              <w:rPr>
-                <w:rFonts w:ascii="Calibri" w:hAnsi="Calibri"/>
-                <w:sz w:val="20"/>
-              </w:rPr>
-              <w:t xml:space="default">430 (89.8%)</w:t>
-            </w:r>
-          </w:p>
-        </w:tc>
-        <w:tc>
-          <w:tcPr>
-            <w:tcBorders>
-              <w:top w:val="single" w:space="0" w:color="D3D3D3"/>
-              <w:bottom w:val="single" w:space="0" w:color="D3D3D3"/>
-              <w:start w:val="single" w:space="0" w:color="D3D3D3"/>
-              <w:end w:val="single" w:space="0" w:color="D3D3D3"/>
-            </w:tcBorders>
-          </w:tcPr>
-          <w:p>
-            <w:pPr>
-              <w:spacing w:before="0" w:after="60"/>
-              <w:keepNext/>
-              <w:jc w:val="start"/>
-            </w:pPr>
-            <w:r>
-              <w:rPr>
-                <w:rFonts w:ascii="Calibri" w:hAnsi="Calibri"/>
-                <w:sz w:val="20"/>
-              </w:rPr>
-              <w:t xml:space="default">771 (88.7%)</w:t>
+              <w:t xml:space="default">292 (86.6%)</w:t>
+            </w:r>
+          </w:p>
+        </w:tc>
+        <w:tc>
+          <w:tcPr>
+            <w:tcBorders>
+              <w:top w:val="single" w:space="0" w:color="D3D3D3"/>
+              <w:bottom w:val="single" w:space="0" w:color="D3D3D3"/>
+              <w:start w:val="single" w:space="0" w:color="D3D3D3"/>
+              <w:end w:val="single" w:space="0" w:color="D3D3D3"/>
+            </w:tcBorders>
+          </w:tcPr>
+          <w:p>
+            <w:pPr>
+              <w:spacing w:before="0" w:after="60"/>
+              <w:keepNext/>
+              <w:jc w:val="start"/>
+            </w:pPr>
+            <w:r>
+              <w:rPr>
+                <w:rFonts w:ascii="Calibri" w:hAnsi="Calibri"/>
+                <w:sz w:val="20"/>
+              </w:rPr>
+              <w:t xml:space="default">422 (89.6%)</w:t>
+            </w:r>
+          </w:p>
+        </w:tc>
+        <w:tc>
+          <w:tcPr>
+            <w:tcBorders>
+              <w:top w:val="single" w:space="0" w:color="D3D3D3"/>
+              <w:bottom w:val="single" w:space="0" w:color="D3D3D3"/>
+              <w:start w:val="single" w:space="0" w:color="D3D3D3"/>
+              <w:end w:val="single" w:space="0" w:color="D3D3D3"/>
+            </w:tcBorders>
+          </w:tcPr>
+          <w:p>
+            <w:pPr>
+              <w:spacing w:before="0" w:after="60"/>
+              <w:keepNext/>
+              <w:jc w:val="start"/>
+            </w:pPr>
+            <w:r>
+              <w:rPr>
+                <w:rFonts w:ascii="Calibri" w:hAnsi="Calibri"/>
+                <w:sz w:val="20"/>
+              </w:rPr>
+              <w:t xml:space="default">715 (88.3%)</w:t>
             </w:r>
           </w:p>
         </w:tc>
@@ -5983,7 +5983,7 @@
                 <w:rFonts w:ascii="Calibri" w:hAnsi="Calibri"/>
                 <w:sz w:val="20"/>
               </w:rPr>
-              <w:t xml:space="default">55.8%</w:t>
+              <w:t xml:space="default">59.1%</w:t>
             </w:r>
           </w:p>
         </w:tc>

</xml_diff>

<commit_message>
v1.7 NIS sheet: traumatic classification and confirmed miscoding finding
</commit_message>
<xml_diff>
--- a/Word Tables/Table1_Patient_Characteristics.docx
+++ b/Word Tables/Table1_Patient_Characteristics.docx
@@ -238,7 +238,7 @@
                 <w:sz w:val="20"/>
                 <w:b w:val="true"/>
               </w:rPr>
-              <w:t xml:space="default">338 (100%)</w:t>
+              <w:t xml:space="default">264 (100%)</w:t>
             </w:r>
           </w:p>
         </w:tc>
@@ -263,7 +263,7 @@
                 <w:sz w:val="20"/>
                 <w:b w:val="true"/>
               </w:rPr>
-              <w:t xml:space="default">471 (100%)</w:t>
+              <w:t xml:space="default">429 (100%)</w:t>
             </w:r>
           </w:p>
         </w:tc>
@@ -288,7 +288,7 @@
                 <w:sz w:val="20"/>
                 <w:b w:val="true"/>
               </w:rPr>
-              <w:t xml:space="default">809</w:t>
+              <w:t xml:space="default">694</w:t>
             </w:r>
           </w:p>
         </w:tc>
@@ -313,7 +313,7 @@
                 <w:sz w:val="20"/>
                 <w:b w:val="true"/>
               </w:rPr>
-              <w:t xml:space="default">58.3%</w:t>
+              <w:t xml:space="default">61.9%</w:t>
             </w:r>
           </w:p>
         </w:tc>
@@ -366,55 +366,55 @@
                 <w:rFonts w:ascii="Calibri" w:hAnsi="Calibri"/>
                 <w:sz w:val="20"/>
               </w:rPr>
-              <w:t xml:space="default">11 (3.1%)</w:t>
-            </w:r>
-          </w:p>
-        </w:tc>
-        <w:tc>
-          <w:tcPr>
-            <w:tcBorders>
-              <w:top w:val="single" w:space="0" w:color="D3D3D3"/>
-              <w:bottom w:val="single" w:space="0" w:color="D3D3D3"/>
-              <w:start w:val="single" w:space="0" w:color="D3D3D3"/>
-              <w:end w:val="single" w:space="0" w:color="D3D3D3"/>
-            </w:tcBorders>
-          </w:tcPr>
-          <w:p>
-            <w:pPr>
-              <w:spacing w:before="0" w:after="60"/>
-              <w:keepNext/>
-              <w:jc w:val="start"/>
-            </w:pPr>
-            <w:r>
-              <w:rPr>
-                <w:rFonts w:ascii="Calibri" w:hAnsi="Calibri"/>
-                <w:sz w:val="20"/>
-              </w:rPr>
-              <w:t xml:space="default">39 (8.2%)</w:t>
-            </w:r>
-          </w:p>
-        </w:tc>
-        <w:tc>
-          <w:tcPr>
-            <w:tcBorders>
-              <w:top w:val="single" w:space="0" w:color="D3D3D3"/>
-              <w:bottom w:val="single" w:space="0" w:color="D3D3D3"/>
-              <w:start w:val="single" w:space="0" w:color="D3D3D3"/>
-              <w:end w:val="single" w:space="0" w:color="D3D3D3"/>
-            </w:tcBorders>
-          </w:tcPr>
-          <w:p>
-            <w:pPr>
-              <w:spacing w:before="0" w:after="60"/>
-              <w:keepNext/>
-              <w:jc w:val="start"/>
-            </w:pPr>
-            <w:r>
-              <w:rPr>
-                <w:rFonts w:ascii="Calibri" w:hAnsi="Calibri"/>
-                <w:sz w:val="20"/>
-              </w:rPr>
-              <w:t xml:space="default">49</w:t>
+              <w:t xml:space="default">11 (4%)</w:t>
+            </w:r>
+          </w:p>
+        </w:tc>
+        <w:tc>
+          <w:tcPr>
+            <w:tcBorders>
+              <w:top w:val="single" w:space="0" w:color="D3D3D3"/>
+              <w:bottom w:val="single" w:space="0" w:color="D3D3D3"/>
+              <w:start w:val="single" w:space="0" w:color="D3D3D3"/>
+              <w:end w:val="single" w:space="0" w:color="D3D3D3"/>
+            </w:tcBorders>
+          </w:tcPr>
+          <w:p>
+            <w:pPr>
+              <w:spacing w:before="0" w:after="60"/>
+              <w:keepNext/>
+              <w:jc w:val="start"/>
+            </w:pPr>
+            <w:r>
+              <w:rPr>
+                <w:rFonts w:ascii="Calibri" w:hAnsi="Calibri"/>
+                <w:sz w:val="20"/>
+              </w:rPr>
+              <w:t xml:space="default">36 (8.4%)</w:t>
+            </w:r>
+          </w:p>
+        </w:tc>
+        <w:tc>
+          <w:tcPr>
+            <w:tcBorders>
+              <w:top w:val="single" w:space="0" w:color="D3D3D3"/>
+              <w:bottom w:val="single" w:space="0" w:color="D3D3D3"/>
+              <w:start w:val="single" w:space="0" w:color="D3D3D3"/>
+              <w:end w:val="single" w:space="0" w:color="D3D3D3"/>
+            </w:tcBorders>
+          </w:tcPr>
+          <w:p>
+            <w:pPr>
+              <w:spacing w:before="0" w:after="60"/>
+              <w:keepNext/>
+              <w:jc w:val="start"/>
+            </w:pPr>
+            <w:r>
+              <w:rPr>
+                <w:rFonts w:ascii="Calibri" w:hAnsi="Calibri"/>
+                <w:sz w:val="20"/>
+              </w:rPr>
+              <w:t xml:space="default">47</w:t>
             </w:r>
           </w:p>
         </w:tc>
@@ -438,7 +438,7 @@
                 <w:rFonts w:ascii="Calibri" w:hAnsi="Calibri"/>
                 <w:sz w:val="20"/>
               </w:rPr>
-              <w:t xml:space="default">78.5%</w:t>
+              <w:t xml:space="default">77.3%</w:t>
             </w:r>
           </w:p>
         </w:tc>
@@ -491,55 +491,55 @@
                 <w:rFonts w:ascii="Calibri" w:hAnsi="Calibri"/>
                 <w:sz w:val="20"/>
               </w:rPr>
-              <w:t xml:space="default">23 (6.7%)</w:t>
-            </w:r>
-          </w:p>
-        </w:tc>
-        <w:tc>
-          <w:tcPr>
-            <w:tcBorders>
-              <w:top w:val="single" w:space="0" w:color="D3D3D3"/>
-              <w:bottom w:val="single" w:space="0" w:color="D3D3D3"/>
-              <w:start w:val="single" w:space="0" w:color="D3D3D3"/>
-              <w:end w:val="single" w:space="0" w:color="D3D3D3"/>
-            </w:tcBorders>
-          </w:tcPr>
-          <w:p>
-            <w:pPr>
-              <w:spacing w:before="0" w:after="60"/>
-              <w:keepNext/>
-              <w:jc w:val="start"/>
-            </w:pPr>
-            <w:r>
-              <w:rPr>
-                <w:rFonts w:ascii="Calibri" w:hAnsi="Calibri"/>
-                <w:sz w:val="20"/>
-              </w:rPr>
-              <w:t xml:space="default">52 (11.1%)</w:t>
-            </w:r>
-          </w:p>
-        </w:tc>
-        <w:tc>
-          <w:tcPr>
-            <w:tcBorders>
-              <w:top w:val="single" w:space="0" w:color="D3D3D3"/>
-              <w:bottom w:val="single" w:space="0" w:color="D3D3D3"/>
-              <w:start w:val="single" w:space="0" w:color="D3D3D3"/>
-              <w:end w:val="single" w:space="0" w:color="D3D3D3"/>
-            </w:tcBorders>
-          </w:tcPr>
-          <w:p>
-            <w:pPr>
-              <w:spacing w:before="0" w:after="60"/>
-              <w:keepNext/>
-              <w:jc w:val="start"/>
-            </w:pPr>
-            <w:r>
-              <w:rPr>
-                <w:rFonts w:ascii="Calibri" w:hAnsi="Calibri"/>
-                <w:sz w:val="20"/>
-              </w:rPr>
-              <w:t xml:space="default">75</w:t>
+              <w:t xml:space="default">13 (4.9%)</w:t>
+            </w:r>
+          </w:p>
+        </w:tc>
+        <w:tc>
+          <w:tcPr>
+            <w:tcBorders>
+              <w:top w:val="single" w:space="0" w:color="D3D3D3"/>
+              <w:bottom w:val="single" w:space="0" w:color="D3D3D3"/>
+              <w:start w:val="single" w:space="0" w:color="D3D3D3"/>
+              <w:end w:val="single" w:space="0" w:color="D3D3D3"/>
+            </w:tcBorders>
+          </w:tcPr>
+          <w:p>
+            <w:pPr>
+              <w:spacing w:before="0" w:after="60"/>
+              <w:keepNext/>
+              <w:jc w:val="start"/>
+            </w:pPr>
+            <w:r>
+              <w:rPr>
+                <w:rFonts w:ascii="Calibri" w:hAnsi="Calibri"/>
+                <w:sz w:val="20"/>
+              </w:rPr>
+              <w:t xml:space="default">47 (10.9%)</w:t>
+            </w:r>
+          </w:p>
+        </w:tc>
+        <w:tc>
+          <w:tcPr>
+            <w:tcBorders>
+              <w:top w:val="single" w:space="0" w:color="D3D3D3"/>
+              <w:bottom w:val="single" w:space="0" w:color="D3D3D3"/>
+              <w:start w:val="single" w:space="0" w:color="D3D3D3"/>
+              <w:end w:val="single" w:space="0" w:color="D3D3D3"/>
+            </w:tcBorders>
+          </w:tcPr>
+          <w:p>
+            <w:pPr>
+              <w:spacing w:before="0" w:after="60"/>
+              <w:keepNext/>
+              <w:jc w:val="start"/>
+            </w:pPr>
+            <w:r>
+              <w:rPr>
+                <w:rFonts w:ascii="Calibri" w:hAnsi="Calibri"/>
+                <w:sz w:val="20"/>
+              </w:rPr>
+              <w:t xml:space="default">60</w:t>
             </w:r>
           </w:p>
         </w:tc>
@@ -563,7 +563,7 @@
                 <w:rFonts w:ascii="Calibri" w:hAnsi="Calibri"/>
                 <w:sz w:val="20"/>
               </w:rPr>
-              <w:t xml:space="default">69.9%</w:t>
+              <w:t xml:space="default">78.2%</w:t>
             </w:r>
           </w:p>
         </w:tc>
@@ -616,55 +616,55 @@
                 <w:rFonts w:ascii="Calibri" w:hAnsi="Calibri"/>
                 <w:sz w:val="20"/>
               </w:rPr>
-              <w:t xml:space="default">20 (5.8%)</w:t>
-            </w:r>
-          </w:p>
-        </w:tc>
-        <w:tc>
-          <w:tcPr>
-            <w:tcBorders>
-              <w:top w:val="single" w:space="0" w:color="D3D3D3"/>
-              <w:bottom w:val="single" w:space="0" w:color="D3D3D3"/>
-              <w:start w:val="single" w:space="0" w:color="D3D3D3"/>
-              <w:end w:val="single" w:space="0" w:color="D3D3D3"/>
-            </w:tcBorders>
-          </w:tcPr>
-          <w:p>
-            <w:pPr>
-              <w:spacing w:before="0" w:after="60"/>
-              <w:keepNext/>
-              <w:jc w:val="start"/>
-            </w:pPr>
-            <w:r>
-              <w:rPr>
-                <w:rFonts w:ascii="Calibri" w:hAnsi="Calibri"/>
-                <w:sz w:val="20"/>
-              </w:rPr>
-              <w:t xml:space="default">44 (9.3%)</w:t>
-            </w:r>
-          </w:p>
-        </w:tc>
-        <w:tc>
-          <w:tcPr>
-            <w:tcBorders>
-              <w:top w:val="single" w:space="0" w:color="D3D3D3"/>
-              <w:bottom w:val="single" w:space="0" w:color="D3D3D3"/>
-              <w:start w:val="single" w:space="0" w:color="D3D3D3"/>
-              <w:end w:val="single" w:space="0" w:color="D3D3D3"/>
-            </w:tcBorders>
-          </w:tcPr>
-          <w:p>
-            <w:pPr>
-              <w:spacing w:before="0" w:after="60"/>
-              <w:keepNext/>
-              <w:jc w:val="start"/>
-            </w:pPr>
-            <w:r>
-              <w:rPr>
-                <w:rFonts w:ascii="Calibri" w:hAnsi="Calibri"/>
-                <w:sz w:val="20"/>
-              </w:rPr>
-              <w:t xml:space="default">63</w:t>
+              <w:t xml:space="default">11 (4.2%)</w:t>
+            </w:r>
+          </w:p>
+        </w:tc>
+        <w:tc>
+          <w:tcPr>
+            <w:tcBorders>
+              <w:top w:val="single" w:space="0" w:color="D3D3D3"/>
+              <w:bottom w:val="single" w:space="0" w:color="D3D3D3"/>
+              <w:start w:val="single" w:space="0" w:color="D3D3D3"/>
+              <w:end w:val="single" w:space="0" w:color="D3D3D3"/>
+            </w:tcBorders>
+          </w:tcPr>
+          <w:p>
+            <w:pPr>
+              <w:spacing w:before="0" w:after="60"/>
+              <w:keepNext/>
+              <w:jc w:val="start"/>
+            </w:pPr>
+            <w:r>
+              <w:rPr>
+                <w:rFonts w:ascii="Calibri" w:hAnsi="Calibri"/>
+                <w:sz w:val="20"/>
+              </w:rPr>
+              <w:t xml:space="default">38 (8.8%)</w:t>
+            </w:r>
+          </w:p>
+        </w:tc>
+        <w:tc>
+          <w:tcPr>
+            <w:tcBorders>
+              <w:top w:val="single" w:space="0" w:color="D3D3D3"/>
+              <w:bottom w:val="single" w:space="0" w:color="D3D3D3"/>
+              <w:start w:val="single" w:space="0" w:color="D3D3D3"/>
+              <w:end w:val="single" w:space="0" w:color="D3D3D3"/>
+            </w:tcBorders>
+          </w:tcPr>
+          <w:p>
+            <w:pPr>
+              <w:spacing w:before="0" w:after="60"/>
+              <w:keepNext/>
+              <w:jc w:val="start"/>
+            </w:pPr>
+            <w:r>
+              <w:rPr>
+                <w:rFonts w:ascii="Calibri" w:hAnsi="Calibri"/>
+                <w:sz w:val="20"/>
+              </w:rPr>
+              <w:t xml:space="default">49</w:t>
             </w:r>
           </w:p>
         </w:tc>
@@ -688,7 +688,7 @@
                 <w:rFonts w:ascii="Calibri" w:hAnsi="Calibri"/>
                 <w:sz w:val="20"/>
               </w:rPr>
-              <w:t xml:space="default">69.1%</w:t>
+              <w:t xml:space="default">77.3%</w:t>
             </w:r>
           </w:p>
         </w:tc>
@@ -741,55 +741,55 @@
                 <w:rFonts w:ascii="Calibri" w:hAnsi="Calibri"/>
                 <w:sz w:val="20"/>
               </w:rPr>
-              <w:t xml:space="default">66 (19.7%)</w:t>
-            </w:r>
-          </w:p>
-        </w:tc>
-        <w:tc>
-          <w:tcPr>
-            <w:tcBorders>
-              <w:top w:val="single" w:space="0" w:color="D3D3D3"/>
-              <w:bottom w:val="single" w:space="0" w:color="D3D3D3"/>
-              <w:start w:val="single" w:space="0" w:color="D3D3D3"/>
-              <w:end w:val="single" w:space="0" w:color="D3D3D3"/>
-            </w:tcBorders>
-          </w:tcPr>
-          <w:p>
-            <w:pPr>
-              <w:spacing w:before="0" w:after="60"/>
-              <w:keepNext/>
-              <w:jc w:val="start"/>
-            </w:pPr>
-            <w:r>
-              <w:rPr>
-                <w:rFonts w:ascii="Calibri" w:hAnsi="Calibri"/>
-                <w:sz w:val="20"/>
-              </w:rPr>
-              <w:t xml:space="default">67 (14.3%)</w:t>
-            </w:r>
-          </w:p>
-        </w:tc>
-        <w:tc>
-          <w:tcPr>
-            <w:tcBorders>
-              <w:top w:val="single" w:space="0" w:color="D3D3D3"/>
-              <w:bottom w:val="single" w:space="0" w:color="D3D3D3"/>
-              <w:start w:val="single" w:space="0" w:color="D3D3D3"/>
-              <w:end w:val="single" w:space="0" w:color="D3D3D3"/>
-            </w:tcBorders>
-          </w:tcPr>
-          <w:p>
-            <w:pPr>
-              <w:spacing w:before="0" w:after="60"/>
-              <w:keepNext/>
-              <w:jc w:val="start"/>
-            </w:pPr>
-            <w:r>
-              <w:rPr>
-                <w:rFonts w:ascii="Calibri" w:hAnsi="Calibri"/>
-                <w:sz w:val="20"/>
-              </w:rPr>
-              <w:t xml:space="default">134</w:t>
+              <w:t xml:space="default">50 (18.8%)</w:t>
+            </w:r>
+          </w:p>
+        </w:tc>
+        <w:tc>
+          <w:tcPr>
+            <w:tcBorders>
+              <w:top w:val="single" w:space="0" w:color="D3D3D3"/>
+              <w:bottom w:val="single" w:space="0" w:color="D3D3D3"/>
+              <w:start w:val="single" w:space="0" w:color="D3D3D3"/>
+              <w:end w:val="single" w:space="0" w:color="D3D3D3"/>
+            </w:tcBorders>
+          </w:tcPr>
+          <w:p>
+            <w:pPr>
+              <w:spacing w:before="0" w:after="60"/>
+              <w:keepNext/>
+              <w:jc w:val="start"/>
+            </w:pPr>
+            <w:r>
+              <w:rPr>
+                <w:rFonts w:ascii="Calibri" w:hAnsi="Calibri"/>
+                <w:sz w:val="20"/>
+              </w:rPr>
+              <w:t xml:space="default">64 (14.9%)</w:t>
+            </w:r>
+          </w:p>
+        </w:tc>
+        <w:tc>
+          <w:tcPr>
+            <w:tcBorders>
+              <w:top w:val="single" w:space="0" w:color="D3D3D3"/>
+              <w:bottom w:val="single" w:space="0" w:color="D3D3D3"/>
+              <w:start w:val="single" w:space="0" w:color="D3D3D3"/>
+              <w:end w:val="single" w:space="0" w:color="D3D3D3"/>
+            </w:tcBorders>
+          </w:tcPr>
+          <w:p>
+            <w:pPr>
+              <w:spacing w:before="0" w:after="60"/>
+              <w:keepNext/>
+              <w:jc w:val="start"/>
+            </w:pPr>
+            <w:r>
+              <w:rPr>
+                <w:rFonts w:ascii="Calibri" w:hAnsi="Calibri"/>
+                <w:sz w:val="20"/>
+              </w:rPr>
+              <w:t xml:space="default">114</w:t>
             </w:r>
           </w:p>
         </w:tc>
@@ -813,7 +813,7 @@
                 <w:rFonts w:ascii="Calibri" w:hAnsi="Calibri"/>
                 <w:sz w:val="20"/>
               </w:rPr>
-              <w:t xml:space="default">50.4%</w:t>
+              <w:t xml:space="default">56.2%</w:t>
             </w:r>
           </w:p>
         </w:tc>
@@ -866,55 +866,55 @@
                 <w:rFonts w:ascii="Calibri" w:hAnsi="Calibri"/>
                 <w:sz w:val="20"/>
               </w:rPr>
-              <w:t xml:space="default">73 (21.5%)</w:t>
-            </w:r>
-          </w:p>
-        </w:tc>
-        <w:tc>
-          <w:tcPr>
-            <w:tcBorders>
-              <w:top w:val="single" w:space="0" w:color="D3D3D3"/>
-              <w:bottom w:val="single" w:space="0" w:color="D3D3D3"/>
-              <w:start w:val="single" w:space="0" w:color="D3D3D3"/>
-              <w:end w:val="single" w:space="0" w:color="D3D3D3"/>
-            </w:tcBorders>
-          </w:tcPr>
-          <w:p>
-            <w:pPr>
-              <w:spacing w:before="0" w:after="60"/>
-              <w:keepNext/>
-              <w:jc w:val="start"/>
-            </w:pPr>
-            <w:r>
-              <w:rPr>
-                <w:rFonts w:ascii="Calibri" w:hAnsi="Calibri"/>
-                <w:sz w:val="20"/>
-              </w:rPr>
-              <w:t xml:space="default">70 (14.8%)</w:t>
-            </w:r>
-          </w:p>
-        </w:tc>
-        <w:tc>
-          <w:tcPr>
-            <w:tcBorders>
-              <w:top w:val="single" w:space="0" w:color="D3D3D3"/>
-              <w:bottom w:val="single" w:space="0" w:color="D3D3D3"/>
-              <w:start w:val="single" w:space="0" w:color="D3D3D3"/>
-              <w:end w:val="single" w:space="0" w:color="D3D3D3"/>
-            </w:tcBorders>
-          </w:tcPr>
-          <w:p>
-            <w:pPr>
-              <w:spacing w:before="0" w:after="60"/>
-              <w:keepNext/>
-              <w:jc w:val="start"/>
-            </w:pPr>
-            <w:r>
-              <w:rPr>
-                <w:rFonts w:ascii="Calibri" w:hAnsi="Calibri"/>
-                <w:sz w:val="20"/>
-              </w:rPr>
-              <w:t xml:space="default">142</w:t>
+              <w:t xml:space="default">60 (22.5%)</w:t>
+            </w:r>
+          </w:p>
+        </w:tc>
+        <w:tc>
+          <w:tcPr>
+            <w:tcBorders>
+              <w:top w:val="single" w:space="0" w:color="D3D3D3"/>
+              <w:bottom w:val="single" w:space="0" w:color="D3D3D3"/>
+              <w:start w:val="single" w:space="0" w:color="D3D3D3"/>
+              <w:end w:val="single" w:space="0" w:color="D3D3D3"/>
+            </w:tcBorders>
+          </w:tcPr>
+          <w:p>
+            <w:pPr>
+              <w:spacing w:before="0" w:after="60"/>
+              <w:keepNext/>
+              <w:jc w:val="start"/>
+            </w:pPr>
+            <w:r>
+              <w:rPr>
+                <w:rFonts w:ascii="Calibri" w:hAnsi="Calibri"/>
+                <w:sz w:val="20"/>
+              </w:rPr>
+              <w:t xml:space="default">66 (15.3%)</w:t>
+            </w:r>
+          </w:p>
+        </w:tc>
+        <w:tc>
+          <w:tcPr>
+            <w:tcBorders>
+              <w:top w:val="single" w:space="0" w:color="D3D3D3"/>
+              <w:bottom w:val="single" w:space="0" w:color="D3D3D3"/>
+              <w:start w:val="single" w:space="0" w:color="D3D3D3"/>
+              <w:end w:val="single" w:space="0" w:color="D3D3D3"/>
+            </w:tcBorders>
+          </w:tcPr>
+          <w:p>
+            <w:pPr>
+              <w:spacing w:before="0" w:after="60"/>
+              <w:keepNext/>
+              <w:jc w:val="start"/>
+            </w:pPr>
+            <w:r>
+              <w:rPr>
+                <w:rFonts w:ascii="Calibri" w:hAnsi="Calibri"/>
+                <w:sz w:val="20"/>
+              </w:rPr>
+              <w:t xml:space="default">125</w:t>
             </w:r>
           </w:p>
         </w:tc>
@@ -938,7 +938,7 @@
                 <w:rFonts w:ascii="Calibri" w:hAnsi="Calibri"/>
                 <w:sz w:val="20"/>
               </w:rPr>
-              <w:t xml:space="default">48.9%</w:t>
+              <w:t xml:space="default">52.5%</w:t>
             </w:r>
           </w:p>
         </w:tc>
@@ -991,55 +991,55 @@
                 <w:rFonts w:ascii="Calibri" w:hAnsi="Calibri"/>
                 <w:sz w:val="20"/>
               </w:rPr>
-              <w:t xml:space="default">63 (18.6%)</w:t>
-            </w:r>
-          </w:p>
-        </w:tc>
-        <w:tc>
-          <w:tcPr>
-            <w:tcBorders>
-              <w:top w:val="single" w:space="0" w:color="D3D3D3"/>
-              <w:bottom w:val="single" w:space="0" w:color="D3D3D3"/>
-              <w:start w:val="single" w:space="0" w:color="D3D3D3"/>
-              <w:end w:val="single" w:space="0" w:color="D3D3D3"/>
-            </w:tcBorders>
-          </w:tcPr>
-          <w:p>
-            <w:pPr>
-              <w:spacing w:before="0" w:after="60"/>
-              <w:keepNext/>
-              <w:jc w:val="start"/>
-            </w:pPr>
-            <w:r>
-              <w:rPr>
-                <w:rFonts w:ascii="Calibri" w:hAnsi="Calibri"/>
-                <w:sz w:val="20"/>
-              </w:rPr>
-              <w:t xml:space="default">67 (14.2%)</w:t>
-            </w:r>
-          </w:p>
-        </w:tc>
-        <w:tc>
-          <w:tcPr>
-            <w:tcBorders>
-              <w:top w:val="single" w:space="0" w:color="D3D3D3"/>
-              <w:bottom w:val="single" w:space="0" w:color="D3D3D3"/>
-              <w:start w:val="single" w:space="0" w:color="D3D3D3"/>
-              <w:end w:val="single" w:space="0" w:color="D3D3D3"/>
-            </w:tcBorders>
-          </w:tcPr>
-          <w:p>
-            <w:pPr>
-              <w:spacing w:before="0" w:after="60"/>
-              <w:keepNext/>
-              <w:jc w:val="start"/>
-            </w:pPr>
-            <w:r>
-              <w:rPr>
-                <w:rFonts w:ascii="Calibri" w:hAnsi="Calibri"/>
-                <w:sz w:val="20"/>
-              </w:rPr>
-              <w:t xml:space="default">130</w:t>
+              <w:t xml:space="default">46 (17.6%)</w:t>
+            </w:r>
+          </w:p>
+        </w:tc>
+        <w:tc>
+          <w:tcPr>
+            <w:tcBorders>
+              <w:top w:val="single" w:space="0" w:color="D3D3D3"/>
+              <w:bottom w:val="single" w:space="0" w:color="D3D3D3"/>
+              <w:start w:val="single" w:space="0" w:color="D3D3D3"/>
+              <w:end w:val="single" w:space="0" w:color="D3D3D3"/>
+            </w:tcBorders>
+          </w:tcPr>
+          <w:p>
+            <w:pPr>
+              <w:spacing w:before="0" w:after="60"/>
+              <w:keepNext/>
+              <w:jc w:val="start"/>
+            </w:pPr>
+            <w:r>
+              <w:rPr>
+                <w:rFonts w:ascii="Calibri" w:hAnsi="Calibri"/>
+                <w:sz w:val="20"/>
+              </w:rPr>
+              <w:t xml:space="default">61 (14.1%)</w:t>
+            </w:r>
+          </w:p>
+        </w:tc>
+        <w:tc>
+          <w:tcPr>
+            <w:tcBorders>
+              <w:top w:val="single" w:space="0" w:color="D3D3D3"/>
+              <w:bottom w:val="single" w:space="0" w:color="D3D3D3"/>
+              <w:start w:val="single" w:space="0" w:color="D3D3D3"/>
+              <w:end w:val="single" w:space="0" w:color="D3D3D3"/>
+            </w:tcBorders>
+          </w:tcPr>
+          <w:p>
+            <w:pPr>
+              <w:spacing w:before="0" w:after="60"/>
+              <w:keepNext/>
+              <w:jc w:val="start"/>
+            </w:pPr>
+            <w:r>
+              <w:rPr>
+                <w:rFonts w:ascii="Calibri" w:hAnsi="Calibri"/>
+                <w:sz w:val="20"/>
+              </w:rPr>
+              <w:t xml:space="default">107</w:t>
             </w:r>
           </w:p>
         </w:tc>
@@ -1063,7 +1063,7 @@
                 <w:rFonts w:ascii="Calibri" w:hAnsi="Calibri"/>
                 <w:sz w:val="20"/>
               </w:rPr>
-              <w:t xml:space="default">51.6%</w:t>
+              <w:t xml:space="default">56.7%</w:t>
             </w:r>
           </w:p>
         </w:tc>
@@ -1116,55 +1116,55 @@
                 <w:rFonts w:ascii="Calibri" w:hAnsi="Calibri"/>
                 <w:sz w:val="20"/>
               </w:rPr>
-              <w:t xml:space="default">46 (13.5%)</w:t>
-            </w:r>
-          </w:p>
-        </w:tc>
-        <w:tc>
-          <w:tcPr>
-            <w:tcBorders>
-              <w:top w:val="single" w:space="0" w:color="D3D3D3"/>
-              <w:bottom w:val="single" w:space="0" w:color="D3D3D3"/>
-              <w:start w:val="single" w:space="0" w:color="D3D3D3"/>
-              <w:end w:val="single" w:space="0" w:color="D3D3D3"/>
-            </w:tcBorders>
-          </w:tcPr>
-          <w:p>
-            <w:pPr>
-              <w:spacing w:before="0" w:after="60"/>
-              <w:keepNext/>
-              <w:jc w:val="start"/>
-            </w:pPr>
-            <w:r>
-              <w:rPr>
-                <w:rFonts w:ascii="Calibri" w:hAnsi="Calibri"/>
-                <w:sz w:val="20"/>
-              </w:rPr>
-              <w:t xml:space="default">72 (15.4%)</w:t>
-            </w:r>
-          </w:p>
-        </w:tc>
-        <w:tc>
-          <w:tcPr>
-            <w:tcBorders>
-              <w:top w:val="single" w:space="0" w:color="D3D3D3"/>
-              <w:bottom w:val="single" w:space="0" w:color="D3D3D3"/>
-              <w:start w:val="single" w:space="0" w:color="D3D3D3"/>
-              <w:end w:val="single" w:space="0" w:color="D3D3D3"/>
-            </w:tcBorders>
-          </w:tcPr>
-          <w:p>
-            <w:pPr>
-              <w:spacing w:before="0" w:after="60"/>
-              <w:keepNext/>
-              <w:jc w:val="start"/>
-            </w:pPr>
-            <w:r>
-              <w:rPr>
-                <w:rFonts w:ascii="Calibri" w:hAnsi="Calibri"/>
-                <w:sz w:val="20"/>
-              </w:rPr>
-              <w:t xml:space="default">118</w:t>
+              <w:t xml:space="default">43 (16.3%)</w:t>
+            </w:r>
+          </w:p>
+        </w:tc>
+        <w:tc>
+          <w:tcPr>
+            <w:tcBorders>
+              <w:top w:val="single" w:space="0" w:color="D3D3D3"/>
+              <w:bottom w:val="single" w:space="0" w:color="D3D3D3"/>
+              <w:start w:val="single" w:space="0" w:color="D3D3D3"/>
+              <w:end w:val="single" w:space="0" w:color="D3D3D3"/>
+            </w:tcBorders>
+          </w:tcPr>
+          <w:p>
+            <w:pPr>
+              <w:spacing w:before="0" w:after="60"/>
+              <w:keepNext/>
+              <w:jc w:val="start"/>
+            </w:pPr>
+            <w:r>
+              <w:rPr>
+                <w:rFonts w:ascii="Calibri" w:hAnsi="Calibri"/>
+                <w:sz w:val="20"/>
+              </w:rPr>
+              <w:t xml:space="default">66 (15.4%)</w:t>
+            </w:r>
+          </w:p>
+        </w:tc>
+        <w:tc>
+          <w:tcPr>
+            <w:tcBorders>
+              <w:top w:val="single" w:space="0" w:color="D3D3D3"/>
+              <w:bottom w:val="single" w:space="0" w:color="D3D3D3"/>
+              <w:start w:val="single" w:space="0" w:color="D3D3D3"/>
+              <w:end w:val="single" w:space="0" w:color="D3D3D3"/>
+            </w:tcBorders>
+          </w:tcPr>
+          <w:p>
+            <w:pPr>
+              <w:spacing w:before="0" w:after="60"/>
+              <w:keepNext/>
+              <w:jc w:val="start"/>
+            </w:pPr>
+            <w:r>
+              <w:rPr>
+                <w:rFonts w:ascii="Calibri" w:hAnsi="Calibri"/>
+                <w:sz w:val="20"/>
+              </w:rPr>
+              <w:t xml:space="default">109</w:t>
             </w:r>
           </w:p>
         </w:tc>
@@ -1188,7 +1188,7 @@
                 <w:rFonts w:ascii="Calibri" w:hAnsi="Calibri"/>
                 <w:sz w:val="20"/>
               </w:rPr>
-              <w:t xml:space="default">61.4%</w:t>
+              <w:t xml:space="default">60.6%</w:t>
             </w:r>
           </w:p>
         </w:tc>
@@ -1241,55 +1241,55 @@
                 <w:rFonts w:ascii="Calibri" w:hAnsi="Calibri"/>
                 <w:sz w:val="20"/>
               </w:rPr>
-              <w:t xml:space="default">38 (11.1%)</w:t>
-            </w:r>
-          </w:p>
-        </w:tc>
-        <w:tc>
-          <w:tcPr>
-            <w:tcBorders>
-              <w:top w:val="single" w:space="0" w:color="D3D3D3"/>
-              <w:bottom w:val="single" w:space="0" w:color="D3D3D3"/>
-              <w:start w:val="single" w:space="0" w:color="D3D3D3"/>
-              <w:end w:val="single" w:space="0" w:color="D3D3D3"/>
-            </w:tcBorders>
-          </w:tcPr>
-          <w:p>
-            <w:pPr>
-              <w:spacing w:before="0" w:after="60"/>
-              <w:keepNext/>
-              <w:jc w:val="start"/>
-            </w:pPr>
-            <w:r>
-              <w:rPr>
-                <w:rFonts w:ascii="Calibri" w:hAnsi="Calibri"/>
-                <w:sz w:val="20"/>
-              </w:rPr>
-              <w:t xml:space="default">60 (12.7%)</w:t>
-            </w:r>
-          </w:p>
-        </w:tc>
-        <w:tc>
-          <w:tcPr>
-            <w:tcBorders>
-              <w:top w:val="single" w:space="0" w:color="D3D3D3"/>
-              <w:bottom w:val="single" w:space="0" w:color="D3D3D3"/>
-              <w:start w:val="single" w:space="0" w:color="D3D3D3"/>
-              <w:end w:val="single" w:space="0" w:color="D3D3D3"/>
-            </w:tcBorders>
-          </w:tcPr>
-          <w:p>
-            <w:pPr>
-              <w:spacing w:before="0" w:after="60"/>
-              <w:keepNext/>
-              <w:jc w:val="start"/>
-            </w:pPr>
-            <w:r>
-              <w:rPr>
-                <w:rFonts w:ascii="Calibri" w:hAnsi="Calibri"/>
-                <w:sz w:val="20"/>
-              </w:rPr>
-              <w:t xml:space="default">97</w:t>
+              <w:t xml:space="default">31 (11.6%)</w:t>
+            </w:r>
+          </w:p>
+        </w:tc>
+        <w:tc>
+          <w:tcPr>
+            <w:tcBorders>
+              <w:top w:val="single" w:space="0" w:color="D3D3D3"/>
+              <w:bottom w:val="single" w:space="0" w:color="D3D3D3"/>
+              <w:start w:val="single" w:space="0" w:color="D3D3D3"/>
+              <w:end w:val="single" w:space="0" w:color="D3D3D3"/>
+            </w:tcBorders>
+          </w:tcPr>
+          <w:p>
+            <w:pPr>
+              <w:spacing w:before="0" w:after="60"/>
+              <w:keepNext/>
+              <w:jc w:val="start"/>
+            </w:pPr>
+            <w:r>
+              <w:rPr>
+                <w:rFonts w:ascii="Calibri" w:hAnsi="Calibri"/>
+                <w:sz w:val="20"/>
+              </w:rPr>
+              <w:t xml:space="default">52 (12.2%)</w:t>
+            </w:r>
+          </w:p>
+        </w:tc>
+        <w:tc>
+          <w:tcPr>
+            <w:tcBorders>
+              <w:top w:val="single" w:space="0" w:color="D3D3D3"/>
+              <w:bottom w:val="single" w:space="0" w:color="D3D3D3"/>
+              <w:start w:val="single" w:space="0" w:color="D3D3D3"/>
+              <w:end w:val="single" w:space="0" w:color="D3D3D3"/>
+            </w:tcBorders>
+          </w:tcPr>
+          <w:p>
+            <w:pPr>
+              <w:spacing w:before="0" w:after="60"/>
+              <w:keepNext/>
+              <w:jc w:val="start"/>
+            </w:pPr>
+            <w:r>
+              <w:rPr>
+                <w:rFonts w:ascii="Calibri" w:hAnsi="Calibri"/>
+                <w:sz w:val="20"/>
+              </w:rPr>
+              <w:t xml:space="default">83</w:t>
             </w:r>
           </w:p>
         </w:tc>
@@ -1313,7 +1313,7 @@
                 <w:rFonts w:ascii="Calibri" w:hAnsi="Calibri"/>
                 <w:sz w:val="20"/>
               </w:rPr>
-              <w:t xml:space="default">61.5%</w:t>
+              <w:t xml:space="default">63.1%</w:t>
             </w:r>
           </w:p>
         </w:tc>
@@ -1368,7 +1368,7 @@
                 <w:sz w:val="20"/>
                 <w:b w:val="true"/>
               </w:rPr>
-              <w:t xml:space="default">42 ± 16.6</w:t>
+              <w:t xml:space="default">42.8 ± 17.3</w:t>
             </w:r>
           </w:p>
         </w:tc>
@@ -1393,7 +1393,7 @@
                 <w:sz w:val="20"/>
                 <w:b w:val="true"/>
               </w:rPr>
-              <w:t xml:space="default">41.6 ± 15.7</w:t>
+              <w:t xml:space="default">41.7 ± 15.9</w:t>
             </w:r>
           </w:p>
         </w:tc>
@@ -1418,7 +1418,7 @@
                 <w:sz w:val="20"/>
                 <w:b w:val="true"/>
               </w:rPr>
-              <w:t xml:space="default">41.8 ± 16.1</w:t>
+              <w:t xml:space="default">42.1 ± 16.5</w:t>
             </w:r>
           </w:p>
         </w:tc>
@@ -1626,55 +1626,55 @@
                 <w:rFonts w:ascii="Calibri" w:hAnsi="Calibri"/>
                 <w:sz w:val="20"/>
               </w:rPr>
-              <w:t xml:space="default">216 (63.9%)</w:t>
-            </w:r>
-          </w:p>
-        </w:tc>
-        <w:tc>
-          <w:tcPr>
-            <w:tcBorders>
-              <w:top w:val="single" w:space="0" w:color="D3D3D3"/>
-              <w:bottom w:val="single" w:space="0" w:color="D3D3D3"/>
-              <w:start w:val="single" w:space="0" w:color="D3D3D3"/>
-              <w:end w:val="single" w:space="0" w:color="D3D3D3"/>
-            </w:tcBorders>
-          </w:tcPr>
-          <w:p>
-            <w:pPr>
-              <w:spacing w:before="0" w:after="60"/>
-              <w:keepNext/>
-              <w:jc w:val="start"/>
-            </w:pPr>
-            <w:r>
-              <w:rPr>
-                <w:rFonts w:ascii="Calibri" w:hAnsi="Calibri"/>
-                <w:sz w:val="20"/>
-              </w:rPr>
-              <w:t xml:space="default">294 (62.3%)</w:t>
-            </w:r>
-          </w:p>
-        </w:tc>
-        <w:tc>
-          <w:tcPr>
-            <w:tcBorders>
-              <w:top w:val="single" w:space="0" w:color="D3D3D3"/>
-              <w:bottom w:val="single" w:space="0" w:color="D3D3D3"/>
-              <w:start w:val="single" w:space="0" w:color="D3D3D3"/>
-              <w:end w:val="single" w:space="0" w:color="D3D3D3"/>
-            </w:tcBorders>
-          </w:tcPr>
-          <w:p>
-            <w:pPr>
-              <w:spacing w:before="0" w:after="60"/>
-              <w:keepNext/>
-              <w:jc w:val="start"/>
-            </w:pPr>
-            <w:r>
-              <w:rPr>
-                <w:rFonts w:ascii="Calibri" w:hAnsi="Calibri"/>
-                <w:sz w:val="20"/>
-              </w:rPr>
-              <w:t xml:space="default">509 (63%)</w:t>
+              <w:t xml:space="default">169 (63.8%)</w:t>
+            </w:r>
+          </w:p>
+        </w:tc>
+        <w:tc>
+          <w:tcPr>
+            <w:tcBorders>
+              <w:top w:val="single" w:space="0" w:color="D3D3D3"/>
+              <w:bottom w:val="single" w:space="0" w:color="D3D3D3"/>
+              <w:start w:val="single" w:space="0" w:color="D3D3D3"/>
+              <w:end w:val="single" w:space="0" w:color="D3D3D3"/>
+            </w:tcBorders>
+          </w:tcPr>
+          <w:p>
+            <w:pPr>
+              <w:spacing w:before="0" w:after="60"/>
+              <w:keepNext/>
+              <w:jc w:val="start"/>
+            </w:pPr>
+            <w:r>
+              <w:rPr>
+                <w:rFonts w:ascii="Calibri" w:hAnsi="Calibri"/>
+                <w:sz w:val="20"/>
+              </w:rPr>
+              <w:t xml:space="default">267 (62.3%)</w:t>
+            </w:r>
+          </w:p>
+        </w:tc>
+        <w:tc>
+          <w:tcPr>
+            <w:tcBorders>
+              <w:top w:val="single" w:space="0" w:color="D3D3D3"/>
+              <w:bottom w:val="single" w:space="0" w:color="D3D3D3"/>
+              <w:start w:val="single" w:space="0" w:color="D3D3D3"/>
+              <w:end w:val="single" w:space="0" w:color="D3D3D3"/>
+            </w:tcBorders>
+          </w:tcPr>
+          <w:p>
+            <w:pPr>
+              <w:spacing w:before="0" w:after="60"/>
+              <w:keepNext/>
+              <w:jc w:val="start"/>
+            </w:pPr>
+            <w:r>
+              <w:rPr>
+                <w:rFonts w:ascii="Calibri" w:hAnsi="Calibri"/>
+                <w:sz w:val="20"/>
+              </w:rPr>
+              <w:t xml:space="default">436 (62.9%)</w:t>
             </w:r>
           </w:p>
         </w:tc>
@@ -1698,7 +1698,7 @@
                 <w:rFonts w:ascii="Calibri" w:hAnsi="Calibri"/>
                 <w:sz w:val="20"/>
               </w:rPr>
-              <w:t xml:space="default">57.7%</w:t>
+              <w:t xml:space="default">61.3%</w:t>
             </w:r>
           </w:p>
         </w:tc>
@@ -1751,55 +1751,55 @@
                 <w:rFonts w:ascii="Calibri" w:hAnsi="Calibri"/>
                 <w:sz w:val="20"/>
               </w:rPr>
-              <w:t xml:space="default">122 (36.1%)</w:t>
-            </w:r>
-          </w:p>
-        </w:tc>
-        <w:tc>
-          <w:tcPr>
-            <w:tcBorders>
-              <w:top w:val="single" w:space="0" w:color="D3D3D3"/>
-              <w:bottom w:val="single" w:space="0" w:color="D3D3D3"/>
-              <w:start w:val="single" w:space="0" w:color="D3D3D3"/>
-              <w:end w:val="single" w:space="0" w:color="D3D3D3"/>
-            </w:tcBorders>
-          </w:tcPr>
-          <w:p>
-            <w:pPr>
-              <w:spacing w:before="0" w:after="60"/>
-              <w:keepNext/>
-              <w:jc w:val="start"/>
-            </w:pPr>
-            <w:r>
-              <w:rPr>
-                <w:rFonts w:ascii="Calibri" w:hAnsi="Calibri"/>
-                <w:sz w:val="20"/>
-              </w:rPr>
-              <w:t xml:space="default">178 (37.7%)</w:t>
-            </w:r>
-          </w:p>
-        </w:tc>
-        <w:tc>
-          <w:tcPr>
-            <w:tcBorders>
-              <w:top w:val="single" w:space="0" w:color="D3D3D3"/>
-              <w:bottom w:val="single" w:space="0" w:color="D3D3D3"/>
-              <w:start w:val="single" w:space="0" w:color="D3D3D3"/>
-              <w:end w:val="single" w:space="0" w:color="D3D3D3"/>
-            </w:tcBorders>
-          </w:tcPr>
-          <w:p>
-            <w:pPr>
-              <w:spacing w:before="0" w:after="60"/>
-              <w:keepNext/>
-              <w:jc w:val="start"/>
-            </w:pPr>
-            <w:r>
-              <w:rPr>
-                <w:rFonts w:ascii="Calibri" w:hAnsi="Calibri"/>
-                <w:sz w:val="20"/>
-              </w:rPr>
-              <w:t xml:space="default">300 (37%)</w:t>
+              <w:t xml:space="default">96 (36.2%)</w:t>
+            </w:r>
+          </w:p>
+        </w:tc>
+        <w:tc>
+          <w:tcPr>
+            <w:tcBorders>
+              <w:top w:val="single" w:space="0" w:color="D3D3D3"/>
+              <w:bottom w:val="single" w:space="0" w:color="D3D3D3"/>
+              <w:start w:val="single" w:space="0" w:color="D3D3D3"/>
+              <w:end w:val="single" w:space="0" w:color="D3D3D3"/>
+            </w:tcBorders>
+          </w:tcPr>
+          <w:p>
+            <w:pPr>
+              <w:spacing w:before="0" w:after="60"/>
+              <w:keepNext/>
+              <w:jc w:val="start"/>
+            </w:pPr>
+            <w:r>
+              <w:rPr>
+                <w:rFonts w:ascii="Calibri" w:hAnsi="Calibri"/>
+                <w:sz w:val="20"/>
+              </w:rPr>
+              <w:t xml:space="default">162 (37.7%)</w:t>
+            </w:r>
+          </w:p>
+        </w:tc>
+        <w:tc>
+          <w:tcPr>
+            <w:tcBorders>
+              <w:top w:val="single" w:space="0" w:color="D3D3D3"/>
+              <w:bottom w:val="single" w:space="0" w:color="D3D3D3"/>
+              <w:start w:val="single" w:space="0" w:color="D3D3D3"/>
+              <w:end w:val="single" w:space="0" w:color="D3D3D3"/>
+            </w:tcBorders>
+          </w:tcPr>
+          <w:p>
+            <w:pPr>
+              <w:spacing w:before="0" w:after="60"/>
+              <w:keepNext/>
+              <w:jc w:val="start"/>
+            </w:pPr>
+            <w:r>
+              <w:rPr>
+                <w:rFonts w:ascii="Calibri" w:hAnsi="Calibri"/>
+                <w:sz w:val="20"/>
+              </w:rPr>
+              <w:t xml:space="default">258 (37.1%)</w:t>
             </w:r>
           </w:p>
         </w:tc>
@@ -1823,7 +1823,7 @@
                 <w:rFonts w:ascii="Calibri" w:hAnsi="Calibri"/>
                 <w:sz w:val="20"/>
               </w:rPr>
-              <w:t xml:space="default">59.3%</w:t>
+              <w:t xml:space="default">62.9%</w:t>
             </w:r>
           </w:p>
         </w:tc>
@@ -2006,55 +2006,55 @@
                 <w:rFonts w:ascii="Calibri" w:hAnsi="Calibri"/>
                 <w:sz w:val="20"/>
               </w:rPr>
-              <w:t xml:space="default">124 (36.8%)</w:t>
-            </w:r>
-          </w:p>
-        </w:tc>
-        <w:tc>
-          <w:tcPr>
-            <w:tcBorders>
-              <w:top w:val="single" w:space="0" w:color="D3D3D3"/>
-              <w:bottom w:val="single" w:space="0" w:color="D3D3D3"/>
-              <w:start w:val="single" w:space="0" w:color="D3D3D3"/>
-              <w:end w:val="single" w:space="0" w:color="D3D3D3"/>
-            </w:tcBorders>
-          </w:tcPr>
-          <w:p>
-            <w:pPr>
-              <w:spacing w:before="0" w:after="60"/>
-              <w:keepNext/>
-              <w:jc w:val="start"/>
-            </w:pPr>
-            <w:r>
-              <w:rPr>
-                <w:rFonts w:ascii="Calibri" w:hAnsi="Calibri"/>
-                <w:sz w:val="20"/>
-              </w:rPr>
-              <w:t xml:space="default">138 (29.2%)</w:t>
-            </w:r>
-          </w:p>
-        </w:tc>
-        <w:tc>
-          <w:tcPr>
-            <w:tcBorders>
-              <w:top w:val="single" w:space="0" w:color="D3D3D3"/>
-              <w:bottom w:val="single" w:space="0" w:color="D3D3D3"/>
-              <w:start w:val="single" w:space="0" w:color="D3D3D3"/>
-              <w:end w:val="single" w:space="0" w:color="D3D3D3"/>
-            </w:tcBorders>
-          </w:tcPr>
-          <w:p>
-            <w:pPr>
-              <w:spacing w:before="0" w:after="60"/>
-              <w:keepNext/>
-              <w:jc w:val="start"/>
-            </w:pPr>
-            <w:r>
-              <w:rPr>
-                <w:rFonts w:ascii="Calibri" w:hAnsi="Calibri"/>
-                <w:sz w:val="20"/>
-              </w:rPr>
-              <w:t xml:space="default">262 (32.4%)</w:t>
+              <w:t xml:space="default">95 (36%)</w:t>
+            </w:r>
+          </w:p>
+        </w:tc>
+        <w:tc>
+          <w:tcPr>
+            <w:tcBorders>
+              <w:top w:val="single" w:space="0" w:color="D3D3D3"/>
+              <w:bottom w:val="single" w:space="0" w:color="D3D3D3"/>
+              <w:start w:val="single" w:space="0" w:color="D3D3D3"/>
+              <w:end w:val="single" w:space="0" w:color="D3D3D3"/>
+            </w:tcBorders>
+          </w:tcPr>
+          <w:p>
+            <w:pPr>
+              <w:spacing w:before="0" w:after="60"/>
+              <w:keepNext/>
+              <w:jc w:val="start"/>
+            </w:pPr>
+            <w:r>
+              <w:rPr>
+                <w:rFonts w:ascii="Calibri" w:hAnsi="Calibri"/>
+                <w:sz w:val="20"/>
+              </w:rPr>
+              <w:t xml:space="default">123 (28.6%)</w:t>
+            </w:r>
+          </w:p>
+        </w:tc>
+        <w:tc>
+          <w:tcPr>
+            <w:tcBorders>
+              <w:top w:val="single" w:space="0" w:color="D3D3D3"/>
+              <w:bottom w:val="single" w:space="0" w:color="D3D3D3"/>
+              <w:start w:val="single" w:space="0" w:color="D3D3D3"/>
+              <w:end w:val="single" w:space="0" w:color="D3D3D3"/>
+            </w:tcBorders>
+          </w:tcPr>
+          <w:p>
+            <w:pPr>
+              <w:spacing w:before="0" w:after="60"/>
+              <w:keepNext/>
+              <w:jc w:val="start"/>
+            </w:pPr>
+            <w:r>
+              <w:rPr>
+                <w:rFonts w:ascii="Calibri" w:hAnsi="Calibri"/>
+                <w:sz w:val="20"/>
+              </w:rPr>
+              <w:t xml:space="default">218 (31.5%)</w:t>
             </w:r>
           </w:p>
         </w:tc>
@@ -2078,7 +2078,7 @@
                 <w:rFonts w:ascii="Calibri" w:hAnsi="Calibri"/>
                 <w:sz w:val="20"/>
               </w:rPr>
-              <w:t xml:space="default">52.6%</w:t>
+              <w:t xml:space="default">56.4%</w:t>
             </w:r>
           </w:p>
         </w:tc>
@@ -2131,55 +2131,55 @@
                 <w:rFonts w:ascii="Calibri" w:hAnsi="Calibri"/>
                 <w:sz w:val="20"/>
               </w:rPr>
-              <w:t xml:space="default">48 (14.3%)</w:t>
-            </w:r>
-          </w:p>
-        </w:tc>
-        <w:tc>
-          <w:tcPr>
-            <w:tcBorders>
-              <w:top w:val="single" w:space="0" w:color="D3D3D3"/>
-              <w:bottom w:val="single" w:space="0" w:color="D3D3D3"/>
-              <w:start w:val="single" w:space="0" w:color="D3D3D3"/>
-              <w:end w:val="single" w:space="0" w:color="D3D3D3"/>
-            </w:tcBorders>
-          </w:tcPr>
-          <w:p>
-            <w:pPr>
-              <w:spacing w:before="0" w:after="60"/>
-              <w:keepNext/>
-              <w:jc w:val="start"/>
-            </w:pPr>
-            <w:r>
-              <w:rPr>
-                <w:rFonts w:ascii="Calibri" w:hAnsi="Calibri"/>
-                <w:sz w:val="20"/>
-              </w:rPr>
-              <w:t xml:space="default">71 (15.1%)</w:t>
-            </w:r>
-          </w:p>
-        </w:tc>
-        <w:tc>
-          <w:tcPr>
-            <w:tcBorders>
-              <w:top w:val="single" w:space="0" w:color="D3D3D3"/>
-              <w:bottom w:val="single" w:space="0" w:color="D3D3D3"/>
-              <w:start w:val="single" w:space="0" w:color="D3D3D3"/>
-              <w:end w:val="single" w:space="0" w:color="D3D3D3"/>
-            </w:tcBorders>
-          </w:tcPr>
-          <w:p>
-            <w:pPr>
-              <w:spacing w:before="0" w:after="60"/>
-              <w:keepNext/>
-              <w:jc w:val="start"/>
-            </w:pPr>
-            <w:r>
-              <w:rPr>
-                <w:rFonts w:ascii="Calibri" w:hAnsi="Calibri"/>
-                <w:sz w:val="20"/>
-              </w:rPr>
-              <w:t xml:space="default">120 (14.8%)</w:t>
+              <w:t xml:space="default">37 (13.9%)</w:t>
+            </w:r>
+          </w:p>
+        </w:tc>
+        <w:tc>
+          <w:tcPr>
+            <w:tcBorders>
+              <w:top w:val="single" w:space="0" w:color="D3D3D3"/>
+              <w:bottom w:val="single" w:space="0" w:color="D3D3D3"/>
+              <w:start w:val="single" w:space="0" w:color="D3D3D3"/>
+              <w:end w:val="single" w:space="0" w:color="D3D3D3"/>
+            </w:tcBorders>
+          </w:tcPr>
+          <w:p>
+            <w:pPr>
+              <w:spacing w:before="0" w:after="60"/>
+              <w:keepNext/>
+              <w:jc w:val="start"/>
+            </w:pPr>
+            <w:r>
+              <w:rPr>
+                <w:rFonts w:ascii="Calibri" w:hAnsi="Calibri"/>
+                <w:sz w:val="20"/>
+              </w:rPr>
+              <w:t xml:space="default">62 (14.5%)</w:t>
+            </w:r>
+          </w:p>
+        </w:tc>
+        <w:tc>
+          <w:tcPr>
+            <w:tcBorders>
+              <w:top w:val="single" w:space="0" w:color="D3D3D3"/>
+              <w:bottom w:val="single" w:space="0" w:color="D3D3D3"/>
+              <w:start w:val="single" w:space="0" w:color="D3D3D3"/>
+              <w:end w:val="single" w:space="0" w:color="D3D3D3"/>
+            </w:tcBorders>
+          </w:tcPr>
+          <w:p>
+            <w:pPr>
+              <w:spacing w:before="0" w:after="60"/>
+              <w:keepNext/>
+              <w:jc w:val="start"/>
+            </w:pPr>
+            <w:r>
+              <w:rPr>
+                <w:rFonts w:ascii="Calibri" w:hAnsi="Calibri"/>
+                <w:sz w:val="20"/>
+              </w:rPr>
+              <w:t xml:space="default">99 (14.3%)</w:t>
             </w:r>
           </w:p>
         </w:tc>
@@ -2203,7 +2203,7 @@
                 <w:rFonts w:ascii="Calibri" w:hAnsi="Calibri"/>
                 <w:sz w:val="20"/>
               </w:rPr>
-              <w:t xml:space="default">59.7%</w:t>
+              <w:t xml:space="default">62.9%</w:t>
             </w:r>
           </w:p>
         </w:tc>
@@ -2256,55 +2256,55 @@
                 <w:rFonts w:ascii="Calibri" w:hAnsi="Calibri"/>
                 <w:sz w:val="20"/>
               </w:rPr>
-              <w:t xml:space="default">46 (13.7%)</w:t>
-            </w:r>
-          </w:p>
-        </w:tc>
-        <w:tc>
-          <w:tcPr>
-            <w:tcBorders>
-              <w:top w:val="single" w:space="0" w:color="D3D3D3"/>
-              <w:bottom w:val="single" w:space="0" w:color="D3D3D3"/>
-              <w:start w:val="single" w:space="0" w:color="D3D3D3"/>
-              <w:end w:val="single" w:space="0" w:color="D3D3D3"/>
-            </w:tcBorders>
-          </w:tcPr>
-          <w:p>
-            <w:pPr>
-              <w:spacing w:before="0" w:after="60"/>
-              <w:keepNext/>
-              <w:jc w:val="start"/>
-            </w:pPr>
-            <w:r>
-              <w:rPr>
-                <w:rFonts w:ascii="Calibri" w:hAnsi="Calibri"/>
-                <w:sz w:val="20"/>
-              </w:rPr>
-              <w:t xml:space="default">60 (12.8%)</w:t>
-            </w:r>
-          </w:p>
-        </w:tc>
-        <w:tc>
-          <w:tcPr>
-            <w:tcBorders>
-              <w:top w:val="single" w:space="0" w:color="D3D3D3"/>
-              <w:bottom w:val="single" w:space="0" w:color="D3D3D3"/>
-              <w:start w:val="single" w:space="0" w:color="D3D3D3"/>
-              <w:end w:val="single" w:space="0" w:color="D3D3D3"/>
-            </w:tcBorders>
-          </w:tcPr>
-          <w:p>
-            <w:pPr>
-              <w:spacing w:before="0" w:after="60"/>
-              <w:keepNext/>
-              <w:jc w:val="start"/>
-            </w:pPr>
-            <w:r>
-              <w:rPr>
-                <w:rFonts w:ascii="Calibri" w:hAnsi="Calibri"/>
-                <w:sz w:val="20"/>
-              </w:rPr>
-              <w:t xml:space="default">107 (13.2%)</w:t>
+              <w:t xml:space="default">29 (11.1%)</w:t>
+            </w:r>
+          </w:p>
+        </w:tc>
+        <w:tc>
+          <w:tcPr>
+            <w:tcBorders>
+              <w:top w:val="single" w:space="0" w:color="D3D3D3"/>
+              <w:bottom w:val="single" w:space="0" w:color="D3D3D3"/>
+              <w:start w:val="single" w:space="0" w:color="D3D3D3"/>
+              <w:end w:val="single" w:space="0" w:color="D3D3D3"/>
+            </w:tcBorders>
+          </w:tcPr>
+          <w:p>
+            <w:pPr>
+              <w:spacing w:before="0" w:after="60"/>
+              <w:keepNext/>
+              <w:jc w:val="start"/>
+            </w:pPr>
+            <w:r>
+              <w:rPr>
+                <w:rFonts w:ascii="Calibri" w:hAnsi="Calibri"/>
+                <w:sz w:val="20"/>
+              </w:rPr>
+              <w:t xml:space="default">50 (11.6%)</w:t>
+            </w:r>
+          </w:p>
+        </w:tc>
+        <w:tc>
+          <w:tcPr>
+            <w:tcBorders>
+              <w:top w:val="single" w:space="0" w:color="D3D3D3"/>
+              <w:bottom w:val="single" w:space="0" w:color="D3D3D3"/>
+              <w:start w:val="single" w:space="0" w:color="D3D3D3"/>
+              <w:end w:val="single" w:space="0" w:color="D3D3D3"/>
+            </w:tcBorders>
+          </w:tcPr>
+          <w:p>
+            <w:pPr>
+              <w:spacing w:before="0" w:after="60"/>
+              <w:keepNext/>
+              <w:jc w:val="start"/>
+            </w:pPr>
+            <w:r>
+              <w:rPr>
+                <w:rFonts w:ascii="Calibri" w:hAnsi="Calibri"/>
+                <w:sz w:val="20"/>
+              </w:rPr>
+              <w:t xml:space="default">79 (11.4%)</w:t>
             </w:r>
           </w:p>
         </w:tc>
@@ -2328,7 +2328,7 @@
                 <w:rFonts w:ascii="Calibri" w:hAnsi="Calibri"/>
                 <w:sz w:val="20"/>
               </w:rPr>
-              <w:t xml:space="default">56.6%</w:t>
+              <w:t xml:space="default">62.8%</w:t>
             </w:r>
           </w:p>
         </w:tc>
@@ -2381,55 +2381,55 @@
                 <w:rFonts w:ascii="Calibri" w:hAnsi="Calibri"/>
                 <w:sz w:val="20"/>
               </w:rPr>
-              <w:t xml:space="default">35 (10.3%)</w:t>
-            </w:r>
-          </w:p>
-        </w:tc>
-        <w:tc>
-          <w:tcPr>
-            <w:tcBorders>
-              <w:top w:val="single" w:space="0" w:color="D3D3D3"/>
-              <w:bottom w:val="single" w:space="0" w:color="D3D3D3"/>
-              <w:start w:val="single" w:space="0" w:color="D3D3D3"/>
-              <w:end w:val="single" w:space="0" w:color="D3D3D3"/>
-            </w:tcBorders>
-          </w:tcPr>
-          <w:p>
-            <w:pPr>
-              <w:spacing w:before="0" w:after="60"/>
-              <w:keepNext/>
-              <w:jc w:val="start"/>
-            </w:pPr>
-            <w:r>
-              <w:rPr>
-                <w:rFonts w:ascii="Calibri" w:hAnsi="Calibri"/>
-                <w:sz w:val="20"/>
-              </w:rPr>
-              <w:t xml:space="default">37 (7.8%)</w:t>
-            </w:r>
-          </w:p>
-        </w:tc>
-        <w:tc>
-          <w:tcPr>
-            <w:tcBorders>
-              <w:top w:val="single" w:space="0" w:color="D3D3D3"/>
-              <w:bottom w:val="single" w:space="0" w:color="D3D3D3"/>
-              <w:start w:val="single" w:space="0" w:color="D3D3D3"/>
-              <w:end w:val="single" w:space="0" w:color="D3D3D3"/>
-            </w:tcBorders>
-          </w:tcPr>
-          <w:p>
-            <w:pPr>
-              <w:spacing w:before="0" w:after="60"/>
-              <w:keepNext/>
-              <w:jc w:val="start"/>
-            </w:pPr>
-            <w:r>
-              <w:rPr>
-                <w:rFonts w:ascii="Calibri" w:hAnsi="Calibri"/>
-                <w:sz w:val="20"/>
-              </w:rPr>
-              <w:t xml:space="default">72 (8.8%)</w:t>
+              <w:t xml:space="default">28 (10.6%)</w:t>
+            </w:r>
+          </w:p>
+        </w:tc>
+        <w:tc>
+          <w:tcPr>
+            <w:tcBorders>
+              <w:top w:val="single" w:space="0" w:color="D3D3D3"/>
+              <w:bottom w:val="single" w:space="0" w:color="D3D3D3"/>
+              <w:start w:val="single" w:space="0" w:color="D3D3D3"/>
+              <w:end w:val="single" w:space="0" w:color="D3D3D3"/>
+            </w:tcBorders>
+          </w:tcPr>
+          <w:p>
+            <w:pPr>
+              <w:spacing w:before="0" w:after="60"/>
+              <w:keepNext/>
+              <w:jc w:val="start"/>
+            </w:pPr>
+            <w:r>
+              <w:rPr>
+                <w:rFonts w:ascii="Calibri" w:hAnsi="Calibri"/>
+                <w:sz w:val="20"/>
+              </w:rPr>
+              <w:t xml:space="default">34 (8%)</w:t>
+            </w:r>
+          </w:p>
+        </w:tc>
+        <w:tc>
+          <w:tcPr>
+            <w:tcBorders>
+              <w:top w:val="single" w:space="0" w:color="D3D3D3"/>
+              <w:bottom w:val="single" w:space="0" w:color="D3D3D3"/>
+              <w:start w:val="single" w:space="0" w:color="D3D3D3"/>
+              <w:end w:val="single" w:space="0" w:color="D3D3D3"/>
+            </w:tcBorders>
+          </w:tcPr>
+          <w:p>
+            <w:pPr>
+              <w:spacing w:before="0" w:after="60"/>
+              <w:keepNext/>
+              <w:jc w:val="start"/>
+            </w:pPr>
+            <w:r>
+              <w:rPr>
+                <w:rFonts w:ascii="Calibri" w:hAnsi="Calibri"/>
+                <w:sz w:val="20"/>
+              </w:rPr>
+              <w:t xml:space="default">62 (9%)</w:t>
             </w:r>
           </w:p>
         </w:tc>
@@ -2453,7 +2453,7 @@
                 <w:rFonts w:ascii="Calibri" w:hAnsi="Calibri"/>
                 <w:sz w:val="20"/>
               </w:rPr>
-              <w:t xml:space="default">51.5%</w:t>
+              <w:t xml:space="default">55.2%</w:t>
             </w:r>
           </w:p>
         </w:tc>
@@ -2506,55 +2506,55 @@
                 <w:rFonts w:ascii="Calibri" w:hAnsi="Calibri"/>
                 <w:sz w:val="20"/>
               </w:rPr>
-              <w:t xml:space="default">38 (11.3%)</w:t>
-            </w:r>
-          </w:p>
-        </w:tc>
-        <w:tc>
-          <w:tcPr>
-            <w:tcBorders>
-              <w:top w:val="single" w:space="0" w:color="D3D3D3"/>
-              <w:bottom w:val="single" w:space="0" w:color="D3D3D3"/>
-              <w:start w:val="single" w:space="0" w:color="D3D3D3"/>
-              <w:end w:val="single" w:space="0" w:color="D3D3D3"/>
-            </w:tcBorders>
-          </w:tcPr>
-          <w:p>
-            <w:pPr>
-              <w:spacing w:before="0" w:after="60"/>
-              <w:keepNext/>
-              <w:jc w:val="start"/>
-            </w:pPr>
-            <w:r>
-              <w:rPr>
-                <w:rFonts w:ascii="Calibri" w:hAnsi="Calibri"/>
-                <w:sz w:val="20"/>
-              </w:rPr>
-              <w:t xml:space="default">37 (7.9%)</w:t>
-            </w:r>
-          </w:p>
-        </w:tc>
-        <w:tc>
-          <w:tcPr>
-            <w:tcBorders>
-              <w:top w:val="single" w:space="0" w:color="D3D3D3"/>
-              <w:bottom w:val="single" w:space="0" w:color="D3D3D3"/>
-              <w:start w:val="single" w:space="0" w:color="D3D3D3"/>
-              <w:end w:val="single" w:space="0" w:color="D3D3D3"/>
-            </w:tcBorders>
-          </w:tcPr>
-          <w:p>
-            <w:pPr>
-              <w:spacing w:before="0" w:after="60"/>
-              <w:keepNext/>
-              <w:jc w:val="start"/>
-            </w:pPr>
-            <w:r>
-              <w:rPr>
-                <w:rFonts w:ascii="Calibri" w:hAnsi="Calibri"/>
-                <w:sz w:val="20"/>
-              </w:rPr>
-              <w:t xml:space="default">75 (9.3%)</w:t>
+              <w:t xml:space="default">35 (13.4%)</w:t>
+            </w:r>
+          </w:p>
+        </w:tc>
+        <w:tc>
+          <w:tcPr>
+            <w:tcBorders>
+              <w:top w:val="single" w:space="0" w:color="D3D3D3"/>
+              <w:bottom w:val="single" w:space="0" w:color="D3D3D3"/>
+              <w:start w:val="single" w:space="0" w:color="D3D3D3"/>
+              <w:end w:val="single" w:space="0" w:color="D3D3D3"/>
+            </w:tcBorders>
+          </w:tcPr>
+          <w:p>
+            <w:pPr>
+              <w:spacing w:before="0" w:after="60"/>
+              <w:keepNext/>
+              <w:jc w:val="start"/>
+            </w:pPr>
+            <w:r>
+              <w:rPr>
+                <w:rFonts w:ascii="Calibri" w:hAnsi="Calibri"/>
+                <w:sz w:val="20"/>
+              </w:rPr>
+              <w:t xml:space="default">35 (8.1%)</w:t>
+            </w:r>
+          </w:p>
+        </w:tc>
+        <w:tc>
+          <w:tcPr>
+            <w:tcBorders>
+              <w:top w:val="single" w:space="0" w:color="D3D3D3"/>
+              <w:bottom w:val="single" w:space="0" w:color="D3D3D3"/>
+              <w:start w:val="single" w:space="0" w:color="D3D3D3"/>
+              <w:end w:val="single" w:space="0" w:color="D3D3D3"/>
+            </w:tcBorders>
+          </w:tcPr>
+          <w:p>
+            <w:pPr>
+              <w:spacing w:before="0" w:after="60"/>
+              <w:keepNext/>
+              <w:jc w:val="start"/>
+            </w:pPr>
+            <w:r>
+              <w:rPr>
+                <w:rFonts w:ascii="Calibri" w:hAnsi="Calibri"/>
+                <w:sz w:val="20"/>
+              </w:rPr>
+              <w:t xml:space="default">70 (10.1%)</w:t>
             </w:r>
           </w:p>
         </w:tc>
@@ -2578,7 +2578,7 @@
                 <w:rFonts w:ascii="Calibri" w:hAnsi="Calibri"/>
                 <w:sz w:val="20"/>
               </w:rPr>
-              <w:t xml:space="default">49.4%</w:t>
+              <w:t xml:space="default">49.5%</w:t>
             </w:r>
           </w:p>
         </w:tc>
@@ -2761,55 +2761,55 @@
                 <w:rFonts w:ascii="Calibri" w:hAnsi="Calibri"/>
                 <w:sz w:val="20"/>
               </w:rPr>
-              <w:t xml:space="default">161 (47.6%)</w:t>
-            </w:r>
-          </w:p>
-        </w:tc>
-        <w:tc>
-          <w:tcPr>
-            <w:tcBorders>
-              <w:top w:val="single" w:space="0" w:color="D3D3D3"/>
-              <w:bottom w:val="single" w:space="0" w:color="D3D3D3"/>
-              <w:start w:val="single" w:space="0" w:color="D3D3D3"/>
-              <w:end w:val="single" w:space="0" w:color="D3D3D3"/>
-            </w:tcBorders>
-          </w:tcPr>
-          <w:p>
-            <w:pPr>
-              <w:spacing w:before="0" w:after="60"/>
-              <w:keepNext/>
-              <w:jc w:val="start"/>
-            </w:pPr>
-            <w:r>
-              <w:rPr>
-                <w:rFonts w:ascii="Calibri" w:hAnsi="Calibri"/>
-                <w:sz w:val="20"/>
-              </w:rPr>
-              <w:t xml:space="default">149 (31.6%)</w:t>
-            </w:r>
-          </w:p>
-        </w:tc>
-        <w:tc>
-          <w:tcPr>
-            <w:tcBorders>
-              <w:top w:val="single" w:space="0" w:color="D3D3D3"/>
-              <w:bottom w:val="single" w:space="0" w:color="D3D3D3"/>
-              <w:start w:val="single" w:space="0" w:color="D3D3D3"/>
-              <w:end w:val="single" w:space="0" w:color="D3D3D3"/>
-            </w:tcBorders>
-          </w:tcPr>
-          <w:p>
-            <w:pPr>
-              <w:spacing w:before="0" w:after="60"/>
-              <w:keepNext/>
-              <w:jc w:val="start"/>
-            </w:pPr>
-            <w:r>
-              <w:rPr>
-                <w:rFonts w:ascii="Calibri" w:hAnsi="Calibri"/>
-                <w:sz w:val="20"/>
-              </w:rPr>
-              <w:t xml:space="default">310 (38.3%)</w:t>
+              <w:t xml:space="default">134 (50.8%)</w:t>
+            </w:r>
+          </w:p>
+        </w:tc>
+        <w:tc>
+          <w:tcPr>
+            <w:tcBorders>
+              <w:top w:val="single" w:space="0" w:color="D3D3D3"/>
+              <w:bottom w:val="single" w:space="0" w:color="D3D3D3"/>
+              <w:start w:val="single" w:space="0" w:color="D3D3D3"/>
+              <w:end w:val="single" w:space="0" w:color="D3D3D3"/>
+            </w:tcBorders>
+          </w:tcPr>
+          <w:p>
+            <w:pPr>
+              <w:spacing w:before="0" w:after="60"/>
+              <w:keepNext/>
+              <w:jc w:val="start"/>
+            </w:pPr>
+            <w:r>
+              <w:rPr>
+                <w:rFonts w:ascii="Calibri" w:hAnsi="Calibri"/>
+                <w:sz w:val="20"/>
+              </w:rPr>
+              <w:t xml:space="default">139 (32.4%)</w:t>
+            </w:r>
+          </w:p>
+        </w:tc>
+        <w:tc>
+          <w:tcPr>
+            <w:tcBorders>
+              <w:top w:val="single" w:space="0" w:color="D3D3D3"/>
+              <w:bottom w:val="single" w:space="0" w:color="D3D3D3"/>
+              <w:start w:val="single" w:space="0" w:color="D3D3D3"/>
+              <w:end w:val="single" w:space="0" w:color="D3D3D3"/>
+            </w:tcBorders>
+          </w:tcPr>
+          <w:p>
+            <w:pPr>
+              <w:spacing w:before="0" w:after="60"/>
+              <w:keepNext/>
+              <w:jc w:val="start"/>
+            </w:pPr>
+            <w:r>
+              <w:rPr>
+                <w:rFonts w:ascii="Calibri" w:hAnsi="Calibri"/>
+                <w:sz w:val="20"/>
+              </w:rPr>
+              <w:t xml:space="default">273 (39.4%)</w:t>
             </w:r>
           </w:p>
         </w:tc>
@@ -2833,7 +2833,7 @@
                 <w:rFonts w:ascii="Calibri" w:hAnsi="Calibri"/>
                 <w:sz w:val="20"/>
               </w:rPr>
-              <w:t xml:space="default">48.1%</w:t>
+              <w:t xml:space="default">50.9%</w:t>
             </w:r>
           </w:p>
         </w:tc>
@@ -2886,55 +2886,55 @@
                 <w:rFonts w:ascii="Calibri" w:hAnsi="Calibri"/>
                 <w:sz w:val="20"/>
               </w:rPr>
-              <w:t xml:space="default">30 (8.8%)</w:t>
-            </w:r>
-          </w:p>
-        </w:tc>
-        <w:tc>
-          <w:tcPr>
-            <w:tcBorders>
-              <w:top w:val="single" w:space="0" w:color="D3D3D3"/>
-              <w:bottom w:val="single" w:space="0" w:color="D3D3D3"/>
-              <w:start w:val="single" w:space="0" w:color="D3D3D3"/>
-              <w:end w:val="single" w:space="0" w:color="D3D3D3"/>
-            </w:tcBorders>
-          </w:tcPr>
-          <w:p>
-            <w:pPr>
-              <w:spacing w:before="0" w:after="60"/>
-              <w:keepNext/>
-              <w:jc w:val="start"/>
-            </w:pPr>
-            <w:r>
-              <w:rPr>
-                <w:rFonts w:ascii="Calibri" w:hAnsi="Calibri"/>
-                <w:sz w:val="20"/>
-              </w:rPr>
-              <w:t xml:space="default">52 (11.1%)</w:t>
-            </w:r>
-          </w:p>
-        </w:tc>
-        <w:tc>
-          <w:tcPr>
-            <w:tcBorders>
-              <w:top w:val="single" w:space="0" w:color="D3D3D3"/>
-              <w:bottom w:val="single" w:space="0" w:color="D3D3D3"/>
-              <w:start w:val="single" w:space="0" w:color="D3D3D3"/>
-              <w:end w:val="single" w:space="0" w:color="D3D3D3"/>
-            </w:tcBorders>
-          </w:tcPr>
-          <w:p>
-            <w:pPr>
-              <w:spacing w:before="0" w:after="60"/>
-              <w:keepNext/>
-              <w:jc w:val="start"/>
-            </w:pPr>
-            <w:r>
-              <w:rPr>
-                <w:rFonts w:ascii="Calibri" w:hAnsi="Calibri"/>
-                <w:sz w:val="20"/>
-              </w:rPr>
-              <w:t xml:space="default">82 (10.1%)</w:t>
+              <w:t xml:space="default">27 (10.3%)</w:t>
+            </w:r>
+          </w:p>
+        </w:tc>
+        <w:tc>
+          <w:tcPr>
+            <w:tcBorders>
+              <w:top w:val="single" w:space="0" w:color="D3D3D3"/>
+              <w:bottom w:val="single" w:space="0" w:color="D3D3D3"/>
+              <w:start w:val="single" w:space="0" w:color="D3D3D3"/>
+              <w:end w:val="single" w:space="0" w:color="D3D3D3"/>
+            </w:tcBorders>
+          </w:tcPr>
+          <w:p>
+            <w:pPr>
+              <w:spacing w:before="0" w:after="60"/>
+              <w:keepNext/>
+              <w:jc w:val="start"/>
+            </w:pPr>
+            <w:r>
+              <w:rPr>
+                <w:rFonts w:ascii="Calibri" w:hAnsi="Calibri"/>
+                <w:sz w:val="20"/>
+              </w:rPr>
+              <w:t xml:space="default">48 (11.1%)</w:t>
+            </w:r>
+          </w:p>
+        </w:tc>
+        <w:tc>
+          <w:tcPr>
+            <w:tcBorders>
+              <w:top w:val="single" w:space="0" w:color="D3D3D3"/>
+              <w:bottom w:val="single" w:space="0" w:color="D3D3D3"/>
+              <w:start w:val="single" w:space="0" w:color="D3D3D3"/>
+              <w:end w:val="single" w:space="0" w:color="D3D3D3"/>
+            </w:tcBorders>
+          </w:tcPr>
+          <w:p>
+            <w:pPr>
+              <w:spacing w:before="0" w:after="60"/>
+              <w:keepNext/>
+              <w:jc w:val="start"/>
+            </w:pPr>
+            <w:r>
+              <w:rPr>
+                <w:rFonts w:ascii="Calibri" w:hAnsi="Calibri"/>
+                <w:sz w:val="20"/>
+              </w:rPr>
+              <w:t xml:space="default">75 (10.8%)</w:t>
             </w:r>
           </w:p>
         </w:tc>
@@ -3011,55 +3011,55 @@
                 <w:rFonts w:ascii="Calibri" w:hAnsi="Calibri"/>
                 <w:sz w:val="20"/>
               </w:rPr>
-              <w:t xml:space="default">38 (11.2%)</w:t>
-            </w:r>
-          </w:p>
-        </w:tc>
-        <w:tc>
-          <w:tcPr>
-            <w:tcBorders>
-              <w:top w:val="single" w:space="0" w:color="D3D3D3"/>
-              <w:bottom w:val="single" w:space="0" w:color="D3D3D3"/>
-              <w:start w:val="single" w:space="0" w:color="D3D3D3"/>
-              <w:end w:val="single" w:space="0" w:color="D3D3D3"/>
-            </w:tcBorders>
-          </w:tcPr>
-          <w:p>
-            <w:pPr>
-              <w:spacing w:before="0" w:after="60"/>
-              <w:keepNext/>
-              <w:jc w:val="start"/>
-            </w:pPr>
-            <w:r>
-              <w:rPr>
-                <w:rFonts w:ascii="Calibri" w:hAnsi="Calibri"/>
-                <w:sz w:val="20"/>
-              </w:rPr>
-              <w:t xml:space="default">44 (9.4%)</w:t>
-            </w:r>
-          </w:p>
-        </w:tc>
-        <w:tc>
-          <w:tcPr>
-            <w:tcBorders>
-              <w:top w:val="single" w:space="0" w:color="D3D3D3"/>
-              <w:bottom w:val="single" w:space="0" w:color="D3D3D3"/>
-              <w:start w:val="single" w:space="0" w:color="D3D3D3"/>
-              <w:end w:val="single" w:space="0" w:color="D3D3D3"/>
-            </w:tcBorders>
-          </w:tcPr>
-          <w:p>
-            <w:pPr>
-              <w:spacing w:before="0" w:after="60"/>
-              <w:keepNext/>
-              <w:jc w:val="start"/>
-            </w:pPr>
-            <w:r>
-              <w:rPr>
-                <w:rFonts w:ascii="Calibri" w:hAnsi="Calibri"/>
-                <w:sz w:val="20"/>
-              </w:rPr>
-              <w:t xml:space="default">82 (10.2%)</w:t>
+              <w:t xml:space="default">27 (10.1%)</w:t>
+            </w:r>
+          </w:p>
+        </w:tc>
+        <w:tc>
+          <w:tcPr>
+            <w:tcBorders>
+              <w:top w:val="single" w:space="0" w:color="D3D3D3"/>
+              <w:bottom w:val="single" w:space="0" w:color="D3D3D3"/>
+              <w:start w:val="single" w:space="0" w:color="D3D3D3"/>
+              <w:end w:val="single" w:space="0" w:color="D3D3D3"/>
+            </w:tcBorders>
+          </w:tcPr>
+          <w:p>
+            <w:pPr>
+              <w:spacing w:before="0" w:after="60"/>
+              <w:keepNext/>
+              <w:jc w:val="start"/>
+            </w:pPr>
+            <w:r>
+              <w:rPr>
+                <w:rFonts w:ascii="Calibri" w:hAnsi="Calibri"/>
+                <w:sz w:val="20"/>
+              </w:rPr>
+              <w:t xml:space="default">40 (9.3%)</w:t>
+            </w:r>
+          </w:p>
+        </w:tc>
+        <w:tc>
+          <w:tcPr>
+            <w:tcBorders>
+              <w:top w:val="single" w:space="0" w:color="D3D3D3"/>
+              <w:bottom w:val="single" w:space="0" w:color="D3D3D3"/>
+              <w:start w:val="single" w:space="0" w:color="D3D3D3"/>
+              <w:end w:val="single" w:space="0" w:color="D3D3D3"/>
+            </w:tcBorders>
+          </w:tcPr>
+          <w:p>
+            <w:pPr>
+              <w:spacing w:before="0" w:after="60"/>
+              <w:keepNext/>
+              <w:jc w:val="start"/>
+            </w:pPr>
+            <w:r>
+              <w:rPr>
+                <w:rFonts w:ascii="Calibri" w:hAnsi="Calibri"/>
+                <w:sz w:val="20"/>
+              </w:rPr>
+              <w:t xml:space="default">67 (9.6%)</w:t>
             </w:r>
           </w:p>
         </w:tc>
@@ -3083,7 +3083,7 @@
                 <w:rFonts w:ascii="Calibri" w:hAnsi="Calibri"/>
                 <w:sz w:val="20"/>
               </w:rPr>
-              <w:t xml:space="default">53.9%</w:t>
+              <w:t xml:space="default">60%</w:t>
             </w:r>
           </w:p>
         </w:tc>
@@ -3136,55 +3136,55 @@
                 <w:rFonts w:ascii="Calibri" w:hAnsi="Calibri"/>
                 <w:sz w:val="20"/>
               </w:rPr>
-              <w:t xml:space="default">10 (3%)</w:t>
-            </w:r>
-          </w:p>
-        </w:tc>
-        <w:tc>
-          <w:tcPr>
-            <w:tcBorders>
-              <w:top w:val="single" w:space="0" w:color="D3D3D3"/>
-              <w:bottom w:val="single" w:space="0" w:color="D3D3D3"/>
-              <w:start w:val="single" w:space="0" w:color="D3D3D3"/>
-              <w:end w:val="single" w:space="0" w:color="D3D3D3"/>
-            </w:tcBorders>
-          </w:tcPr>
-          <w:p>
-            <w:pPr>
-              <w:spacing w:before="0" w:after="60"/>
-              <w:keepNext/>
-              <w:jc w:val="start"/>
-            </w:pPr>
-            <w:r>
-              <w:rPr>
-                <w:rFonts w:ascii="Calibri" w:hAnsi="Calibri"/>
-                <w:sz w:val="20"/>
-              </w:rPr>
-              <w:t xml:space="default">25 (5.4%)</w:t>
-            </w:r>
-          </w:p>
-        </w:tc>
-        <w:tc>
-          <w:tcPr>
-            <w:tcBorders>
-              <w:top w:val="single" w:space="0" w:color="D3D3D3"/>
-              <w:bottom w:val="single" w:space="0" w:color="D3D3D3"/>
-              <w:start w:val="single" w:space="0" w:color="D3D3D3"/>
-              <w:end w:val="single" w:space="0" w:color="D3D3D3"/>
-            </w:tcBorders>
-          </w:tcPr>
-          <w:p>
-            <w:pPr>
-              <w:spacing w:before="0" w:after="60"/>
-              <w:keepNext/>
-              <w:jc w:val="start"/>
-            </w:pPr>
-            <w:r>
-              <w:rPr>
-                <w:rFonts w:ascii="Calibri" w:hAnsi="Calibri"/>
-                <w:sz w:val="20"/>
-              </w:rPr>
-              <w:t xml:space="default">35 (4.4%)</w:t>
+              <w:t xml:space="default">6 (2.4%)</w:t>
+            </w:r>
+          </w:p>
+        </w:tc>
+        <w:tc>
+          <w:tcPr>
+            <w:tcBorders>
+              <w:top w:val="single" w:space="0" w:color="D3D3D3"/>
+              <w:bottom w:val="single" w:space="0" w:color="D3D3D3"/>
+              <w:start w:val="single" w:space="0" w:color="D3D3D3"/>
+              <w:end w:val="single" w:space="0" w:color="D3D3D3"/>
+            </w:tcBorders>
+          </w:tcPr>
+          <w:p>
+            <w:pPr>
+              <w:spacing w:before="0" w:after="60"/>
+              <w:keepNext/>
+              <w:jc w:val="start"/>
+            </w:pPr>
+            <w:r>
+              <w:rPr>
+                <w:rFonts w:ascii="Calibri" w:hAnsi="Calibri"/>
+                <w:sz w:val="20"/>
+              </w:rPr>
+              <w:t xml:space="default">24 (5.5%)</w:t>
+            </w:r>
+          </w:p>
+        </w:tc>
+        <w:tc>
+          <w:tcPr>
+            <w:tcBorders>
+              <w:top w:val="single" w:space="0" w:color="D3D3D3"/>
+              <w:bottom w:val="single" w:space="0" w:color="D3D3D3"/>
+              <w:start w:val="single" w:space="0" w:color="D3D3D3"/>
+              <w:end w:val="single" w:space="0" w:color="D3D3D3"/>
+            </w:tcBorders>
+          </w:tcPr>
+          <w:p>
+            <w:pPr>
+              <w:spacing w:before="0" w:after="60"/>
+              <w:keepNext/>
+              <w:jc w:val="start"/>
+            </w:pPr>
+            <w:r>
+              <w:rPr>
+                <w:rFonts w:ascii="Calibri" w:hAnsi="Calibri"/>
+                <w:sz w:val="20"/>
+              </w:rPr>
+              <w:t xml:space="default">30 (4.3%)</w:t>
             </w:r>
           </w:p>
         </w:tc>
@@ -3208,7 +3208,7 @@
                 <w:rFonts w:ascii="Calibri" w:hAnsi="Calibri"/>
                 <w:sz w:val="20"/>
               </w:rPr>
-              <w:t xml:space="default">71.5%</w:t>
+              <w:t xml:space="default">79.2%</w:t>
             </w:r>
           </w:p>
         </w:tc>
@@ -3391,55 +3391,55 @@
                 <w:rFonts w:ascii="Calibri" w:hAnsi="Calibri"/>
                 <w:sz w:val="20"/>
               </w:rPr>
-              <w:t xml:space="default">82 (24.3%)</w:t>
-            </w:r>
-          </w:p>
-        </w:tc>
-        <w:tc>
-          <w:tcPr>
-            <w:tcBorders>
-              <w:top w:val="single" w:space="0" w:color="D3D3D3"/>
-              <w:bottom w:val="single" w:space="0" w:color="D3D3D3"/>
-              <w:start w:val="single" w:space="0" w:color="D3D3D3"/>
-              <w:end w:val="single" w:space="0" w:color="D3D3D3"/>
-            </w:tcBorders>
-          </w:tcPr>
-          <w:p>
-            <w:pPr>
-              <w:spacing w:before="0" w:after="60"/>
-              <w:keepNext/>
-              <w:jc w:val="start"/>
-            </w:pPr>
-            <w:r>
-              <w:rPr>
-                <w:rFonts w:ascii="Calibri" w:hAnsi="Calibri"/>
-                <w:sz w:val="20"/>
-              </w:rPr>
-              <w:t xml:space="default">123 (26.2%)</w:t>
-            </w:r>
-          </w:p>
-        </w:tc>
-        <w:tc>
-          <w:tcPr>
-            <w:tcBorders>
-              <w:top w:val="single" w:space="0" w:color="D3D3D3"/>
-              <w:bottom w:val="single" w:space="0" w:color="D3D3D3"/>
-              <w:start w:val="single" w:space="0" w:color="D3D3D3"/>
-              <w:end w:val="single" w:space="0" w:color="D3D3D3"/>
-            </w:tcBorders>
-          </w:tcPr>
-          <w:p>
-            <w:pPr>
-              <w:spacing w:before="0" w:after="60"/>
-              <w:keepNext/>
-              <w:jc w:val="start"/>
-            </w:pPr>
-            <w:r>
-              <w:rPr>
-                <w:rFonts w:ascii="Calibri" w:hAnsi="Calibri"/>
-                <w:sz w:val="20"/>
-              </w:rPr>
-              <w:t xml:space="default">206 (25.4%)</w:t>
+              <w:t xml:space="default">67 (25.2%)</w:t>
+            </w:r>
+          </w:p>
+        </w:tc>
+        <w:tc>
+          <w:tcPr>
+            <w:tcBorders>
+              <w:top w:val="single" w:space="0" w:color="D3D3D3"/>
+              <w:bottom w:val="single" w:space="0" w:color="D3D3D3"/>
+              <w:start w:val="single" w:space="0" w:color="D3D3D3"/>
+              <w:end w:val="single" w:space="0" w:color="D3D3D3"/>
+            </w:tcBorders>
+          </w:tcPr>
+          <w:p>
+            <w:pPr>
+              <w:spacing w:before="0" w:after="60"/>
+              <w:keepNext/>
+              <w:jc w:val="start"/>
+            </w:pPr>
+            <w:r>
+              <w:rPr>
+                <w:rFonts w:ascii="Calibri" w:hAnsi="Calibri"/>
+                <w:sz w:val="20"/>
+              </w:rPr>
+              <w:t xml:space="default">111 (25.9%)</w:t>
+            </w:r>
+          </w:p>
+        </w:tc>
+        <w:tc>
+          <w:tcPr>
+            <w:tcBorders>
+              <w:top w:val="single" w:space="0" w:color="D3D3D3"/>
+              <w:bottom w:val="single" w:space="0" w:color="D3D3D3"/>
+              <w:start w:val="single" w:space="0" w:color="D3D3D3"/>
+              <w:end w:val="single" w:space="0" w:color="D3D3D3"/>
+            </w:tcBorders>
+          </w:tcPr>
+          <w:p>
+            <w:pPr>
+              <w:spacing w:before="0" w:after="60"/>
+              <w:keepNext/>
+              <w:jc w:val="start"/>
+            </w:pPr>
+            <w:r>
+              <w:rPr>
+                <w:rFonts w:ascii="Calibri" w:hAnsi="Calibri"/>
+                <w:sz w:val="20"/>
+              </w:rPr>
+              <w:t xml:space="default">178 (25.6%)</w:t>
             </w:r>
           </w:p>
         </w:tc>
@@ -3463,7 +3463,7 @@
                 <w:rFonts w:ascii="Calibri" w:hAnsi="Calibri"/>
                 <w:sz w:val="20"/>
               </w:rPr>
-              <w:t xml:space="default">60.1%</w:t>
+              <w:t xml:space="default">62.5%</w:t>
             </w:r>
           </w:p>
         </w:tc>
@@ -3516,55 +3516,55 @@
                 <w:rFonts w:ascii="Calibri" w:hAnsi="Calibri"/>
                 <w:sz w:val="20"/>
               </w:rPr>
-              <w:t xml:space="default">92 (27.4%)</w:t>
-            </w:r>
-          </w:p>
-        </w:tc>
-        <w:tc>
-          <w:tcPr>
-            <w:tcBorders>
-              <w:top w:val="single" w:space="0" w:color="D3D3D3"/>
-              <w:bottom w:val="single" w:space="0" w:color="D3D3D3"/>
-              <w:start w:val="single" w:space="0" w:color="D3D3D3"/>
-              <w:end w:val="single" w:space="0" w:color="D3D3D3"/>
-            </w:tcBorders>
-          </w:tcPr>
-          <w:p>
-            <w:pPr>
-              <w:spacing w:before="0" w:after="60"/>
-              <w:keepNext/>
-              <w:jc w:val="start"/>
-            </w:pPr>
-            <w:r>
-              <w:rPr>
-                <w:rFonts w:ascii="Calibri" w:hAnsi="Calibri"/>
-                <w:sz w:val="20"/>
-              </w:rPr>
-              <w:t xml:space="default">97 (20.6%)</w:t>
-            </w:r>
-          </w:p>
-        </w:tc>
-        <w:tc>
-          <w:tcPr>
-            <w:tcBorders>
-              <w:top w:val="single" w:space="0" w:color="D3D3D3"/>
-              <w:bottom w:val="single" w:space="0" w:color="D3D3D3"/>
-              <w:start w:val="single" w:space="0" w:color="D3D3D3"/>
-              <w:end w:val="single" w:space="0" w:color="D3D3D3"/>
-            </w:tcBorders>
-          </w:tcPr>
-          <w:p>
-            <w:pPr>
-              <w:spacing w:before="0" w:after="60"/>
-              <w:keepNext/>
-              <w:jc w:val="start"/>
-            </w:pPr>
-            <w:r>
-              <w:rPr>
-                <w:rFonts w:ascii="Calibri" w:hAnsi="Calibri"/>
-                <w:sz w:val="20"/>
-              </w:rPr>
-              <w:t xml:space="default">190 (23.4%)</w:t>
+              <w:t xml:space="default">74 (28%)</w:t>
+            </w:r>
+          </w:p>
+        </w:tc>
+        <w:tc>
+          <w:tcPr>
+            <w:tcBorders>
+              <w:top w:val="single" w:space="0" w:color="D3D3D3"/>
+              <w:bottom w:val="single" w:space="0" w:color="D3D3D3"/>
+              <w:start w:val="single" w:space="0" w:color="D3D3D3"/>
+              <w:end w:val="single" w:space="0" w:color="D3D3D3"/>
+            </w:tcBorders>
+          </w:tcPr>
+          <w:p>
+            <w:pPr>
+              <w:spacing w:before="0" w:after="60"/>
+              <w:keepNext/>
+              <w:jc w:val="start"/>
+            </w:pPr>
+            <w:r>
+              <w:rPr>
+                <w:rFonts w:ascii="Calibri" w:hAnsi="Calibri"/>
+                <w:sz w:val="20"/>
+              </w:rPr>
+              <w:t xml:space="default">85 (19.7%)</w:t>
+            </w:r>
+          </w:p>
+        </w:tc>
+        <w:tc>
+          <w:tcPr>
+            <w:tcBorders>
+              <w:top w:val="single" w:space="0" w:color="D3D3D3"/>
+              <w:bottom w:val="single" w:space="0" w:color="D3D3D3"/>
+              <w:start w:val="single" w:space="0" w:color="D3D3D3"/>
+              <w:end w:val="single" w:space="0" w:color="D3D3D3"/>
+            </w:tcBorders>
+          </w:tcPr>
+          <w:p>
+            <w:pPr>
+              <w:spacing w:before="0" w:after="60"/>
+              <w:keepNext/>
+              <w:jc w:val="start"/>
+            </w:pPr>
+            <w:r>
+              <w:rPr>
+                <w:rFonts w:ascii="Calibri" w:hAnsi="Calibri"/>
+                <w:sz w:val="20"/>
+              </w:rPr>
+              <w:t xml:space="default">159 (22.9%)</w:t>
             </w:r>
           </w:p>
         </w:tc>
@@ -3588,7 +3588,7 @@
                 <w:rFonts w:ascii="Calibri" w:hAnsi="Calibri"/>
                 <w:sz w:val="20"/>
               </w:rPr>
-              <w:t xml:space="default">51.3%</w:t>
+              <w:t xml:space="default">53.3%</w:t>
             </w:r>
           </w:p>
         </w:tc>
@@ -3641,55 +3641,55 @@
                 <w:rFonts w:ascii="Calibri" w:hAnsi="Calibri"/>
                 <w:sz w:val="20"/>
               </w:rPr>
-              <w:t xml:space="default">85 (25.1%)</w:t>
-            </w:r>
-          </w:p>
-        </w:tc>
-        <w:tc>
-          <w:tcPr>
-            <w:tcBorders>
-              <w:top w:val="single" w:space="0" w:color="D3D3D3"/>
-              <w:bottom w:val="single" w:space="0" w:color="D3D3D3"/>
-              <w:start w:val="single" w:space="0" w:color="D3D3D3"/>
-              <w:end w:val="single" w:space="0" w:color="D3D3D3"/>
-            </w:tcBorders>
-          </w:tcPr>
-          <w:p>
-            <w:pPr>
-              <w:spacing w:before="0" w:after="60"/>
-              <w:keepNext/>
-              <w:jc w:val="start"/>
-            </w:pPr>
-            <w:r>
-              <w:rPr>
-                <w:rFonts w:ascii="Calibri" w:hAnsi="Calibri"/>
-                <w:sz w:val="20"/>
-              </w:rPr>
-              <w:t xml:space="default">107 (22.6%)</w:t>
-            </w:r>
-          </w:p>
-        </w:tc>
-        <w:tc>
-          <w:tcPr>
-            <w:tcBorders>
-              <w:top w:val="single" w:space="0" w:color="D3D3D3"/>
-              <w:bottom w:val="single" w:space="0" w:color="D3D3D3"/>
-              <w:start w:val="single" w:space="0" w:color="D3D3D3"/>
-              <w:end w:val="single" w:space="0" w:color="D3D3D3"/>
-            </w:tcBorders>
-          </w:tcPr>
-          <w:p>
-            <w:pPr>
-              <w:spacing w:before="0" w:after="60"/>
-              <w:keepNext/>
-              <w:jc w:val="start"/>
-            </w:pPr>
-            <w:r>
-              <w:rPr>
-                <w:rFonts w:ascii="Calibri" w:hAnsi="Calibri"/>
-                <w:sz w:val="20"/>
-              </w:rPr>
-              <w:t xml:space="default">191 (23.6%)</w:t>
+              <w:t xml:space="default">58 (22%)</w:t>
+            </w:r>
+          </w:p>
+        </w:tc>
+        <w:tc>
+          <w:tcPr>
+            <w:tcBorders>
+              <w:top w:val="single" w:space="0" w:color="D3D3D3"/>
+              <w:bottom w:val="single" w:space="0" w:color="D3D3D3"/>
+              <w:start w:val="single" w:space="0" w:color="D3D3D3"/>
+              <w:end w:val="single" w:space="0" w:color="D3D3D3"/>
+            </w:tcBorders>
+          </w:tcPr>
+          <w:p>
+            <w:pPr>
+              <w:spacing w:before="0" w:after="60"/>
+              <w:keepNext/>
+              <w:jc w:val="start"/>
+            </w:pPr>
+            <w:r>
+              <w:rPr>
+                <w:rFonts w:ascii="Calibri" w:hAnsi="Calibri"/>
+                <w:sz w:val="20"/>
+              </w:rPr>
+              <w:t xml:space="default">100 (23.3%)</w:t>
+            </w:r>
+          </w:p>
+        </w:tc>
+        <w:tc>
+          <w:tcPr>
+            <w:tcBorders>
+              <w:top w:val="single" w:space="0" w:color="D3D3D3"/>
+              <w:bottom w:val="single" w:space="0" w:color="D3D3D3"/>
+              <w:start w:val="single" w:space="0" w:color="D3D3D3"/>
+              <w:end w:val="single" w:space="0" w:color="D3D3D3"/>
+            </w:tcBorders>
+          </w:tcPr>
+          <w:p>
+            <w:pPr>
+              <w:spacing w:before="0" w:after="60"/>
+              <w:keepNext/>
+              <w:jc w:val="start"/>
+            </w:pPr>
+            <w:r>
+              <w:rPr>
+                <w:rFonts w:ascii="Calibri" w:hAnsi="Calibri"/>
+                <w:sz w:val="20"/>
+              </w:rPr>
+              <w:t xml:space="default">158 (22.8%)</w:t>
             </w:r>
           </w:p>
         </w:tc>
@@ -3713,7 +3713,7 @@
                 <w:rFonts w:ascii="Calibri" w:hAnsi="Calibri"/>
                 <w:sz w:val="20"/>
               </w:rPr>
-              <w:t xml:space="default">55.7%</w:t>
+              <w:t xml:space="default">63.3%</w:t>
             </w:r>
           </w:p>
         </w:tc>
@@ -3766,55 +3766,55 @@
                 <w:rFonts w:ascii="Calibri" w:hAnsi="Calibri"/>
                 <w:sz w:val="20"/>
               </w:rPr>
-              <w:t xml:space="default">75 (22.3%)</w:t>
-            </w:r>
-          </w:p>
-        </w:tc>
-        <w:tc>
-          <w:tcPr>
-            <w:tcBorders>
-              <w:top w:val="single" w:space="0" w:color="D3D3D3"/>
-              <w:bottom w:val="single" w:space="0" w:color="D3D3D3"/>
-              <w:start w:val="single" w:space="0" w:color="D3D3D3"/>
-              <w:end w:val="single" w:space="0" w:color="D3D3D3"/>
-            </w:tcBorders>
-          </w:tcPr>
-          <w:p>
-            <w:pPr>
-              <w:spacing w:before="0" w:after="60"/>
-              <w:keepNext/>
-              <w:jc w:val="start"/>
-            </w:pPr>
-            <w:r>
-              <w:rPr>
-                <w:rFonts w:ascii="Calibri" w:hAnsi="Calibri"/>
-                <w:sz w:val="20"/>
-              </w:rPr>
-              <w:t xml:space="default">140 (29.6%)</w:t>
-            </w:r>
-          </w:p>
-        </w:tc>
-        <w:tc>
-          <w:tcPr>
-            <w:tcBorders>
-              <w:top w:val="single" w:space="0" w:color="D3D3D3"/>
-              <w:bottom w:val="single" w:space="0" w:color="D3D3D3"/>
-              <w:start w:val="single" w:space="0" w:color="D3D3D3"/>
-              <w:end w:val="single" w:space="0" w:color="D3D3D3"/>
-            </w:tcBorders>
-          </w:tcPr>
-          <w:p>
-            <w:pPr>
-              <w:spacing w:before="0" w:after="60"/>
-              <w:keepNext/>
-              <w:jc w:val="start"/>
-            </w:pPr>
-            <w:r>
-              <w:rPr>
-                <w:rFonts w:ascii="Calibri" w:hAnsi="Calibri"/>
-                <w:sz w:val="20"/>
-              </w:rPr>
-              <w:t xml:space="default">215 (26.6%)</w:t>
+              <w:t xml:space="default">62 (23.6%)</w:t>
+            </w:r>
+          </w:p>
+        </w:tc>
+        <w:tc>
+          <w:tcPr>
+            <w:tcBorders>
+              <w:top w:val="single" w:space="0" w:color="D3D3D3"/>
+              <w:bottom w:val="single" w:space="0" w:color="D3D3D3"/>
+              <w:start w:val="single" w:space="0" w:color="D3D3D3"/>
+              <w:end w:val="single" w:space="0" w:color="D3D3D3"/>
+            </w:tcBorders>
+          </w:tcPr>
+          <w:p>
+            <w:pPr>
+              <w:spacing w:before="0" w:after="60"/>
+              <w:keepNext/>
+              <w:jc w:val="start"/>
+            </w:pPr>
+            <w:r>
+              <w:rPr>
+                <w:rFonts w:ascii="Calibri" w:hAnsi="Calibri"/>
+                <w:sz w:val="20"/>
+              </w:rPr>
+              <w:t xml:space="default">131 (30.5%)</w:t>
+            </w:r>
+          </w:p>
+        </w:tc>
+        <w:tc>
+          <w:tcPr>
+            <w:tcBorders>
+              <w:top w:val="single" w:space="0" w:color="D3D3D3"/>
+              <w:bottom w:val="single" w:space="0" w:color="D3D3D3"/>
+              <w:start w:val="single" w:space="0" w:color="D3D3D3"/>
+              <w:end w:val="single" w:space="0" w:color="D3D3D3"/>
+            </w:tcBorders>
+          </w:tcPr>
+          <w:p>
+            <w:pPr>
+              <w:spacing w:before="0" w:after="60"/>
+              <w:keepNext/>
+              <w:jc w:val="start"/>
+            </w:pPr>
+            <w:r>
+              <w:rPr>
+                <w:rFonts w:ascii="Calibri" w:hAnsi="Calibri"/>
+                <w:sz w:val="20"/>
+              </w:rPr>
+              <w:t xml:space="default">193 (27.8%)</w:t>
             </w:r>
           </w:p>
         </w:tc>
@@ -3838,7 +3838,7 @@
                 <w:rFonts w:ascii="Calibri" w:hAnsi="Calibri"/>
                 <w:sz w:val="20"/>
               </w:rPr>
-              <w:t xml:space="default">65%</w:t>
+              <w:t xml:space="default">67.7%</w:t>
             </w:r>
           </w:p>
         </w:tc>
@@ -4021,55 +4021,55 @@
                 <w:rFonts w:ascii="Calibri" w:hAnsi="Calibri"/>
                 <w:sz w:val="20"/>
               </w:rPr>
-              <w:t xml:space="default">36 (10.6%)</w:t>
-            </w:r>
-          </w:p>
-        </w:tc>
-        <w:tc>
-          <w:tcPr>
-            <w:tcBorders>
-              <w:top w:val="single" w:space="0" w:color="D3D3D3"/>
-              <w:bottom w:val="single" w:space="0" w:color="D3D3D3"/>
-              <w:start w:val="single" w:space="0" w:color="D3D3D3"/>
-              <w:end w:val="single" w:space="0" w:color="D3D3D3"/>
-            </w:tcBorders>
-          </w:tcPr>
-          <w:p>
-            <w:pPr>
-              <w:spacing w:before="0" w:after="60"/>
-              <w:keepNext/>
-              <w:jc w:val="start"/>
-            </w:pPr>
-            <w:r>
-              <w:rPr>
-                <w:rFonts w:ascii="Calibri" w:hAnsi="Calibri"/>
-                <w:sz w:val="20"/>
-              </w:rPr>
-              <w:t xml:space="default">41 (8.7%)</w:t>
-            </w:r>
-          </w:p>
-        </w:tc>
-        <w:tc>
-          <w:tcPr>
-            <w:tcBorders>
-              <w:top w:val="single" w:space="0" w:color="D3D3D3"/>
-              <w:bottom w:val="single" w:space="0" w:color="D3D3D3"/>
-              <w:start w:val="single" w:space="0" w:color="D3D3D3"/>
-              <w:end w:val="single" w:space="0" w:color="D3D3D3"/>
-            </w:tcBorders>
-          </w:tcPr>
-          <w:p>
-            <w:pPr>
-              <w:spacing w:before="0" w:after="60"/>
-              <w:keepNext/>
-              <w:jc w:val="start"/>
-            </w:pPr>
-            <w:r>
-              <w:rPr>
-                <w:rFonts w:ascii="Calibri" w:hAnsi="Calibri"/>
-                <w:sz w:val="20"/>
-              </w:rPr>
-              <w:t xml:space="default">77 (9.5%)</w:t>
+              <w:t xml:space="default">29 (11%)</w:t>
+            </w:r>
+          </w:p>
+        </w:tc>
+        <w:tc>
+          <w:tcPr>
+            <w:tcBorders>
+              <w:top w:val="single" w:space="0" w:color="D3D3D3"/>
+              <w:bottom w:val="single" w:space="0" w:color="D3D3D3"/>
+              <w:start w:val="single" w:space="0" w:color="D3D3D3"/>
+              <w:end w:val="single" w:space="0" w:color="D3D3D3"/>
+            </w:tcBorders>
+          </w:tcPr>
+          <w:p>
+            <w:pPr>
+              <w:spacing w:before="0" w:after="60"/>
+              <w:keepNext/>
+              <w:jc w:val="start"/>
+            </w:pPr>
+            <w:r>
+              <w:rPr>
+                <w:rFonts w:ascii="Calibri" w:hAnsi="Calibri"/>
+                <w:sz w:val="20"/>
+              </w:rPr>
+              <w:t xml:space="default">38 (8.9%)</w:t>
+            </w:r>
+          </w:p>
+        </w:tc>
+        <w:tc>
+          <w:tcPr>
+            <w:tcBorders>
+              <w:top w:val="single" w:space="0" w:color="D3D3D3"/>
+              <w:bottom w:val="single" w:space="0" w:color="D3D3D3"/>
+              <w:start w:val="single" w:space="0" w:color="D3D3D3"/>
+              <w:end w:val="single" w:space="0" w:color="D3D3D3"/>
+            </w:tcBorders>
+          </w:tcPr>
+          <w:p>
+            <w:pPr>
+              <w:spacing w:before="0" w:after="60"/>
+              <w:keepNext/>
+              <w:jc w:val="start"/>
+            </w:pPr>
+            <w:r>
+              <w:rPr>
+                <w:rFonts w:ascii="Calibri" w:hAnsi="Calibri"/>
+                <w:sz w:val="20"/>
+              </w:rPr>
+              <w:t xml:space="default">68 (9.7%)</w:t>
             </w:r>
           </w:p>
         </w:tc>
@@ -4093,7 +4093,7 @@
                 <w:rFonts w:ascii="Calibri" w:hAnsi="Calibri"/>
                 <w:sz w:val="20"/>
               </w:rPr>
-              <w:t xml:space="default">53.3%</w:t>
+              <w:t xml:space="default">56.8%</w:t>
             </w:r>
           </w:p>
         </w:tc>
@@ -4146,55 +4146,55 @@
                 <w:rFonts w:ascii="Calibri" w:hAnsi="Calibri"/>
                 <w:sz w:val="20"/>
               </w:rPr>
-              <w:t xml:space="default">72 (21.4%)</w:t>
-            </w:r>
-          </w:p>
-        </w:tc>
-        <w:tc>
-          <w:tcPr>
-            <w:tcBorders>
-              <w:top w:val="single" w:space="0" w:color="D3D3D3"/>
-              <w:bottom w:val="single" w:space="0" w:color="D3D3D3"/>
-              <w:start w:val="single" w:space="0" w:color="D3D3D3"/>
-              <w:end w:val="single" w:space="0" w:color="D3D3D3"/>
-            </w:tcBorders>
-          </w:tcPr>
-          <w:p>
-            <w:pPr>
-              <w:spacing w:before="0" w:after="60"/>
-              <w:keepNext/>
-              <w:jc w:val="start"/>
-            </w:pPr>
-            <w:r>
-              <w:rPr>
-                <w:rFonts w:ascii="Calibri" w:hAnsi="Calibri"/>
-                <w:sz w:val="20"/>
-              </w:rPr>
-              <w:t xml:space="default">110 (23.4%)</w:t>
-            </w:r>
-          </w:p>
-        </w:tc>
-        <w:tc>
-          <w:tcPr>
-            <w:tcBorders>
-              <w:top w:val="single" w:space="0" w:color="D3D3D3"/>
-              <w:bottom w:val="single" w:space="0" w:color="D3D3D3"/>
-              <w:start w:val="single" w:space="0" w:color="D3D3D3"/>
-              <w:end w:val="single" w:space="0" w:color="D3D3D3"/>
-            </w:tcBorders>
-          </w:tcPr>
-          <w:p>
-            <w:pPr>
-              <w:spacing w:before="0" w:after="60"/>
-              <w:keepNext/>
-              <w:jc w:val="start"/>
-            </w:pPr>
-            <w:r>
-              <w:rPr>
-                <w:rFonts w:ascii="Calibri" w:hAnsi="Calibri"/>
-                <w:sz w:val="20"/>
-              </w:rPr>
-              <w:t xml:space="default">182 (22.6%)</w:t>
+              <w:t xml:space="default">57 (21.7%)</w:t>
+            </w:r>
+          </w:p>
+        </w:tc>
+        <w:tc>
+          <w:tcPr>
+            <w:tcBorders>
+              <w:top w:val="single" w:space="0" w:color="D3D3D3"/>
+              <w:bottom w:val="single" w:space="0" w:color="D3D3D3"/>
+              <w:start w:val="single" w:space="0" w:color="D3D3D3"/>
+              <w:end w:val="single" w:space="0" w:color="D3D3D3"/>
+            </w:tcBorders>
+          </w:tcPr>
+          <w:p>
+            <w:pPr>
+              <w:spacing w:before="0" w:after="60"/>
+              <w:keepNext/>
+              <w:jc w:val="start"/>
+            </w:pPr>
+            <w:r>
+              <w:rPr>
+                <w:rFonts w:ascii="Calibri" w:hAnsi="Calibri"/>
+                <w:sz w:val="20"/>
+              </w:rPr>
+              <w:t xml:space="default">98 (22.9%)</w:t>
+            </w:r>
+          </w:p>
+        </w:tc>
+        <w:tc>
+          <w:tcPr>
+            <w:tcBorders>
+              <w:top w:val="single" w:space="0" w:color="D3D3D3"/>
+              <w:bottom w:val="single" w:space="0" w:color="D3D3D3"/>
+              <w:start w:val="single" w:space="0" w:color="D3D3D3"/>
+              <w:end w:val="single" w:space="0" w:color="D3D3D3"/>
+            </w:tcBorders>
+          </w:tcPr>
+          <w:p>
+            <w:pPr>
+              <w:spacing w:before="0" w:after="60"/>
+              <w:keepNext/>
+              <w:jc w:val="start"/>
+            </w:pPr>
+            <w:r>
+              <w:rPr>
+                <w:rFonts w:ascii="Calibri" w:hAnsi="Calibri"/>
+                <w:sz w:val="20"/>
+              </w:rPr>
+              <w:t xml:space="default">156 (22.4%)</w:t>
             </w:r>
           </w:p>
         </w:tc>
@@ -4218,7 +4218,7 @@
                 <w:rFonts w:ascii="Calibri" w:hAnsi="Calibri"/>
                 <w:sz w:val="20"/>
               </w:rPr>
-              <w:t xml:space="default">60.5%</w:t>
+              <w:t xml:space="default">63.2%</w:t>
             </w:r>
           </w:p>
         </w:tc>
@@ -4271,55 +4271,55 @@
                 <w:rFonts w:ascii="Calibri" w:hAnsi="Calibri"/>
                 <w:sz w:val="20"/>
               </w:rPr>
-              <w:t xml:space="default">146 (43.2%)</w:t>
-            </w:r>
-          </w:p>
-        </w:tc>
-        <w:tc>
-          <w:tcPr>
-            <w:tcBorders>
-              <w:top w:val="single" w:space="0" w:color="D3D3D3"/>
-              <w:bottom w:val="single" w:space="0" w:color="D3D3D3"/>
-              <w:start w:val="single" w:space="0" w:color="D3D3D3"/>
-              <w:end w:val="single" w:space="0" w:color="D3D3D3"/>
-            </w:tcBorders>
-          </w:tcPr>
-          <w:p>
-            <w:pPr>
-              <w:spacing w:before="0" w:after="60"/>
-              <w:keepNext/>
-              <w:jc w:val="start"/>
-            </w:pPr>
-            <w:r>
-              <w:rPr>
-                <w:rFonts w:ascii="Calibri" w:hAnsi="Calibri"/>
-                <w:sz w:val="20"/>
-              </w:rPr>
-              <w:t xml:space="default">236 (50.1%)</w:t>
-            </w:r>
-          </w:p>
-        </w:tc>
-        <w:tc>
-          <w:tcPr>
-            <w:tcBorders>
-              <w:top w:val="single" w:space="0" w:color="D3D3D3"/>
-              <w:bottom w:val="single" w:space="0" w:color="D3D3D3"/>
-              <w:start w:val="single" w:space="0" w:color="D3D3D3"/>
-              <w:end w:val="single" w:space="0" w:color="D3D3D3"/>
-            </w:tcBorders>
-          </w:tcPr>
-          <w:p>
-            <w:pPr>
-              <w:spacing w:before="0" w:after="60"/>
-              <w:keepNext/>
-              <w:jc w:val="start"/>
-            </w:pPr>
-            <w:r>
-              <w:rPr>
-                <w:rFonts w:ascii="Calibri" w:hAnsi="Calibri"/>
-                <w:sz w:val="20"/>
-              </w:rPr>
-              <w:t xml:space="default">382 (47.3%)</w:t>
+              <w:t xml:space="default">107 (40.6%)</w:t>
+            </w:r>
+          </w:p>
+        </w:tc>
+        <w:tc>
+          <w:tcPr>
+            <w:tcBorders>
+              <w:top w:val="single" w:space="0" w:color="D3D3D3"/>
+              <w:bottom w:val="single" w:space="0" w:color="D3D3D3"/>
+              <w:start w:val="single" w:space="0" w:color="D3D3D3"/>
+              <w:end w:val="single" w:space="0" w:color="D3D3D3"/>
+            </w:tcBorders>
+          </w:tcPr>
+          <w:p>
+            <w:pPr>
+              <w:spacing w:before="0" w:after="60"/>
+              <w:keepNext/>
+              <w:jc w:val="start"/>
+            </w:pPr>
+            <w:r>
+              <w:rPr>
+                <w:rFonts w:ascii="Calibri" w:hAnsi="Calibri"/>
+                <w:sz w:val="20"/>
+              </w:rPr>
+              <w:t xml:space="default">223 (51.8%)</w:t>
+            </w:r>
+          </w:p>
+        </w:tc>
+        <w:tc>
+          <w:tcPr>
+            <w:tcBorders>
+              <w:top w:val="single" w:space="0" w:color="D3D3D3"/>
+              <w:bottom w:val="single" w:space="0" w:color="D3D3D3"/>
+              <w:start w:val="single" w:space="0" w:color="D3D3D3"/>
+              <w:end w:val="single" w:space="0" w:color="D3D3D3"/>
+            </w:tcBorders>
+          </w:tcPr>
+          <w:p>
+            <w:pPr>
+              <w:spacing w:before="0" w:after="60"/>
+              <w:keepNext/>
+              <w:jc w:val="start"/>
+            </w:pPr>
+            <w:r>
+              <w:rPr>
+                <w:rFonts w:ascii="Calibri" w:hAnsi="Calibri"/>
+                <w:sz w:val="20"/>
+              </w:rPr>
+              <w:t xml:space="default">330 (47.6%)</w:t>
             </w:r>
           </w:p>
         </w:tc>
@@ -4343,7 +4343,7 @@
                 <w:rFonts w:ascii="Calibri" w:hAnsi="Calibri"/>
                 <w:sz w:val="20"/>
               </w:rPr>
-              <w:t xml:space="default">61.8%</w:t>
+              <w:t xml:space="default">67.5%</w:t>
             </w:r>
           </w:p>
         </w:tc>
@@ -4396,55 +4396,55 @@
                 <w:rFonts w:ascii="Calibri" w:hAnsi="Calibri"/>
                 <w:sz w:val="20"/>
               </w:rPr>
-              <w:t xml:space="default">37 (11%)</w:t>
-            </w:r>
-          </w:p>
-        </w:tc>
-        <w:tc>
-          <w:tcPr>
-            <w:tcBorders>
-              <w:top w:val="single" w:space="0" w:color="D3D3D3"/>
-              <w:bottom w:val="single" w:space="0" w:color="D3D3D3"/>
-              <w:start w:val="single" w:space="0" w:color="D3D3D3"/>
-              <w:end w:val="single" w:space="0" w:color="D3D3D3"/>
-            </w:tcBorders>
-          </w:tcPr>
-          <w:p>
-            <w:pPr>
-              <w:spacing w:before="0" w:after="60"/>
-              <w:keepNext/>
-              <w:jc w:val="start"/>
-            </w:pPr>
-            <w:r>
-              <w:rPr>
-                <w:rFonts w:ascii="Calibri" w:hAnsi="Calibri"/>
-                <w:sz w:val="20"/>
-              </w:rPr>
-              <w:t xml:space="default">44 (9.4%)</w:t>
-            </w:r>
-          </w:p>
-        </w:tc>
-        <w:tc>
-          <w:tcPr>
-            <w:tcBorders>
-              <w:top w:val="single" w:space="0" w:color="D3D3D3"/>
-              <w:bottom w:val="single" w:space="0" w:color="D3D3D3"/>
-              <w:start w:val="single" w:space="0" w:color="D3D3D3"/>
-              <w:end w:val="single" w:space="0" w:color="D3D3D3"/>
-            </w:tcBorders>
-          </w:tcPr>
-          <w:p>
-            <w:pPr>
-              <w:spacing w:before="0" w:after="60"/>
-              <w:keepNext/>
-              <w:jc w:val="start"/>
-            </w:pPr>
-            <w:r>
-              <w:rPr>
-                <w:rFonts w:ascii="Calibri" w:hAnsi="Calibri"/>
-                <w:sz w:val="20"/>
-              </w:rPr>
-              <w:t xml:space="default">81 (10.1%)</w:t>
+              <w:t xml:space="default">36 (13.7%)</w:t>
+            </w:r>
+          </w:p>
+        </w:tc>
+        <w:tc>
+          <w:tcPr>
+            <w:tcBorders>
+              <w:top w:val="single" w:space="0" w:color="D3D3D3"/>
+              <w:bottom w:val="single" w:space="0" w:color="D3D3D3"/>
+              <w:start w:val="single" w:space="0" w:color="D3D3D3"/>
+              <w:end w:val="single" w:space="0" w:color="D3D3D3"/>
+            </w:tcBorders>
+          </w:tcPr>
+          <w:p>
+            <w:pPr>
+              <w:spacing w:before="0" w:after="60"/>
+              <w:keepNext/>
+              <w:jc w:val="start"/>
+            </w:pPr>
+            <w:r>
+              <w:rPr>
+                <w:rFonts w:ascii="Calibri" w:hAnsi="Calibri"/>
+                <w:sz w:val="20"/>
+              </w:rPr>
+              <w:t xml:space="default">34 (7.8%)</w:t>
+            </w:r>
+          </w:p>
+        </w:tc>
+        <w:tc>
+          <w:tcPr>
+            <w:tcBorders>
+              <w:top w:val="single" w:space="0" w:color="D3D3D3"/>
+              <w:bottom w:val="single" w:space="0" w:color="D3D3D3"/>
+              <w:start w:val="single" w:space="0" w:color="D3D3D3"/>
+              <w:end w:val="single" w:space="0" w:color="D3D3D3"/>
+            </w:tcBorders>
+          </w:tcPr>
+          <w:p>
+            <w:pPr>
+              <w:spacing w:before="0" w:after="60"/>
+              <w:keepNext/>
+              <w:jc w:val="start"/>
+            </w:pPr>
+            <w:r>
+              <w:rPr>
+                <w:rFonts w:ascii="Calibri" w:hAnsi="Calibri"/>
+                <w:sz w:val="20"/>
+              </w:rPr>
+              <w:t xml:space="default">70 (10.1%)</w:t>
             </w:r>
           </w:p>
         </w:tc>
@@ -4468,7 +4468,7 @@
                 <w:rFonts w:ascii="Calibri" w:hAnsi="Calibri"/>
                 <w:sz w:val="20"/>
               </w:rPr>
-              <w:t xml:space="default">54.2%</w:t>
+              <w:t xml:space="default">48.2%</w:t>
             </w:r>
           </w:p>
         </w:tc>
@@ -4521,55 +4521,55 @@
                 <w:rFonts w:ascii="Calibri" w:hAnsi="Calibri"/>
                 <w:sz w:val="20"/>
               </w:rPr>
-              <w:t xml:space="default">45 (13.4%)</w:t>
-            </w:r>
-          </w:p>
-        </w:tc>
-        <w:tc>
-          <w:tcPr>
-            <w:tcBorders>
-              <w:top w:val="single" w:space="0" w:color="D3D3D3"/>
-              <w:bottom w:val="single" w:space="0" w:color="D3D3D3"/>
-              <w:start w:val="single" w:space="0" w:color="D3D3D3"/>
-              <w:end w:val="single" w:space="0" w:color="D3D3D3"/>
-            </w:tcBorders>
-          </w:tcPr>
-          <w:p>
-            <w:pPr>
-              <w:spacing w:before="0" w:after="60"/>
-              <w:keepNext/>
-              <w:jc w:val="start"/>
-            </w:pPr>
-            <w:r>
-              <w:rPr>
-                <w:rFonts w:ascii="Calibri" w:hAnsi="Calibri"/>
-                <w:sz w:val="20"/>
-              </w:rPr>
-              <w:t xml:space="default">39 (8.2%)</w:t>
-            </w:r>
-          </w:p>
-        </w:tc>
-        <w:tc>
-          <w:tcPr>
-            <w:tcBorders>
-              <w:top w:val="single" w:space="0" w:color="D3D3D3"/>
-              <w:bottom w:val="single" w:space="0" w:color="D3D3D3"/>
-              <w:start w:val="single" w:space="0" w:color="D3D3D3"/>
-              <w:end w:val="single" w:space="0" w:color="D3D3D3"/>
-            </w:tcBorders>
-          </w:tcPr>
-          <w:p>
-            <w:pPr>
-              <w:spacing w:before="0" w:after="60"/>
-              <w:keepNext/>
-              <w:jc w:val="start"/>
-            </w:pPr>
-            <w:r>
-              <w:rPr>
-                <w:rFonts w:ascii="Calibri" w:hAnsi="Calibri"/>
-                <w:sz w:val="20"/>
-              </w:rPr>
-              <w:t xml:space="default">84 (10.4%)</w:t>
+              <w:t xml:space="default">33 (12.5%)</w:t>
+            </w:r>
+          </w:p>
+        </w:tc>
+        <w:tc>
+          <w:tcPr>
+            <w:tcBorders>
+              <w:top w:val="single" w:space="0" w:color="D3D3D3"/>
+              <w:bottom w:val="single" w:space="0" w:color="D3D3D3"/>
+              <w:start w:val="single" w:space="0" w:color="D3D3D3"/>
+              <w:end w:val="single" w:space="0" w:color="D3D3D3"/>
+            </w:tcBorders>
+          </w:tcPr>
+          <w:p>
+            <w:pPr>
+              <w:spacing w:before="0" w:after="60"/>
+              <w:keepNext/>
+              <w:jc w:val="start"/>
+            </w:pPr>
+            <w:r>
+              <w:rPr>
+                <w:rFonts w:ascii="Calibri" w:hAnsi="Calibri"/>
+                <w:sz w:val="20"/>
+              </w:rPr>
+              <w:t xml:space="default">35 (8.3%)</w:t>
+            </w:r>
+          </w:p>
+        </w:tc>
+        <w:tc>
+          <w:tcPr>
+            <w:tcBorders>
+              <w:top w:val="single" w:space="0" w:color="D3D3D3"/>
+              <w:bottom w:val="single" w:space="0" w:color="D3D3D3"/>
+              <w:start w:val="single" w:space="0" w:color="D3D3D3"/>
+              <w:end w:val="single" w:space="0" w:color="D3D3D3"/>
+            </w:tcBorders>
+          </w:tcPr>
+          <w:p>
+            <w:pPr>
+              <w:spacing w:before="0" w:after="60"/>
+              <w:keepNext/>
+              <w:jc w:val="start"/>
+            </w:pPr>
+            <w:r>
+              <w:rPr>
+                <w:rFonts w:ascii="Calibri" w:hAnsi="Calibri"/>
+                <w:sz w:val="20"/>
+              </w:rPr>
+              <w:t xml:space="default">69 (9.9%)</w:t>
             </w:r>
           </w:p>
         </w:tc>
@@ -4593,7 +4593,7 @@
                 <w:rFonts w:ascii="Calibri" w:hAnsi="Calibri"/>
                 <w:sz w:val="20"/>
               </w:rPr>
-              <w:t xml:space="default">46%</w:t>
+              <w:t xml:space="default">51.7%</w:t>
             </w:r>
           </w:p>
         </w:tc>
@@ -4776,55 +4776,55 @@
                 <w:rFonts w:ascii="Calibri" w:hAnsi="Calibri"/>
                 <w:sz w:val="20"/>
               </w:rPr>
-              <w:t xml:space="default">53 (15.8%)</w:t>
-            </w:r>
-          </w:p>
-        </w:tc>
-        <w:tc>
-          <w:tcPr>
-            <w:tcBorders>
-              <w:top w:val="single" w:space="0" w:color="D3D3D3"/>
-              <w:bottom w:val="single" w:space="0" w:color="D3D3D3"/>
-              <w:start w:val="single" w:space="0" w:color="D3D3D3"/>
-              <w:end w:val="single" w:space="0" w:color="D3D3D3"/>
-            </w:tcBorders>
-          </w:tcPr>
-          <w:p>
-            <w:pPr>
-              <w:spacing w:before="0" w:after="60"/>
-              <w:keepNext/>
-              <w:jc w:val="start"/>
-            </w:pPr>
-            <w:r>
-              <w:rPr>
-                <w:rFonts w:ascii="Calibri" w:hAnsi="Calibri"/>
-                <w:sz w:val="20"/>
-              </w:rPr>
-              <w:t xml:space="default">69 (14.6%)</w:t>
-            </w:r>
-          </w:p>
-        </w:tc>
-        <w:tc>
-          <w:tcPr>
-            <w:tcBorders>
-              <w:top w:val="single" w:space="0" w:color="D3D3D3"/>
-              <w:bottom w:val="single" w:space="0" w:color="D3D3D3"/>
-              <w:start w:val="single" w:space="0" w:color="D3D3D3"/>
-              <w:end w:val="single" w:space="0" w:color="D3D3D3"/>
-            </w:tcBorders>
-          </w:tcPr>
-          <w:p>
-            <w:pPr>
-              <w:spacing w:before="0" w:after="60"/>
-              <w:keepNext/>
-              <w:jc w:val="start"/>
-            </w:pPr>
-            <w:r>
-              <w:rPr>
-                <w:rFonts w:ascii="Calibri" w:hAnsi="Calibri"/>
-                <w:sz w:val="20"/>
-              </w:rPr>
-              <w:t xml:space="default">122 (15.1%)</w:t>
+              <w:t xml:space="default">42 (16%)</w:t>
+            </w:r>
+          </w:p>
+        </w:tc>
+        <w:tc>
+          <w:tcPr>
+            <w:tcBorders>
+              <w:top w:val="single" w:space="0" w:color="D3D3D3"/>
+              <w:bottom w:val="single" w:space="0" w:color="D3D3D3"/>
+              <w:start w:val="single" w:space="0" w:color="D3D3D3"/>
+              <w:end w:val="single" w:space="0" w:color="D3D3D3"/>
+            </w:tcBorders>
+          </w:tcPr>
+          <w:p>
+            <w:pPr>
+              <w:spacing w:before="0" w:after="60"/>
+              <w:keepNext/>
+              <w:jc w:val="start"/>
+            </w:pPr>
+            <w:r>
+              <w:rPr>
+                <w:rFonts w:ascii="Calibri" w:hAnsi="Calibri"/>
+                <w:sz w:val="20"/>
+              </w:rPr>
+              <w:t xml:space="default">62 (14.5%)</w:t>
+            </w:r>
+          </w:p>
+        </w:tc>
+        <w:tc>
+          <w:tcPr>
+            <w:tcBorders>
+              <w:top w:val="single" w:space="0" w:color="D3D3D3"/>
+              <w:bottom w:val="single" w:space="0" w:color="D3D3D3"/>
+              <w:start w:val="single" w:space="0" w:color="D3D3D3"/>
+              <w:end w:val="single" w:space="0" w:color="D3D3D3"/>
+            </w:tcBorders>
+          </w:tcPr>
+          <w:p>
+            <w:pPr>
+              <w:spacing w:before="0" w:after="60"/>
+              <w:keepNext/>
+              <w:jc w:val="start"/>
+            </w:pPr>
+            <w:r>
+              <w:rPr>
+                <w:rFonts w:ascii="Calibri" w:hAnsi="Calibri"/>
+                <w:sz w:val="20"/>
+              </w:rPr>
+              <w:t xml:space="default">105 (15.1%)</w:t>
             </w:r>
           </w:p>
         </w:tc>
@@ -4848,7 +4848,7 @@
                 <w:rFonts w:ascii="Calibri" w:hAnsi="Calibri"/>
                 <w:sz w:val="20"/>
               </w:rPr>
-              <w:t xml:space="default">56.3%</w:t>
+              <w:t xml:space="default">59.6%</w:t>
             </w:r>
           </w:p>
         </w:tc>
@@ -4901,55 +4901,55 @@
                 <w:rFonts w:ascii="Calibri" w:hAnsi="Calibri"/>
                 <w:sz w:val="20"/>
               </w:rPr>
-              <w:t xml:space="default">71 (21.1%)</w:t>
-            </w:r>
-          </w:p>
-        </w:tc>
-        <w:tc>
-          <w:tcPr>
-            <w:tcBorders>
-              <w:top w:val="single" w:space="0" w:color="D3D3D3"/>
-              <w:bottom w:val="single" w:space="0" w:color="D3D3D3"/>
-              <w:start w:val="single" w:space="0" w:color="D3D3D3"/>
-              <w:end w:val="single" w:space="0" w:color="D3D3D3"/>
-            </w:tcBorders>
-          </w:tcPr>
-          <w:p>
-            <w:pPr>
-              <w:spacing w:before="0" w:after="60"/>
-              <w:keepNext/>
-              <w:jc w:val="start"/>
-            </w:pPr>
-            <w:r>
-              <w:rPr>
-                <w:rFonts w:ascii="Calibri" w:hAnsi="Calibri"/>
-                <w:sz w:val="20"/>
-              </w:rPr>
-              <w:t xml:space="default">107 (22.6%)</w:t>
-            </w:r>
-          </w:p>
-        </w:tc>
-        <w:tc>
-          <w:tcPr>
-            <w:tcBorders>
-              <w:top w:val="single" w:space="0" w:color="D3D3D3"/>
-              <w:bottom w:val="single" w:space="0" w:color="D3D3D3"/>
-              <w:start w:val="single" w:space="0" w:color="D3D3D3"/>
-              <w:end w:val="single" w:space="0" w:color="D3D3D3"/>
-            </w:tcBorders>
-          </w:tcPr>
-          <w:p>
-            <w:pPr>
-              <w:spacing w:before="0" w:after="60"/>
-              <w:keepNext/>
-              <w:jc w:val="start"/>
-            </w:pPr>
-            <w:r>
-              <w:rPr>
-                <w:rFonts w:ascii="Calibri" w:hAnsi="Calibri"/>
-                <w:sz w:val="20"/>
-              </w:rPr>
-              <w:t xml:space="default">178 (22%)</w:t>
+              <w:t xml:space="default">59 (22.2%)</w:t>
+            </w:r>
+          </w:p>
+        </w:tc>
+        <w:tc>
+          <w:tcPr>
+            <w:tcBorders>
+              <w:top w:val="single" w:space="0" w:color="D3D3D3"/>
+              <w:bottom w:val="single" w:space="0" w:color="D3D3D3"/>
+              <w:start w:val="single" w:space="0" w:color="D3D3D3"/>
+              <w:end w:val="single" w:space="0" w:color="D3D3D3"/>
+            </w:tcBorders>
+          </w:tcPr>
+          <w:p>
+            <w:pPr>
+              <w:spacing w:before="0" w:after="60"/>
+              <w:keepNext/>
+              <w:jc w:val="start"/>
+            </w:pPr>
+            <w:r>
+              <w:rPr>
+                <w:rFonts w:ascii="Calibri" w:hAnsi="Calibri"/>
+                <w:sz w:val="20"/>
+              </w:rPr>
+              <w:t xml:space="default">98 (22.8%)</w:t>
+            </w:r>
+          </w:p>
+        </w:tc>
+        <w:tc>
+          <w:tcPr>
+            <w:tcBorders>
+              <w:top w:val="single" w:space="0" w:color="D3D3D3"/>
+              <w:bottom w:val="single" w:space="0" w:color="D3D3D3"/>
+              <w:start w:val="single" w:space="0" w:color="D3D3D3"/>
+              <w:end w:val="single" w:space="0" w:color="D3D3D3"/>
+            </w:tcBorders>
+          </w:tcPr>
+          <w:p>
+            <w:pPr>
+              <w:spacing w:before="0" w:after="60"/>
+              <w:keepNext/>
+              <w:jc w:val="start"/>
+            </w:pPr>
+            <w:r>
+              <w:rPr>
+                <w:rFonts w:ascii="Calibri" w:hAnsi="Calibri"/>
+                <w:sz w:val="20"/>
+              </w:rPr>
+              <w:t xml:space="default">157 (22.6%)</w:t>
             </w:r>
           </w:p>
         </w:tc>
@@ -4973,7 +4973,7 @@
                 <w:rFonts w:ascii="Calibri" w:hAnsi="Calibri"/>
                 <w:sz w:val="20"/>
               </w:rPr>
-              <w:t xml:space="default">60%</w:t>
+              <w:t xml:space="default">62.5%</w:t>
             </w:r>
           </w:p>
         </w:tc>
@@ -5026,55 +5026,55 @@
                 <w:rFonts w:ascii="Calibri" w:hAnsi="Calibri"/>
                 <w:sz w:val="20"/>
               </w:rPr>
-              <w:t xml:space="default">126 (37.2%)</w:t>
-            </w:r>
-          </w:p>
-        </w:tc>
-        <w:tc>
-          <w:tcPr>
-            <w:tcBorders>
-              <w:top w:val="single" w:space="0" w:color="D3D3D3"/>
-              <w:bottom w:val="single" w:space="0" w:color="D3D3D3"/>
-              <w:start w:val="single" w:space="0" w:color="D3D3D3"/>
-              <w:end w:val="single" w:space="0" w:color="D3D3D3"/>
-            </w:tcBorders>
-          </w:tcPr>
-          <w:p>
-            <w:pPr>
-              <w:spacing w:before="0" w:after="60"/>
-              <w:keepNext/>
-              <w:jc w:val="start"/>
-            </w:pPr>
-            <w:r>
-              <w:rPr>
-                <w:rFonts w:ascii="Calibri" w:hAnsi="Calibri"/>
-                <w:sz w:val="20"/>
-              </w:rPr>
-              <w:t xml:space="default">120 (25.5%)</w:t>
-            </w:r>
-          </w:p>
-        </w:tc>
-        <w:tc>
-          <w:tcPr>
-            <w:tcBorders>
-              <w:top w:val="single" w:space="0" w:color="D3D3D3"/>
-              <w:bottom w:val="single" w:space="0" w:color="D3D3D3"/>
-              <w:start w:val="single" w:space="0" w:color="D3D3D3"/>
-              <w:end w:val="single" w:space="0" w:color="D3D3D3"/>
-            </w:tcBorders>
-          </w:tcPr>
-          <w:p>
-            <w:pPr>
-              <w:spacing w:before="0" w:after="60"/>
-              <w:keepNext/>
-              <w:jc w:val="start"/>
-            </w:pPr>
-            <w:r>
-              <w:rPr>
-                <w:rFonts w:ascii="Calibri" w:hAnsi="Calibri"/>
-                <w:sz w:val="20"/>
-              </w:rPr>
-              <w:t xml:space="default">246 (30.4%)</w:t>
+              <w:t xml:space="default">92 (34.8%)</w:t>
+            </w:r>
+          </w:p>
+        </w:tc>
+        <w:tc>
+          <w:tcPr>
+            <w:tcBorders>
+              <w:top w:val="single" w:space="0" w:color="D3D3D3"/>
+              <w:bottom w:val="single" w:space="0" w:color="D3D3D3"/>
+              <w:start w:val="single" w:space="0" w:color="D3D3D3"/>
+              <w:end w:val="single" w:space="0" w:color="D3D3D3"/>
+            </w:tcBorders>
+          </w:tcPr>
+          <w:p>
+            <w:pPr>
+              <w:spacing w:before="0" w:after="60"/>
+              <w:keepNext/>
+              <w:jc w:val="start"/>
+            </w:pPr>
+            <w:r>
+              <w:rPr>
+                <w:rFonts w:ascii="Calibri" w:hAnsi="Calibri"/>
+                <w:sz w:val="20"/>
+              </w:rPr>
+              <w:t xml:space="default">107 (24.9%)</w:t>
+            </w:r>
+          </w:p>
+        </w:tc>
+        <w:tc>
+          <w:tcPr>
+            <w:tcBorders>
+              <w:top w:val="single" w:space="0" w:color="D3D3D3"/>
+              <w:bottom w:val="single" w:space="0" w:color="D3D3D3"/>
+              <w:start w:val="single" w:space="0" w:color="D3D3D3"/>
+              <w:end w:val="single" w:space="0" w:color="D3D3D3"/>
+            </w:tcBorders>
+          </w:tcPr>
+          <w:p>
+            <w:pPr>
+              <w:spacing w:before="0" w:after="60"/>
+              <w:keepNext/>
+              <w:jc w:val="start"/>
+            </w:pPr>
+            <w:r>
+              <w:rPr>
+                <w:rFonts w:ascii="Calibri" w:hAnsi="Calibri"/>
+                <w:sz w:val="20"/>
+              </w:rPr>
+              <w:t xml:space="default">199 (28.7%)</w:t>
             </w:r>
           </w:p>
         </w:tc>
@@ -5098,7 +5098,7 @@
                 <w:rFonts w:ascii="Calibri" w:hAnsi="Calibri"/>
                 <w:sz w:val="20"/>
               </w:rPr>
-              <w:t xml:space="default">48.9%</w:t>
+              <w:t xml:space="default">53.8%</w:t>
             </w:r>
           </w:p>
         </w:tc>
@@ -5151,55 +5151,55 @@
                 <w:rFonts w:ascii="Calibri" w:hAnsi="Calibri"/>
                 <w:sz w:val="20"/>
               </w:rPr>
-              <w:t xml:space="default">50 (14.8%)</w:t>
-            </w:r>
-          </w:p>
-        </w:tc>
-        <w:tc>
-          <w:tcPr>
-            <w:tcBorders>
-              <w:top w:val="single" w:space="0" w:color="D3D3D3"/>
-              <w:bottom w:val="single" w:space="0" w:color="D3D3D3"/>
-              <w:start w:val="single" w:space="0" w:color="D3D3D3"/>
-              <w:end w:val="single" w:space="0" w:color="D3D3D3"/>
-            </w:tcBorders>
-          </w:tcPr>
-          <w:p>
-            <w:pPr>
-              <w:spacing w:before="0" w:after="60"/>
-              <w:keepNext/>
-              <w:jc w:val="start"/>
-            </w:pPr>
-            <w:r>
-              <w:rPr>
-                <w:rFonts w:ascii="Calibri" w:hAnsi="Calibri"/>
-                <w:sz w:val="20"/>
-              </w:rPr>
-              <w:t xml:space="default">116 (24.6%)</w:t>
-            </w:r>
-          </w:p>
-        </w:tc>
-        <w:tc>
-          <w:tcPr>
-            <w:tcBorders>
-              <w:top w:val="single" w:space="0" w:color="D3D3D3"/>
-              <w:bottom w:val="single" w:space="0" w:color="D3D3D3"/>
-              <w:start w:val="single" w:space="0" w:color="D3D3D3"/>
-              <w:end w:val="single" w:space="0" w:color="D3D3D3"/>
-            </w:tcBorders>
-          </w:tcPr>
-          <w:p>
-            <w:pPr>
-              <w:spacing w:before="0" w:after="60"/>
-              <w:keepNext/>
-              <w:jc w:val="start"/>
-            </w:pPr>
-            <w:r>
-              <w:rPr>
-                <w:rFonts w:ascii="Calibri" w:hAnsi="Calibri"/>
-                <w:sz w:val="20"/>
-              </w:rPr>
-              <w:t xml:space="default">166 (20.5%)</w:t>
+              <w:t xml:space="default">41 (15.4%)</w:t>
+            </w:r>
+          </w:p>
+        </w:tc>
+        <w:tc>
+          <w:tcPr>
+            <w:tcBorders>
+              <w:top w:val="single" w:space="0" w:color="D3D3D3"/>
+              <w:bottom w:val="single" w:space="0" w:color="D3D3D3"/>
+              <w:start w:val="single" w:space="0" w:color="D3D3D3"/>
+              <w:end w:val="single" w:space="0" w:color="D3D3D3"/>
+            </w:tcBorders>
+          </w:tcPr>
+          <w:p>
+            <w:pPr>
+              <w:spacing w:before="0" w:after="60"/>
+              <w:keepNext/>
+              <w:jc w:val="start"/>
+            </w:pPr>
+            <w:r>
+              <w:rPr>
+                <w:rFonts w:ascii="Calibri" w:hAnsi="Calibri"/>
+                <w:sz w:val="20"/>
+              </w:rPr>
+              <w:t xml:space="default">110 (25.6%)</w:t>
+            </w:r>
+          </w:p>
+        </w:tc>
+        <w:tc>
+          <w:tcPr>
+            <w:tcBorders>
+              <w:top w:val="single" w:space="0" w:color="D3D3D3"/>
+              <w:bottom w:val="single" w:space="0" w:color="D3D3D3"/>
+              <w:start w:val="single" w:space="0" w:color="D3D3D3"/>
+              <w:end w:val="single" w:space="0" w:color="D3D3D3"/>
+            </w:tcBorders>
+          </w:tcPr>
+          <w:p>
+            <w:pPr>
+              <w:spacing w:before="0" w:after="60"/>
+              <w:keepNext/>
+              <w:jc w:val="start"/>
+            </w:pPr>
+            <w:r>
+              <w:rPr>
+                <w:rFonts w:ascii="Calibri" w:hAnsi="Calibri"/>
+                <w:sz w:val="20"/>
+              </w:rPr>
+              <w:t xml:space="default">151 (21.7%)</w:t>
             </w:r>
           </w:p>
         </w:tc>
@@ -5223,7 +5223,7 @@
                 <w:rFonts w:ascii="Calibri" w:hAnsi="Calibri"/>
                 <w:sz w:val="20"/>
               </w:rPr>
-              <w:t xml:space="default">69.9%</w:t>
+              <w:t xml:space="default">72.9%</w:t>
             </w:r>
           </w:p>
         </w:tc>
@@ -5406,55 +5406,55 @@
                 <w:rFonts w:ascii="Calibri" w:hAnsi="Calibri"/>
                 <w:sz w:val="20"/>
               </w:rPr>
-              <w:t xml:space="default">22 (6.5%)</w:t>
-            </w:r>
-          </w:p>
-        </w:tc>
-        <w:tc>
-          <w:tcPr>
-            <w:tcBorders>
-              <w:top w:val="single" w:space="0" w:color="D3D3D3"/>
-              <w:bottom w:val="single" w:space="0" w:color="D3D3D3"/>
-              <w:start w:val="single" w:space="0" w:color="D3D3D3"/>
-              <w:end w:val="single" w:space="0" w:color="D3D3D3"/>
-            </w:tcBorders>
-          </w:tcPr>
-          <w:p>
-            <w:pPr>
-              <w:spacing w:before="0" w:after="60"/>
-              <w:keepNext/>
-              <w:jc w:val="start"/>
-            </w:pPr>
-            <w:r>
-              <w:rPr>
-                <w:rFonts w:ascii="Calibri" w:hAnsi="Calibri"/>
-                <w:sz w:val="20"/>
-              </w:rPr>
-              <w:t xml:space="default">11 (2.3%)</w:t>
-            </w:r>
-          </w:p>
-        </w:tc>
-        <w:tc>
-          <w:tcPr>
-            <w:tcBorders>
-              <w:top w:val="single" w:space="0" w:color="D3D3D3"/>
-              <w:bottom w:val="single" w:space="0" w:color="D3D3D3"/>
-              <w:start w:val="single" w:space="0" w:color="D3D3D3"/>
-              <w:end w:val="single" w:space="0" w:color="D3D3D3"/>
-            </w:tcBorders>
-          </w:tcPr>
-          <w:p>
-            <w:pPr>
-              <w:spacing w:before="0" w:after="60"/>
-              <w:keepNext/>
-              <w:jc w:val="start"/>
-            </w:pPr>
-            <w:r>
-              <w:rPr>
-                <w:rFonts w:ascii="Calibri" w:hAnsi="Calibri"/>
-                <w:sz w:val="20"/>
-              </w:rPr>
-              <w:t xml:space="default">33 (4.1%)</w:t>
+              <w:t xml:space="default">20 (7.4%)</w:t>
+            </w:r>
+          </w:p>
+        </w:tc>
+        <w:tc>
+          <w:tcPr>
+            <w:tcBorders>
+              <w:top w:val="single" w:space="0" w:color="D3D3D3"/>
+              <w:bottom w:val="single" w:space="0" w:color="D3D3D3"/>
+              <w:start w:val="single" w:space="0" w:color="D3D3D3"/>
+              <w:end w:val="single" w:space="0" w:color="D3D3D3"/>
+            </w:tcBorders>
+          </w:tcPr>
+          <w:p>
+            <w:pPr>
+              <w:spacing w:before="0" w:after="60"/>
+              <w:keepNext/>
+              <w:jc w:val="start"/>
+            </w:pPr>
+            <w:r>
+              <w:rPr>
+                <w:rFonts w:ascii="Calibri" w:hAnsi="Calibri"/>
+                <w:sz w:val="20"/>
+              </w:rPr>
+              <w:t xml:space="default">7 (1.6%)</w:t>
+            </w:r>
+          </w:p>
+        </w:tc>
+        <w:tc>
+          <w:tcPr>
+            <w:tcBorders>
+              <w:top w:val="single" w:space="0" w:color="D3D3D3"/>
+              <w:bottom w:val="single" w:space="0" w:color="D3D3D3"/>
+              <w:start w:val="single" w:space="0" w:color="D3D3D3"/>
+              <w:end w:val="single" w:space="0" w:color="D3D3D3"/>
+            </w:tcBorders>
+          </w:tcPr>
+          <w:p>
+            <w:pPr>
+              <w:spacing w:before="0" w:after="60"/>
+              <w:keepNext/>
+              <w:jc w:val="start"/>
+            </w:pPr>
+            <w:r>
+              <w:rPr>
+                <w:rFonts w:ascii="Calibri" w:hAnsi="Calibri"/>
+                <w:sz w:val="20"/>
+              </w:rPr>
+              <w:t xml:space="default">26 (3.8%)</w:t>
             </w:r>
           </w:p>
         </w:tc>
@@ -5478,7 +5478,7 @@
                 <w:rFonts w:ascii="Calibri" w:hAnsi="Calibri"/>
                 <w:sz w:val="20"/>
               </w:rPr>
-              <w:t xml:space="default">33.6%</w:t>
+              <w:t xml:space="default">26.3%</w:t>
             </w:r>
           </w:p>
         </w:tc>
@@ -5531,55 +5531,55 @@
                 <w:rFonts w:ascii="Calibri" w:hAnsi="Calibri"/>
                 <w:sz w:val="20"/>
               </w:rPr>
-              <w:t xml:space="default">316 (93.5%)</w:t>
-            </w:r>
-          </w:p>
-        </w:tc>
-        <w:tc>
-          <w:tcPr>
-            <w:tcBorders>
-              <w:top w:val="single" w:space="0" w:color="D3D3D3"/>
-              <w:bottom w:val="single" w:space="0" w:color="D3D3D3"/>
-              <w:start w:val="single" w:space="0" w:color="D3D3D3"/>
-              <w:end w:val="single" w:space="0" w:color="D3D3D3"/>
-            </w:tcBorders>
-          </w:tcPr>
-          <w:p>
-            <w:pPr>
-              <w:spacing w:before="0" w:after="60"/>
-              <w:keepNext/>
-              <w:jc w:val="start"/>
-            </w:pPr>
-            <w:r>
-              <w:rPr>
-                <w:rFonts w:ascii="Calibri" w:hAnsi="Calibri"/>
-                <w:sz w:val="20"/>
-              </w:rPr>
-              <w:t xml:space="default">460 (97.7%)</w:t>
-            </w:r>
-          </w:p>
-        </w:tc>
-        <w:tc>
-          <w:tcPr>
-            <w:tcBorders>
-              <w:top w:val="single" w:space="0" w:color="D3D3D3"/>
-              <w:bottom w:val="single" w:space="0" w:color="D3D3D3"/>
-              <w:start w:val="single" w:space="0" w:color="D3D3D3"/>
-              <w:end w:val="single" w:space="0" w:color="D3D3D3"/>
-            </w:tcBorders>
-          </w:tcPr>
-          <w:p>
-            <w:pPr>
-              <w:spacing w:before="0" w:after="60"/>
-              <w:keepNext/>
-              <w:jc w:val="start"/>
-            </w:pPr>
-            <w:r>
-              <w:rPr>
-                <w:rFonts w:ascii="Calibri" w:hAnsi="Calibri"/>
-                <w:sz w:val="20"/>
-              </w:rPr>
-              <w:t xml:space="default">776 (95.9%)</w:t>
+              <w:t xml:space="default">245 (92.6%)</w:t>
+            </w:r>
+          </w:p>
+        </w:tc>
+        <w:tc>
+          <w:tcPr>
+            <w:tcBorders>
+              <w:top w:val="single" w:space="0" w:color="D3D3D3"/>
+              <w:bottom w:val="single" w:space="0" w:color="D3D3D3"/>
+              <w:start w:val="single" w:space="0" w:color="D3D3D3"/>
+              <w:end w:val="single" w:space="0" w:color="D3D3D3"/>
+            </w:tcBorders>
+          </w:tcPr>
+          <w:p>
+            <w:pPr>
+              <w:spacing w:before="0" w:after="60"/>
+              <w:keepNext/>
+              <w:jc w:val="start"/>
+            </w:pPr>
+            <w:r>
+              <w:rPr>
+                <w:rFonts w:ascii="Calibri" w:hAnsi="Calibri"/>
+                <w:sz w:val="20"/>
+              </w:rPr>
+              <w:t xml:space="default">422 (98.4%)</w:t>
+            </w:r>
+          </w:p>
+        </w:tc>
+        <w:tc>
+          <w:tcPr>
+            <w:tcBorders>
+              <w:top w:val="single" w:space="0" w:color="D3D3D3"/>
+              <w:bottom w:val="single" w:space="0" w:color="D3D3D3"/>
+              <w:start w:val="single" w:space="0" w:color="D3D3D3"/>
+              <w:end w:val="single" w:space="0" w:color="D3D3D3"/>
+            </w:tcBorders>
+          </w:tcPr>
+          <w:p>
+            <w:pPr>
+              <w:spacing w:before="0" w:after="60"/>
+              <w:keepNext/>
+              <w:jc w:val="start"/>
+            </w:pPr>
+            <w:r>
+              <w:rPr>
+                <w:rFonts w:ascii="Calibri" w:hAnsi="Calibri"/>
+                <w:sz w:val="20"/>
+              </w:rPr>
+              <w:t xml:space="default">667 (96.2%)</w:t>
             </w:r>
           </w:p>
         </w:tc>
@@ -5603,7 +5603,7 @@
                 <w:rFonts w:ascii="Calibri" w:hAnsi="Calibri"/>
                 <w:sz w:val="20"/>
               </w:rPr>
-              <w:t xml:space="default">59.3%</w:t>
+              <w:t xml:space="default">63.3%</w:t>
             </w:r>
           </w:p>
         </w:tc>
@@ -5786,55 +5786,55 @@
                 <w:rFonts w:ascii="Calibri" w:hAnsi="Calibri"/>
                 <w:sz w:val="20"/>
               </w:rPr>
-              <w:t xml:space="default">45 (13.4%)</w:t>
-            </w:r>
-          </w:p>
-        </w:tc>
-        <w:tc>
-          <w:tcPr>
-            <w:tcBorders>
-              <w:top w:val="single" w:space="0" w:color="D3D3D3"/>
-              <w:bottom w:val="single" w:space="0" w:color="D3D3D3"/>
-              <w:start w:val="single" w:space="0" w:color="D3D3D3"/>
-              <w:end w:val="single" w:space="0" w:color="D3D3D3"/>
-            </w:tcBorders>
-          </w:tcPr>
-          <w:p>
-            <w:pPr>
-              <w:spacing w:before="0" w:after="60"/>
-              <w:keepNext/>
-              <w:jc w:val="start"/>
-            </w:pPr>
-            <w:r>
-              <w:rPr>
-                <w:rFonts w:ascii="Calibri" w:hAnsi="Calibri"/>
-                <w:sz w:val="20"/>
-              </w:rPr>
-              <w:t xml:space="default">49 (10.4%)</w:t>
-            </w:r>
-          </w:p>
-        </w:tc>
-        <w:tc>
-          <w:tcPr>
-            <w:tcBorders>
-              <w:top w:val="single" w:space="0" w:color="D3D3D3"/>
-              <w:bottom w:val="single" w:space="0" w:color="D3D3D3"/>
-              <w:start w:val="single" w:space="0" w:color="D3D3D3"/>
-              <w:end w:val="single" w:space="0" w:color="D3D3D3"/>
-            </w:tcBorders>
-          </w:tcPr>
-          <w:p>
-            <w:pPr>
-              <w:spacing w:before="0" w:after="60"/>
-              <w:keepNext/>
-              <w:jc w:val="start"/>
-            </w:pPr>
-            <w:r>
-              <w:rPr>
-                <w:rFonts w:ascii="Calibri" w:hAnsi="Calibri"/>
-                <w:sz w:val="20"/>
-              </w:rPr>
-              <w:t xml:space="default">94 (11.7%)</w:t>
+              <w:t xml:space="default">36 (13.8%)</w:t>
+            </w:r>
+          </w:p>
+        </w:tc>
+        <w:tc>
+          <w:tcPr>
+            <w:tcBorders>
+              <w:top w:val="single" w:space="0" w:color="D3D3D3"/>
+              <w:bottom w:val="single" w:space="0" w:color="D3D3D3"/>
+              <w:start w:val="single" w:space="0" w:color="D3D3D3"/>
+              <w:end w:val="single" w:space="0" w:color="D3D3D3"/>
+            </w:tcBorders>
+          </w:tcPr>
+          <w:p>
+            <w:pPr>
+              <w:spacing w:before="0" w:after="60"/>
+              <w:keepNext/>
+              <w:jc w:val="start"/>
+            </w:pPr>
+            <w:r>
+              <w:rPr>
+                <w:rFonts w:ascii="Calibri" w:hAnsi="Calibri"/>
+                <w:sz w:val="20"/>
+              </w:rPr>
+              <w:t xml:space="default">45 (10.4%)</w:t>
+            </w:r>
+          </w:p>
+        </w:tc>
+        <w:tc>
+          <w:tcPr>
+            <w:tcBorders>
+              <w:top w:val="single" w:space="0" w:color="D3D3D3"/>
+              <w:bottom w:val="single" w:space="0" w:color="D3D3D3"/>
+              <w:start w:val="single" w:space="0" w:color="D3D3D3"/>
+              <w:end w:val="single" w:space="0" w:color="D3D3D3"/>
+            </w:tcBorders>
+          </w:tcPr>
+          <w:p>
+            <w:pPr>
+              <w:spacing w:before="0" w:after="60"/>
+              <w:keepNext/>
+              <w:jc w:val="start"/>
+            </w:pPr>
+            <w:r>
+              <w:rPr>
+                <w:rFonts w:ascii="Calibri" w:hAnsi="Calibri"/>
+                <w:sz w:val="20"/>
+              </w:rPr>
+              <w:t xml:space="default">81 (11.7%)</w:t>
             </w:r>
           </w:p>
         </w:tc>
@@ -5858,7 +5858,7 @@
                 <w:rFonts w:ascii="Calibri" w:hAnsi="Calibri"/>
                 <w:sz w:val="20"/>
               </w:rPr>
-              <w:t xml:space="default">51.9%</w:t>
+              <w:t xml:space="default">55.2%</w:t>
             </w:r>
           </w:p>
         </w:tc>
@@ -5911,55 +5911,55 @@
                 <w:rFonts w:ascii="Calibri" w:hAnsi="Calibri"/>
                 <w:sz w:val="20"/>
               </w:rPr>
-              <w:t xml:space="default">292 (86.6%)</w:t>
-            </w:r>
-          </w:p>
-        </w:tc>
-        <w:tc>
-          <w:tcPr>
-            <w:tcBorders>
-              <w:top w:val="single" w:space="0" w:color="D3D3D3"/>
-              <w:bottom w:val="single" w:space="0" w:color="D3D3D3"/>
-              <w:start w:val="single" w:space="0" w:color="D3D3D3"/>
-              <w:end w:val="single" w:space="0" w:color="D3D3D3"/>
-            </w:tcBorders>
-          </w:tcPr>
-          <w:p>
-            <w:pPr>
-              <w:spacing w:before="0" w:after="60"/>
-              <w:keepNext/>
-              <w:jc w:val="start"/>
-            </w:pPr>
-            <w:r>
-              <w:rPr>
-                <w:rFonts w:ascii="Calibri" w:hAnsi="Calibri"/>
-                <w:sz w:val="20"/>
-              </w:rPr>
-              <w:t xml:space="default">422 (89.6%)</w:t>
-            </w:r>
-          </w:p>
-        </w:tc>
-        <w:tc>
-          <w:tcPr>
-            <w:tcBorders>
-              <w:top w:val="single" w:space="0" w:color="D3D3D3"/>
-              <w:bottom w:val="single" w:space="0" w:color="D3D3D3"/>
-              <w:start w:val="single" w:space="0" w:color="D3D3D3"/>
-              <w:end w:val="single" w:space="0" w:color="D3D3D3"/>
-            </w:tcBorders>
-          </w:tcPr>
-          <w:p>
-            <w:pPr>
-              <w:spacing w:before="0" w:after="60"/>
-              <w:keepNext/>
-              <w:jc w:val="start"/>
-            </w:pPr>
-            <w:r>
-              <w:rPr>
-                <w:rFonts w:ascii="Calibri" w:hAnsi="Calibri"/>
-                <w:sz w:val="20"/>
-              </w:rPr>
-              <w:t xml:space="default">715 (88.3%)</w:t>
+              <w:t xml:space="default">228 (86.2%)</w:t>
+            </w:r>
+          </w:p>
+        </w:tc>
+        <w:tc>
+          <w:tcPr>
+            <w:tcBorders>
+              <w:top w:val="single" w:space="0" w:color="D3D3D3"/>
+              <w:bottom w:val="single" w:space="0" w:color="D3D3D3"/>
+              <w:start w:val="single" w:space="0" w:color="D3D3D3"/>
+              <w:end w:val="single" w:space="0" w:color="D3D3D3"/>
+            </w:tcBorders>
+          </w:tcPr>
+          <w:p>
+            <w:pPr>
+              <w:spacing w:before="0" w:after="60"/>
+              <w:keepNext/>
+              <w:jc w:val="start"/>
+            </w:pPr>
+            <w:r>
+              <w:rPr>
+                <w:rFonts w:ascii="Calibri" w:hAnsi="Calibri"/>
+                <w:sz w:val="20"/>
+              </w:rPr>
+              <w:t xml:space="default">385 (89.6%)</w:t>
+            </w:r>
+          </w:p>
+        </w:tc>
+        <w:tc>
+          <w:tcPr>
+            <w:tcBorders>
+              <w:top w:val="single" w:space="0" w:color="D3D3D3"/>
+              <w:bottom w:val="single" w:space="0" w:color="D3D3D3"/>
+              <w:start w:val="single" w:space="0" w:color="D3D3D3"/>
+              <w:end w:val="single" w:space="0" w:color="D3D3D3"/>
+            </w:tcBorders>
+          </w:tcPr>
+          <w:p>
+            <w:pPr>
+              <w:spacing w:before="0" w:after="60"/>
+              <w:keepNext/>
+              <w:jc w:val="start"/>
+            </w:pPr>
+            <w:r>
+              <w:rPr>
+                <w:rFonts w:ascii="Calibri" w:hAnsi="Calibri"/>
+                <w:sz w:val="20"/>
+              </w:rPr>
+              <w:t xml:space="default">612 (88.3%)</w:t>
             </w:r>
           </w:p>
         </w:tc>
@@ -5983,7 +5983,7 @@
                 <w:rFonts w:ascii="Calibri" w:hAnsi="Calibri"/>
                 <w:sz w:val="20"/>
               </w:rPr>
-              <w:t xml:space="default">59.1%</w:t>
+              <w:t xml:space="default">62.8%</w:t>
             </w:r>
           </w:p>
         </w:tc>

</xml_diff>

<commit_message>
v1.9 fix NIS svytotal; local data paths; multicore
</commit_message>
<xml_diff>
--- a/Word Tables/Table1_Patient_Characteristics.docx
+++ b/Word Tables/Table1_Patient_Characteristics.docx
@@ -238,7 +238,7 @@
                 <w:sz w:val="20"/>
                 <w:b w:val="true"/>
               </w:rPr>
-              <w:t xml:space="default">264 (100%)</w:t>
+              <w:t xml:space="default">263 (100%)</w:t>
             </w:r>
           </w:p>
         </w:tc>
@@ -263,7 +263,7 @@
                 <w:sz w:val="20"/>
                 <w:b w:val="true"/>
               </w:rPr>
-              <w:t xml:space="default">429 (100%)</w:t>
+              <w:t xml:space="default">424 (100%)</w:t>
             </w:r>
           </w:p>
         </w:tc>
@@ -288,7 +288,7 @@
                 <w:sz w:val="20"/>
                 <w:b w:val="true"/>
               </w:rPr>
-              <w:t xml:space="default">694</w:t>
+              <w:t xml:space="default">686</w:t>
             </w:r>
           </w:p>
         </w:tc>
@@ -313,7 +313,7 @@
                 <w:sz w:val="20"/>
                 <w:b w:val="true"/>
               </w:rPr>
-              <w:t xml:space="default">61.9%</w:t>
+              <w:t xml:space="default">61.7%</w:t>
             </w:r>
           </w:p>
         </w:tc>
@@ -390,7 +390,7 @@
                 <w:rFonts w:ascii="Calibri" w:hAnsi="Calibri"/>
                 <w:sz w:val="20"/>
               </w:rPr>
-              <w:t xml:space="default">36 (8.4%)</w:t>
+              <w:t xml:space="default">36 (8.5%)</w:t>
             </w:r>
           </w:p>
         </w:tc>
@@ -491,55 +491,55 @@
                 <w:rFonts w:ascii="Calibri" w:hAnsi="Calibri"/>
                 <w:sz w:val="20"/>
               </w:rPr>
-              <w:t xml:space="default">13 (4.9%)</w:t>
-            </w:r>
-          </w:p>
-        </w:tc>
-        <w:tc>
-          <w:tcPr>
-            <w:tcBorders>
-              <w:top w:val="single" w:space="0" w:color="D3D3D3"/>
-              <w:bottom w:val="single" w:space="0" w:color="D3D3D3"/>
-              <w:start w:val="single" w:space="0" w:color="D3D3D3"/>
-              <w:end w:val="single" w:space="0" w:color="D3D3D3"/>
-            </w:tcBorders>
-          </w:tcPr>
-          <w:p>
-            <w:pPr>
-              <w:spacing w:before="0" w:after="60"/>
-              <w:keepNext/>
-              <w:jc w:val="start"/>
-            </w:pPr>
-            <w:r>
-              <w:rPr>
-                <w:rFonts w:ascii="Calibri" w:hAnsi="Calibri"/>
-                <w:sz w:val="20"/>
-              </w:rPr>
-              <w:t xml:space="default">47 (10.9%)</w:t>
-            </w:r>
-          </w:p>
-        </w:tc>
-        <w:tc>
-          <w:tcPr>
-            <w:tcBorders>
-              <w:top w:val="single" w:space="0" w:color="D3D3D3"/>
-              <w:bottom w:val="single" w:space="0" w:color="D3D3D3"/>
-              <w:start w:val="single" w:space="0" w:color="D3D3D3"/>
-              <w:end w:val="single" w:space="0" w:color="D3D3D3"/>
-            </w:tcBorders>
-          </w:tcPr>
-          <w:p>
-            <w:pPr>
-              <w:spacing w:before="0" w:after="60"/>
-              <w:keepNext/>
-              <w:jc w:val="start"/>
-            </w:pPr>
-            <w:r>
-              <w:rPr>
-                <w:rFonts w:ascii="Calibri" w:hAnsi="Calibri"/>
-                <w:sz w:val="20"/>
-              </w:rPr>
-              <w:t xml:space="default">60</w:t>
+              <w:t xml:space="default">11 (4.4%)</w:t>
+            </w:r>
+          </w:p>
+        </w:tc>
+        <w:tc>
+          <w:tcPr>
+            <w:tcBorders>
+              <w:top w:val="single" w:space="0" w:color="D3D3D3"/>
+              <w:bottom w:val="single" w:space="0" w:color="D3D3D3"/>
+              <w:start w:val="single" w:space="0" w:color="D3D3D3"/>
+              <w:end w:val="single" w:space="0" w:color="D3D3D3"/>
+            </w:tcBorders>
+          </w:tcPr>
+          <w:p>
+            <w:pPr>
+              <w:spacing w:before="0" w:after="60"/>
+              <w:keepNext/>
+              <w:jc w:val="start"/>
+            </w:pPr>
+            <w:r>
+              <w:rPr>
+                <w:rFonts w:ascii="Calibri" w:hAnsi="Calibri"/>
+                <w:sz w:val="20"/>
+              </w:rPr>
+              <w:t xml:space="default">47 (11%)</w:t>
+            </w:r>
+          </w:p>
+        </w:tc>
+        <w:tc>
+          <w:tcPr>
+            <w:tcBorders>
+              <w:top w:val="single" w:space="0" w:color="D3D3D3"/>
+              <w:bottom w:val="single" w:space="0" w:color="D3D3D3"/>
+              <w:start w:val="single" w:space="0" w:color="D3D3D3"/>
+              <w:end w:val="single" w:space="0" w:color="D3D3D3"/>
+            </w:tcBorders>
+          </w:tcPr>
+          <w:p>
+            <w:pPr>
+              <w:spacing w:before="0" w:after="60"/>
+              <w:keepNext/>
+              <w:jc w:val="start"/>
+            </w:pPr>
+            <w:r>
+              <w:rPr>
+                <w:rFonts w:ascii="Calibri" w:hAnsi="Calibri"/>
+                <w:sz w:val="20"/>
+              </w:rPr>
+              <w:t xml:space="default">58</w:t>
             </w:r>
           </w:p>
         </w:tc>
@@ -563,7 +563,7 @@
                 <w:rFonts w:ascii="Calibri" w:hAnsi="Calibri"/>
                 <w:sz w:val="20"/>
               </w:rPr>
-              <w:t xml:space="default">78.2%</w:t>
+              <w:t xml:space="default">80.3%</w:t>
             </w:r>
           </w:p>
         </w:tc>
@@ -640,7 +640,7 @@
                 <w:rFonts w:ascii="Calibri" w:hAnsi="Calibri"/>
                 <w:sz w:val="20"/>
               </w:rPr>
-              <w:t xml:space="default">38 (8.8%)</w:t>
+              <w:t xml:space="default">38 (8.9%)</w:t>
             </w:r>
           </w:p>
         </w:tc>
@@ -741,31 +741,31 @@
                 <w:rFonts w:ascii="Calibri" w:hAnsi="Calibri"/>
                 <w:sz w:val="20"/>
               </w:rPr>
-              <w:t xml:space="default">50 (18.8%)</w:t>
-            </w:r>
-          </w:p>
-        </w:tc>
-        <w:tc>
-          <w:tcPr>
-            <w:tcBorders>
-              <w:top w:val="single" w:space="0" w:color="D3D3D3"/>
-              <w:bottom w:val="single" w:space="0" w:color="D3D3D3"/>
-              <w:start w:val="single" w:space="0" w:color="D3D3D3"/>
-              <w:end w:val="single" w:space="0" w:color="D3D3D3"/>
-            </w:tcBorders>
-          </w:tcPr>
-          <w:p>
-            <w:pPr>
-              <w:spacing w:before="0" w:after="60"/>
-              <w:keepNext/>
-              <w:jc w:val="start"/>
-            </w:pPr>
-            <w:r>
-              <w:rPr>
-                <w:rFonts w:ascii="Calibri" w:hAnsi="Calibri"/>
-                <w:sz w:val="20"/>
-              </w:rPr>
-              <w:t xml:space="default">64 (14.9%)</w:t>
+              <w:t xml:space="default">50 (18.9%)</w:t>
+            </w:r>
+          </w:p>
+        </w:tc>
+        <w:tc>
+          <w:tcPr>
+            <w:tcBorders>
+              <w:top w:val="single" w:space="0" w:color="D3D3D3"/>
+              <w:bottom w:val="single" w:space="0" w:color="D3D3D3"/>
+              <w:start w:val="single" w:space="0" w:color="D3D3D3"/>
+              <w:end w:val="single" w:space="0" w:color="D3D3D3"/>
+            </w:tcBorders>
+          </w:tcPr>
+          <w:p>
+            <w:pPr>
+              <w:spacing w:before="0" w:after="60"/>
+              <w:keepNext/>
+              <w:jc w:val="start"/>
+            </w:pPr>
+            <w:r>
+              <w:rPr>
+                <w:rFonts w:ascii="Calibri" w:hAnsi="Calibri"/>
+                <w:sz w:val="20"/>
+              </w:rPr>
+              <w:t xml:space="default">64 (15.1%)</w:t>
             </w:r>
           </w:p>
         </w:tc>
@@ -866,31 +866,31 @@
                 <w:rFonts w:ascii="Calibri" w:hAnsi="Calibri"/>
                 <w:sz w:val="20"/>
               </w:rPr>
-              <w:t xml:space="default">60 (22.5%)</w:t>
-            </w:r>
-          </w:p>
-        </w:tc>
-        <w:tc>
-          <w:tcPr>
-            <w:tcBorders>
-              <w:top w:val="single" w:space="0" w:color="D3D3D3"/>
-              <w:bottom w:val="single" w:space="0" w:color="D3D3D3"/>
-              <w:start w:val="single" w:space="0" w:color="D3D3D3"/>
-              <w:end w:val="single" w:space="0" w:color="D3D3D3"/>
-            </w:tcBorders>
-          </w:tcPr>
-          <w:p>
-            <w:pPr>
-              <w:spacing w:before="0" w:after="60"/>
-              <w:keepNext/>
-              <w:jc w:val="start"/>
-            </w:pPr>
-            <w:r>
-              <w:rPr>
-                <w:rFonts w:ascii="Calibri" w:hAnsi="Calibri"/>
-                <w:sz w:val="20"/>
-              </w:rPr>
-              <w:t xml:space="default">66 (15.3%)</w:t>
+              <w:t xml:space="default">60 (22.7%)</w:t>
+            </w:r>
+          </w:p>
+        </w:tc>
+        <w:tc>
+          <w:tcPr>
+            <w:tcBorders>
+              <w:top w:val="single" w:space="0" w:color="D3D3D3"/>
+              <w:bottom w:val="single" w:space="0" w:color="D3D3D3"/>
+              <w:start w:val="single" w:space="0" w:color="D3D3D3"/>
+              <w:end w:val="single" w:space="0" w:color="D3D3D3"/>
+            </w:tcBorders>
+          </w:tcPr>
+          <w:p>
+            <w:pPr>
+              <w:spacing w:before="0" w:after="60"/>
+              <w:keepNext/>
+              <w:jc w:val="start"/>
+            </w:pPr>
+            <w:r>
+              <w:rPr>
+                <w:rFonts w:ascii="Calibri" w:hAnsi="Calibri"/>
+                <w:sz w:val="20"/>
+              </w:rPr>
+              <w:t xml:space="default">66 (15.5%)</w:t>
             </w:r>
           </w:p>
         </w:tc>
@@ -991,31 +991,31 @@
                 <w:rFonts w:ascii="Calibri" w:hAnsi="Calibri"/>
                 <w:sz w:val="20"/>
               </w:rPr>
-              <w:t xml:space="default">46 (17.6%)</w:t>
-            </w:r>
-          </w:p>
-        </w:tc>
-        <w:tc>
-          <w:tcPr>
-            <w:tcBorders>
-              <w:top w:val="single" w:space="0" w:color="D3D3D3"/>
-              <w:bottom w:val="single" w:space="0" w:color="D3D3D3"/>
-              <w:start w:val="single" w:space="0" w:color="D3D3D3"/>
-              <w:end w:val="single" w:space="0" w:color="D3D3D3"/>
-            </w:tcBorders>
-          </w:tcPr>
-          <w:p>
-            <w:pPr>
-              <w:spacing w:before="0" w:after="60"/>
-              <w:keepNext/>
-              <w:jc w:val="start"/>
-            </w:pPr>
-            <w:r>
-              <w:rPr>
-                <w:rFonts w:ascii="Calibri" w:hAnsi="Calibri"/>
-                <w:sz w:val="20"/>
-              </w:rPr>
-              <w:t xml:space="default">61 (14.1%)</w:t>
+              <w:t xml:space="default">46 (17.7%)</w:t>
+            </w:r>
+          </w:p>
+        </w:tc>
+        <w:tc>
+          <w:tcPr>
+            <w:tcBorders>
+              <w:top w:val="single" w:space="0" w:color="D3D3D3"/>
+              <w:bottom w:val="single" w:space="0" w:color="D3D3D3"/>
+              <w:start w:val="single" w:space="0" w:color="D3D3D3"/>
+              <w:end w:val="single" w:space="0" w:color="D3D3D3"/>
+            </w:tcBorders>
+          </w:tcPr>
+          <w:p>
+            <w:pPr>
+              <w:spacing w:before="0" w:after="60"/>
+              <w:keepNext/>
+              <w:jc w:val="start"/>
+            </w:pPr>
+            <w:r>
+              <w:rPr>
+                <w:rFonts w:ascii="Calibri" w:hAnsi="Calibri"/>
+                <w:sz w:val="20"/>
+              </w:rPr>
+              <w:t xml:space="default">61 (14.3%)</w:t>
             </w:r>
           </w:p>
         </w:tc>
@@ -1116,31 +1116,31 @@
                 <w:rFonts w:ascii="Calibri" w:hAnsi="Calibri"/>
                 <w:sz w:val="20"/>
               </w:rPr>
-              <w:t xml:space="default">43 (16.3%)</w:t>
-            </w:r>
-          </w:p>
-        </w:tc>
-        <w:tc>
-          <w:tcPr>
-            <w:tcBorders>
-              <w:top w:val="single" w:space="0" w:color="D3D3D3"/>
-              <w:bottom w:val="single" w:space="0" w:color="D3D3D3"/>
-              <w:start w:val="single" w:space="0" w:color="D3D3D3"/>
-              <w:end w:val="single" w:space="0" w:color="D3D3D3"/>
-            </w:tcBorders>
-          </w:tcPr>
-          <w:p>
-            <w:pPr>
-              <w:spacing w:before="0" w:after="60"/>
-              <w:keepNext/>
-              <w:jc w:val="start"/>
-            </w:pPr>
-            <w:r>
-              <w:rPr>
-                <w:rFonts w:ascii="Calibri" w:hAnsi="Calibri"/>
-                <w:sz w:val="20"/>
-              </w:rPr>
-              <w:t xml:space="default">66 (15.4%)</w:t>
+              <w:t xml:space="default">43 (16.4%)</w:t>
+            </w:r>
+          </w:p>
+        </w:tc>
+        <w:tc>
+          <w:tcPr>
+            <w:tcBorders>
+              <w:top w:val="single" w:space="0" w:color="D3D3D3"/>
+              <w:bottom w:val="single" w:space="0" w:color="D3D3D3"/>
+              <w:start w:val="single" w:space="0" w:color="D3D3D3"/>
+              <w:end w:val="single" w:space="0" w:color="D3D3D3"/>
+            </w:tcBorders>
+          </w:tcPr>
+          <w:p>
+            <w:pPr>
+              <w:spacing w:before="0" w:after="60"/>
+              <w:keepNext/>
+              <w:jc w:val="start"/>
+            </w:pPr>
+            <w:r>
+              <w:rPr>
+                <w:rFonts w:ascii="Calibri" w:hAnsi="Calibri"/>
+                <w:sz w:val="20"/>
+              </w:rPr>
+              <w:t xml:space="default">66 (15.6%)</w:t>
             </w:r>
           </w:p>
         </w:tc>
@@ -1241,55 +1241,55 @@
                 <w:rFonts w:ascii="Calibri" w:hAnsi="Calibri"/>
                 <w:sz w:val="20"/>
               </w:rPr>
-              <w:t xml:space="default">31 (11.6%)</w:t>
-            </w:r>
-          </w:p>
-        </w:tc>
-        <w:tc>
-          <w:tcPr>
-            <w:tcBorders>
-              <w:top w:val="single" w:space="0" w:color="D3D3D3"/>
-              <w:bottom w:val="single" w:space="0" w:color="D3D3D3"/>
-              <w:start w:val="single" w:space="0" w:color="D3D3D3"/>
-              <w:end w:val="single" w:space="0" w:color="D3D3D3"/>
-            </w:tcBorders>
-          </w:tcPr>
-          <w:p>
-            <w:pPr>
-              <w:spacing w:before="0" w:after="60"/>
-              <w:keepNext/>
-              <w:jc w:val="start"/>
-            </w:pPr>
-            <w:r>
-              <w:rPr>
-                <w:rFonts w:ascii="Calibri" w:hAnsi="Calibri"/>
-                <w:sz w:val="20"/>
-              </w:rPr>
-              <w:t xml:space="default">52 (12.2%)</w:t>
-            </w:r>
-          </w:p>
-        </w:tc>
-        <w:tc>
-          <w:tcPr>
-            <w:tcBorders>
-              <w:top w:val="single" w:space="0" w:color="D3D3D3"/>
-              <w:bottom w:val="single" w:space="0" w:color="D3D3D3"/>
-              <w:start w:val="single" w:space="0" w:color="D3D3D3"/>
-              <w:end w:val="single" w:space="0" w:color="D3D3D3"/>
-            </w:tcBorders>
-          </w:tcPr>
-          <w:p>
-            <w:pPr>
-              <w:spacing w:before="0" w:after="60"/>
-              <w:keepNext/>
-              <w:jc w:val="start"/>
-            </w:pPr>
-            <w:r>
-              <w:rPr>
-                <w:rFonts w:ascii="Calibri" w:hAnsi="Calibri"/>
-                <w:sz w:val="20"/>
-              </w:rPr>
-              <w:t xml:space="default">83</w:t>
+              <w:t xml:space="default">31 (11.7%)</w:t>
+            </w:r>
+          </w:p>
+        </w:tc>
+        <w:tc>
+          <w:tcPr>
+            <w:tcBorders>
+              <w:top w:val="single" w:space="0" w:color="D3D3D3"/>
+              <w:bottom w:val="single" w:space="0" w:color="D3D3D3"/>
+              <w:start w:val="single" w:space="0" w:color="D3D3D3"/>
+              <w:end w:val="single" w:space="0" w:color="D3D3D3"/>
+            </w:tcBorders>
+          </w:tcPr>
+          <w:p>
+            <w:pPr>
+              <w:spacing w:before="0" w:after="60"/>
+              <w:keepNext/>
+              <w:jc w:val="start"/>
+            </w:pPr>
+            <w:r>
+              <w:rPr>
+                <w:rFonts w:ascii="Calibri" w:hAnsi="Calibri"/>
+                <w:sz w:val="20"/>
+              </w:rPr>
+              <w:t xml:space="default">47 (11%)</w:t>
+            </w:r>
+          </w:p>
+        </w:tc>
+        <w:tc>
+          <w:tcPr>
+            <w:tcBorders>
+              <w:top w:val="single" w:space="0" w:color="D3D3D3"/>
+              <w:bottom w:val="single" w:space="0" w:color="D3D3D3"/>
+              <w:start w:val="single" w:space="0" w:color="D3D3D3"/>
+              <w:end w:val="single" w:space="0" w:color="D3D3D3"/>
+            </w:tcBorders>
+          </w:tcPr>
+          <w:p>
+            <w:pPr>
+              <w:spacing w:before="0" w:after="60"/>
+              <w:keepNext/>
+              <w:jc w:val="start"/>
+            </w:pPr>
+            <w:r>
+              <w:rPr>
+                <w:rFonts w:ascii="Calibri" w:hAnsi="Calibri"/>
+                <w:sz w:val="20"/>
+              </w:rPr>
+              <w:t xml:space="default">77</w:t>
             </w:r>
           </w:p>
         </w:tc>
@@ -1313,7 +1313,7 @@
                 <w:rFonts w:ascii="Calibri" w:hAnsi="Calibri"/>
                 <w:sz w:val="20"/>
               </w:rPr>
-              <w:t xml:space="default">63.1%</w:t>
+              <w:t xml:space="default">60.4%</w:t>
             </w:r>
           </w:p>
         </w:tc>
@@ -1368,7 +1368,7 @@
                 <w:sz w:val="20"/>
                 <w:b w:val="true"/>
               </w:rPr>
-              <w:t xml:space="default">42.8 ± 17.3</w:t>
+              <w:t xml:space="default">42.6 ± 17.3</w:t>
             </w:r>
           </w:p>
         </w:tc>
@@ -1626,55 +1626,55 @@
                 <w:rFonts w:ascii="Calibri" w:hAnsi="Calibri"/>
                 <w:sz w:val="20"/>
               </w:rPr>
-              <w:t xml:space="default">169 (63.8%)</w:t>
-            </w:r>
-          </w:p>
-        </w:tc>
-        <w:tc>
-          <w:tcPr>
-            <w:tcBorders>
-              <w:top w:val="single" w:space="0" w:color="D3D3D3"/>
-              <w:bottom w:val="single" w:space="0" w:color="D3D3D3"/>
-              <w:start w:val="single" w:space="0" w:color="D3D3D3"/>
-              <w:end w:val="single" w:space="0" w:color="D3D3D3"/>
-            </w:tcBorders>
-          </w:tcPr>
-          <w:p>
-            <w:pPr>
-              <w:spacing w:before="0" w:after="60"/>
-              <w:keepNext/>
-              <w:jc w:val="start"/>
-            </w:pPr>
-            <w:r>
-              <w:rPr>
-                <w:rFonts w:ascii="Calibri" w:hAnsi="Calibri"/>
-                <w:sz w:val="20"/>
-              </w:rPr>
-              <w:t xml:space="default">267 (62.3%)</w:t>
-            </w:r>
-          </w:p>
-        </w:tc>
-        <w:tc>
-          <w:tcPr>
-            <w:tcBorders>
-              <w:top w:val="single" w:space="0" w:color="D3D3D3"/>
-              <w:bottom w:val="single" w:space="0" w:color="D3D3D3"/>
-              <w:start w:val="single" w:space="0" w:color="D3D3D3"/>
-              <w:end w:val="single" w:space="0" w:color="D3D3D3"/>
-            </w:tcBorders>
-          </w:tcPr>
-          <w:p>
-            <w:pPr>
-              <w:spacing w:before="0" w:after="60"/>
-              <w:keepNext/>
-              <w:jc w:val="start"/>
-            </w:pPr>
-            <w:r>
-              <w:rPr>
-                <w:rFonts w:ascii="Calibri" w:hAnsi="Calibri"/>
-                <w:sz w:val="20"/>
-              </w:rPr>
-              <w:t xml:space="default">436 (62.9%)</w:t>
+              <w:t xml:space="default">167 (63.6%)</w:t>
+            </w:r>
+          </w:p>
+        </w:tc>
+        <w:tc>
+          <w:tcPr>
+            <w:tcBorders>
+              <w:top w:val="single" w:space="0" w:color="D3D3D3"/>
+              <w:bottom w:val="single" w:space="0" w:color="D3D3D3"/>
+              <w:start w:val="single" w:space="0" w:color="D3D3D3"/>
+              <w:end w:val="single" w:space="0" w:color="D3D3D3"/>
+            </w:tcBorders>
+          </w:tcPr>
+          <w:p>
+            <w:pPr>
+              <w:spacing w:before="0" w:after="60"/>
+              <w:keepNext/>
+              <w:jc w:val="start"/>
+            </w:pPr>
+            <w:r>
+              <w:rPr>
+                <w:rFonts w:ascii="Calibri" w:hAnsi="Calibri"/>
+                <w:sz w:val="20"/>
+              </w:rPr>
+              <w:t xml:space="default">262 (61.8%)</w:t>
+            </w:r>
+          </w:p>
+        </w:tc>
+        <w:tc>
+          <w:tcPr>
+            <w:tcBorders>
+              <w:top w:val="single" w:space="0" w:color="D3D3D3"/>
+              <w:bottom w:val="single" w:space="0" w:color="D3D3D3"/>
+              <w:start w:val="single" w:space="0" w:color="D3D3D3"/>
+              <w:end w:val="single" w:space="0" w:color="D3D3D3"/>
+            </w:tcBorders>
+          </w:tcPr>
+          <w:p>
+            <w:pPr>
+              <w:spacing w:before="0" w:after="60"/>
+              <w:keepNext/>
+              <w:jc w:val="start"/>
+            </w:pPr>
+            <w:r>
+              <w:rPr>
+                <w:rFonts w:ascii="Calibri" w:hAnsi="Calibri"/>
+                <w:sz w:val="20"/>
+              </w:rPr>
+              <w:t xml:space="default">429 (62.5%)</w:t>
             </w:r>
           </w:p>
         </w:tc>
@@ -1698,7 +1698,7 @@
                 <w:rFonts w:ascii="Calibri" w:hAnsi="Calibri"/>
                 <w:sz w:val="20"/>
               </w:rPr>
-              <w:t xml:space="default">61.3%</w:t>
+              <w:t xml:space="default">61%</w:t>
             </w:r>
           </w:p>
         </w:tc>
@@ -1751,55 +1751,55 @@
                 <w:rFonts w:ascii="Calibri" w:hAnsi="Calibri"/>
                 <w:sz w:val="20"/>
               </w:rPr>
-              <w:t xml:space="default">96 (36.2%)</w:t>
-            </w:r>
-          </w:p>
-        </w:tc>
-        <w:tc>
-          <w:tcPr>
-            <w:tcBorders>
-              <w:top w:val="single" w:space="0" w:color="D3D3D3"/>
-              <w:bottom w:val="single" w:space="0" w:color="D3D3D3"/>
-              <w:start w:val="single" w:space="0" w:color="D3D3D3"/>
-              <w:end w:val="single" w:space="0" w:color="D3D3D3"/>
-            </w:tcBorders>
-          </w:tcPr>
-          <w:p>
-            <w:pPr>
-              <w:spacing w:before="0" w:after="60"/>
-              <w:keepNext/>
-              <w:jc w:val="start"/>
-            </w:pPr>
-            <w:r>
-              <w:rPr>
-                <w:rFonts w:ascii="Calibri" w:hAnsi="Calibri"/>
-                <w:sz w:val="20"/>
-              </w:rPr>
-              <w:t xml:space="default">162 (37.7%)</w:t>
-            </w:r>
-          </w:p>
-        </w:tc>
-        <w:tc>
-          <w:tcPr>
-            <w:tcBorders>
-              <w:top w:val="single" w:space="0" w:color="D3D3D3"/>
-              <w:bottom w:val="single" w:space="0" w:color="D3D3D3"/>
-              <w:start w:val="single" w:space="0" w:color="D3D3D3"/>
-              <w:end w:val="single" w:space="0" w:color="D3D3D3"/>
-            </w:tcBorders>
-          </w:tcPr>
-          <w:p>
-            <w:pPr>
-              <w:spacing w:before="0" w:after="60"/>
-              <w:keepNext/>
-              <w:jc w:val="start"/>
-            </w:pPr>
-            <w:r>
-              <w:rPr>
-                <w:rFonts w:ascii="Calibri" w:hAnsi="Calibri"/>
-                <w:sz w:val="20"/>
-              </w:rPr>
-              <w:t xml:space="default">258 (37.1%)</w:t>
+              <w:t xml:space="default">96 (36.4%)</w:t>
+            </w:r>
+          </w:p>
+        </w:tc>
+        <w:tc>
+          <w:tcPr>
+            <w:tcBorders>
+              <w:top w:val="single" w:space="0" w:color="D3D3D3"/>
+              <w:bottom w:val="single" w:space="0" w:color="D3D3D3"/>
+              <w:start w:val="single" w:space="0" w:color="D3D3D3"/>
+              <w:end w:val="single" w:space="0" w:color="D3D3D3"/>
+            </w:tcBorders>
+          </w:tcPr>
+          <w:p>
+            <w:pPr>
+              <w:spacing w:before="0" w:after="60"/>
+              <w:keepNext/>
+              <w:jc w:val="start"/>
+            </w:pPr>
+            <w:r>
+              <w:rPr>
+                <w:rFonts w:ascii="Calibri" w:hAnsi="Calibri"/>
+                <w:sz w:val="20"/>
+              </w:rPr>
+              <w:t xml:space="default">162 (38.2%)</w:t>
+            </w:r>
+          </w:p>
+        </w:tc>
+        <w:tc>
+          <w:tcPr>
+            <w:tcBorders>
+              <w:top w:val="single" w:space="0" w:color="D3D3D3"/>
+              <w:bottom w:val="single" w:space="0" w:color="D3D3D3"/>
+              <w:start w:val="single" w:space="0" w:color="D3D3D3"/>
+              <w:end w:val="single" w:space="0" w:color="D3D3D3"/>
+            </w:tcBorders>
+          </w:tcPr>
+          <w:p>
+            <w:pPr>
+              <w:spacing w:before="0" w:after="60"/>
+              <w:keepNext/>
+              <w:jc w:val="start"/>
+            </w:pPr>
+            <w:r>
+              <w:rPr>
+                <w:rFonts w:ascii="Calibri" w:hAnsi="Calibri"/>
+                <w:sz w:val="20"/>
+              </w:rPr>
+              <w:t xml:space="default">258 (37.5%)</w:t>
             </w:r>
           </w:p>
         </w:tc>
@@ -2006,55 +2006,55 @@
                 <w:rFonts w:ascii="Calibri" w:hAnsi="Calibri"/>
                 <w:sz w:val="20"/>
               </w:rPr>
-              <w:t xml:space="default">95 (36%)</w:t>
-            </w:r>
-          </w:p>
-        </w:tc>
-        <w:tc>
-          <w:tcPr>
-            <w:tcBorders>
-              <w:top w:val="single" w:space="0" w:color="D3D3D3"/>
-              <w:bottom w:val="single" w:space="0" w:color="D3D3D3"/>
-              <w:start w:val="single" w:space="0" w:color="D3D3D3"/>
-              <w:end w:val="single" w:space="0" w:color="D3D3D3"/>
-            </w:tcBorders>
-          </w:tcPr>
-          <w:p>
-            <w:pPr>
-              <w:spacing w:before="0" w:after="60"/>
-              <w:keepNext/>
-              <w:jc w:val="start"/>
-            </w:pPr>
-            <w:r>
-              <w:rPr>
-                <w:rFonts w:ascii="Calibri" w:hAnsi="Calibri"/>
-                <w:sz w:val="20"/>
-              </w:rPr>
-              <w:t xml:space="default">123 (28.6%)</w:t>
-            </w:r>
-          </w:p>
-        </w:tc>
-        <w:tc>
-          <w:tcPr>
-            <w:tcBorders>
-              <w:top w:val="single" w:space="0" w:color="D3D3D3"/>
-              <w:bottom w:val="single" w:space="0" w:color="D3D3D3"/>
-              <w:start w:val="single" w:space="0" w:color="D3D3D3"/>
-              <w:end w:val="single" w:space="0" w:color="D3D3D3"/>
-            </w:tcBorders>
-          </w:tcPr>
-          <w:p>
-            <w:pPr>
-              <w:spacing w:before="0" w:after="60"/>
-              <w:keepNext/>
-              <w:jc w:val="start"/>
-            </w:pPr>
-            <w:r>
-              <w:rPr>
-                <w:rFonts w:ascii="Calibri" w:hAnsi="Calibri"/>
-                <w:sz w:val="20"/>
-              </w:rPr>
-              <w:t xml:space="default">218 (31.5%)</w:t>
+              <w:t xml:space="default">95 (36.3%)</w:t>
+            </w:r>
+          </w:p>
+        </w:tc>
+        <w:tc>
+          <w:tcPr>
+            <w:tcBorders>
+              <w:top w:val="single" w:space="0" w:color="D3D3D3"/>
+              <w:bottom w:val="single" w:space="0" w:color="D3D3D3"/>
+              <w:start w:val="single" w:space="0" w:color="D3D3D3"/>
+              <w:end w:val="single" w:space="0" w:color="D3D3D3"/>
+            </w:tcBorders>
+          </w:tcPr>
+          <w:p>
+            <w:pPr>
+              <w:spacing w:before="0" w:after="60"/>
+              <w:keepNext/>
+              <w:jc w:val="start"/>
+            </w:pPr>
+            <w:r>
+              <w:rPr>
+                <w:rFonts w:ascii="Calibri" w:hAnsi="Calibri"/>
+                <w:sz w:val="20"/>
+              </w:rPr>
+              <w:t xml:space="default">123 (29%)</w:t>
+            </w:r>
+          </w:p>
+        </w:tc>
+        <w:tc>
+          <w:tcPr>
+            <w:tcBorders>
+              <w:top w:val="single" w:space="0" w:color="D3D3D3"/>
+              <w:bottom w:val="single" w:space="0" w:color="D3D3D3"/>
+              <w:start w:val="single" w:space="0" w:color="D3D3D3"/>
+              <w:end w:val="single" w:space="0" w:color="D3D3D3"/>
+            </w:tcBorders>
+          </w:tcPr>
+          <w:p>
+            <w:pPr>
+              <w:spacing w:before="0" w:after="60"/>
+              <w:keepNext/>
+              <w:jc w:val="start"/>
+            </w:pPr>
+            <w:r>
+              <w:rPr>
+                <w:rFonts w:ascii="Calibri" w:hAnsi="Calibri"/>
+                <w:sz w:val="20"/>
+              </w:rPr>
+              <w:t xml:space="default">218 (31.8%)</w:t>
             </w:r>
           </w:p>
         </w:tc>
@@ -2131,55 +2131,55 @@
                 <w:rFonts w:ascii="Calibri" w:hAnsi="Calibri"/>
                 <w:sz w:val="20"/>
               </w:rPr>
-              <w:t xml:space="default">37 (13.9%)</w:t>
-            </w:r>
-          </w:p>
-        </w:tc>
-        <w:tc>
-          <w:tcPr>
-            <w:tcBorders>
-              <w:top w:val="single" w:space="0" w:color="D3D3D3"/>
-              <w:bottom w:val="single" w:space="0" w:color="D3D3D3"/>
-              <w:start w:val="single" w:space="0" w:color="D3D3D3"/>
-              <w:end w:val="single" w:space="0" w:color="D3D3D3"/>
-            </w:tcBorders>
-          </w:tcPr>
-          <w:p>
-            <w:pPr>
-              <w:spacing w:before="0" w:after="60"/>
-              <w:keepNext/>
-              <w:jc w:val="start"/>
-            </w:pPr>
-            <w:r>
-              <w:rPr>
-                <w:rFonts w:ascii="Calibri" w:hAnsi="Calibri"/>
-                <w:sz w:val="20"/>
-              </w:rPr>
-              <w:t xml:space="default">62 (14.5%)</w:t>
-            </w:r>
-          </w:p>
-        </w:tc>
-        <w:tc>
-          <w:tcPr>
-            <w:tcBorders>
-              <w:top w:val="single" w:space="0" w:color="D3D3D3"/>
-              <w:bottom w:val="single" w:space="0" w:color="D3D3D3"/>
-              <w:start w:val="single" w:space="0" w:color="D3D3D3"/>
-              <w:end w:val="single" w:space="0" w:color="D3D3D3"/>
-            </w:tcBorders>
-          </w:tcPr>
-          <w:p>
-            <w:pPr>
-              <w:spacing w:before="0" w:after="60"/>
-              <w:keepNext/>
-              <w:jc w:val="start"/>
-            </w:pPr>
-            <w:r>
-              <w:rPr>
-                <w:rFonts w:ascii="Calibri" w:hAnsi="Calibri"/>
-                <w:sz w:val="20"/>
-              </w:rPr>
-              <w:t xml:space="default">99 (14.3%)</w:t>
+              <w:t xml:space="default">37 (14%)</w:t>
+            </w:r>
+          </w:p>
+        </w:tc>
+        <w:tc>
+          <w:tcPr>
+            <w:tcBorders>
+              <w:top w:val="single" w:space="0" w:color="D3D3D3"/>
+              <w:bottom w:val="single" w:space="0" w:color="D3D3D3"/>
+              <w:start w:val="single" w:space="0" w:color="D3D3D3"/>
+              <w:end w:val="single" w:space="0" w:color="D3D3D3"/>
+            </w:tcBorders>
+          </w:tcPr>
+          <w:p>
+            <w:pPr>
+              <w:spacing w:before="0" w:after="60"/>
+              <w:keepNext/>
+              <w:jc w:val="start"/>
+            </w:pPr>
+            <w:r>
+              <w:rPr>
+                <w:rFonts w:ascii="Calibri" w:hAnsi="Calibri"/>
+                <w:sz w:val="20"/>
+              </w:rPr>
+              <w:t xml:space="default">62 (14.7%)</w:t>
+            </w:r>
+          </w:p>
+        </w:tc>
+        <w:tc>
+          <w:tcPr>
+            <w:tcBorders>
+              <w:top w:val="single" w:space="0" w:color="D3D3D3"/>
+              <w:bottom w:val="single" w:space="0" w:color="D3D3D3"/>
+              <w:start w:val="single" w:space="0" w:color="D3D3D3"/>
+              <w:end w:val="single" w:space="0" w:color="D3D3D3"/>
+            </w:tcBorders>
+          </w:tcPr>
+          <w:p>
+            <w:pPr>
+              <w:spacing w:before="0" w:after="60"/>
+              <w:keepNext/>
+              <w:jc w:val="start"/>
+            </w:pPr>
+            <w:r>
+              <w:rPr>
+                <w:rFonts w:ascii="Calibri" w:hAnsi="Calibri"/>
+                <w:sz w:val="20"/>
+              </w:rPr>
+              <w:t xml:space="default">99 (14.4%)</w:t>
             </w:r>
           </w:p>
         </w:tc>
@@ -2256,55 +2256,55 @@
                 <w:rFonts w:ascii="Calibri" w:hAnsi="Calibri"/>
                 <w:sz w:val="20"/>
               </w:rPr>
-              <w:t xml:space="default">29 (11.1%)</w:t>
-            </w:r>
-          </w:p>
-        </w:tc>
-        <w:tc>
-          <w:tcPr>
-            <w:tcBorders>
-              <w:top w:val="single" w:space="0" w:color="D3D3D3"/>
-              <w:bottom w:val="single" w:space="0" w:color="D3D3D3"/>
-              <w:start w:val="single" w:space="0" w:color="D3D3D3"/>
-              <w:end w:val="single" w:space="0" w:color="D3D3D3"/>
-            </w:tcBorders>
-          </w:tcPr>
-          <w:p>
-            <w:pPr>
-              <w:spacing w:before="0" w:after="60"/>
-              <w:keepNext/>
-              <w:jc w:val="start"/>
-            </w:pPr>
-            <w:r>
-              <w:rPr>
-                <w:rFonts w:ascii="Calibri" w:hAnsi="Calibri"/>
-                <w:sz w:val="20"/>
-              </w:rPr>
-              <w:t xml:space="default">50 (11.6%)</w:t>
-            </w:r>
-          </w:p>
-        </w:tc>
-        <w:tc>
-          <w:tcPr>
-            <w:tcBorders>
-              <w:top w:val="single" w:space="0" w:color="D3D3D3"/>
-              <w:bottom w:val="single" w:space="0" w:color="D3D3D3"/>
-              <w:start w:val="single" w:space="0" w:color="D3D3D3"/>
-              <w:end w:val="single" w:space="0" w:color="D3D3D3"/>
-            </w:tcBorders>
-          </w:tcPr>
-          <w:p>
-            <w:pPr>
-              <w:spacing w:before="0" w:after="60"/>
-              <w:keepNext/>
-              <w:jc w:val="start"/>
-            </w:pPr>
-            <w:r>
-              <w:rPr>
-                <w:rFonts w:ascii="Calibri" w:hAnsi="Calibri"/>
-                <w:sz w:val="20"/>
-              </w:rPr>
-              <w:t xml:space="default">79 (11.4%)</w:t>
+              <w:t xml:space="default">29 (11.2%)</w:t>
+            </w:r>
+          </w:p>
+        </w:tc>
+        <w:tc>
+          <w:tcPr>
+            <w:tcBorders>
+              <w:top w:val="single" w:space="0" w:color="D3D3D3"/>
+              <w:bottom w:val="single" w:space="0" w:color="D3D3D3"/>
+              <w:start w:val="single" w:space="0" w:color="D3D3D3"/>
+              <w:end w:val="single" w:space="0" w:color="D3D3D3"/>
+            </w:tcBorders>
+          </w:tcPr>
+          <w:p>
+            <w:pPr>
+              <w:spacing w:before="0" w:after="60"/>
+              <w:keepNext/>
+              <w:jc w:val="start"/>
+            </w:pPr>
+            <w:r>
+              <w:rPr>
+                <w:rFonts w:ascii="Calibri" w:hAnsi="Calibri"/>
+                <w:sz w:val="20"/>
+              </w:rPr>
+              <w:t xml:space="default">50 (11.7%)</w:t>
+            </w:r>
+          </w:p>
+        </w:tc>
+        <w:tc>
+          <w:tcPr>
+            <w:tcBorders>
+              <w:top w:val="single" w:space="0" w:color="D3D3D3"/>
+              <w:bottom w:val="single" w:space="0" w:color="D3D3D3"/>
+              <w:start w:val="single" w:space="0" w:color="D3D3D3"/>
+              <w:end w:val="single" w:space="0" w:color="D3D3D3"/>
+            </w:tcBorders>
+          </w:tcPr>
+          <w:p>
+            <w:pPr>
+              <w:spacing w:before="0" w:after="60"/>
+              <w:keepNext/>
+              <w:jc w:val="start"/>
+            </w:pPr>
+            <w:r>
+              <w:rPr>
+                <w:rFonts w:ascii="Calibri" w:hAnsi="Calibri"/>
+                <w:sz w:val="20"/>
+              </w:rPr>
+              <w:t xml:space="default">79 (11.5%)</w:t>
             </w:r>
           </w:p>
         </w:tc>
@@ -2381,55 +2381,55 @@
                 <w:rFonts w:ascii="Calibri" w:hAnsi="Calibri"/>
                 <w:sz w:val="20"/>
               </w:rPr>
-              <w:t xml:space="default">28 (10.6%)</w:t>
-            </w:r>
-          </w:p>
-        </w:tc>
-        <w:tc>
-          <w:tcPr>
-            <w:tcBorders>
-              <w:top w:val="single" w:space="0" w:color="D3D3D3"/>
-              <w:bottom w:val="single" w:space="0" w:color="D3D3D3"/>
-              <w:start w:val="single" w:space="0" w:color="D3D3D3"/>
-              <w:end w:val="single" w:space="0" w:color="D3D3D3"/>
-            </w:tcBorders>
-          </w:tcPr>
-          <w:p>
-            <w:pPr>
-              <w:spacing w:before="0" w:after="60"/>
-              <w:keepNext/>
-              <w:jc w:val="start"/>
-            </w:pPr>
-            <w:r>
-              <w:rPr>
-                <w:rFonts w:ascii="Calibri" w:hAnsi="Calibri"/>
-                <w:sz w:val="20"/>
-              </w:rPr>
-              <w:t xml:space="default">34 (8%)</w:t>
-            </w:r>
-          </w:p>
-        </w:tc>
-        <w:tc>
-          <w:tcPr>
-            <w:tcBorders>
-              <w:top w:val="single" w:space="0" w:color="D3D3D3"/>
-              <w:bottom w:val="single" w:space="0" w:color="D3D3D3"/>
-              <w:start w:val="single" w:space="0" w:color="D3D3D3"/>
-              <w:end w:val="single" w:space="0" w:color="D3D3D3"/>
-            </w:tcBorders>
-          </w:tcPr>
-          <w:p>
-            <w:pPr>
-              <w:spacing w:before="0" w:after="60"/>
-              <w:keepNext/>
-              <w:jc w:val="start"/>
-            </w:pPr>
-            <w:r>
-              <w:rPr>
-                <w:rFonts w:ascii="Calibri" w:hAnsi="Calibri"/>
-                <w:sz w:val="20"/>
-              </w:rPr>
-              <w:t xml:space="default">62 (9%)</w:t>
+              <w:t xml:space="default">26 (10%)</w:t>
+            </w:r>
+          </w:p>
+        </w:tc>
+        <w:tc>
+          <w:tcPr>
+            <w:tcBorders>
+              <w:top w:val="single" w:space="0" w:color="D3D3D3"/>
+              <w:bottom w:val="single" w:space="0" w:color="D3D3D3"/>
+              <w:start w:val="single" w:space="0" w:color="D3D3D3"/>
+              <w:end w:val="single" w:space="0" w:color="D3D3D3"/>
+            </w:tcBorders>
+          </w:tcPr>
+          <w:p>
+            <w:pPr>
+              <w:spacing w:before="0" w:after="60"/>
+              <w:keepNext/>
+              <w:jc w:val="start"/>
+            </w:pPr>
+            <w:r>
+              <w:rPr>
+                <w:rFonts w:ascii="Calibri" w:hAnsi="Calibri"/>
+                <w:sz w:val="20"/>
+              </w:rPr>
+              <w:t xml:space="default">34 (8.1%)</w:t>
+            </w:r>
+          </w:p>
+        </w:tc>
+        <w:tc>
+          <w:tcPr>
+            <w:tcBorders>
+              <w:top w:val="single" w:space="0" w:color="D3D3D3"/>
+              <w:bottom w:val="single" w:space="0" w:color="D3D3D3"/>
+              <w:start w:val="single" w:space="0" w:color="D3D3D3"/>
+              <w:end w:val="single" w:space="0" w:color="D3D3D3"/>
+            </w:tcBorders>
+          </w:tcPr>
+          <w:p>
+            <w:pPr>
+              <w:spacing w:before="0" w:after="60"/>
+              <w:keepNext/>
+              <w:jc w:val="start"/>
+            </w:pPr>
+            <w:r>
+              <w:rPr>
+                <w:rFonts w:ascii="Calibri" w:hAnsi="Calibri"/>
+                <w:sz w:val="20"/>
+              </w:rPr>
+              <w:t xml:space="default">61 (8.9%)</w:t>
             </w:r>
           </w:p>
         </w:tc>
@@ -2453,7 +2453,7 @@
                 <w:rFonts w:ascii="Calibri" w:hAnsi="Calibri"/>
                 <w:sz w:val="20"/>
               </w:rPr>
-              <w:t xml:space="default">55.2%</w:t>
+              <w:t xml:space="default">56.6%</w:t>
             </w:r>
           </w:p>
         </w:tc>
@@ -2506,55 +2506,55 @@
                 <w:rFonts w:ascii="Calibri" w:hAnsi="Calibri"/>
                 <w:sz w:val="20"/>
               </w:rPr>
-              <w:t xml:space="default">35 (13.4%)</w:t>
-            </w:r>
-          </w:p>
-        </w:tc>
-        <w:tc>
-          <w:tcPr>
-            <w:tcBorders>
-              <w:top w:val="single" w:space="0" w:color="D3D3D3"/>
-              <w:bottom w:val="single" w:space="0" w:color="D3D3D3"/>
-              <w:start w:val="single" w:space="0" w:color="D3D3D3"/>
-              <w:end w:val="single" w:space="0" w:color="D3D3D3"/>
-            </w:tcBorders>
-          </w:tcPr>
-          <w:p>
-            <w:pPr>
-              <w:spacing w:before="0" w:after="60"/>
-              <w:keepNext/>
-              <w:jc w:val="start"/>
-            </w:pPr>
-            <w:r>
-              <w:rPr>
-                <w:rFonts w:ascii="Calibri" w:hAnsi="Calibri"/>
-                <w:sz w:val="20"/>
-              </w:rPr>
-              <w:t xml:space="default">35 (8.1%)</w:t>
-            </w:r>
-          </w:p>
-        </w:tc>
-        <w:tc>
-          <w:tcPr>
-            <w:tcBorders>
-              <w:top w:val="single" w:space="0" w:color="D3D3D3"/>
-              <w:bottom w:val="single" w:space="0" w:color="D3D3D3"/>
-              <w:start w:val="single" w:space="0" w:color="D3D3D3"/>
-              <w:end w:val="single" w:space="0" w:color="D3D3D3"/>
-            </w:tcBorders>
-          </w:tcPr>
-          <w:p>
-            <w:pPr>
-              <w:spacing w:before="0" w:after="60"/>
-              <w:keepNext/>
-              <w:jc w:val="start"/>
-            </w:pPr>
-            <w:r>
-              <w:rPr>
-                <w:rFonts w:ascii="Calibri" w:hAnsi="Calibri"/>
-                <w:sz w:val="20"/>
-              </w:rPr>
-              <w:t xml:space="default">70 (10.1%)</w:t>
+              <w:t xml:space="default">35 (13.5%)</w:t>
+            </w:r>
+          </w:p>
+        </w:tc>
+        <w:tc>
+          <w:tcPr>
+            <w:tcBorders>
+              <w:top w:val="single" w:space="0" w:color="D3D3D3"/>
+              <w:bottom w:val="single" w:space="0" w:color="D3D3D3"/>
+              <w:start w:val="single" w:space="0" w:color="D3D3D3"/>
+              <w:end w:val="single" w:space="0" w:color="D3D3D3"/>
+            </w:tcBorders>
+          </w:tcPr>
+          <w:p>
+            <w:pPr>
+              <w:spacing w:before="0" w:after="60"/>
+              <w:keepNext/>
+              <w:jc w:val="start"/>
+            </w:pPr>
+            <w:r>
+              <w:rPr>
+                <w:rFonts w:ascii="Calibri" w:hAnsi="Calibri"/>
+                <w:sz w:val="20"/>
+              </w:rPr>
+              <w:t xml:space="default">35 (8.2%)</w:t>
+            </w:r>
+          </w:p>
+        </w:tc>
+        <w:tc>
+          <w:tcPr>
+            <w:tcBorders>
+              <w:top w:val="single" w:space="0" w:color="D3D3D3"/>
+              <w:bottom w:val="single" w:space="0" w:color="D3D3D3"/>
+              <w:start w:val="single" w:space="0" w:color="D3D3D3"/>
+              <w:end w:val="single" w:space="0" w:color="D3D3D3"/>
+            </w:tcBorders>
+          </w:tcPr>
+          <w:p>
+            <w:pPr>
+              <w:spacing w:before="0" w:after="60"/>
+              <w:keepNext/>
+              <w:jc w:val="start"/>
+            </w:pPr>
+            <w:r>
+              <w:rPr>
+                <w:rFonts w:ascii="Calibri" w:hAnsi="Calibri"/>
+                <w:sz w:val="20"/>
+              </w:rPr>
+              <w:t xml:space="default">70 (10.2%)</w:t>
             </w:r>
           </w:p>
         </w:tc>
@@ -2761,55 +2761,55 @@
                 <w:rFonts w:ascii="Calibri" w:hAnsi="Calibri"/>
                 <w:sz w:val="20"/>
               </w:rPr>
-              <w:t xml:space="default">134 (50.8%)</w:t>
-            </w:r>
-          </w:p>
-        </w:tc>
-        <w:tc>
-          <w:tcPr>
-            <w:tcBorders>
-              <w:top w:val="single" w:space="0" w:color="D3D3D3"/>
-              <w:bottom w:val="single" w:space="0" w:color="D3D3D3"/>
-              <w:start w:val="single" w:space="0" w:color="D3D3D3"/>
-              <w:end w:val="single" w:space="0" w:color="D3D3D3"/>
-            </w:tcBorders>
-          </w:tcPr>
-          <w:p>
-            <w:pPr>
-              <w:spacing w:before="0" w:after="60"/>
-              <w:keepNext/>
-              <w:jc w:val="start"/>
-            </w:pPr>
-            <w:r>
-              <w:rPr>
-                <w:rFonts w:ascii="Calibri" w:hAnsi="Calibri"/>
-                <w:sz w:val="20"/>
-              </w:rPr>
-              <w:t xml:space="default">139 (32.4%)</w:t>
-            </w:r>
-          </w:p>
-        </w:tc>
-        <w:tc>
-          <w:tcPr>
-            <w:tcBorders>
-              <w:top w:val="single" w:space="0" w:color="D3D3D3"/>
-              <w:bottom w:val="single" w:space="0" w:color="D3D3D3"/>
-              <w:start w:val="single" w:space="0" w:color="D3D3D3"/>
-              <w:end w:val="single" w:space="0" w:color="D3D3D3"/>
-            </w:tcBorders>
-          </w:tcPr>
-          <w:p>
-            <w:pPr>
-              <w:spacing w:before="0" w:after="60"/>
-              <w:keepNext/>
-              <w:jc w:val="start"/>
-            </w:pPr>
-            <w:r>
-              <w:rPr>
-                <w:rFonts w:ascii="Calibri" w:hAnsi="Calibri"/>
-                <w:sz w:val="20"/>
-              </w:rPr>
-              <w:t xml:space="default">273 (39.4%)</w:t>
+              <w:t xml:space="default">134 (51.1%)</w:t>
+            </w:r>
+          </w:p>
+        </w:tc>
+        <w:tc>
+          <w:tcPr>
+            <w:tcBorders>
+              <w:top w:val="single" w:space="0" w:color="D3D3D3"/>
+              <w:bottom w:val="single" w:space="0" w:color="D3D3D3"/>
+              <w:start w:val="single" w:space="0" w:color="D3D3D3"/>
+              <w:end w:val="single" w:space="0" w:color="D3D3D3"/>
+            </w:tcBorders>
+          </w:tcPr>
+          <w:p>
+            <w:pPr>
+              <w:spacing w:before="0" w:after="60"/>
+              <w:keepNext/>
+              <w:jc w:val="start"/>
+            </w:pPr>
+            <w:r>
+              <w:rPr>
+                <w:rFonts w:ascii="Calibri" w:hAnsi="Calibri"/>
+                <w:sz w:val="20"/>
+              </w:rPr>
+              <w:t xml:space="default">139 (32.8%)</w:t>
+            </w:r>
+          </w:p>
+        </w:tc>
+        <w:tc>
+          <w:tcPr>
+            <w:tcBorders>
+              <w:top w:val="single" w:space="0" w:color="D3D3D3"/>
+              <w:bottom w:val="single" w:space="0" w:color="D3D3D3"/>
+              <w:start w:val="single" w:space="0" w:color="D3D3D3"/>
+              <w:end w:val="single" w:space="0" w:color="D3D3D3"/>
+            </w:tcBorders>
+          </w:tcPr>
+          <w:p>
+            <w:pPr>
+              <w:spacing w:before="0" w:after="60"/>
+              <w:keepNext/>
+              <w:jc w:val="start"/>
+            </w:pPr>
+            <w:r>
+              <w:rPr>
+                <w:rFonts w:ascii="Calibri" w:hAnsi="Calibri"/>
+                <w:sz w:val="20"/>
+              </w:rPr>
+              <w:t xml:space="default">273 (39.8%)</w:t>
             </w:r>
           </w:p>
         </w:tc>
@@ -2886,55 +2886,55 @@
                 <w:rFonts w:ascii="Calibri" w:hAnsi="Calibri"/>
                 <w:sz w:val="20"/>
               </w:rPr>
-              <w:t xml:space="default">27 (10.3%)</w:t>
-            </w:r>
-          </w:p>
-        </w:tc>
-        <w:tc>
-          <w:tcPr>
-            <w:tcBorders>
-              <w:top w:val="single" w:space="0" w:color="D3D3D3"/>
-              <w:bottom w:val="single" w:space="0" w:color="D3D3D3"/>
-              <w:start w:val="single" w:space="0" w:color="D3D3D3"/>
-              <w:end w:val="single" w:space="0" w:color="D3D3D3"/>
-            </w:tcBorders>
-          </w:tcPr>
-          <w:p>
-            <w:pPr>
-              <w:spacing w:before="0" w:after="60"/>
-              <w:keepNext/>
-              <w:jc w:val="start"/>
-            </w:pPr>
-            <w:r>
-              <w:rPr>
-                <w:rFonts w:ascii="Calibri" w:hAnsi="Calibri"/>
-                <w:sz w:val="20"/>
-              </w:rPr>
-              <w:t xml:space="default">48 (11.1%)</w:t>
-            </w:r>
-          </w:p>
-        </w:tc>
-        <w:tc>
-          <w:tcPr>
-            <w:tcBorders>
-              <w:top w:val="single" w:space="0" w:color="D3D3D3"/>
-              <w:bottom w:val="single" w:space="0" w:color="D3D3D3"/>
-              <w:start w:val="single" w:space="0" w:color="D3D3D3"/>
-              <w:end w:val="single" w:space="0" w:color="D3D3D3"/>
-            </w:tcBorders>
-          </w:tcPr>
-          <w:p>
-            <w:pPr>
-              <w:spacing w:before="0" w:after="60"/>
-              <w:keepNext/>
-              <w:jc w:val="start"/>
-            </w:pPr>
-            <w:r>
-              <w:rPr>
-                <w:rFonts w:ascii="Calibri" w:hAnsi="Calibri"/>
-                <w:sz w:val="20"/>
-              </w:rPr>
-              <w:t xml:space="default">75 (10.8%)</w:t>
+              <w:t xml:space="default">27 (10.4%)</w:t>
+            </w:r>
+          </w:p>
+        </w:tc>
+        <w:tc>
+          <w:tcPr>
+            <w:tcBorders>
+              <w:top w:val="single" w:space="0" w:color="D3D3D3"/>
+              <w:bottom w:val="single" w:space="0" w:color="D3D3D3"/>
+              <w:start w:val="single" w:space="0" w:color="D3D3D3"/>
+              <w:end w:val="single" w:space="0" w:color="D3D3D3"/>
+            </w:tcBorders>
+          </w:tcPr>
+          <w:p>
+            <w:pPr>
+              <w:spacing w:before="0" w:after="60"/>
+              <w:keepNext/>
+              <w:jc w:val="start"/>
+            </w:pPr>
+            <w:r>
+              <w:rPr>
+                <w:rFonts w:ascii="Calibri" w:hAnsi="Calibri"/>
+                <w:sz w:val="20"/>
+              </w:rPr>
+              <w:t xml:space="default">48 (11.3%)</w:t>
+            </w:r>
+          </w:p>
+        </w:tc>
+        <w:tc>
+          <w:tcPr>
+            <w:tcBorders>
+              <w:top w:val="single" w:space="0" w:color="D3D3D3"/>
+              <w:bottom w:val="single" w:space="0" w:color="D3D3D3"/>
+              <w:start w:val="single" w:space="0" w:color="D3D3D3"/>
+              <w:end w:val="single" w:space="0" w:color="D3D3D3"/>
+            </w:tcBorders>
+          </w:tcPr>
+          <w:p>
+            <w:pPr>
+              <w:spacing w:before="0" w:after="60"/>
+              <w:keepNext/>
+              <w:jc w:val="start"/>
+            </w:pPr>
+            <w:r>
+              <w:rPr>
+                <w:rFonts w:ascii="Calibri" w:hAnsi="Calibri"/>
+                <w:sz w:val="20"/>
+              </w:rPr>
+              <w:t xml:space="default">75 (10.9%)</w:t>
             </w:r>
           </w:p>
         </w:tc>
@@ -3011,55 +3011,55 @@
                 <w:rFonts w:ascii="Calibri" w:hAnsi="Calibri"/>
                 <w:sz w:val="20"/>
               </w:rPr>
-              <w:t xml:space="default">27 (10.1%)</w:t>
-            </w:r>
-          </w:p>
-        </w:tc>
-        <w:tc>
-          <w:tcPr>
-            <w:tcBorders>
-              <w:top w:val="single" w:space="0" w:color="D3D3D3"/>
-              <w:bottom w:val="single" w:space="0" w:color="D3D3D3"/>
-              <w:start w:val="single" w:space="0" w:color="D3D3D3"/>
-              <w:end w:val="single" w:space="0" w:color="D3D3D3"/>
-            </w:tcBorders>
-          </w:tcPr>
-          <w:p>
-            <w:pPr>
-              <w:spacing w:before="0" w:after="60"/>
-              <w:keepNext/>
-              <w:jc w:val="start"/>
-            </w:pPr>
-            <w:r>
-              <w:rPr>
-                <w:rFonts w:ascii="Calibri" w:hAnsi="Calibri"/>
-                <w:sz w:val="20"/>
-              </w:rPr>
-              <w:t xml:space="default">40 (9.3%)</w:t>
-            </w:r>
-          </w:p>
-        </w:tc>
-        <w:tc>
-          <w:tcPr>
-            <w:tcBorders>
-              <w:top w:val="single" w:space="0" w:color="D3D3D3"/>
-              <w:bottom w:val="single" w:space="0" w:color="D3D3D3"/>
-              <w:start w:val="single" w:space="0" w:color="D3D3D3"/>
-              <w:end w:val="single" w:space="0" w:color="D3D3D3"/>
-            </w:tcBorders>
-          </w:tcPr>
-          <w:p>
-            <w:pPr>
-              <w:spacing w:before="0" w:after="60"/>
-              <w:keepNext/>
-              <w:jc w:val="start"/>
-            </w:pPr>
-            <w:r>
-              <w:rPr>
-                <w:rFonts w:ascii="Calibri" w:hAnsi="Calibri"/>
-                <w:sz w:val="20"/>
-              </w:rPr>
-              <w:t xml:space="default">67 (9.6%)</w:t>
+              <w:t xml:space="default">27 (10.2%)</w:t>
+            </w:r>
+          </w:p>
+        </w:tc>
+        <w:tc>
+          <w:tcPr>
+            <w:tcBorders>
+              <w:top w:val="single" w:space="0" w:color="D3D3D3"/>
+              <w:bottom w:val="single" w:space="0" w:color="D3D3D3"/>
+              <w:start w:val="single" w:space="0" w:color="D3D3D3"/>
+              <w:end w:val="single" w:space="0" w:color="D3D3D3"/>
+            </w:tcBorders>
+          </w:tcPr>
+          <w:p>
+            <w:pPr>
+              <w:spacing w:before="0" w:after="60"/>
+              <w:keepNext/>
+              <w:jc w:val="start"/>
+            </w:pPr>
+            <w:r>
+              <w:rPr>
+                <w:rFonts w:ascii="Calibri" w:hAnsi="Calibri"/>
+                <w:sz w:val="20"/>
+              </w:rPr>
+              <w:t xml:space="default">40 (9.5%)</w:t>
+            </w:r>
+          </w:p>
+        </w:tc>
+        <w:tc>
+          <w:tcPr>
+            <w:tcBorders>
+              <w:top w:val="single" w:space="0" w:color="D3D3D3"/>
+              <w:bottom w:val="single" w:space="0" w:color="D3D3D3"/>
+              <w:start w:val="single" w:space="0" w:color="D3D3D3"/>
+              <w:end w:val="single" w:space="0" w:color="D3D3D3"/>
+            </w:tcBorders>
+          </w:tcPr>
+          <w:p>
+            <w:pPr>
+              <w:spacing w:before="0" w:after="60"/>
+              <w:keepNext/>
+              <w:jc w:val="start"/>
+            </w:pPr>
+            <w:r>
+              <w:rPr>
+                <w:rFonts w:ascii="Calibri" w:hAnsi="Calibri"/>
+                <w:sz w:val="20"/>
+              </w:rPr>
+              <w:t xml:space="default">67 (9.7%)</w:t>
             </w:r>
           </w:p>
         </w:tc>
@@ -3160,31 +3160,31 @@
                 <w:rFonts w:ascii="Calibri" w:hAnsi="Calibri"/>
                 <w:sz w:val="20"/>
               </w:rPr>
-              <w:t xml:space="default">24 (5.5%)</w:t>
-            </w:r>
-          </w:p>
-        </w:tc>
-        <w:tc>
-          <w:tcPr>
-            <w:tcBorders>
-              <w:top w:val="single" w:space="0" w:color="D3D3D3"/>
-              <w:bottom w:val="single" w:space="0" w:color="D3D3D3"/>
-              <w:start w:val="single" w:space="0" w:color="D3D3D3"/>
-              <w:end w:val="single" w:space="0" w:color="D3D3D3"/>
-            </w:tcBorders>
-          </w:tcPr>
-          <w:p>
-            <w:pPr>
-              <w:spacing w:before="0" w:after="60"/>
-              <w:keepNext/>
-              <w:jc w:val="start"/>
-            </w:pPr>
-            <w:r>
-              <w:rPr>
-                <w:rFonts w:ascii="Calibri" w:hAnsi="Calibri"/>
-                <w:sz w:val="20"/>
-              </w:rPr>
-              <w:t xml:space="default">30 (4.3%)</w:t>
+              <w:t xml:space="default">24 (5.6%)</w:t>
+            </w:r>
+          </w:p>
+        </w:tc>
+        <w:tc>
+          <w:tcPr>
+            <w:tcBorders>
+              <w:top w:val="single" w:space="0" w:color="D3D3D3"/>
+              <w:bottom w:val="single" w:space="0" w:color="D3D3D3"/>
+              <w:start w:val="single" w:space="0" w:color="D3D3D3"/>
+              <w:end w:val="single" w:space="0" w:color="D3D3D3"/>
+            </w:tcBorders>
+          </w:tcPr>
+          <w:p>
+            <w:pPr>
+              <w:spacing w:before="0" w:after="60"/>
+              <w:keepNext/>
+              <w:jc w:val="start"/>
+            </w:pPr>
+            <w:r>
+              <w:rPr>
+                <w:rFonts w:ascii="Calibri" w:hAnsi="Calibri"/>
+                <w:sz w:val="20"/>
+              </w:rPr>
+              <w:t xml:space="default">30 (4.4%)</w:t>
             </w:r>
           </w:p>
         </w:tc>
@@ -3391,55 +3391,55 @@
                 <w:rFonts w:ascii="Calibri" w:hAnsi="Calibri"/>
                 <w:sz w:val="20"/>
               </w:rPr>
-              <w:t xml:space="default">67 (25.2%)</w:t>
-            </w:r>
-          </w:p>
-        </w:tc>
-        <w:tc>
-          <w:tcPr>
-            <w:tcBorders>
-              <w:top w:val="single" w:space="0" w:color="D3D3D3"/>
-              <w:bottom w:val="single" w:space="0" w:color="D3D3D3"/>
-              <w:start w:val="single" w:space="0" w:color="D3D3D3"/>
-              <w:end w:val="single" w:space="0" w:color="D3D3D3"/>
-            </w:tcBorders>
-          </w:tcPr>
-          <w:p>
-            <w:pPr>
-              <w:spacing w:before="0" w:after="60"/>
-              <w:keepNext/>
-              <w:jc w:val="start"/>
-            </w:pPr>
-            <w:r>
-              <w:rPr>
-                <w:rFonts w:ascii="Calibri" w:hAnsi="Calibri"/>
-                <w:sz w:val="20"/>
-              </w:rPr>
-              <w:t xml:space="default">111 (25.9%)</w:t>
-            </w:r>
-          </w:p>
-        </w:tc>
-        <w:tc>
-          <w:tcPr>
-            <w:tcBorders>
-              <w:top w:val="single" w:space="0" w:color="D3D3D3"/>
-              <w:bottom w:val="single" w:space="0" w:color="D3D3D3"/>
-              <w:start w:val="single" w:space="0" w:color="D3D3D3"/>
-              <w:end w:val="single" w:space="0" w:color="D3D3D3"/>
-            </w:tcBorders>
-          </w:tcPr>
-          <w:p>
-            <w:pPr>
-              <w:spacing w:before="0" w:after="60"/>
-              <w:keepNext/>
-              <w:jc w:val="start"/>
-            </w:pPr>
-            <w:r>
-              <w:rPr>
-                <w:rFonts w:ascii="Calibri" w:hAnsi="Calibri"/>
-                <w:sz w:val="20"/>
-              </w:rPr>
-              <w:t xml:space="default">178 (25.6%)</w:t>
+              <w:t xml:space="default">67 (25.4%)</w:t>
+            </w:r>
+          </w:p>
+        </w:tc>
+        <w:tc>
+          <w:tcPr>
+            <w:tcBorders>
+              <w:top w:val="single" w:space="0" w:color="D3D3D3"/>
+              <w:bottom w:val="single" w:space="0" w:color="D3D3D3"/>
+              <w:start w:val="single" w:space="0" w:color="D3D3D3"/>
+              <w:end w:val="single" w:space="0" w:color="D3D3D3"/>
+            </w:tcBorders>
+          </w:tcPr>
+          <w:p>
+            <w:pPr>
+              <w:spacing w:before="0" w:after="60"/>
+              <w:keepNext/>
+              <w:jc w:val="start"/>
+            </w:pPr>
+            <w:r>
+              <w:rPr>
+                <w:rFonts w:ascii="Calibri" w:hAnsi="Calibri"/>
+                <w:sz w:val="20"/>
+              </w:rPr>
+              <w:t xml:space="default">105 (24.9%)</w:t>
+            </w:r>
+          </w:p>
+        </w:tc>
+        <w:tc>
+          <w:tcPr>
+            <w:tcBorders>
+              <w:top w:val="single" w:space="0" w:color="D3D3D3"/>
+              <w:bottom w:val="single" w:space="0" w:color="D3D3D3"/>
+              <w:start w:val="single" w:space="0" w:color="D3D3D3"/>
+              <w:end w:val="single" w:space="0" w:color="D3D3D3"/>
+            </w:tcBorders>
+          </w:tcPr>
+          <w:p>
+            <w:pPr>
+              <w:spacing w:before="0" w:after="60"/>
+              <w:keepNext/>
+              <w:jc w:val="start"/>
+            </w:pPr>
+            <w:r>
+              <w:rPr>
+                <w:rFonts w:ascii="Calibri" w:hAnsi="Calibri"/>
+                <w:sz w:val="20"/>
+              </w:rPr>
+              <w:t xml:space="default">172 (25.1%)</w:t>
             </w:r>
           </w:p>
         </w:tc>
@@ -3463,7 +3463,7 @@
                 <w:rFonts w:ascii="Calibri" w:hAnsi="Calibri"/>
                 <w:sz w:val="20"/>
               </w:rPr>
-              <w:t xml:space="default">62.5%</w:t>
+              <w:t xml:space="default">61.2%</w:t>
             </w:r>
           </w:p>
         </w:tc>
@@ -3516,55 +3516,55 @@
                 <w:rFonts w:ascii="Calibri" w:hAnsi="Calibri"/>
                 <w:sz w:val="20"/>
               </w:rPr>
-              <w:t xml:space="default">74 (28%)</w:t>
-            </w:r>
-          </w:p>
-        </w:tc>
-        <w:tc>
-          <w:tcPr>
-            <w:tcBorders>
-              <w:top w:val="single" w:space="0" w:color="D3D3D3"/>
-              <w:bottom w:val="single" w:space="0" w:color="D3D3D3"/>
-              <w:start w:val="single" w:space="0" w:color="D3D3D3"/>
-              <w:end w:val="single" w:space="0" w:color="D3D3D3"/>
-            </w:tcBorders>
-          </w:tcPr>
-          <w:p>
-            <w:pPr>
-              <w:spacing w:before="0" w:after="60"/>
-              <w:keepNext/>
-              <w:jc w:val="start"/>
-            </w:pPr>
-            <w:r>
-              <w:rPr>
-                <w:rFonts w:ascii="Calibri" w:hAnsi="Calibri"/>
-                <w:sz w:val="20"/>
-              </w:rPr>
-              <w:t xml:space="default">85 (19.7%)</w:t>
-            </w:r>
-          </w:p>
-        </w:tc>
-        <w:tc>
-          <w:tcPr>
-            <w:tcBorders>
-              <w:top w:val="single" w:space="0" w:color="D3D3D3"/>
-              <w:bottom w:val="single" w:space="0" w:color="D3D3D3"/>
-              <w:start w:val="single" w:space="0" w:color="D3D3D3"/>
-              <w:end w:val="single" w:space="0" w:color="D3D3D3"/>
-            </w:tcBorders>
-          </w:tcPr>
-          <w:p>
-            <w:pPr>
-              <w:spacing w:before="0" w:after="60"/>
-              <w:keepNext/>
-              <w:jc w:val="start"/>
-            </w:pPr>
-            <w:r>
-              <w:rPr>
-                <w:rFonts w:ascii="Calibri" w:hAnsi="Calibri"/>
-                <w:sz w:val="20"/>
-              </w:rPr>
-              <w:t xml:space="default">159 (22.9%)</w:t>
+              <w:t xml:space="default">73 (27.6%)</w:t>
+            </w:r>
+          </w:p>
+        </w:tc>
+        <w:tc>
+          <w:tcPr>
+            <w:tcBorders>
+              <w:top w:val="single" w:space="0" w:color="D3D3D3"/>
+              <w:bottom w:val="single" w:space="0" w:color="D3D3D3"/>
+              <w:start w:val="single" w:space="0" w:color="D3D3D3"/>
+              <w:end w:val="single" w:space="0" w:color="D3D3D3"/>
+            </w:tcBorders>
+          </w:tcPr>
+          <w:p>
+            <w:pPr>
+              <w:spacing w:before="0" w:after="60"/>
+              <w:keepNext/>
+              <w:jc w:val="start"/>
+            </w:pPr>
+            <w:r>
+              <w:rPr>
+                <w:rFonts w:ascii="Calibri" w:hAnsi="Calibri"/>
+                <w:sz w:val="20"/>
+              </w:rPr>
+              <w:t xml:space="default">85 (20%)</w:t>
+            </w:r>
+          </w:p>
+        </w:tc>
+        <w:tc>
+          <w:tcPr>
+            <w:tcBorders>
+              <w:top w:val="single" w:space="0" w:color="D3D3D3"/>
+              <w:bottom w:val="single" w:space="0" w:color="D3D3D3"/>
+              <w:start w:val="single" w:space="0" w:color="D3D3D3"/>
+              <w:end w:val="single" w:space="0" w:color="D3D3D3"/>
+            </w:tcBorders>
+          </w:tcPr>
+          <w:p>
+            <w:pPr>
+              <w:spacing w:before="0" w:after="60"/>
+              <w:keepNext/>
+              <w:jc w:val="start"/>
+            </w:pPr>
+            <w:r>
+              <w:rPr>
+                <w:rFonts w:ascii="Calibri" w:hAnsi="Calibri"/>
+                <w:sz w:val="20"/>
+              </w:rPr>
+              <w:t xml:space="default">157 (22.9%)</w:t>
             </w:r>
           </w:p>
         </w:tc>
@@ -3588,7 +3588,7 @@
                 <w:rFonts w:ascii="Calibri" w:hAnsi="Calibri"/>
                 <w:sz w:val="20"/>
               </w:rPr>
-              <w:t xml:space="default">53.3%</w:t>
+              <w:t xml:space="default">53.8%</w:t>
             </w:r>
           </w:p>
         </w:tc>
@@ -3641,55 +3641,55 @@
                 <w:rFonts w:ascii="Calibri" w:hAnsi="Calibri"/>
                 <w:sz w:val="20"/>
               </w:rPr>
-              <w:t xml:space="default">58 (22%)</w:t>
-            </w:r>
-          </w:p>
-        </w:tc>
-        <w:tc>
-          <w:tcPr>
-            <w:tcBorders>
-              <w:top w:val="single" w:space="0" w:color="D3D3D3"/>
-              <w:bottom w:val="single" w:space="0" w:color="D3D3D3"/>
-              <w:start w:val="single" w:space="0" w:color="D3D3D3"/>
-              <w:end w:val="single" w:space="0" w:color="D3D3D3"/>
-            </w:tcBorders>
-          </w:tcPr>
-          <w:p>
-            <w:pPr>
-              <w:spacing w:before="0" w:after="60"/>
-              <w:keepNext/>
-              <w:jc w:val="start"/>
-            </w:pPr>
-            <w:r>
-              <w:rPr>
-                <w:rFonts w:ascii="Calibri" w:hAnsi="Calibri"/>
-                <w:sz w:val="20"/>
-              </w:rPr>
-              <w:t xml:space="default">100 (23.3%)</w:t>
-            </w:r>
-          </w:p>
-        </w:tc>
-        <w:tc>
-          <w:tcPr>
-            <w:tcBorders>
-              <w:top w:val="single" w:space="0" w:color="D3D3D3"/>
-              <w:bottom w:val="single" w:space="0" w:color="D3D3D3"/>
-              <w:start w:val="single" w:space="0" w:color="D3D3D3"/>
-              <w:end w:val="single" w:space="0" w:color="D3D3D3"/>
-            </w:tcBorders>
-          </w:tcPr>
-          <w:p>
-            <w:pPr>
-              <w:spacing w:before="0" w:after="60"/>
-              <w:keepNext/>
-              <w:jc w:val="start"/>
-            </w:pPr>
-            <w:r>
-              <w:rPr>
-                <w:rFonts w:ascii="Calibri" w:hAnsi="Calibri"/>
-                <w:sz w:val="20"/>
-              </w:rPr>
-              <w:t xml:space="default">158 (22.8%)</w:t>
+              <w:t xml:space="default">58 (22.1%)</w:t>
+            </w:r>
+          </w:p>
+        </w:tc>
+        <w:tc>
+          <w:tcPr>
+            <w:tcBorders>
+              <w:top w:val="single" w:space="0" w:color="D3D3D3"/>
+              <w:bottom w:val="single" w:space="0" w:color="D3D3D3"/>
+              <w:start w:val="single" w:space="0" w:color="D3D3D3"/>
+              <w:end w:val="single" w:space="0" w:color="D3D3D3"/>
+            </w:tcBorders>
+          </w:tcPr>
+          <w:p>
+            <w:pPr>
+              <w:spacing w:before="0" w:after="60"/>
+              <w:keepNext/>
+              <w:jc w:val="start"/>
+            </w:pPr>
+            <w:r>
+              <w:rPr>
+                <w:rFonts w:ascii="Calibri" w:hAnsi="Calibri"/>
+                <w:sz w:val="20"/>
+              </w:rPr>
+              <w:t xml:space="default">100 (23.6%)</w:t>
+            </w:r>
+          </w:p>
+        </w:tc>
+        <w:tc>
+          <w:tcPr>
+            <w:tcBorders>
+              <w:top w:val="single" w:space="0" w:color="D3D3D3"/>
+              <w:bottom w:val="single" w:space="0" w:color="D3D3D3"/>
+              <w:start w:val="single" w:space="0" w:color="D3D3D3"/>
+              <w:end w:val="single" w:space="0" w:color="D3D3D3"/>
+            </w:tcBorders>
+          </w:tcPr>
+          <w:p>
+            <w:pPr>
+              <w:spacing w:before="0" w:after="60"/>
+              <w:keepNext/>
+              <w:jc w:val="start"/>
+            </w:pPr>
+            <w:r>
+              <w:rPr>
+                <w:rFonts w:ascii="Calibri" w:hAnsi="Calibri"/>
+                <w:sz w:val="20"/>
+              </w:rPr>
+              <w:t xml:space="default">158 (23.1%)</w:t>
             </w:r>
           </w:p>
         </w:tc>
@@ -3766,55 +3766,55 @@
                 <w:rFonts w:ascii="Calibri" w:hAnsi="Calibri"/>
                 <w:sz w:val="20"/>
               </w:rPr>
-              <w:t xml:space="default">62 (23.6%)</w:t>
-            </w:r>
-          </w:p>
-        </w:tc>
-        <w:tc>
-          <w:tcPr>
-            <w:tcBorders>
-              <w:top w:val="single" w:space="0" w:color="D3D3D3"/>
-              <w:bottom w:val="single" w:space="0" w:color="D3D3D3"/>
-              <w:start w:val="single" w:space="0" w:color="D3D3D3"/>
-              <w:end w:val="single" w:space="0" w:color="D3D3D3"/>
-            </w:tcBorders>
-          </w:tcPr>
-          <w:p>
-            <w:pPr>
-              <w:spacing w:before="0" w:after="60"/>
-              <w:keepNext/>
-              <w:jc w:val="start"/>
-            </w:pPr>
-            <w:r>
-              <w:rPr>
-                <w:rFonts w:ascii="Calibri" w:hAnsi="Calibri"/>
-                <w:sz w:val="20"/>
-              </w:rPr>
-              <w:t xml:space="default">131 (30.5%)</w:t>
-            </w:r>
-          </w:p>
-        </w:tc>
-        <w:tc>
-          <w:tcPr>
-            <w:tcBorders>
-              <w:top w:val="single" w:space="0" w:color="D3D3D3"/>
-              <w:bottom w:val="single" w:space="0" w:color="D3D3D3"/>
-              <w:start w:val="single" w:space="0" w:color="D3D3D3"/>
-              <w:end w:val="single" w:space="0" w:color="D3D3D3"/>
-            </w:tcBorders>
-          </w:tcPr>
-          <w:p>
-            <w:pPr>
-              <w:spacing w:before="0" w:after="60"/>
-              <w:keepNext/>
-              <w:jc w:val="start"/>
-            </w:pPr>
-            <w:r>
-              <w:rPr>
-                <w:rFonts w:ascii="Calibri" w:hAnsi="Calibri"/>
-                <w:sz w:val="20"/>
-              </w:rPr>
-              <w:t xml:space="default">193 (27.8%)</w:t>
+              <w:t xml:space="default">62 (23.7%)</w:t>
+            </w:r>
+          </w:p>
+        </w:tc>
+        <w:tc>
+          <w:tcPr>
+            <w:tcBorders>
+              <w:top w:val="single" w:space="0" w:color="D3D3D3"/>
+              <w:bottom w:val="single" w:space="0" w:color="D3D3D3"/>
+              <w:start w:val="single" w:space="0" w:color="D3D3D3"/>
+              <w:end w:val="single" w:space="0" w:color="D3D3D3"/>
+            </w:tcBorders>
+          </w:tcPr>
+          <w:p>
+            <w:pPr>
+              <w:spacing w:before="0" w:after="60"/>
+              <w:keepNext/>
+              <w:jc w:val="start"/>
+            </w:pPr>
+            <w:r>
+              <w:rPr>
+                <w:rFonts w:ascii="Calibri" w:hAnsi="Calibri"/>
+                <w:sz w:val="20"/>
+              </w:rPr>
+              <w:t xml:space="default">131 (30.9%)</w:t>
+            </w:r>
+          </w:p>
+        </w:tc>
+        <w:tc>
+          <w:tcPr>
+            <w:tcBorders>
+              <w:top w:val="single" w:space="0" w:color="D3D3D3"/>
+              <w:bottom w:val="single" w:space="0" w:color="D3D3D3"/>
+              <w:start w:val="single" w:space="0" w:color="D3D3D3"/>
+              <w:end w:val="single" w:space="0" w:color="D3D3D3"/>
+            </w:tcBorders>
+          </w:tcPr>
+          <w:p>
+            <w:pPr>
+              <w:spacing w:before="0" w:after="60"/>
+              <w:keepNext/>
+              <w:jc w:val="start"/>
+            </w:pPr>
+            <w:r>
+              <w:rPr>
+                <w:rFonts w:ascii="Calibri" w:hAnsi="Calibri"/>
+                <w:sz w:val="20"/>
+              </w:rPr>
+              <w:t xml:space="default">193 (28.1%)</w:t>
             </w:r>
           </w:p>
         </w:tc>
@@ -4021,55 +4021,55 @@
                 <w:rFonts w:ascii="Calibri" w:hAnsi="Calibri"/>
                 <w:sz w:val="20"/>
               </w:rPr>
-              <w:t xml:space="default">29 (11%)</w:t>
-            </w:r>
-          </w:p>
-        </w:tc>
-        <w:tc>
-          <w:tcPr>
-            <w:tcBorders>
-              <w:top w:val="single" w:space="0" w:color="D3D3D3"/>
-              <w:bottom w:val="single" w:space="0" w:color="D3D3D3"/>
-              <w:start w:val="single" w:space="0" w:color="D3D3D3"/>
-              <w:end w:val="single" w:space="0" w:color="D3D3D3"/>
-            </w:tcBorders>
-          </w:tcPr>
-          <w:p>
-            <w:pPr>
-              <w:spacing w:before="0" w:after="60"/>
-              <w:keepNext/>
-              <w:jc w:val="start"/>
-            </w:pPr>
-            <w:r>
-              <w:rPr>
-                <w:rFonts w:ascii="Calibri" w:hAnsi="Calibri"/>
-                <w:sz w:val="20"/>
-              </w:rPr>
-              <w:t xml:space="default">38 (8.9%)</w:t>
-            </w:r>
-          </w:p>
-        </w:tc>
-        <w:tc>
-          <w:tcPr>
-            <w:tcBorders>
-              <w:top w:val="single" w:space="0" w:color="D3D3D3"/>
-              <w:bottom w:val="single" w:space="0" w:color="D3D3D3"/>
-              <w:start w:val="single" w:space="0" w:color="D3D3D3"/>
-              <w:end w:val="single" w:space="0" w:color="D3D3D3"/>
-            </w:tcBorders>
-          </w:tcPr>
-          <w:p>
-            <w:pPr>
-              <w:spacing w:before="0" w:after="60"/>
-              <w:keepNext/>
-              <w:jc w:val="start"/>
-            </w:pPr>
-            <w:r>
-              <w:rPr>
-                <w:rFonts w:ascii="Calibri" w:hAnsi="Calibri"/>
-                <w:sz w:val="20"/>
-              </w:rPr>
-              <w:t xml:space="default">68 (9.7%)</w:t>
+              <w:t xml:space="default">29 (11.1%)</w:t>
+            </w:r>
+          </w:p>
+        </w:tc>
+        <w:tc>
+          <w:tcPr>
+            <w:tcBorders>
+              <w:top w:val="single" w:space="0" w:color="D3D3D3"/>
+              <w:bottom w:val="single" w:space="0" w:color="D3D3D3"/>
+              <w:start w:val="single" w:space="0" w:color="D3D3D3"/>
+              <w:end w:val="single" w:space="0" w:color="D3D3D3"/>
+            </w:tcBorders>
+          </w:tcPr>
+          <w:p>
+            <w:pPr>
+              <w:spacing w:before="0" w:after="60"/>
+              <w:keepNext/>
+              <w:jc w:val="start"/>
+            </w:pPr>
+            <w:r>
+              <w:rPr>
+                <w:rFonts w:ascii="Calibri" w:hAnsi="Calibri"/>
+                <w:sz w:val="20"/>
+              </w:rPr>
+              <w:t xml:space="default">38 (9.1%)</w:t>
+            </w:r>
+          </w:p>
+        </w:tc>
+        <w:tc>
+          <w:tcPr>
+            <w:tcBorders>
+              <w:top w:val="single" w:space="0" w:color="D3D3D3"/>
+              <w:bottom w:val="single" w:space="0" w:color="D3D3D3"/>
+              <w:start w:val="single" w:space="0" w:color="D3D3D3"/>
+              <w:end w:val="single" w:space="0" w:color="D3D3D3"/>
+            </w:tcBorders>
+          </w:tcPr>
+          <w:p>
+            <w:pPr>
+              <w:spacing w:before="0" w:after="60"/>
+              <w:keepNext/>
+              <w:jc w:val="start"/>
+            </w:pPr>
+            <w:r>
+              <w:rPr>
+                <w:rFonts w:ascii="Calibri" w:hAnsi="Calibri"/>
+                <w:sz w:val="20"/>
+              </w:rPr>
+              <w:t xml:space="default">68 (9.8%)</w:t>
             </w:r>
           </w:p>
         </w:tc>
@@ -4146,55 +4146,55 @@
                 <w:rFonts w:ascii="Calibri" w:hAnsi="Calibri"/>
                 <w:sz w:val="20"/>
               </w:rPr>
-              <w:t xml:space="default">57 (21.7%)</w:t>
-            </w:r>
-          </w:p>
-        </w:tc>
-        <w:tc>
-          <w:tcPr>
-            <w:tcBorders>
-              <w:top w:val="single" w:space="0" w:color="D3D3D3"/>
-              <w:bottom w:val="single" w:space="0" w:color="D3D3D3"/>
-              <w:start w:val="single" w:space="0" w:color="D3D3D3"/>
-              <w:end w:val="single" w:space="0" w:color="D3D3D3"/>
-            </w:tcBorders>
-          </w:tcPr>
-          <w:p>
-            <w:pPr>
-              <w:spacing w:before="0" w:after="60"/>
-              <w:keepNext/>
-              <w:jc w:val="start"/>
-            </w:pPr>
-            <w:r>
-              <w:rPr>
-                <w:rFonts w:ascii="Calibri" w:hAnsi="Calibri"/>
-                <w:sz w:val="20"/>
-              </w:rPr>
-              <w:t xml:space="default">98 (22.9%)</w:t>
-            </w:r>
-          </w:p>
-        </w:tc>
-        <w:tc>
-          <w:tcPr>
-            <w:tcBorders>
-              <w:top w:val="single" w:space="0" w:color="D3D3D3"/>
-              <w:bottom w:val="single" w:space="0" w:color="D3D3D3"/>
-              <w:start w:val="single" w:space="0" w:color="D3D3D3"/>
-              <w:end w:val="single" w:space="0" w:color="D3D3D3"/>
-            </w:tcBorders>
-          </w:tcPr>
-          <w:p>
-            <w:pPr>
-              <w:spacing w:before="0" w:after="60"/>
-              <w:keepNext/>
-              <w:jc w:val="start"/>
-            </w:pPr>
-            <w:r>
-              <w:rPr>
-                <w:rFonts w:ascii="Calibri" w:hAnsi="Calibri"/>
-                <w:sz w:val="20"/>
-              </w:rPr>
-              <w:t xml:space="default">156 (22.4%)</w:t>
+              <w:t xml:space="default">57 (21.8%)</w:t>
+            </w:r>
+          </w:p>
+        </w:tc>
+        <w:tc>
+          <w:tcPr>
+            <w:tcBorders>
+              <w:top w:val="single" w:space="0" w:color="D3D3D3"/>
+              <w:bottom w:val="single" w:space="0" w:color="D3D3D3"/>
+              <w:start w:val="single" w:space="0" w:color="D3D3D3"/>
+              <w:end w:val="single" w:space="0" w:color="D3D3D3"/>
+            </w:tcBorders>
+          </w:tcPr>
+          <w:p>
+            <w:pPr>
+              <w:spacing w:before="0" w:after="60"/>
+              <w:keepNext/>
+              <w:jc w:val="start"/>
+            </w:pPr>
+            <w:r>
+              <w:rPr>
+                <w:rFonts w:ascii="Calibri" w:hAnsi="Calibri"/>
+                <w:sz w:val="20"/>
+              </w:rPr>
+              <w:t xml:space="default">98 (23.2%)</w:t>
+            </w:r>
+          </w:p>
+        </w:tc>
+        <w:tc>
+          <w:tcPr>
+            <w:tcBorders>
+              <w:top w:val="single" w:space="0" w:color="D3D3D3"/>
+              <w:bottom w:val="single" w:space="0" w:color="D3D3D3"/>
+              <w:start w:val="single" w:space="0" w:color="D3D3D3"/>
+              <w:end w:val="single" w:space="0" w:color="D3D3D3"/>
+            </w:tcBorders>
+          </w:tcPr>
+          <w:p>
+            <w:pPr>
+              <w:spacing w:before="0" w:after="60"/>
+              <w:keepNext/>
+              <w:jc w:val="start"/>
+            </w:pPr>
+            <w:r>
+              <w:rPr>
+                <w:rFonts w:ascii="Calibri" w:hAnsi="Calibri"/>
+                <w:sz w:val="20"/>
+              </w:rPr>
+              <w:t xml:space="default">156 (22.7%)</w:t>
             </w:r>
           </w:p>
         </w:tc>
@@ -4271,55 +4271,55 @@
                 <w:rFonts w:ascii="Calibri" w:hAnsi="Calibri"/>
                 <w:sz w:val="20"/>
               </w:rPr>
-              <w:t xml:space="default">107 (40.6%)</w:t>
-            </w:r>
-          </w:p>
-        </w:tc>
-        <w:tc>
-          <w:tcPr>
-            <w:tcBorders>
-              <w:top w:val="single" w:space="0" w:color="D3D3D3"/>
-              <w:bottom w:val="single" w:space="0" w:color="D3D3D3"/>
-              <w:start w:val="single" w:space="0" w:color="D3D3D3"/>
-              <w:end w:val="single" w:space="0" w:color="D3D3D3"/>
-            </w:tcBorders>
-          </w:tcPr>
-          <w:p>
-            <w:pPr>
-              <w:spacing w:before="0" w:after="60"/>
-              <w:keepNext/>
-              <w:jc w:val="start"/>
-            </w:pPr>
-            <w:r>
-              <w:rPr>
-                <w:rFonts w:ascii="Calibri" w:hAnsi="Calibri"/>
-                <w:sz w:val="20"/>
-              </w:rPr>
-              <w:t xml:space="default">223 (51.8%)</w:t>
-            </w:r>
-          </w:p>
-        </w:tc>
-        <w:tc>
-          <w:tcPr>
-            <w:tcBorders>
-              <w:top w:val="single" w:space="0" w:color="D3D3D3"/>
-              <w:bottom w:val="single" w:space="0" w:color="D3D3D3"/>
-              <w:start w:val="single" w:space="0" w:color="D3D3D3"/>
-              <w:end w:val="single" w:space="0" w:color="D3D3D3"/>
-            </w:tcBorders>
-          </w:tcPr>
-          <w:p>
-            <w:pPr>
-              <w:spacing w:before="0" w:after="60"/>
-              <w:keepNext/>
-              <w:jc w:val="start"/>
-            </w:pPr>
-            <w:r>
-              <w:rPr>
-                <w:rFonts w:ascii="Calibri" w:hAnsi="Calibri"/>
-                <w:sz w:val="20"/>
-              </w:rPr>
-              <w:t xml:space="default">330 (47.6%)</w:t>
+              <w:t xml:space="default">106 (40.2%)</w:t>
+            </w:r>
+          </w:p>
+        </w:tc>
+        <w:tc>
+          <w:tcPr>
+            <w:tcBorders>
+              <w:top w:val="single" w:space="0" w:color="D3D3D3"/>
+              <w:bottom w:val="single" w:space="0" w:color="D3D3D3"/>
+              <w:start w:val="single" w:space="0" w:color="D3D3D3"/>
+              <w:end w:val="single" w:space="0" w:color="D3D3D3"/>
+            </w:tcBorders>
+          </w:tcPr>
+          <w:p>
+            <w:pPr>
+              <w:spacing w:before="0" w:after="60"/>
+              <w:keepNext/>
+              <w:jc w:val="start"/>
+            </w:pPr>
+            <w:r>
+              <w:rPr>
+                <w:rFonts w:ascii="Calibri" w:hAnsi="Calibri"/>
+                <w:sz w:val="20"/>
+              </w:rPr>
+              <w:t xml:space="default">217 (51.2%)</w:t>
+            </w:r>
+          </w:p>
+        </w:tc>
+        <w:tc>
+          <w:tcPr>
+            <w:tcBorders>
+              <w:top w:val="single" w:space="0" w:color="D3D3D3"/>
+              <w:bottom w:val="single" w:space="0" w:color="D3D3D3"/>
+              <w:start w:val="single" w:space="0" w:color="D3D3D3"/>
+              <w:end w:val="single" w:space="0" w:color="D3D3D3"/>
+            </w:tcBorders>
+          </w:tcPr>
+          <w:p>
+            <w:pPr>
+              <w:spacing w:before="0" w:after="60"/>
+              <w:keepNext/>
+              <w:jc w:val="start"/>
+            </w:pPr>
+            <w:r>
+              <w:rPr>
+                <w:rFonts w:ascii="Calibri" w:hAnsi="Calibri"/>
+                <w:sz w:val="20"/>
+              </w:rPr>
+              <w:t xml:space="default">323 (47%)</w:t>
             </w:r>
           </w:p>
         </w:tc>
@@ -4343,7 +4343,7 @@
                 <w:rFonts w:ascii="Calibri" w:hAnsi="Calibri"/>
                 <w:sz w:val="20"/>
               </w:rPr>
-              <w:t xml:space="default">67.5%</w:t>
+              <w:t xml:space="default">67.2%</w:t>
             </w:r>
           </w:p>
         </w:tc>
@@ -4396,55 +4396,55 @@
                 <w:rFonts w:ascii="Calibri" w:hAnsi="Calibri"/>
                 <w:sz w:val="20"/>
               </w:rPr>
-              <w:t xml:space="default">36 (13.7%)</w:t>
-            </w:r>
-          </w:p>
-        </w:tc>
-        <w:tc>
-          <w:tcPr>
-            <w:tcBorders>
-              <w:top w:val="single" w:space="0" w:color="D3D3D3"/>
-              <w:bottom w:val="single" w:space="0" w:color="D3D3D3"/>
-              <w:start w:val="single" w:space="0" w:color="D3D3D3"/>
-              <w:end w:val="single" w:space="0" w:color="D3D3D3"/>
-            </w:tcBorders>
-          </w:tcPr>
-          <w:p>
-            <w:pPr>
-              <w:spacing w:before="0" w:after="60"/>
-              <w:keepNext/>
-              <w:jc w:val="start"/>
-            </w:pPr>
-            <w:r>
-              <w:rPr>
-                <w:rFonts w:ascii="Calibri" w:hAnsi="Calibri"/>
-                <w:sz w:val="20"/>
-              </w:rPr>
-              <w:t xml:space="default">34 (7.8%)</w:t>
-            </w:r>
-          </w:p>
-        </w:tc>
-        <w:tc>
-          <w:tcPr>
-            <w:tcBorders>
-              <w:top w:val="single" w:space="0" w:color="D3D3D3"/>
-              <w:bottom w:val="single" w:space="0" w:color="D3D3D3"/>
-              <w:start w:val="single" w:space="0" w:color="D3D3D3"/>
-              <w:end w:val="single" w:space="0" w:color="D3D3D3"/>
-            </w:tcBorders>
-          </w:tcPr>
-          <w:p>
-            <w:pPr>
-              <w:spacing w:before="0" w:after="60"/>
-              <w:keepNext/>
-              <w:jc w:val="start"/>
-            </w:pPr>
-            <w:r>
-              <w:rPr>
-                <w:rFonts w:ascii="Calibri" w:hAnsi="Calibri"/>
-                <w:sz w:val="20"/>
-              </w:rPr>
-              <w:t xml:space="default">70 (10.1%)</w:t>
+              <w:t xml:space="default">36 (13.8%)</w:t>
+            </w:r>
+          </w:p>
+        </w:tc>
+        <w:tc>
+          <w:tcPr>
+            <w:tcBorders>
+              <w:top w:val="single" w:space="0" w:color="D3D3D3"/>
+              <w:bottom w:val="single" w:space="0" w:color="D3D3D3"/>
+              <w:start w:val="single" w:space="0" w:color="D3D3D3"/>
+              <w:end w:val="single" w:space="0" w:color="D3D3D3"/>
+            </w:tcBorders>
+          </w:tcPr>
+          <w:p>
+            <w:pPr>
+              <w:spacing w:before="0" w:after="60"/>
+              <w:keepNext/>
+              <w:jc w:val="start"/>
+            </w:pPr>
+            <w:r>
+              <w:rPr>
+                <w:rFonts w:ascii="Calibri" w:hAnsi="Calibri"/>
+                <w:sz w:val="20"/>
+              </w:rPr>
+              <w:t xml:space="default">34 (8%)</w:t>
+            </w:r>
+          </w:p>
+        </w:tc>
+        <w:tc>
+          <w:tcPr>
+            <w:tcBorders>
+              <w:top w:val="single" w:space="0" w:color="D3D3D3"/>
+              <w:bottom w:val="single" w:space="0" w:color="D3D3D3"/>
+              <w:start w:val="single" w:space="0" w:color="D3D3D3"/>
+              <w:end w:val="single" w:space="0" w:color="D3D3D3"/>
+            </w:tcBorders>
+          </w:tcPr>
+          <w:p>
+            <w:pPr>
+              <w:spacing w:before="0" w:after="60"/>
+              <w:keepNext/>
+              <w:jc w:val="start"/>
+            </w:pPr>
+            <w:r>
+              <w:rPr>
+                <w:rFonts w:ascii="Calibri" w:hAnsi="Calibri"/>
+                <w:sz w:val="20"/>
+              </w:rPr>
+              <w:t xml:space="default">70 (10.2%)</w:t>
             </w:r>
           </w:p>
         </w:tc>
@@ -4521,55 +4521,55 @@
                 <w:rFonts w:ascii="Calibri" w:hAnsi="Calibri"/>
                 <w:sz w:val="20"/>
               </w:rPr>
-              <w:t xml:space="default">33 (12.5%)</w:t>
-            </w:r>
-          </w:p>
-        </w:tc>
-        <w:tc>
-          <w:tcPr>
-            <w:tcBorders>
-              <w:top w:val="single" w:space="0" w:color="D3D3D3"/>
-              <w:bottom w:val="single" w:space="0" w:color="D3D3D3"/>
-              <w:start w:val="single" w:space="0" w:color="D3D3D3"/>
-              <w:end w:val="single" w:space="0" w:color="D3D3D3"/>
-            </w:tcBorders>
-          </w:tcPr>
-          <w:p>
-            <w:pPr>
-              <w:spacing w:before="0" w:after="60"/>
-              <w:keepNext/>
-              <w:jc w:val="start"/>
-            </w:pPr>
-            <w:r>
-              <w:rPr>
-                <w:rFonts w:ascii="Calibri" w:hAnsi="Calibri"/>
-                <w:sz w:val="20"/>
-              </w:rPr>
-              <w:t xml:space="default">35 (8.3%)</w:t>
-            </w:r>
-          </w:p>
-        </w:tc>
-        <w:tc>
-          <w:tcPr>
-            <w:tcBorders>
-              <w:top w:val="single" w:space="0" w:color="D3D3D3"/>
-              <w:bottom w:val="single" w:space="0" w:color="D3D3D3"/>
-              <w:start w:val="single" w:space="0" w:color="D3D3D3"/>
-              <w:end w:val="single" w:space="0" w:color="D3D3D3"/>
-            </w:tcBorders>
-          </w:tcPr>
-          <w:p>
-            <w:pPr>
-              <w:spacing w:before="0" w:after="60"/>
-              <w:keepNext/>
-              <w:jc w:val="start"/>
-            </w:pPr>
-            <w:r>
-              <w:rPr>
-                <w:rFonts w:ascii="Calibri" w:hAnsi="Calibri"/>
-                <w:sz w:val="20"/>
-              </w:rPr>
-              <w:t xml:space="default">69 (9.9%)</w:t>
+              <w:t xml:space="default">33 (12.6%)</w:t>
+            </w:r>
+          </w:p>
+        </w:tc>
+        <w:tc>
+          <w:tcPr>
+            <w:tcBorders>
+              <w:top w:val="single" w:space="0" w:color="D3D3D3"/>
+              <w:bottom w:val="single" w:space="0" w:color="D3D3D3"/>
+              <w:start w:val="single" w:space="0" w:color="D3D3D3"/>
+              <w:end w:val="single" w:space="0" w:color="D3D3D3"/>
+            </w:tcBorders>
+          </w:tcPr>
+          <w:p>
+            <w:pPr>
+              <w:spacing w:before="0" w:after="60"/>
+              <w:keepNext/>
+              <w:jc w:val="start"/>
+            </w:pPr>
+            <w:r>
+              <w:rPr>
+                <w:rFonts w:ascii="Calibri" w:hAnsi="Calibri"/>
+                <w:sz w:val="20"/>
+              </w:rPr>
+              <w:t xml:space="default">35 (8.4%)</w:t>
+            </w:r>
+          </w:p>
+        </w:tc>
+        <w:tc>
+          <w:tcPr>
+            <w:tcBorders>
+              <w:top w:val="single" w:space="0" w:color="D3D3D3"/>
+              <w:bottom w:val="single" w:space="0" w:color="D3D3D3"/>
+              <w:start w:val="single" w:space="0" w:color="D3D3D3"/>
+              <w:end w:val="single" w:space="0" w:color="D3D3D3"/>
+            </w:tcBorders>
+          </w:tcPr>
+          <w:p>
+            <w:pPr>
+              <w:spacing w:before="0" w:after="60"/>
+              <w:keepNext/>
+              <w:jc w:val="start"/>
+            </w:pPr>
+            <w:r>
+              <w:rPr>
+                <w:rFonts w:ascii="Calibri" w:hAnsi="Calibri"/>
+                <w:sz w:val="20"/>
+              </w:rPr>
+              <w:t xml:space="default">69 (10%)</w:t>
             </w:r>
           </w:p>
         </w:tc>
@@ -4776,55 +4776,55 @@
                 <w:rFonts w:ascii="Calibri" w:hAnsi="Calibri"/>
                 <w:sz w:val="20"/>
               </w:rPr>
-              <w:t xml:space="default">42 (16%)</w:t>
-            </w:r>
-          </w:p>
-        </w:tc>
-        <w:tc>
-          <w:tcPr>
-            <w:tcBorders>
-              <w:top w:val="single" w:space="0" w:color="D3D3D3"/>
-              <w:bottom w:val="single" w:space="0" w:color="D3D3D3"/>
-              <w:start w:val="single" w:space="0" w:color="D3D3D3"/>
-              <w:end w:val="single" w:space="0" w:color="D3D3D3"/>
-            </w:tcBorders>
-          </w:tcPr>
-          <w:p>
-            <w:pPr>
-              <w:spacing w:before="0" w:after="60"/>
-              <w:keepNext/>
-              <w:jc w:val="start"/>
-            </w:pPr>
-            <w:r>
-              <w:rPr>
-                <w:rFonts w:ascii="Calibri" w:hAnsi="Calibri"/>
-                <w:sz w:val="20"/>
-              </w:rPr>
-              <w:t xml:space="default">62 (14.5%)</w:t>
-            </w:r>
-          </w:p>
-        </w:tc>
-        <w:tc>
-          <w:tcPr>
-            <w:tcBorders>
-              <w:top w:val="single" w:space="0" w:color="D3D3D3"/>
-              <w:bottom w:val="single" w:space="0" w:color="D3D3D3"/>
-              <w:start w:val="single" w:space="0" w:color="D3D3D3"/>
-              <w:end w:val="single" w:space="0" w:color="D3D3D3"/>
-            </w:tcBorders>
-          </w:tcPr>
-          <w:p>
-            <w:pPr>
-              <w:spacing w:before="0" w:after="60"/>
-              <w:keepNext/>
-              <w:jc w:val="start"/>
-            </w:pPr>
-            <w:r>
-              <w:rPr>
-                <w:rFonts w:ascii="Calibri" w:hAnsi="Calibri"/>
-                <w:sz w:val="20"/>
-              </w:rPr>
-              <w:t xml:space="default">105 (15.1%)</w:t>
+              <w:t xml:space="default">42 (16.1%)</w:t>
+            </w:r>
+          </w:p>
+        </w:tc>
+        <w:tc>
+          <w:tcPr>
+            <w:tcBorders>
+              <w:top w:val="single" w:space="0" w:color="D3D3D3"/>
+              <w:bottom w:val="single" w:space="0" w:color="D3D3D3"/>
+              <w:start w:val="single" w:space="0" w:color="D3D3D3"/>
+              <w:end w:val="single" w:space="0" w:color="D3D3D3"/>
+            </w:tcBorders>
+          </w:tcPr>
+          <w:p>
+            <w:pPr>
+              <w:spacing w:before="0" w:after="60"/>
+              <w:keepNext/>
+              <w:jc w:val="start"/>
+            </w:pPr>
+            <w:r>
+              <w:rPr>
+                <w:rFonts w:ascii="Calibri" w:hAnsi="Calibri"/>
+                <w:sz w:val="20"/>
+              </w:rPr>
+              <w:t xml:space="default">62 (14.7%)</w:t>
+            </w:r>
+          </w:p>
+        </w:tc>
+        <w:tc>
+          <w:tcPr>
+            <w:tcBorders>
+              <w:top w:val="single" w:space="0" w:color="D3D3D3"/>
+              <w:bottom w:val="single" w:space="0" w:color="D3D3D3"/>
+              <w:start w:val="single" w:space="0" w:color="D3D3D3"/>
+              <w:end w:val="single" w:space="0" w:color="D3D3D3"/>
+            </w:tcBorders>
+          </w:tcPr>
+          <w:p>
+            <w:pPr>
+              <w:spacing w:before="0" w:after="60"/>
+              <w:keepNext/>
+              <w:jc w:val="start"/>
+            </w:pPr>
+            <w:r>
+              <w:rPr>
+                <w:rFonts w:ascii="Calibri" w:hAnsi="Calibri"/>
+                <w:sz w:val="20"/>
+              </w:rPr>
+              <w:t xml:space="default">105 (15.2%)</w:t>
             </w:r>
           </w:p>
         </w:tc>
@@ -4901,55 +4901,55 @@
                 <w:rFonts w:ascii="Calibri" w:hAnsi="Calibri"/>
                 <w:sz w:val="20"/>
               </w:rPr>
-              <w:t xml:space="default">59 (22.2%)</w:t>
-            </w:r>
-          </w:p>
-        </w:tc>
-        <w:tc>
-          <w:tcPr>
-            <w:tcBorders>
-              <w:top w:val="single" w:space="0" w:color="D3D3D3"/>
-              <w:bottom w:val="single" w:space="0" w:color="D3D3D3"/>
-              <w:start w:val="single" w:space="0" w:color="D3D3D3"/>
-              <w:end w:val="single" w:space="0" w:color="D3D3D3"/>
-            </w:tcBorders>
-          </w:tcPr>
-          <w:p>
-            <w:pPr>
-              <w:spacing w:before="0" w:after="60"/>
-              <w:keepNext/>
-              <w:jc w:val="start"/>
-            </w:pPr>
-            <w:r>
-              <w:rPr>
-                <w:rFonts w:ascii="Calibri" w:hAnsi="Calibri"/>
-                <w:sz w:val="20"/>
-              </w:rPr>
-              <w:t xml:space="default">98 (22.8%)</w:t>
-            </w:r>
-          </w:p>
-        </w:tc>
-        <w:tc>
-          <w:tcPr>
-            <w:tcBorders>
-              <w:top w:val="single" w:space="0" w:color="D3D3D3"/>
-              <w:bottom w:val="single" w:space="0" w:color="D3D3D3"/>
-              <w:start w:val="single" w:space="0" w:color="D3D3D3"/>
-              <w:end w:val="single" w:space="0" w:color="D3D3D3"/>
-            </w:tcBorders>
-          </w:tcPr>
-          <w:p>
-            <w:pPr>
-              <w:spacing w:before="0" w:after="60"/>
-              <w:keepNext/>
-              <w:jc w:val="start"/>
-            </w:pPr>
-            <w:r>
-              <w:rPr>
-                <w:rFonts w:ascii="Calibri" w:hAnsi="Calibri"/>
-                <w:sz w:val="20"/>
-              </w:rPr>
-              <w:t xml:space="default">157 (22.6%)</w:t>
+              <w:t xml:space="default">59 (22.3%)</w:t>
+            </w:r>
+          </w:p>
+        </w:tc>
+        <w:tc>
+          <w:tcPr>
+            <w:tcBorders>
+              <w:top w:val="single" w:space="0" w:color="D3D3D3"/>
+              <w:bottom w:val="single" w:space="0" w:color="D3D3D3"/>
+              <w:start w:val="single" w:space="0" w:color="D3D3D3"/>
+              <w:end w:val="single" w:space="0" w:color="D3D3D3"/>
+            </w:tcBorders>
+          </w:tcPr>
+          <w:p>
+            <w:pPr>
+              <w:spacing w:before="0" w:after="60"/>
+              <w:keepNext/>
+              <w:jc w:val="start"/>
+            </w:pPr>
+            <w:r>
+              <w:rPr>
+                <w:rFonts w:ascii="Calibri" w:hAnsi="Calibri"/>
+                <w:sz w:val="20"/>
+              </w:rPr>
+              <w:t xml:space="default">98 (23.1%)</w:t>
+            </w:r>
+          </w:p>
+        </w:tc>
+        <w:tc>
+          <w:tcPr>
+            <w:tcBorders>
+              <w:top w:val="single" w:space="0" w:color="D3D3D3"/>
+              <w:bottom w:val="single" w:space="0" w:color="D3D3D3"/>
+              <w:start w:val="single" w:space="0" w:color="D3D3D3"/>
+              <w:end w:val="single" w:space="0" w:color="D3D3D3"/>
+            </w:tcBorders>
+          </w:tcPr>
+          <w:p>
+            <w:pPr>
+              <w:spacing w:before="0" w:after="60"/>
+              <w:keepNext/>
+              <w:jc w:val="start"/>
+            </w:pPr>
+            <w:r>
+              <w:rPr>
+                <w:rFonts w:ascii="Calibri" w:hAnsi="Calibri"/>
+                <w:sz w:val="20"/>
+              </w:rPr>
+              <w:t xml:space="default">157 (22.8%)</w:t>
             </w:r>
           </w:p>
         </w:tc>
@@ -5026,55 +5026,55 @@
                 <w:rFonts w:ascii="Calibri" w:hAnsi="Calibri"/>
                 <w:sz w:val="20"/>
               </w:rPr>
-              <w:t xml:space="default">92 (34.8%)</w:t>
-            </w:r>
-          </w:p>
-        </w:tc>
-        <w:tc>
-          <w:tcPr>
-            <w:tcBorders>
-              <w:top w:val="single" w:space="0" w:color="D3D3D3"/>
-              <w:bottom w:val="single" w:space="0" w:color="D3D3D3"/>
-              <w:start w:val="single" w:space="0" w:color="D3D3D3"/>
-              <w:end w:val="single" w:space="0" w:color="D3D3D3"/>
-            </w:tcBorders>
-          </w:tcPr>
-          <w:p>
-            <w:pPr>
-              <w:spacing w:before="0" w:after="60"/>
-              <w:keepNext/>
-              <w:jc w:val="start"/>
-            </w:pPr>
-            <w:r>
-              <w:rPr>
-                <w:rFonts w:ascii="Calibri" w:hAnsi="Calibri"/>
-                <w:sz w:val="20"/>
-              </w:rPr>
-              <w:t xml:space="default">107 (24.9%)</w:t>
-            </w:r>
-          </w:p>
-        </w:tc>
-        <w:tc>
-          <w:tcPr>
-            <w:tcBorders>
-              <w:top w:val="single" w:space="0" w:color="D3D3D3"/>
-              <w:bottom w:val="single" w:space="0" w:color="D3D3D3"/>
-              <w:start w:val="single" w:space="0" w:color="D3D3D3"/>
-              <w:end w:val="single" w:space="0" w:color="D3D3D3"/>
-            </w:tcBorders>
-          </w:tcPr>
-          <w:p>
-            <w:pPr>
-              <w:spacing w:before="0" w:after="60"/>
-              <w:keepNext/>
-              <w:jc w:val="start"/>
-            </w:pPr>
-            <w:r>
-              <w:rPr>
-                <w:rFonts w:ascii="Calibri" w:hAnsi="Calibri"/>
-                <w:sz w:val="20"/>
-              </w:rPr>
-              <w:t xml:space="default">199 (28.7%)</w:t>
+              <w:t xml:space="default">90 (34.4%)</w:t>
+            </w:r>
+          </w:p>
+        </w:tc>
+        <w:tc>
+          <w:tcPr>
+            <w:tcBorders>
+              <w:top w:val="single" w:space="0" w:color="D3D3D3"/>
+              <w:bottom w:val="single" w:space="0" w:color="D3D3D3"/>
+              <w:start w:val="single" w:space="0" w:color="D3D3D3"/>
+              <w:end w:val="single" w:space="0" w:color="D3D3D3"/>
+            </w:tcBorders>
+          </w:tcPr>
+          <w:p>
+            <w:pPr>
+              <w:spacing w:before="0" w:after="60"/>
+              <w:keepNext/>
+              <w:jc w:val="start"/>
+            </w:pPr>
+            <w:r>
+              <w:rPr>
+                <w:rFonts w:ascii="Calibri" w:hAnsi="Calibri"/>
+                <w:sz w:val="20"/>
+              </w:rPr>
+              <w:t xml:space="default">107 (25.2%)</w:t>
+            </w:r>
+          </w:p>
+        </w:tc>
+        <w:tc>
+          <w:tcPr>
+            <w:tcBorders>
+              <w:top w:val="single" w:space="0" w:color="D3D3D3"/>
+              <w:bottom w:val="single" w:space="0" w:color="D3D3D3"/>
+              <w:start w:val="single" w:space="0" w:color="D3D3D3"/>
+              <w:end w:val="single" w:space="0" w:color="D3D3D3"/>
+            </w:tcBorders>
+          </w:tcPr>
+          <w:p>
+            <w:pPr>
+              <w:spacing w:before="0" w:after="60"/>
+              <w:keepNext/>
+              <w:jc w:val="start"/>
+            </w:pPr>
+            <w:r>
+              <w:rPr>
+                <w:rFonts w:ascii="Calibri" w:hAnsi="Calibri"/>
+                <w:sz w:val="20"/>
+              </w:rPr>
+              <w:t xml:space="default">197 (28.7%)</w:t>
             </w:r>
           </w:p>
         </w:tc>
@@ -5098,7 +5098,7 @@
                 <w:rFonts w:ascii="Calibri" w:hAnsi="Calibri"/>
                 <w:sz w:val="20"/>
               </w:rPr>
-              <w:t xml:space="default">53.8%</w:t>
+              <w:t xml:space="default">54.2%</w:t>
             </w:r>
           </w:p>
         </w:tc>
@@ -5151,55 +5151,55 @@
                 <w:rFonts w:ascii="Calibri" w:hAnsi="Calibri"/>
                 <w:sz w:val="20"/>
               </w:rPr>
-              <w:t xml:space="default">41 (15.4%)</w:t>
-            </w:r>
-          </w:p>
-        </w:tc>
-        <w:tc>
-          <w:tcPr>
-            <w:tcBorders>
-              <w:top w:val="single" w:space="0" w:color="D3D3D3"/>
-              <w:bottom w:val="single" w:space="0" w:color="D3D3D3"/>
-              <w:start w:val="single" w:space="0" w:color="D3D3D3"/>
-              <w:end w:val="single" w:space="0" w:color="D3D3D3"/>
-            </w:tcBorders>
-          </w:tcPr>
-          <w:p>
-            <w:pPr>
-              <w:spacing w:before="0" w:after="60"/>
-              <w:keepNext/>
-              <w:jc w:val="start"/>
-            </w:pPr>
-            <w:r>
-              <w:rPr>
-                <w:rFonts w:ascii="Calibri" w:hAnsi="Calibri"/>
-                <w:sz w:val="20"/>
-              </w:rPr>
-              <w:t xml:space="default">110 (25.6%)</w:t>
-            </w:r>
-          </w:p>
-        </w:tc>
-        <w:tc>
-          <w:tcPr>
-            <w:tcBorders>
-              <w:top w:val="single" w:space="0" w:color="D3D3D3"/>
-              <w:bottom w:val="single" w:space="0" w:color="D3D3D3"/>
-              <w:start w:val="single" w:space="0" w:color="D3D3D3"/>
-              <w:end w:val="single" w:space="0" w:color="D3D3D3"/>
-            </w:tcBorders>
-          </w:tcPr>
-          <w:p>
-            <w:pPr>
-              <w:spacing w:before="0" w:after="60"/>
-              <w:keepNext/>
-              <w:jc w:val="start"/>
-            </w:pPr>
-            <w:r>
-              <w:rPr>
-                <w:rFonts w:ascii="Calibri" w:hAnsi="Calibri"/>
-                <w:sz w:val="20"/>
-              </w:rPr>
-              <w:t xml:space="default">151 (21.7%)</w:t>
+              <w:t xml:space="default">41 (15.5%)</w:t>
+            </w:r>
+          </w:p>
+        </w:tc>
+        <w:tc>
+          <w:tcPr>
+            <w:tcBorders>
+              <w:top w:val="single" w:space="0" w:color="D3D3D3"/>
+              <w:bottom w:val="single" w:space="0" w:color="D3D3D3"/>
+              <w:start w:val="single" w:space="0" w:color="D3D3D3"/>
+              <w:end w:val="single" w:space="0" w:color="D3D3D3"/>
+            </w:tcBorders>
+          </w:tcPr>
+          <w:p>
+            <w:pPr>
+              <w:spacing w:before="0" w:after="60"/>
+              <w:keepNext/>
+              <w:jc w:val="start"/>
+            </w:pPr>
+            <w:r>
+              <w:rPr>
+                <w:rFonts w:ascii="Calibri" w:hAnsi="Calibri"/>
+                <w:sz w:val="20"/>
+              </w:rPr>
+              <w:t xml:space="default">110 (25.9%)</w:t>
+            </w:r>
+          </w:p>
+        </w:tc>
+        <w:tc>
+          <w:tcPr>
+            <w:tcBorders>
+              <w:top w:val="single" w:space="0" w:color="D3D3D3"/>
+              <w:bottom w:val="single" w:space="0" w:color="D3D3D3"/>
+              <w:start w:val="single" w:space="0" w:color="D3D3D3"/>
+              <w:end w:val="single" w:space="0" w:color="D3D3D3"/>
+            </w:tcBorders>
+          </w:tcPr>
+          <w:p>
+            <w:pPr>
+              <w:spacing w:before="0" w:after="60"/>
+              <w:keepNext/>
+              <w:jc w:val="start"/>
+            </w:pPr>
+            <w:r>
+              <w:rPr>
+                <w:rFonts w:ascii="Calibri" w:hAnsi="Calibri"/>
+                <w:sz w:val="20"/>
+              </w:rPr>
+              <w:t xml:space="default">151 (22%)</w:t>
             </w:r>
           </w:p>
         </w:tc>
@@ -5454,7 +5454,7 @@
                 <w:rFonts w:ascii="Calibri" w:hAnsi="Calibri"/>
                 <w:sz w:val="20"/>
               </w:rPr>
-              <w:t xml:space="default">26 (3.8%)</w:t>
+              <w:t xml:space="default">26 (3.9%)</w:t>
             </w:r>
           </w:p>
         </w:tc>
@@ -5531,55 +5531,55 @@
                 <w:rFonts w:ascii="Calibri" w:hAnsi="Calibri"/>
                 <w:sz w:val="20"/>
               </w:rPr>
-              <w:t xml:space="default">245 (92.6%)</w:t>
-            </w:r>
-          </w:p>
-        </w:tc>
-        <w:tc>
-          <w:tcPr>
-            <w:tcBorders>
-              <w:top w:val="single" w:space="0" w:color="D3D3D3"/>
-              <w:bottom w:val="single" w:space="0" w:color="D3D3D3"/>
-              <w:start w:val="single" w:space="0" w:color="D3D3D3"/>
-              <w:end w:val="single" w:space="0" w:color="D3D3D3"/>
-            </w:tcBorders>
-          </w:tcPr>
-          <w:p>
-            <w:pPr>
-              <w:spacing w:before="0" w:after="60"/>
-              <w:keepNext/>
-              <w:jc w:val="start"/>
-            </w:pPr>
-            <w:r>
-              <w:rPr>
-                <w:rFonts w:ascii="Calibri" w:hAnsi="Calibri"/>
-                <w:sz w:val="20"/>
-              </w:rPr>
-              <w:t xml:space="default">422 (98.4%)</w:t>
-            </w:r>
-          </w:p>
-        </w:tc>
-        <w:tc>
-          <w:tcPr>
-            <w:tcBorders>
-              <w:top w:val="single" w:space="0" w:color="D3D3D3"/>
-              <w:bottom w:val="single" w:space="0" w:color="D3D3D3"/>
-              <w:start w:val="single" w:space="0" w:color="D3D3D3"/>
-              <w:end w:val="single" w:space="0" w:color="D3D3D3"/>
-            </w:tcBorders>
-          </w:tcPr>
-          <w:p>
-            <w:pPr>
-              <w:spacing w:before="0" w:after="60"/>
-              <w:keepNext/>
-              <w:jc w:val="start"/>
-            </w:pPr>
-            <w:r>
-              <w:rPr>
-                <w:rFonts w:ascii="Calibri" w:hAnsi="Calibri"/>
-                <w:sz w:val="20"/>
-              </w:rPr>
-              <w:t xml:space="default">667 (96.2%)</w:t>
+              <w:t xml:space="default">243 (92.6%)</w:t>
+            </w:r>
+          </w:p>
+        </w:tc>
+        <w:tc>
+          <w:tcPr>
+            <w:tcBorders>
+              <w:top w:val="single" w:space="0" w:color="D3D3D3"/>
+              <w:bottom w:val="single" w:space="0" w:color="D3D3D3"/>
+              <w:start w:val="single" w:space="0" w:color="D3D3D3"/>
+              <w:end w:val="single" w:space="0" w:color="D3D3D3"/>
+            </w:tcBorders>
+          </w:tcPr>
+          <w:p>
+            <w:pPr>
+              <w:spacing w:before="0" w:after="60"/>
+              <w:keepNext/>
+              <w:jc w:val="start"/>
+            </w:pPr>
+            <w:r>
+              <w:rPr>
+                <w:rFonts w:ascii="Calibri" w:hAnsi="Calibri"/>
+                <w:sz w:val="20"/>
+              </w:rPr>
+              <w:t xml:space="default">417 (98.4%)</w:t>
+            </w:r>
+          </w:p>
+        </w:tc>
+        <w:tc>
+          <w:tcPr>
+            <w:tcBorders>
+              <w:top w:val="single" w:space="0" w:color="D3D3D3"/>
+              <w:bottom w:val="single" w:space="0" w:color="D3D3D3"/>
+              <w:start w:val="single" w:space="0" w:color="D3D3D3"/>
+              <w:end w:val="single" w:space="0" w:color="D3D3D3"/>
+            </w:tcBorders>
+          </w:tcPr>
+          <w:p>
+            <w:pPr>
+              <w:spacing w:before="0" w:after="60"/>
+              <w:keepNext/>
+              <w:jc w:val="start"/>
+            </w:pPr>
+            <w:r>
+              <w:rPr>
+                <w:rFonts w:ascii="Calibri" w:hAnsi="Calibri"/>
+                <w:sz w:val="20"/>
+              </w:rPr>
+              <w:t xml:space="default">660 (96.1%)</w:t>
             </w:r>
           </w:p>
         </w:tc>
@@ -5603,7 +5603,7 @@
                 <w:rFonts w:ascii="Calibri" w:hAnsi="Calibri"/>
                 <w:sz w:val="20"/>
               </w:rPr>
-              <w:t xml:space="default">63.3%</w:t>
+              <w:t xml:space="default">63.2%</w:t>
             </w:r>
           </w:p>
         </w:tc>
@@ -5786,55 +5786,55 @@
                 <w:rFonts w:ascii="Calibri" w:hAnsi="Calibri"/>
                 <w:sz w:val="20"/>
               </w:rPr>
-              <w:t xml:space="default">36 (13.8%)</w:t>
-            </w:r>
-          </w:p>
-        </w:tc>
-        <w:tc>
-          <w:tcPr>
-            <w:tcBorders>
-              <w:top w:val="single" w:space="0" w:color="D3D3D3"/>
-              <w:bottom w:val="single" w:space="0" w:color="D3D3D3"/>
-              <w:start w:val="single" w:space="0" w:color="D3D3D3"/>
-              <w:end w:val="single" w:space="0" w:color="D3D3D3"/>
-            </w:tcBorders>
-          </w:tcPr>
-          <w:p>
-            <w:pPr>
-              <w:spacing w:before="0" w:after="60"/>
-              <w:keepNext/>
-              <w:jc w:val="start"/>
-            </w:pPr>
-            <w:r>
-              <w:rPr>
-                <w:rFonts w:ascii="Calibri" w:hAnsi="Calibri"/>
-                <w:sz w:val="20"/>
-              </w:rPr>
-              <w:t xml:space="default">45 (10.4%)</w:t>
-            </w:r>
-          </w:p>
-        </w:tc>
-        <w:tc>
-          <w:tcPr>
-            <w:tcBorders>
-              <w:top w:val="single" w:space="0" w:color="D3D3D3"/>
-              <w:bottom w:val="single" w:space="0" w:color="D3D3D3"/>
-              <w:start w:val="single" w:space="0" w:color="D3D3D3"/>
-              <w:end w:val="single" w:space="0" w:color="D3D3D3"/>
-            </w:tcBorders>
-          </w:tcPr>
-          <w:p>
-            <w:pPr>
-              <w:spacing w:before="0" w:after="60"/>
-              <w:keepNext/>
-              <w:jc w:val="start"/>
-            </w:pPr>
-            <w:r>
-              <w:rPr>
-                <w:rFonts w:ascii="Calibri" w:hAnsi="Calibri"/>
-                <w:sz w:val="20"/>
-              </w:rPr>
-              <w:t xml:space="default">81 (11.7%)</w:t>
+              <w:t xml:space="default">36 (13.9%)</w:t>
+            </w:r>
+          </w:p>
+        </w:tc>
+        <w:tc>
+          <w:tcPr>
+            <w:tcBorders>
+              <w:top w:val="single" w:space="0" w:color="D3D3D3"/>
+              <w:bottom w:val="single" w:space="0" w:color="D3D3D3"/>
+              <w:start w:val="single" w:space="0" w:color="D3D3D3"/>
+              <w:end w:val="single" w:space="0" w:color="D3D3D3"/>
+            </w:tcBorders>
+          </w:tcPr>
+          <w:p>
+            <w:pPr>
+              <w:spacing w:before="0" w:after="60"/>
+              <w:keepNext/>
+              <w:jc w:val="start"/>
+            </w:pPr>
+            <w:r>
+              <w:rPr>
+                <w:rFonts w:ascii="Calibri" w:hAnsi="Calibri"/>
+                <w:sz w:val="20"/>
+              </w:rPr>
+              <w:t xml:space="default">45 (10.6%)</w:t>
+            </w:r>
+          </w:p>
+        </w:tc>
+        <w:tc>
+          <w:tcPr>
+            <w:tcBorders>
+              <w:top w:val="single" w:space="0" w:color="D3D3D3"/>
+              <w:bottom w:val="single" w:space="0" w:color="D3D3D3"/>
+              <w:start w:val="single" w:space="0" w:color="D3D3D3"/>
+              <w:end w:val="single" w:space="0" w:color="D3D3D3"/>
+            </w:tcBorders>
+          </w:tcPr>
+          <w:p>
+            <w:pPr>
+              <w:spacing w:before="0" w:after="60"/>
+              <w:keepNext/>
+              <w:jc w:val="start"/>
+            </w:pPr>
+            <w:r>
+              <w:rPr>
+                <w:rFonts w:ascii="Calibri" w:hAnsi="Calibri"/>
+                <w:sz w:val="20"/>
+              </w:rPr>
+              <w:t xml:space="default">81 (11.8%)</w:t>
             </w:r>
           </w:p>
         </w:tc>
@@ -5911,55 +5911,55 @@
                 <w:rFonts w:ascii="Calibri" w:hAnsi="Calibri"/>
                 <w:sz w:val="20"/>
               </w:rPr>
-              <w:t xml:space="default">228 (86.2%)</w:t>
-            </w:r>
-          </w:p>
-        </w:tc>
-        <w:tc>
-          <w:tcPr>
-            <w:tcBorders>
-              <w:top w:val="single" w:space="0" w:color="D3D3D3"/>
-              <w:bottom w:val="single" w:space="0" w:color="D3D3D3"/>
-              <w:start w:val="single" w:space="0" w:color="D3D3D3"/>
-              <w:end w:val="single" w:space="0" w:color="D3D3D3"/>
-            </w:tcBorders>
-          </w:tcPr>
-          <w:p>
-            <w:pPr>
-              <w:spacing w:before="0" w:after="60"/>
-              <w:keepNext/>
-              <w:jc w:val="start"/>
-            </w:pPr>
-            <w:r>
-              <w:rPr>
-                <w:rFonts w:ascii="Calibri" w:hAnsi="Calibri"/>
-                <w:sz w:val="20"/>
-              </w:rPr>
-              <w:t xml:space="default">385 (89.6%)</w:t>
-            </w:r>
-          </w:p>
-        </w:tc>
-        <w:tc>
-          <w:tcPr>
-            <w:tcBorders>
-              <w:top w:val="single" w:space="0" w:color="D3D3D3"/>
-              <w:bottom w:val="single" w:space="0" w:color="D3D3D3"/>
-              <w:start w:val="single" w:space="0" w:color="D3D3D3"/>
-              <w:end w:val="single" w:space="0" w:color="D3D3D3"/>
-            </w:tcBorders>
-          </w:tcPr>
-          <w:p>
-            <w:pPr>
-              <w:spacing w:before="0" w:after="60"/>
-              <w:keepNext/>
-              <w:jc w:val="start"/>
-            </w:pPr>
-            <w:r>
-              <w:rPr>
-                <w:rFonts w:ascii="Calibri" w:hAnsi="Calibri"/>
-                <w:sz w:val="20"/>
-              </w:rPr>
-              <w:t xml:space="default">612 (88.3%)</w:t>
+              <w:t xml:space="default">226 (86.1%)</w:t>
+            </w:r>
+          </w:p>
+        </w:tc>
+        <w:tc>
+          <w:tcPr>
+            <w:tcBorders>
+              <w:top w:val="single" w:space="0" w:color="D3D3D3"/>
+              <w:bottom w:val="single" w:space="0" w:color="D3D3D3"/>
+              <w:start w:val="single" w:space="0" w:color="D3D3D3"/>
+              <w:end w:val="single" w:space="0" w:color="D3D3D3"/>
+            </w:tcBorders>
+          </w:tcPr>
+          <w:p>
+            <w:pPr>
+              <w:spacing w:before="0" w:after="60"/>
+              <w:keepNext/>
+              <w:jc w:val="start"/>
+            </w:pPr>
+            <w:r>
+              <w:rPr>
+                <w:rFonts w:ascii="Calibri" w:hAnsi="Calibri"/>
+                <w:sz w:val="20"/>
+              </w:rPr>
+              <w:t xml:space="default">379 (89.4%)</w:t>
+            </w:r>
+          </w:p>
+        </w:tc>
+        <w:tc>
+          <w:tcPr>
+            <w:tcBorders>
+              <w:top w:val="single" w:space="0" w:color="D3D3D3"/>
+              <w:bottom w:val="single" w:space="0" w:color="D3D3D3"/>
+              <w:start w:val="single" w:space="0" w:color="D3D3D3"/>
+              <w:end w:val="single" w:space="0" w:color="D3D3D3"/>
+            </w:tcBorders>
+          </w:tcPr>
+          <w:p>
+            <w:pPr>
+              <w:spacing w:before="0" w:after="60"/>
+              <w:keepNext/>
+              <w:jc w:val="start"/>
+            </w:pPr>
+            <w:r>
+              <w:rPr>
+                <w:rFonts w:ascii="Calibri" w:hAnsi="Calibri"/>
+                <w:sz w:val="20"/>
+              </w:rPr>
+              <w:t xml:space="default">605 (88.2%)</w:t>
             </w:r>
           </w:p>
         </w:tc>
@@ -5983,7 +5983,7 @@
                 <w:rFonts w:ascii="Calibri" w:hAnsi="Calibri"/>
                 <w:sz w:val="20"/>
               </w:rPr>
-              <w:t xml:space="default">62.8%</w:t>
+              <w:t xml:space="default">62.6%</w:t>
             </w:r>
           </w:p>
         </w:tc>

</xml_diff>